<commit_message>
Missing files added. Command line: options may now start with - or /. -? or -h or -help displays a usage screen. IsAnyOverrideUsed discarded. Changes to share more code with ModbusImport. Updated manual.
git-svn-id: http://visualsvn.edna.local/EDNA/ModbusControl/V2@4002 03c8d257-35a7-c645-9f01-50f27e98b9e6
</commit_message>
<xml_diff>
--- a/Manuals/ModbusControl - User manual.docx
+++ b/Manuals/ModbusControl - User manual.docx
@@ -9556,11 +9556,6 @@
       <w:bookmarkEnd w:id="39"/>
     </w:p>
     <w:p>
-      <w:pPr>
-        <w:rPr>
-          <w:rFonts w:hint="eastAsia"/>
-        </w:rPr>
-      </w:pPr>
       <w:r>
         <w:t>Command line options allow to override the connection parameters</w:t>
       </w:r>
@@ -9602,25 +9597,23 @@
           <w:sz w:val="20"/>
           <w:szCs w:val="20"/>
         </w:rPr>
-        <w:t xml:space="preserve"> test3.mbc -connection </w:t>
-      </w:r>
-      <w:proofErr w:type="spellStart"/>
+        <w:t xml:space="preserve"> </w:t>
+      </w:r>
       <w:r>
         <w:rPr>
           <w:rFonts w:ascii="Courier New" w:hAnsi="Courier New" w:cs="Courier New"/>
           <w:sz w:val="20"/>
           <w:szCs w:val="20"/>
         </w:rPr>
-        <w:t>serialrtu</w:t>
-      </w:r>
-      <w:proofErr w:type="spellEnd"/>
+        <w:t>Test1</w:t>
+      </w:r>
       <w:r>
         <w:rPr>
           <w:rFonts w:ascii="Courier New" w:hAnsi="Courier New" w:cs="Courier New"/>
           <w:sz w:val="20"/>
           <w:szCs w:val="20"/>
         </w:rPr>
-        <w:t xml:space="preserve"> -port COM1 -</w:t>
+        <w:t xml:space="preserve">.mbc -connection </w:t>
       </w:r>
       <w:proofErr w:type="spellStart"/>
       <w:r>
@@ -9629,7 +9622,7 @@
           <w:sz w:val="20"/>
           <w:szCs w:val="20"/>
         </w:rPr>
-        <w:t>baudrate</w:t>
+        <w:t>serialrtu</w:t>
       </w:r>
       <w:proofErr w:type="spellEnd"/>
       <w:r>
@@ -9638,15 +9631,35 @@
           <w:sz w:val="20"/>
           <w:szCs w:val="20"/>
         </w:rPr>
-        <w:t xml:space="preserve"> 19200</w:t>
-      </w:r>
+        <w:t xml:space="preserve"> -port COM1 -</w:t>
+      </w:r>
+      <w:proofErr w:type="spellStart"/>
       <w:r>
         <w:rPr>
           <w:rFonts w:ascii="Courier New" w:hAnsi="Courier New" w:cs="Courier New"/>
           <w:sz w:val="20"/>
           <w:szCs w:val="20"/>
         </w:rPr>
-        <w:br/>
+        <w:t>baudrate</w:t>
+      </w:r>
+      <w:proofErr w:type="spellEnd"/>
+      <w:r>
+        <w:rPr>
+          <w:rFonts w:ascii="Courier New" w:hAnsi="Courier New" w:cs="Courier New"/>
+          <w:sz w:val="20"/>
+          <w:szCs w:val="20"/>
+        </w:rPr>
+        <w:t xml:space="preserve"> 19200</w:t>
+      </w:r>
+    </w:p>
+    <w:p>
+      <w:pPr>
+        <w:rPr>
+          <w:rFonts w:hint="eastAsia"/>
+        </w:rPr>
+      </w:pPr>
+      <w:r>
+        <w:t>Options can start with - (dash) or / (slash).</w:t>
       </w:r>
     </w:p>
     <w:tbl>
@@ -9849,13 +9862,7 @@
               <w:t xml:space="preserve"> </w:t>
             </w:r>
             <w:r>
-              <w:t>&lt;</w:t>
-            </w:r>
-            <w:r>
               <w:t>###</w:t>
-            </w:r>
-            <w:r>
-              <w:t>&gt;</w:t>
             </w:r>
           </w:p>
         </w:tc>
@@ -9976,13 +9983,7 @@
               <w:t xml:space="preserve"> </w:t>
             </w:r>
             <w:r>
-              <w:t>&lt;</w:t>
-            </w:r>
-            <w:r>
               <w:t>###</w:t>
-            </w:r>
-            <w:r>
-              <w:t>&gt;</w:t>
             </w:r>
           </w:p>
         </w:tc>
@@ -10041,9 +10042,6 @@
             <w:r>
               <w:t xml:space="preserve"> </w:t>
             </w:r>
-            <w:r>
-              <w:t>&lt;true/false&gt;</w:t>
-            </w:r>
           </w:p>
         </w:tc>
         <w:tc>
@@ -10058,13 +10056,10 @@
               </w:rPr>
             </w:pPr>
             <w:r>
-              <w:t>S</w:t>
-            </w:r>
-            <w:r>
-              <w:rPr>
-                <w:rFonts w:hint="eastAsia"/>
-              </w:rPr>
-              <w:t>uppress the query command being echoed back to ModbusControl.</w:t>
+              <w:rPr>
+                <w:rFonts w:hint="eastAsia"/>
+              </w:rPr>
+              <w:t>Ignore</w:t>
             </w:r>
             <w:r>
               <w:t xml:space="preserve"> </w:t>
@@ -10073,10 +10068,13 @@
               <w:rPr>
                 <w:rFonts w:hint="eastAsia"/>
               </w:rPr>
-              <w:t>S</w:t>
-            </w:r>
-            <w:r>
-              <w:t>et true or false.</w:t>
+              <w:t>the query command being echoed back to ModbusControl.</w:t>
+            </w:r>
+            <w:r>
+              <w:t xml:space="preserve"> </w:t>
+            </w:r>
+            <w:r>
+              <w:t>No value.</w:t>
             </w:r>
           </w:p>
         </w:tc>
@@ -10108,16 +10106,7 @@
             </w:r>
             <w:proofErr w:type="spellEnd"/>
             <w:r>
-              <w:t xml:space="preserve"> </w:t>
-            </w:r>
-            <w:r>
-              <w:t>&lt;</w:t>
-            </w:r>
-            <w:r>
-              <w:t>###.###.###.###</w:t>
-            </w:r>
-            <w:r>
-              <w:t>&gt;</w:t>
+              <w:t xml:space="preserve"> ###.###.###.###</w:t>
             </w:r>
           </w:p>
         </w:tc>
@@ -10150,13 +10139,6 @@
             <w:r>
               <w:t>100</w:t>
             </w:r>
-          </w:p>
-          <w:p>
-            <w:pPr>
-              <w:rPr>
-                <w:rFonts w:hint="eastAsia"/>
-              </w:rPr>
-            </w:pPr>
           </w:p>
         </w:tc>
       </w:tr>
@@ -10187,16 +10169,7 @@
             </w:r>
             <w:proofErr w:type="spellEnd"/>
             <w:r>
-              <w:t xml:space="preserve"> </w:t>
-            </w:r>
-            <w:r>
-              <w:t>&lt;</w:t>
-            </w:r>
-            <w:r>
-              <w:t>###</w:t>
-            </w:r>
-            <w:r>
-              <w:t>&gt;</w:t>
+              <w:t xml:space="preserve"> ###</w:t>
             </w:r>
           </w:p>
         </w:tc>
@@ -10229,13 +10202,6 @@
             <w:r>
               <w:t>2</w:t>
             </w:r>
-          </w:p>
-          <w:p>
-            <w:pPr>
-              <w:rPr>
-                <w:rFonts w:hint="eastAsia"/>
-              </w:rPr>
-            </w:pPr>
           </w:p>
         </w:tc>
       </w:tr>
@@ -10269,21 +10235,8 @@
               <w:t xml:space="preserve"> </w:t>
             </w:r>
             <w:r>
-              <w:t>&lt;</w:t>
-            </w:r>
-            <w:r>
               <w:t>###</w:t>
             </w:r>
-            <w:r>
-              <w:t>&gt;</w:t>
-            </w:r>
-          </w:p>
-          <w:p>
-            <w:pPr>
-              <w:rPr>
-                <w:rFonts w:hint="eastAsia"/>
-              </w:rPr>
-            </w:pPr>
           </w:p>
         </w:tc>
         <w:tc>
@@ -10342,13 +10295,6 @@
               <w:t>###</w:t>
             </w:r>
           </w:p>
-          <w:p>
-            <w:pPr>
-              <w:rPr>
-                <w:rFonts w:hint="eastAsia"/>
-              </w:rPr>
-            </w:pPr>
-          </w:p>
         </w:tc>
         <w:tc>
           <w:tcPr>
@@ -10406,13 +10352,6 @@
               <w:t>###</w:t>
             </w:r>
           </w:p>
-          <w:p>
-            <w:pPr>
-              <w:rPr>
-                <w:rFonts w:hint="eastAsia"/>
-              </w:rPr>
-            </w:pPr>
-          </w:p>
         </w:tc>
         <w:tc>
           <w:tcPr>
@@ -10473,13 +10412,6 @@
               <w:t>###</w:t>
             </w:r>
           </w:p>
-          <w:p>
-            <w:pPr>
-              <w:rPr>
-                <w:rFonts w:hint="eastAsia"/>
-              </w:rPr>
-            </w:pPr>
-          </w:p>
         </w:tc>
         <w:tc>
           <w:tcPr>
@@ -10500,6 +10432,53 @@
                 <w:rFonts w:hint="eastAsia"/>
               </w:rPr>
               <w:t xml:space="preserve"> milliseconds.</w:t>
+            </w:r>
+          </w:p>
+        </w:tc>
+      </w:tr>
+      <w:tr>
+        <w:tc>
+          <w:tcPr>
+            <w:tcW w:w="3260" w:type="dxa"/>
+            <w:shd w:val="clear" w:color="auto" w:fill="auto"/>
+          </w:tcPr>
+          <w:p>
+            <w:pPr>
+              <w:rPr>
+                <w:rFonts w:hint="eastAsia"/>
+              </w:rPr>
+            </w:pPr>
+            <w:r>
+              <w:rPr>
+                <w:rFonts w:hint="eastAsia"/>
+              </w:rPr>
+              <w:t xml:space="preserve">-? or -help  </w:t>
+            </w:r>
+          </w:p>
+        </w:tc>
+        <w:tc>
+          <w:tcPr>
+            <w:tcW w:w="6268" w:type="dxa"/>
+            <w:shd w:val="clear" w:color="auto" w:fill="auto"/>
+          </w:tcPr>
+          <w:p>
+            <w:r>
+              <w:rPr>
+                <w:rFonts w:hint="eastAsia"/>
+              </w:rPr>
+              <w:t xml:space="preserve">Shows </w:t>
+            </w:r>
+            <w:r>
+              <w:t xml:space="preserve">a command line </w:t>
+            </w:r>
+            <w:r>
+              <w:rPr>
+                <w:rFonts w:hint="eastAsia"/>
+              </w:rPr>
+              <w:t>help screen</w:t>
+            </w:r>
+            <w:r>
+              <w:t>.</w:t>
             </w:r>
           </w:p>
         </w:tc>
@@ -10627,49 +10606,52 @@
       </w:pPr>
       <w:bookmarkStart w:id="41" w:name="_Toc138517973"/>
       <w:r>
+        <w:t>Editing the mbc project file</w:t>
+      </w:r>
+      <w:bookmarkEnd w:id="41"/>
+    </w:p>
+    <w:p>
+      <w:pPr>
+        <w:pStyle w:val="Kop2"/>
+        <w:rPr>
+          <w:rFonts w:hint="eastAsia"/>
+        </w:rPr>
+      </w:pPr>
+      <w:bookmarkStart w:id="42" w:name="_Toc138517974"/>
+      <w:r>
+        <w:rPr>
+          <w:lang w:val="en-GB"/>
+        </w:rPr>
+        <w:t>Editing the XML</w:t>
+      </w:r>
+      <w:bookmarkEnd w:id="42"/>
+    </w:p>
+    <w:p>
+      <w:pPr>
+        <w:rPr>
+          <w:rFonts w:hint="eastAsia"/>
+        </w:rPr>
+      </w:pPr>
+      <w:r>
+        <w:t xml:space="preserve">The mbc project file is an XML formatted text file that is both human-readable and machine-readable. ModbusControl does not (yet) support creation of a project file so it has to be edited manually. You can also use the example project </w:t>
+      </w:r>
+      <w:proofErr w:type="spellStart"/>
+      <w:r>
+        <w:t>Demo.mbc</w:t>
+      </w:r>
+      <w:proofErr w:type="spellEnd"/>
+      <w:r>
+        <w:t xml:space="preserve"> to start from. You</w:t>
+      </w:r>
+      <w:r>
+        <w:t>’</w:t>
+      </w:r>
+      <w:r>
+        <w:t xml:space="preserve">ll find it in the Help </w:t>
+      </w:r>
+      <w:r>
         <w:lastRenderedPageBreak/>
-        <w:t>Editing the mbc project file</w:t>
-      </w:r>
-      <w:bookmarkEnd w:id="41"/>
-    </w:p>
-    <w:p>
-      <w:pPr>
-        <w:pStyle w:val="Kop2"/>
-        <w:rPr>
-          <w:rFonts w:hint="eastAsia"/>
-        </w:rPr>
-      </w:pPr>
-      <w:bookmarkStart w:id="42" w:name="_Toc138517974"/>
-      <w:r>
-        <w:rPr>
-          <w:lang w:val="en-GB"/>
-        </w:rPr>
-        <w:t>Editing the XML</w:t>
-      </w:r>
-      <w:bookmarkEnd w:id="42"/>
-    </w:p>
-    <w:p>
-      <w:pPr>
-        <w:rPr>
-          <w:rFonts w:hint="eastAsia"/>
-        </w:rPr>
-      </w:pPr>
-      <w:r>
-        <w:t xml:space="preserve">The mbc project file is an XML formatted text file that is both human-readable and machine-readable. ModbusControl does not (yet) support creation of a project file so it has to be edited manually. You can also use the example project </w:t>
-      </w:r>
-      <w:proofErr w:type="spellStart"/>
-      <w:r>
-        <w:t>Demo.mbc</w:t>
-      </w:r>
-      <w:proofErr w:type="spellEnd"/>
-      <w:r>
-        <w:t xml:space="preserve"> to start from. You</w:t>
-      </w:r>
-      <w:r>
-        <w:t>’</w:t>
-      </w:r>
-      <w:r>
-        <w:t>ll find it in the Help menu.</w:t>
+        <w:t>menu.</w:t>
       </w:r>
     </w:p>
     <w:p>
@@ -11534,7 +11516,6 @@
               </w:rPr>
             </w:pPr>
             <w:r>
-              <w:lastRenderedPageBreak/>
               <w:t>Value “serial/</w:t>
             </w:r>
             <w:proofErr w:type="spellStart"/>
@@ -11608,7 +11589,6 @@
               <w:rPr>
                 <w:lang w:val="en-GB"/>
               </w:rPr>
-              <w:lastRenderedPageBreak/>
               <w:t>&lt;port&gt;</w:t>
             </w:r>
           </w:p>
@@ -11695,6 +11675,7 @@
               <w:rPr>
                 <w:lang w:val="en-GB"/>
               </w:rPr>
+              <w:lastRenderedPageBreak/>
               <w:t xml:space="preserve">&lt;parity&gt; </w:t>
             </w:r>
           </w:p>
@@ -12353,7 +12334,6 @@
               </w:rPr>
             </w:pPr>
             <w:r>
-              <w:lastRenderedPageBreak/>
               <w:t>Value “big” for high-low word order: the high bits in the first 16-bit register and the low bits in the second 16-bit register.</w:t>
             </w:r>
           </w:p>
@@ -12385,25 +12365,28 @@
               <w:rPr>
                 <w:lang w:val="en-GB"/>
               </w:rPr>
+              <w:t>&lt;float32endian&gt;</w:t>
+            </w:r>
+          </w:p>
+        </w:tc>
+        <w:tc>
+          <w:tcPr>
+            <w:tcW w:w="6747" w:type="dxa"/>
+            <w:shd w:val="clear" w:color="auto" w:fill="auto"/>
+          </w:tcPr>
+          <w:p>
+            <w:pPr>
+              <w:pStyle w:val="Xmlgridtext"/>
+              <w:rPr>
+                <w:rFonts w:hint="eastAsia"/>
+              </w:rPr>
+            </w:pPr>
+            <w:r>
+              <w:t xml:space="preserve">Defines how a 32-bit floating point value is stored in 2 16-bit </w:t>
+            </w:r>
+            <w:r>
               <w:lastRenderedPageBreak/>
-              <w:t>&lt;float32endian&gt;</w:t>
-            </w:r>
-          </w:p>
-        </w:tc>
-        <w:tc>
-          <w:tcPr>
-            <w:tcW w:w="6747" w:type="dxa"/>
-            <w:shd w:val="clear" w:color="auto" w:fill="auto"/>
-          </w:tcPr>
-          <w:p>
-            <w:pPr>
-              <w:pStyle w:val="Xmlgridtext"/>
-              <w:rPr>
-                <w:rFonts w:hint="eastAsia"/>
-              </w:rPr>
-            </w:pPr>
-            <w:r>
-              <w:t xml:space="preserve">Defines how a 32-bit floating point value is stored in 2 16-bit registers. </w:t>
+              <w:t xml:space="preserve">registers. </w:t>
             </w:r>
           </w:p>
           <w:p>
@@ -12444,6 +12427,7 @@
               <w:rPr>
                 <w:lang w:val="en-GB"/>
               </w:rPr>
+              <w:lastRenderedPageBreak/>
               <w:t>&lt;ascii16endian&gt;</w:t>
             </w:r>
           </w:p>
@@ -13636,7 +13620,6 @@
               <w:rPr>
                 <w:lang w:val="en-GB"/>
               </w:rPr>
-              <w:lastRenderedPageBreak/>
               <w:t>&lt;name&gt;</w:t>
             </w:r>
           </w:p>
@@ -13966,6 +13949,7 @@
               <w:rPr>
                 <w:lang w:val="en-GB"/>
               </w:rPr>
+              <w:lastRenderedPageBreak/>
               <w:t>&lt;</w:t>
             </w:r>
             <w:proofErr w:type="spellStart"/>
@@ -15319,7 +15303,6 @@
               <w:rPr>
                 <w:lang w:val="en-GB"/>
               </w:rPr>
-              <w:lastRenderedPageBreak/>
               <w:t>&lt;reg&gt;</w:t>
             </w:r>
           </w:p>
@@ -15529,6 +15512,7 @@
               <w:rPr>
                 <w:lang w:val="en-GB"/>
               </w:rPr>
+              <w:lastRenderedPageBreak/>
               <w:t>&lt;type&gt;</w:t>
             </w:r>
           </w:p>
@@ -16444,7 +16428,6 @@
         <w:rPr>
           <w:rStyle w:val="XMLBracket"/>
         </w:rPr>
-        <w:lastRenderedPageBreak/>
         <w:t>&lt;</w:t>
       </w:r>
       <w:r>
@@ -17078,6 +17061,7 @@
         <w:rPr>
           <w:lang w:val="en-GB"/>
         </w:rPr>
+        <w:lastRenderedPageBreak/>
         <w:t>The &lt;text&gt; element</w:t>
       </w:r>
       <w:bookmarkEnd w:id="49"/>
@@ -18138,7 +18122,6 @@
           <w:rStyle w:val="XMLElement"/>
           <w:noProof/>
         </w:rPr>
-        <w:lastRenderedPageBreak/>
         <w:t xml:space="preserve"> </w:t>
       </w:r>
       <w:r>
@@ -18224,6 +18207,7 @@
               <w:rPr>
                 <w:lang w:val="en-GB"/>
               </w:rPr>
+              <w:lastRenderedPageBreak/>
               <w:t>int16</w:t>
             </w:r>
           </w:p>
@@ -19486,9 +19470,6 @@
       </w:r>
       <w:r>
         <w:br/>
-      </w:r>
-      <w:r>
-        <w:lastRenderedPageBreak/>
         <w:t xml:space="preserve">The </w:t>
       </w:r>
       <w:r>
@@ -19651,6 +19632,7 @@
               </w:rPr>
             </w:pPr>
             <w:r>
+              <w:lastRenderedPageBreak/>
               <w:t>Optional. Default is 1.</w:t>
             </w:r>
           </w:p>
@@ -19670,6 +19652,7 @@
               <w:rPr>
                 <w:lang w:val="en-GB"/>
               </w:rPr>
+              <w:lastRenderedPageBreak/>
               <w:t xml:space="preserve">&lt;text&gt; </w:t>
             </w:r>
           </w:p>
@@ -21979,7 +21962,6 @@
                 <w:rStyle w:val="XMLBracket"/>
                 <w:lang w:val="en-GB"/>
               </w:rPr>
-              <w:lastRenderedPageBreak/>
               <w:t>&lt;</w:t>
             </w:r>
             <w:proofErr w:type="spellStart"/>
@@ -22353,6 +22335,7 @@
                 <w:rStyle w:val="XMLBracket"/>
                 <w:lang w:val="en-GB"/>
               </w:rPr>
+              <w:lastRenderedPageBreak/>
               <w:t>&lt;</w:t>
             </w:r>
             <w:proofErr w:type="spellStart"/>
@@ -22813,7 +22796,6 @@
               <w:rPr>
                 <w:lang w:val="en-GB"/>
               </w:rPr>
-              <w:lastRenderedPageBreak/>
               <w:t>&lt;page&gt;</w:t>
             </w:r>
           </w:p>
@@ -22913,6 +22895,7 @@
         </w:rPr>
       </w:pPr>
       <w:r>
+        <w:lastRenderedPageBreak/>
         <w:t>See [</w:t>
       </w:r>
       <w:r>

</xml_diff>

<commit_message>
Command line parameters processing improved. Improved usage and help texts. ModbusImport and ModbusExport: added -tabs option.
git-svn-id: http://visualsvn.edna.local/EDNA/ModbusControl/V2@4021 03c8d257-35a7-c645-9f01-50f27e98b9e6
</commit_message>
<xml_diff>
--- a/Manuals/ModbusControl - User manual.docx
+++ b/Manuals/ModbusControl - User manual.docx
@@ -112,7 +112,6 @@
         </w:r>
         <w:r>
           <w:rPr>
-            <w:rFonts w:hint="eastAsia"/>
             <w:noProof/>
           </w:rPr>
           <w:fldChar w:fldCharType="separate"/>
@@ -199,7 +198,6 @@
         </w:r>
         <w:r>
           <w:rPr>
-            <w:rFonts w:hint="eastAsia"/>
             <w:noProof/>
           </w:rPr>
           <w:fldChar w:fldCharType="separate"/>
@@ -286,7 +284,6 @@
         </w:r>
         <w:r>
           <w:rPr>
-            <w:rFonts w:hint="eastAsia"/>
             <w:noProof/>
           </w:rPr>
           <w:fldChar w:fldCharType="separate"/>
@@ -373,7 +370,6 @@
         </w:r>
         <w:r>
           <w:rPr>
-            <w:rFonts w:hint="eastAsia"/>
             <w:noProof/>
           </w:rPr>
           <w:fldChar w:fldCharType="separate"/>
@@ -460,7 +456,6 @@
         </w:r>
         <w:r>
           <w:rPr>
-            <w:rFonts w:hint="eastAsia"/>
             <w:noProof/>
           </w:rPr>
           <w:fldChar w:fldCharType="separate"/>
@@ -547,7 +542,6 @@
         </w:r>
         <w:r>
           <w:rPr>
-            <w:rFonts w:hint="eastAsia"/>
             <w:noProof/>
           </w:rPr>
           <w:fldChar w:fldCharType="separate"/>
@@ -634,7 +628,6 @@
         </w:r>
         <w:r>
           <w:rPr>
-            <w:rFonts w:hint="eastAsia"/>
             <w:noProof/>
           </w:rPr>
           <w:fldChar w:fldCharType="separate"/>
@@ -721,7 +714,6 @@
         </w:r>
         <w:r>
           <w:rPr>
-            <w:rFonts w:hint="eastAsia"/>
             <w:noProof/>
           </w:rPr>
           <w:fldChar w:fldCharType="separate"/>
@@ -808,7 +800,6 @@
         </w:r>
         <w:r>
           <w:rPr>
-            <w:rFonts w:hint="eastAsia"/>
             <w:noProof/>
           </w:rPr>
           <w:fldChar w:fldCharType="separate"/>
@@ -895,7 +886,6 @@
         </w:r>
         <w:r>
           <w:rPr>
-            <w:rFonts w:hint="eastAsia"/>
             <w:noProof/>
           </w:rPr>
           <w:fldChar w:fldCharType="separate"/>
@@ -982,7 +972,6 @@
         </w:r>
         <w:r>
           <w:rPr>
-            <w:rFonts w:hint="eastAsia"/>
             <w:noProof/>
           </w:rPr>
           <w:fldChar w:fldCharType="separate"/>
@@ -1069,7 +1058,6 @@
         </w:r>
         <w:r>
           <w:rPr>
-            <w:rFonts w:hint="eastAsia"/>
             <w:noProof/>
           </w:rPr>
           <w:fldChar w:fldCharType="separate"/>
@@ -1156,7 +1144,6 @@
         </w:r>
         <w:r>
           <w:rPr>
-            <w:rFonts w:hint="eastAsia"/>
             <w:noProof/>
           </w:rPr>
           <w:fldChar w:fldCharType="separate"/>
@@ -1243,7 +1230,6 @@
         </w:r>
         <w:r>
           <w:rPr>
-            <w:rFonts w:hint="eastAsia"/>
             <w:noProof/>
           </w:rPr>
           <w:fldChar w:fldCharType="separate"/>
@@ -1330,7 +1316,6 @@
         </w:r>
         <w:r>
           <w:rPr>
-            <w:rFonts w:hint="eastAsia"/>
             <w:noProof/>
           </w:rPr>
           <w:fldChar w:fldCharType="separate"/>
@@ -1417,7 +1402,6 @@
         </w:r>
         <w:r>
           <w:rPr>
-            <w:rFonts w:hint="eastAsia"/>
             <w:noProof/>
           </w:rPr>
           <w:fldChar w:fldCharType="separate"/>
@@ -1504,7 +1488,6 @@
         </w:r>
         <w:r>
           <w:rPr>
-            <w:rFonts w:hint="eastAsia"/>
             <w:noProof/>
           </w:rPr>
           <w:fldChar w:fldCharType="separate"/>
@@ -1591,7 +1574,6 @@
         </w:r>
         <w:r>
           <w:rPr>
-            <w:rFonts w:hint="eastAsia"/>
             <w:noProof/>
           </w:rPr>
           <w:fldChar w:fldCharType="separate"/>
@@ -1678,7 +1660,6 @@
         </w:r>
         <w:r>
           <w:rPr>
-            <w:rFonts w:hint="eastAsia"/>
             <w:noProof/>
           </w:rPr>
           <w:fldChar w:fldCharType="separate"/>
@@ -1765,7 +1746,6 @@
         </w:r>
         <w:r>
           <w:rPr>
-            <w:rFonts w:hint="eastAsia"/>
             <w:noProof/>
           </w:rPr>
           <w:fldChar w:fldCharType="separate"/>
@@ -1852,7 +1832,6 @@
         </w:r>
         <w:r>
           <w:rPr>
-            <w:rFonts w:hint="eastAsia"/>
             <w:noProof/>
           </w:rPr>
           <w:fldChar w:fldCharType="separate"/>
@@ -1939,7 +1918,6 @@
         </w:r>
         <w:r>
           <w:rPr>
-            <w:rFonts w:hint="eastAsia"/>
             <w:noProof/>
           </w:rPr>
           <w:fldChar w:fldCharType="separate"/>
@@ -2026,7 +2004,6 @@
         </w:r>
         <w:r>
           <w:rPr>
-            <w:rFonts w:hint="eastAsia"/>
             <w:noProof/>
           </w:rPr>
           <w:fldChar w:fldCharType="separate"/>
@@ -2113,7 +2090,6 @@
         </w:r>
         <w:r>
           <w:rPr>
-            <w:rFonts w:hint="eastAsia"/>
             <w:noProof/>
           </w:rPr>
           <w:fldChar w:fldCharType="separate"/>
@@ -2200,7 +2176,6 @@
         </w:r>
         <w:r>
           <w:rPr>
-            <w:rFonts w:hint="eastAsia"/>
             <w:noProof/>
           </w:rPr>
           <w:fldChar w:fldCharType="separate"/>
@@ -2287,7 +2262,6 @@
         </w:r>
         <w:r>
           <w:rPr>
-            <w:rFonts w:hint="eastAsia"/>
             <w:noProof/>
           </w:rPr>
           <w:fldChar w:fldCharType="separate"/>
@@ -2374,7 +2348,6 @@
         </w:r>
         <w:r>
           <w:rPr>
-            <w:rFonts w:hint="eastAsia"/>
             <w:noProof/>
           </w:rPr>
           <w:fldChar w:fldCharType="separate"/>
@@ -2461,7 +2434,6 @@
         </w:r>
         <w:r>
           <w:rPr>
-            <w:rFonts w:hint="eastAsia"/>
             <w:noProof/>
           </w:rPr>
           <w:fldChar w:fldCharType="separate"/>
@@ -2548,7 +2520,6 @@
         </w:r>
         <w:r>
           <w:rPr>
-            <w:rFonts w:hint="eastAsia"/>
             <w:noProof/>
           </w:rPr>
           <w:fldChar w:fldCharType="separate"/>
@@ -2635,7 +2606,6 @@
         </w:r>
         <w:r>
           <w:rPr>
-            <w:rFonts w:hint="eastAsia"/>
             <w:noProof/>
           </w:rPr>
           <w:fldChar w:fldCharType="separate"/>
@@ -2722,7 +2692,6 @@
         </w:r>
         <w:r>
           <w:rPr>
-            <w:rFonts w:hint="eastAsia"/>
             <w:noProof/>
           </w:rPr>
           <w:fldChar w:fldCharType="separate"/>
@@ -2809,7 +2778,6 @@
         </w:r>
         <w:r>
           <w:rPr>
-            <w:rFonts w:hint="eastAsia"/>
             <w:noProof/>
           </w:rPr>
           <w:fldChar w:fldCharType="separate"/>
@@ -2896,7 +2864,6 @@
         </w:r>
         <w:r>
           <w:rPr>
-            <w:rFonts w:hint="eastAsia"/>
             <w:noProof/>
           </w:rPr>
           <w:fldChar w:fldCharType="separate"/>
@@ -2985,7 +2952,6 @@
         </w:r>
         <w:r>
           <w:rPr>
-            <w:rFonts w:hint="eastAsia"/>
             <w:noProof/>
           </w:rPr>
           <w:fldChar w:fldCharType="separate"/>
@@ -3072,7 +3038,6 @@
         </w:r>
         <w:r>
           <w:rPr>
-            <w:rFonts w:hint="eastAsia"/>
             <w:noProof/>
           </w:rPr>
           <w:fldChar w:fldCharType="separate"/>
@@ -3159,7 +3124,6 @@
         </w:r>
         <w:r>
           <w:rPr>
-            <w:rFonts w:hint="eastAsia"/>
             <w:noProof/>
           </w:rPr>
           <w:fldChar w:fldCharType="separate"/>
@@ -3246,7 +3210,6 @@
         </w:r>
         <w:r>
           <w:rPr>
-            <w:rFonts w:hint="eastAsia"/>
             <w:noProof/>
           </w:rPr>
           <w:fldChar w:fldCharType="separate"/>
@@ -3333,7 +3296,6 @@
         </w:r>
         <w:r>
           <w:rPr>
-            <w:rFonts w:hint="eastAsia"/>
             <w:noProof/>
           </w:rPr>
           <w:fldChar w:fldCharType="separate"/>
@@ -3420,7 +3382,6 @@
         </w:r>
         <w:r>
           <w:rPr>
-            <w:rFonts w:hint="eastAsia"/>
             <w:noProof/>
           </w:rPr>
           <w:fldChar w:fldCharType="separate"/>
@@ -3507,7 +3468,6 @@
         </w:r>
         <w:r>
           <w:rPr>
-            <w:rFonts w:hint="eastAsia"/>
             <w:noProof/>
           </w:rPr>
           <w:fldChar w:fldCharType="separate"/>
@@ -3594,7 +3554,6 @@
         </w:r>
         <w:r>
           <w:rPr>
-            <w:rFonts w:hint="eastAsia"/>
             <w:noProof/>
           </w:rPr>
           <w:fldChar w:fldCharType="separate"/>
@@ -3681,7 +3640,6 @@
         </w:r>
         <w:r>
           <w:rPr>
-            <w:rFonts w:hint="eastAsia"/>
             <w:noProof/>
           </w:rPr>
           <w:fldChar w:fldCharType="separate"/>
@@ -3768,7 +3726,6 @@
         </w:r>
         <w:r>
           <w:rPr>
-            <w:rFonts w:hint="eastAsia"/>
             <w:noProof/>
           </w:rPr>
           <w:fldChar w:fldCharType="separate"/>
@@ -3855,7 +3812,6 @@
         </w:r>
         <w:r>
           <w:rPr>
-            <w:rFonts w:hint="eastAsia"/>
             <w:noProof/>
           </w:rPr>
           <w:fldChar w:fldCharType="separate"/>
@@ -5482,7 +5438,7 @@
             <v:path o:extrusionok="f" gradientshapeok="t" o:connecttype="rect"/>
             <o:lock v:ext="edit" aspectratio="t"/>
           </v:shapetype>
-          <v:shape id="_x0000_i1025" type="#_x0000_t75" style="width:408.75pt;height:55.5pt;visibility:visible;mso-wrap-style:square">
+          <v:shape id="_x0000_i1025" type="#_x0000_t75" style="width:408.55pt;height:55.65pt;visibility:visible;mso-wrap-style:square">
             <v:imagedata r:id="rId8" o:title=""/>
           </v:shape>
         </w:pict>
@@ -8788,7 +8744,7 @@
           <w:noProof/>
         </w:rPr>
         <w:pict w14:anchorId="5CABB691">
-          <v:shape id="_x0000_i1026" type="#_x0000_t75" style="width:391.5pt;height:51.75pt;visibility:visible;mso-wrap-style:square">
+          <v:shape id="_x0000_i1026" type="#_x0000_t75" style="width:391.65pt;height:51.8pt;visibility:visible;mso-wrap-style:square">
             <v:imagedata r:id="rId10" o:title=""/>
           </v:shape>
         </w:pict>
@@ -9801,7 +9757,10 @@
               <w:rPr>
                 <w:rFonts w:hint="eastAsia"/>
               </w:rPr>
-              <w:t>Serial port name: COM1,..</w:t>
+              <w:t>Serial port name: COM1</w:t>
+            </w:r>
+            <w:r>
+              <w:t>,…</w:t>
             </w:r>
           </w:p>
         </w:tc>
@@ -10206,7 +10165,16 @@
               <w:rPr>
                 <w:rFonts w:hint="eastAsia"/>
               </w:rPr>
-              <w:t>Slave ID number: 1 .. 255</w:t>
+              <w:t>Slave ID number: 1</w:t>
+            </w:r>
+            <w:r>
+              <w:t xml:space="preserve"> - </w:t>
+            </w:r>
+            <w:r>
+              <w:rPr>
+                <w:rFonts w:hint="eastAsia"/>
+              </w:rPr>
+              <w:t>255</w:t>
             </w:r>
           </w:p>
         </w:tc>
@@ -10246,7 +10214,16 @@
               <w:rPr>
                 <w:rFonts w:hint="eastAsia"/>
               </w:rPr>
-              <w:t>Maximum frame size: 13..256</w:t>
+              <w:t>Maximum frame size: 13</w:t>
+            </w:r>
+            <w:r>
+              <w:t xml:space="preserve"> - </w:t>
+            </w:r>
+            <w:r>
+              <w:rPr>
+                <w:rFonts w:hint="eastAsia"/>
+              </w:rPr>
+              <w:t>256</w:t>
             </w:r>
           </w:p>
         </w:tc>
@@ -10764,7 +10741,10 @@
               <w:rPr>
                 <w:rFonts w:hint="eastAsia"/>
               </w:rPr>
-              <w:t>Serial port name: COM1,..</w:t>
+              <w:t>Serial port name: COM1,</w:t>
+            </w:r>
+            <w:r>
+              <w:t>…</w:t>
             </w:r>
           </w:p>
         </w:tc>
@@ -11100,7 +11080,16 @@
               <w:rPr>
                 <w:rFonts w:hint="eastAsia"/>
               </w:rPr>
-              <w:t>Slave ID number: 1 .. 255</w:t>
+              <w:t>Slave ID number: 1</w:t>
+            </w:r>
+            <w:r>
+              <w:t xml:space="preserve"> - </w:t>
+            </w:r>
+            <w:r>
+              <w:rPr>
+                <w:rFonts w:hint="eastAsia"/>
+              </w:rPr>
+              <w:t>255</w:t>
             </w:r>
           </w:p>
         </w:tc>
@@ -11140,7 +11129,16 @@
               <w:rPr>
                 <w:rFonts w:hint="eastAsia"/>
               </w:rPr>
-              <w:t>Maximum frame size: 13..256</w:t>
+              <w:t>Maximum frame size: 13</w:t>
+            </w:r>
+            <w:r>
+              <w:t xml:space="preserve"> - </w:t>
+            </w:r>
+            <w:r>
+              <w:rPr>
+                <w:rFonts w:hint="eastAsia"/>
+              </w:rPr>
+              <w:t>256</w:t>
             </w:r>
           </w:p>
         </w:tc>
@@ -11940,7 +11938,10 @@
               <w:rPr>
                 <w:rFonts w:hint="eastAsia"/>
               </w:rPr>
-              <w:t>Serial port name: COM1,..</w:t>
+              <w:t>Serial port name: COM1,</w:t>
+            </w:r>
+            <w:r>
+              <w:t>…</w:t>
             </w:r>
           </w:p>
         </w:tc>
@@ -12276,7 +12277,16 @@
               <w:rPr>
                 <w:rFonts w:hint="eastAsia"/>
               </w:rPr>
-              <w:t>Slave ID number: 1 .. 255</w:t>
+              <w:t xml:space="preserve">Slave ID number: 1 </w:t>
+            </w:r>
+            <w:r>
+              <w:t>-</w:t>
+            </w:r>
+            <w:r>
+              <w:rPr>
+                <w:rFonts w:hint="eastAsia"/>
+              </w:rPr>
+              <w:t xml:space="preserve"> 255</w:t>
             </w:r>
           </w:p>
         </w:tc>
@@ -12316,7 +12326,16 @@
               <w:rPr>
                 <w:rFonts w:hint="eastAsia"/>
               </w:rPr>
-              <w:t>Maximum frame size: 13..256</w:t>
+              <w:t>Maximum frame size: 13</w:t>
+            </w:r>
+            <w:r>
+              <w:t xml:space="preserve"> - </w:t>
+            </w:r>
+            <w:r>
+              <w:rPr>
+                <w:rFonts w:hint="eastAsia"/>
+              </w:rPr>
+              <w:t>256</w:t>
             </w:r>
           </w:p>
         </w:tc>
@@ -20779,7 +20798,7 @@
           <w:noProof/>
         </w:rPr>
         <w:pict w14:anchorId="56E75F81">
-          <v:shape id="Afbeelding 1" o:spid="_x0000_i1027" type="#_x0000_t75" style="width:345.75pt;height:52.5pt;visibility:visible;mso-wrap-style:square">
+          <v:shape id="Afbeelding 1" o:spid="_x0000_i1027" type="#_x0000_t75" style="width:345.8pt;height:52.35pt;visibility:visible;mso-wrap-style:square">
             <v:imagedata r:id="rId14" o:title=""/>
           </v:shape>
         </w:pict>

</xml_diff>

<commit_message>
Import: now reports error if r/w field is empty.
git-svn-id: http://visualsvn.edna.local/EDNA/ModbusControl/V2@4031 03c8d257-35a7-c645-9f01-50f27e98b9e6
</commit_message>
<xml_diff>
--- a/Manuals/ModbusControl - User manual.docx
+++ b/Manuals/ModbusControl - User manual.docx
@@ -61,7 +61,7 @@
       <w:r>
         <w:fldChar w:fldCharType="separate"/>
       </w:r>
-      <w:hyperlink w:anchor="_Toc151130190" w:history="1">
+      <w:hyperlink w:anchor="_Toc152927199" w:history="1">
         <w:r>
           <w:rPr>
             <w:rStyle w:val="Hyperlink"/>
@@ -103,7 +103,7 @@
           <w:rPr>
             <w:noProof/>
           </w:rPr>
-          <w:instrText xml:space="preserve"> PAGEREF _Toc151130190 \h </w:instrText>
+          <w:instrText xml:space="preserve"> PAGEREF _Toc152927199 \h </w:instrText>
         </w:r>
         <w:r>
           <w:rPr>
@@ -148,7 +148,7 @@
           <w:lang w:val="nl-BE" w:eastAsia="nl-BE" w:bidi="ar-SA"/>
         </w:rPr>
       </w:pPr>
-      <w:hyperlink w:anchor="_Toc151130191" w:history="1">
+      <w:hyperlink w:anchor="_Toc152927200" w:history="1">
         <w:r>
           <w:rPr>
             <w:rStyle w:val="Hyperlink"/>
@@ -190,7 +190,7 @@
           <w:rPr>
             <w:noProof/>
           </w:rPr>
-          <w:instrText xml:space="preserve"> PAGEREF _Toc151130191 \h </w:instrText>
+          <w:instrText xml:space="preserve"> PAGEREF _Toc152927200 \h </w:instrText>
         </w:r>
         <w:r>
           <w:rPr>
@@ -235,7 +235,7 @@
           <w:lang w:val="nl-BE" w:eastAsia="nl-BE" w:bidi="ar-SA"/>
         </w:rPr>
       </w:pPr>
-      <w:hyperlink w:anchor="_Toc151130192" w:history="1">
+      <w:hyperlink w:anchor="_Toc152927201" w:history="1">
         <w:r>
           <w:rPr>
             <w:rStyle w:val="Hyperlink"/>
@@ -277,7 +277,7 @@
           <w:rPr>
             <w:noProof/>
           </w:rPr>
-          <w:instrText xml:space="preserve"> PAGEREF _Toc151130192 \h </w:instrText>
+          <w:instrText xml:space="preserve"> PAGEREF _Toc152927201 \h </w:instrText>
         </w:r>
         <w:r>
           <w:rPr>
@@ -322,7 +322,7 @@
           <w:lang w:val="nl-BE" w:eastAsia="nl-BE" w:bidi="ar-SA"/>
         </w:rPr>
       </w:pPr>
-      <w:hyperlink w:anchor="_Toc151130193" w:history="1">
+      <w:hyperlink w:anchor="_Toc152927202" w:history="1">
         <w:r>
           <w:rPr>
             <w:rStyle w:val="Hyperlink"/>
@@ -364,7 +364,7 @@
           <w:rPr>
             <w:noProof/>
           </w:rPr>
-          <w:instrText xml:space="preserve"> PAGEREF _Toc151130193 \h </w:instrText>
+          <w:instrText xml:space="preserve"> PAGEREF _Toc152927202 \h </w:instrText>
         </w:r>
         <w:r>
           <w:rPr>
@@ -409,7 +409,7 @@
           <w:lang w:val="nl-BE" w:eastAsia="nl-BE" w:bidi="ar-SA"/>
         </w:rPr>
       </w:pPr>
-      <w:hyperlink w:anchor="_Toc151130194" w:history="1">
+      <w:hyperlink w:anchor="_Toc152927203" w:history="1">
         <w:r>
           <w:rPr>
             <w:rStyle w:val="Hyperlink"/>
@@ -451,7 +451,7 @@
           <w:rPr>
             <w:noProof/>
           </w:rPr>
-          <w:instrText xml:space="preserve"> PAGEREF _Toc151130194 \h </w:instrText>
+          <w:instrText xml:space="preserve"> PAGEREF _Toc152927203 \h </w:instrText>
         </w:r>
         <w:r>
           <w:rPr>
@@ -496,7 +496,7 @@
           <w:lang w:val="nl-BE" w:eastAsia="nl-BE" w:bidi="ar-SA"/>
         </w:rPr>
       </w:pPr>
-      <w:hyperlink w:anchor="_Toc151130195" w:history="1">
+      <w:hyperlink w:anchor="_Toc152927204" w:history="1">
         <w:r>
           <w:rPr>
             <w:rStyle w:val="Hyperlink"/>
@@ -538,7 +538,7 @@
           <w:rPr>
             <w:noProof/>
           </w:rPr>
-          <w:instrText xml:space="preserve"> PAGEREF _Toc151130195 \h </w:instrText>
+          <w:instrText xml:space="preserve"> PAGEREF _Toc152927204 \h </w:instrText>
         </w:r>
         <w:r>
           <w:rPr>
@@ -583,7 +583,7 @@
           <w:lang w:val="nl-BE" w:eastAsia="nl-BE" w:bidi="ar-SA"/>
         </w:rPr>
       </w:pPr>
-      <w:hyperlink w:anchor="_Toc151130196" w:history="1">
+      <w:hyperlink w:anchor="_Toc152927205" w:history="1">
         <w:r>
           <w:rPr>
             <w:rStyle w:val="Hyperlink"/>
@@ -625,7 +625,7 @@
           <w:rPr>
             <w:noProof/>
           </w:rPr>
-          <w:instrText xml:space="preserve"> PAGEREF _Toc151130196 \h </w:instrText>
+          <w:instrText xml:space="preserve"> PAGEREF _Toc152927205 \h </w:instrText>
         </w:r>
         <w:r>
           <w:rPr>
@@ -670,7 +670,7 @@
           <w:lang w:val="nl-BE" w:eastAsia="nl-BE" w:bidi="ar-SA"/>
         </w:rPr>
       </w:pPr>
-      <w:hyperlink w:anchor="_Toc151130197" w:history="1">
+      <w:hyperlink w:anchor="_Toc152927206" w:history="1">
         <w:r>
           <w:rPr>
             <w:rStyle w:val="Hyperlink"/>
@@ -712,7 +712,7 @@
           <w:rPr>
             <w:noProof/>
           </w:rPr>
-          <w:instrText xml:space="preserve"> PAGEREF _Toc151130197 \h </w:instrText>
+          <w:instrText xml:space="preserve"> PAGEREF _Toc152927206 \h </w:instrText>
         </w:r>
         <w:r>
           <w:rPr>
@@ -757,7 +757,7 @@
           <w:lang w:val="nl-BE" w:eastAsia="nl-BE" w:bidi="ar-SA"/>
         </w:rPr>
       </w:pPr>
-      <w:hyperlink w:anchor="_Toc151130198" w:history="1">
+      <w:hyperlink w:anchor="_Toc152927207" w:history="1">
         <w:r>
           <w:rPr>
             <w:rStyle w:val="Hyperlink"/>
@@ -799,7 +799,7 @@
           <w:rPr>
             <w:noProof/>
           </w:rPr>
-          <w:instrText xml:space="preserve"> PAGEREF _Toc151130198 \h </w:instrText>
+          <w:instrText xml:space="preserve"> PAGEREF _Toc152927207 \h </w:instrText>
         </w:r>
         <w:r>
           <w:rPr>
@@ -844,7 +844,7 @@
           <w:lang w:val="nl-BE" w:eastAsia="nl-BE" w:bidi="ar-SA"/>
         </w:rPr>
       </w:pPr>
-      <w:hyperlink w:anchor="_Toc151130199" w:history="1">
+      <w:hyperlink w:anchor="_Toc152927208" w:history="1">
         <w:r>
           <w:rPr>
             <w:rStyle w:val="Hyperlink"/>
@@ -886,7 +886,7 @@
           <w:rPr>
             <w:noProof/>
           </w:rPr>
-          <w:instrText xml:space="preserve"> PAGEREF _Toc151130199 \h </w:instrText>
+          <w:instrText xml:space="preserve"> PAGEREF _Toc152927208 \h </w:instrText>
         </w:r>
         <w:r>
           <w:rPr>
@@ -931,7 +931,7 @@
           <w:lang w:val="nl-BE" w:eastAsia="nl-BE" w:bidi="ar-SA"/>
         </w:rPr>
       </w:pPr>
-      <w:hyperlink w:anchor="_Toc151130200" w:history="1">
+      <w:hyperlink w:anchor="_Toc152927209" w:history="1">
         <w:r>
           <w:rPr>
             <w:rStyle w:val="Hyperlink"/>
@@ -973,7 +973,7 @@
           <w:rPr>
             <w:noProof/>
           </w:rPr>
-          <w:instrText xml:space="preserve"> PAGEREF _Toc151130200 \h </w:instrText>
+          <w:instrText xml:space="preserve"> PAGEREF _Toc152927209 \h </w:instrText>
         </w:r>
         <w:r>
           <w:rPr>
@@ -1018,7 +1018,7 @@
           <w:lang w:val="nl-BE" w:eastAsia="nl-BE" w:bidi="ar-SA"/>
         </w:rPr>
       </w:pPr>
-      <w:hyperlink w:anchor="_Toc151130201" w:history="1">
+      <w:hyperlink w:anchor="_Toc152927210" w:history="1">
         <w:r>
           <w:rPr>
             <w:rStyle w:val="Hyperlink"/>
@@ -1060,7 +1060,7 @@
           <w:rPr>
             <w:noProof/>
           </w:rPr>
-          <w:instrText xml:space="preserve"> PAGEREF _Toc151130201 \h </w:instrText>
+          <w:instrText xml:space="preserve"> PAGEREF _Toc152927210 \h </w:instrText>
         </w:r>
         <w:r>
           <w:rPr>
@@ -1105,7 +1105,7 @@
           <w:lang w:val="nl-BE" w:eastAsia="nl-BE" w:bidi="ar-SA"/>
         </w:rPr>
       </w:pPr>
-      <w:hyperlink w:anchor="_Toc151130202" w:history="1">
+      <w:hyperlink w:anchor="_Toc152927211" w:history="1">
         <w:r>
           <w:rPr>
             <w:rStyle w:val="Hyperlink"/>
@@ -1147,7 +1147,7 @@
           <w:rPr>
             <w:noProof/>
           </w:rPr>
-          <w:instrText xml:space="preserve"> PAGEREF _Toc151130202 \h </w:instrText>
+          <w:instrText xml:space="preserve"> PAGEREF _Toc152927211 \h </w:instrText>
         </w:r>
         <w:r>
           <w:rPr>
@@ -1192,7 +1192,7 @@
           <w:lang w:val="nl-BE" w:eastAsia="nl-BE" w:bidi="ar-SA"/>
         </w:rPr>
       </w:pPr>
-      <w:hyperlink w:anchor="_Toc151130203" w:history="1">
+      <w:hyperlink w:anchor="_Toc152927212" w:history="1">
         <w:r>
           <w:rPr>
             <w:rStyle w:val="Hyperlink"/>
@@ -1234,7 +1234,7 @@
           <w:rPr>
             <w:noProof/>
           </w:rPr>
-          <w:instrText xml:space="preserve"> PAGEREF _Toc151130203 \h </w:instrText>
+          <w:instrText xml:space="preserve"> PAGEREF _Toc152927212 \h </w:instrText>
         </w:r>
         <w:r>
           <w:rPr>
@@ -1279,7 +1279,7 @@
           <w:lang w:val="nl-BE" w:eastAsia="nl-BE" w:bidi="ar-SA"/>
         </w:rPr>
       </w:pPr>
-      <w:hyperlink w:anchor="_Toc151130204" w:history="1">
+      <w:hyperlink w:anchor="_Toc152927213" w:history="1">
         <w:r>
           <w:rPr>
             <w:rStyle w:val="Hyperlink"/>
@@ -1321,7 +1321,7 @@
           <w:rPr>
             <w:noProof/>
           </w:rPr>
-          <w:instrText xml:space="preserve"> PAGEREF _Toc151130204 \h </w:instrText>
+          <w:instrText xml:space="preserve"> PAGEREF _Toc152927213 \h </w:instrText>
         </w:r>
         <w:r>
           <w:rPr>
@@ -1366,7 +1366,7 @@
           <w:lang w:val="nl-BE" w:eastAsia="nl-BE" w:bidi="ar-SA"/>
         </w:rPr>
       </w:pPr>
-      <w:hyperlink w:anchor="_Toc151130205" w:history="1">
+      <w:hyperlink w:anchor="_Toc152927214" w:history="1">
         <w:r>
           <w:rPr>
             <w:rStyle w:val="Hyperlink"/>
@@ -1408,7 +1408,7 @@
           <w:rPr>
             <w:noProof/>
           </w:rPr>
-          <w:instrText xml:space="preserve"> PAGEREF _Toc151130205 \h </w:instrText>
+          <w:instrText xml:space="preserve"> PAGEREF _Toc152927214 \h </w:instrText>
         </w:r>
         <w:r>
           <w:rPr>
@@ -1453,7 +1453,7 @@
           <w:lang w:val="nl-BE" w:eastAsia="nl-BE" w:bidi="ar-SA"/>
         </w:rPr>
       </w:pPr>
-      <w:hyperlink w:anchor="_Toc151130206" w:history="1">
+      <w:hyperlink w:anchor="_Toc152927215" w:history="1">
         <w:r>
           <w:rPr>
             <w:rStyle w:val="Hyperlink"/>
@@ -1495,7 +1495,7 @@
           <w:rPr>
             <w:noProof/>
           </w:rPr>
-          <w:instrText xml:space="preserve"> PAGEREF _Toc151130206 \h </w:instrText>
+          <w:instrText xml:space="preserve"> PAGEREF _Toc152927215 \h </w:instrText>
         </w:r>
         <w:r>
           <w:rPr>
@@ -1540,7 +1540,7 @@
           <w:lang w:val="nl-BE" w:eastAsia="nl-BE" w:bidi="ar-SA"/>
         </w:rPr>
       </w:pPr>
-      <w:hyperlink w:anchor="_Toc151130207" w:history="1">
+      <w:hyperlink w:anchor="_Toc152927216" w:history="1">
         <w:r>
           <w:rPr>
             <w:rStyle w:val="Hyperlink"/>
@@ -1582,7 +1582,7 @@
           <w:rPr>
             <w:noProof/>
           </w:rPr>
-          <w:instrText xml:space="preserve"> PAGEREF _Toc151130207 \h </w:instrText>
+          <w:instrText xml:space="preserve"> PAGEREF _Toc152927216 \h </w:instrText>
         </w:r>
         <w:r>
           <w:rPr>
@@ -1627,7 +1627,7 @@
           <w:lang w:val="nl-BE" w:eastAsia="nl-BE" w:bidi="ar-SA"/>
         </w:rPr>
       </w:pPr>
-      <w:hyperlink w:anchor="_Toc151130208" w:history="1">
+      <w:hyperlink w:anchor="_Toc152927217" w:history="1">
         <w:r>
           <w:rPr>
             <w:rStyle w:val="Hyperlink"/>
@@ -1669,7 +1669,7 @@
           <w:rPr>
             <w:noProof/>
           </w:rPr>
-          <w:instrText xml:space="preserve"> PAGEREF _Toc151130208 \h </w:instrText>
+          <w:instrText xml:space="preserve"> PAGEREF _Toc152927217 \h </w:instrText>
         </w:r>
         <w:r>
           <w:rPr>
@@ -1714,7 +1714,7 @@
           <w:lang w:val="nl-BE" w:eastAsia="nl-BE" w:bidi="ar-SA"/>
         </w:rPr>
       </w:pPr>
-      <w:hyperlink w:anchor="_Toc151130209" w:history="1">
+      <w:hyperlink w:anchor="_Toc152927218" w:history="1">
         <w:r>
           <w:rPr>
             <w:rStyle w:val="Hyperlink"/>
@@ -1756,7 +1756,7 @@
           <w:rPr>
             <w:noProof/>
           </w:rPr>
-          <w:instrText xml:space="preserve"> PAGEREF _Toc151130209 \h </w:instrText>
+          <w:instrText xml:space="preserve"> PAGEREF _Toc152927218 \h </w:instrText>
         </w:r>
         <w:r>
           <w:rPr>
@@ -1801,7 +1801,7 @@
           <w:lang w:val="nl-BE" w:eastAsia="nl-BE" w:bidi="ar-SA"/>
         </w:rPr>
       </w:pPr>
-      <w:hyperlink w:anchor="_Toc151130210" w:history="1">
+      <w:hyperlink w:anchor="_Toc152927219" w:history="1">
         <w:r>
           <w:rPr>
             <w:rStyle w:val="Hyperlink"/>
@@ -1843,7 +1843,7 @@
           <w:rPr>
             <w:noProof/>
           </w:rPr>
-          <w:instrText xml:space="preserve"> PAGEREF _Toc151130210 \h </w:instrText>
+          <w:instrText xml:space="preserve"> PAGEREF _Toc152927219 \h </w:instrText>
         </w:r>
         <w:r>
           <w:rPr>
@@ -1888,7 +1888,7 @@
           <w:lang w:val="nl-BE" w:eastAsia="nl-BE" w:bidi="ar-SA"/>
         </w:rPr>
       </w:pPr>
-      <w:hyperlink w:anchor="_Toc151130211" w:history="1">
+      <w:hyperlink w:anchor="_Toc152927220" w:history="1">
         <w:r>
           <w:rPr>
             <w:rStyle w:val="Hyperlink"/>
@@ -1930,7 +1930,7 @@
           <w:rPr>
             <w:noProof/>
           </w:rPr>
-          <w:instrText xml:space="preserve"> PAGEREF _Toc151130211 \h </w:instrText>
+          <w:instrText xml:space="preserve"> PAGEREF _Toc152927220 \h </w:instrText>
         </w:r>
         <w:r>
           <w:rPr>
@@ -1975,7 +1975,7 @@
           <w:lang w:val="nl-BE" w:eastAsia="nl-BE" w:bidi="ar-SA"/>
         </w:rPr>
       </w:pPr>
-      <w:hyperlink w:anchor="_Toc151130212" w:history="1">
+      <w:hyperlink w:anchor="_Toc152927221" w:history="1">
         <w:r>
           <w:rPr>
             <w:rStyle w:val="Hyperlink"/>
@@ -2017,7 +2017,7 @@
           <w:rPr>
             <w:noProof/>
           </w:rPr>
-          <w:instrText xml:space="preserve"> PAGEREF _Toc151130212 \h </w:instrText>
+          <w:instrText xml:space="preserve"> PAGEREF _Toc152927221 \h </w:instrText>
         </w:r>
         <w:r>
           <w:rPr>
@@ -2062,7 +2062,7 @@
           <w:lang w:val="nl-BE" w:eastAsia="nl-BE" w:bidi="ar-SA"/>
         </w:rPr>
       </w:pPr>
-      <w:hyperlink w:anchor="_Toc151130213" w:history="1">
+      <w:hyperlink w:anchor="_Toc152927222" w:history="1">
         <w:r>
           <w:rPr>
             <w:rStyle w:val="Hyperlink"/>
@@ -2104,7 +2104,7 @@
           <w:rPr>
             <w:noProof/>
           </w:rPr>
-          <w:instrText xml:space="preserve"> PAGEREF _Toc151130213 \h </w:instrText>
+          <w:instrText xml:space="preserve"> PAGEREF _Toc152927222 \h </w:instrText>
         </w:r>
         <w:r>
           <w:rPr>
@@ -2149,7 +2149,7 @@
           <w:lang w:val="nl-BE" w:eastAsia="nl-BE" w:bidi="ar-SA"/>
         </w:rPr>
       </w:pPr>
-      <w:hyperlink w:anchor="_Toc151130214" w:history="1">
+      <w:hyperlink w:anchor="_Toc152927223" w:history="1">
         <w:r>
           <w:rPr>
             <w:rStyle w:val="Hyperlink"/>
@@ -2191,7 +2191,7 @@
           <w:rPr>
             <w:noProof/>
           </w:rPr>
-          <w:instrText xml:space="preserve"> PAGEREF _Toc151130214 \h </w:instrText>
+          <w:instrText xml:space="preserve"> PAGEREF _Toc152927223 \h </w:instrText>
         </w:r>
         <w:r>
           <w:rPr>
@@ -2236,7 +2236,7 @@
           <w:lang w:val="nl-BE" w:eastAsia="nl-BE" w:bidi="ar-SA"/>
         </w:rPr>
       </w:pPr>
-      <w:hyperlink w:anchor="_Toc151130215" w:history="1">
+      <w:hyperlink w:anchor="_Toc152927224" w:history="1">
         <w:r>
           <w:rPr>
             <w:rStyle w:val="Hyperlink"/>
@@ -2260,7 +2260,7 @@
             <w:rStyle w:val="Hyperlink"/>
             <w:noProof/>
           </w:rPr>
-          <w:t>The Import / Export format</w:t>
+          <w:t>The Import/Export format</w:t>
         </w:r>
         <w:r>
           <w:rPr>
@@ -2278,7 +2278,7 @@
           <w:rPr>
             <w:noProof/>
           </w:rPr>
-          <w:instrText xml:space="preserve"> PAGEREF _Toc151130215 \h </w:instrText>
+          <w:instrText xml:space="preserve"> PAGEREF _Toc152927224 \h </w:instrText>
         </w:r>
         <w:r>
           <w:rPr>
@@ -2323,7 +2323,7 @@
           <w:lang w:val="nl-BE" w:eastAsia="nl-BE" w:bidi="ar-SA"/>
         </w:rPr>
       </w:pPr>
-      <w:hyperlink w:anchor="_Toc151130216" w:history="1">
+      <w:hyperlink w:anchor="_Toc152927225" w:history="1">
         <w:r>
           <w:rPr>
             <w:rStyle w:val="Hyperlink"/>
@@ -2365,7 +2365,7 @@
           <w:rPr>
             <w:noProof/>
           </w:rPr>
-          <w:instrText xml:space="preserve"> PAGEREF _Toc151130216 \h </w:instrText>
+          <w:instrText xml:space="preserve"> PAGEREF _Toc152927225 \h </w:instrText>
         </w:r>
         <w:r>
           <w:rPr>
@@ -2410,7 +2410,7 @@
           <w:lang w:val="nl-BE" w:eastAsia="nl-BE" w:bidi="ar-SA"/>
         </w:rPr>
       </w:pPr>
-      <w:hyperlink w:anchor="_Toc151130217" w:history="1">
+      <w:hyperlink w:anchor="_Toc152927226" w:history="1">
         <w:r>
           <w:rPr>
             <w:rStyle w:val="Hyperlink"/>
@@ -2452,7 +2452,7 @@
           <w:rPr>
             <w:noProof/>
           </w:rPr>
-          <w:instrText xml:space="preserve"> PAGEREF _Toc151130217 \h </w:instrText>
+          <w:instrText xml:space="preserve"> PAGEREF _Toc152927226 \h </w:instrText>
         </w:r>
         <w:r>
           <w:rPr>
@@ -2497,7 +2497,7 @@
           <w:lang w:val="nl-BE" w:eastAsia="nl-BE" w:bidi="ar-SA"/>
         </w:rPr>
       </w:pPr>
-      <w:hyperlink w:anchor="_Toc151130218" w:history="1">
+      <w:hyperlink w:anchor="_Toc152927227" w:history="1">
         <w:r>
           <w:rPr>
             <w:rStyle w:val="Hyperlink"/>
@@ -2539,7 +2539,7 @@
           <w:rPr>
             <w:noProof/>
           </w:rPr>
-          <w:instrText xml:space="preserve"> PAGEREF _Toc151130218 \h </w:instrText>
+          <w:instrText xml:space="preserve"> PAGEREF _Toc152927227 \h </w:instrText>
         </w:r>
         <w:r>
           <w:rPr>
@@ -2584,7 +2584,7 @@
           <w:lang w:val="nl-BE" w:eastAsia="nl-BE" w:bidi="ar-SA"/>
         </w:rPr>
       </w:pPr>
-      <w:hyperlink w:anchor="_Toc151130219" w:history="1">
+      <w:hyperlink w:anchor="_Toc152927228" w:history="1">
         <w:r>
           <w:rPr>
             <w:rStyle w:val="Hyperlink"/>
@@ -2626,7 +2626,7 @@
           <w:rPr>
             <w:noProof/>
           </w:rPr>
-          <w:instrText xml:space="preserve"> PAGEREF _Toc151130219 \h </w:instrText>
+          <w:instrText xml:space="preserve"> PAGEREF _Toc152927228 \h </w:instrText>
         </w:r>
         <w:r>
           <w:rPr>
@@ -2671,7 +2671,7 @@
           <w:lang w:val="nl-BE" w:eastAsia="nl-BE" w:bidi="ar-SA"/>
         </w:rPr>
       </w:pPr>
-      <w:hyperlink w:anchor="_Toc151130220" w:history="1">
+      <w:hyperlink w:anchor="_Toc152927229" w:history="1">
         <w:r>
           <w:rPr>
             <w:rStyle w:val="Hyperlink"/>
@@ -2713,7 +2713,7 @@
           <w:rPr>
             <w:noProof/>
           </w:rPr>
-          <w:instrText xml:space="preserve"> PAGEREF _Toc151130220 \h </w:instrText>
+          <w:instrText xml:space="preserve"> PAGEREF _Toc152927229 \h </w:instrText>
         </w:r>
         <w:r>
           <w:rPr>
@@ -2758,7 +2758,7 @@
           <w:lang w:val="nl-BE" w:eastAsia="nl-BE" w:bidi="ar-SA"/>
         </w:rPr>
       </w:pPr>
-      <w:hyperlink w:anchor="_Toc151130221" w:history="1">
+      <w:hyperlink w:anchor="_Toc152927230" w:history="1">
         <w:r>
           <w:rPr>
             <w:rStyle w:val="Hyperlink"/>
@@ -2800,7 +2800,7 @@
           <w:rPr>
             <w:noProof/>
           </w:rPr>
-          <w:instrText xml:space="preserve"> PAGEREF _Toc151130221 \h </w:instrText>
+          <w:instrText xml:space="preserve"> PAGEREF _Toc152927230 \h </w:instrText>
         </w:r>
         <w:r>
           <w:rPr>
@@ -2845,7 +2845,7 @@
           <w:lang w:val="nl-BE" w:eastAsia="nl-BE" w:bidi="ar-SA"/>
         </w:rPr>
       </w:pPr>
-      <w:hyperlink w:anchor="_Toc151130222" w:history="1">
+      <w:hyperlink w:anchor="_Toc152927231" w:history="1">
         <w:r>
           <w:rPr>
             <w:rStyle w:val="Hyperlink"/>
@@ -2887,7 +2887,7 @@
           <w:rPr>
             <w:noProof/>
           </w:rPr>
-          <w:instrText xml:space="preserve"> PAGEREF _Toc151130222 \h </w:instrText>
+          <w:instrText xml:space="preserve"> PAGEREF _Toc152927231 \h </w:instrText>
         </w:r>
         <w:r>
           <w:rPr>
@@ -2932,7 +2932,7 @@
           <w:lang w:val="nl-BE" w:eastAsia="nl-BE" w:bidi="ar-SA"/>
         </w:rPr>
       </w:pPr>
-      <w:hyperlink w:anchor="_Toc151130223" w:history="1">
+      <w:hyperlink w:anchor="_Toc152927232" w:history="1">
         <w:r>
           <w:rPr>
             <w:rStyle w:val="Hyperlink"/>
@@ -2976,7 +2976,7 @@
           <w:rPr>
             <w:noProof/>
           </w:rPr>
-          <w:instrText xml:space="preserve"> PAGEREF _Toc151130223 \h </w:instrText>
+          <w:instrText xml:space="preserve"> PAGEREF _Toc152927232 \h </w:instrText>
         </w:r>
         <w:r>
           <w:rPr>
@@ -3021,7 +3021,7 @@
           <w:lang w:val="nl-BE" w:eastAsia="nl-BE" w:bidi="ar-SA"/>
         </w:rPr>
       </w:pPr>
-      <w:hyperlink w:anchor="_Toc151130224" w:history="1">
+      <w:hyperlink w:anchor="_Toc152927233" w:history="1">
         <w:r>
           <w:rPr>
             <w:rStyle w:val="Hyperlink"/>
@@ -3063,7 +3063,7 @@
           <w:rPr>
             <w:noProof/>
           </w:rPr>
-          <w:instrText xml:space="preserve"> PAGEREF _Toc151130224 \h </w:instrText>
+          <w:instrText xml:space="preserve"> PAGEREF _Toc152927233 \h </w:instrText>
         </w:r>
         <w:r>
           <w:rPr>
@@ -3108,7 +3108,7 @@
           <w:lang w:val="nl-BE" w:eastAsia="nl-BE" w:bidi="ar-SA"/>
         </w:rPr>
       </w:pPr>
-      <w:hyperlink w:anchor="_Toc151130225" w:history="1">
+      <w:hyperlink w:anchor="_Toc152927234" w:history="1">
         <w:r>
           <w:rPr>
             <w:rStyle w:val="Hyperlink"/>
@@ -3150,7 +3150,7 @@
           <w:rPr>
             <w:noProof/>
           </w:rPr>
-          <w:instrText xml:space="preserve"> PAGEREF _Toc151130225 \h </w:instrText>
+          <w:instrText xml:space="preserve"> PAGEREF _Toc152927234 \h </w:instrText>
         </w:r>
         <w:r>
           <w:rPr>
@@ -3195,7 +3195,7 @@
           <w:lang w:val="nl-BE" w:eastAsia="nl-BE" w:bidi="ar-SA"/>
         </w:rPr>
       </w:pPr>
-      <w:hyperlink w:anchor="_Toc151130226" w:history="1">
+      <w:hyperlink w:anchor="_Toc152927235" w:history="1">
         <w:r>
           <w:rPr>
             <w:rStyle w:val="Hyperlink"/>
@@ -3237,7 +3237,7 @@
           <w:rPr>
             <w:noProof/>
           </w:rPr>
-          <w:instrText xml:space="preserve"> PAGEREF _Toc151130226 \h </w:instrText>
+          <w:instrText xml:space="preserve"> PAGEREF _Toc152927235 \h </w:instrText>
         </w:r>
         <w:r>
           <w:rPr>
@@ -3282,7 +3282,7 @@
           <w:lang w:val="nl-BE" w:eastAsia="nl-BE" w:bidi="ar-SA"/>
         </w:rPr>
       </w:pPr>
-      <w:hyperlink w:anchor="_Toc151130227" w:history="1">
+      <w:hyperlink w:anchor="_Toc152927236" w:history="1">
         <w:r>
           <w:rPr>
             <w:rStyle w:val="Hyperlink"/>
@@ -3324,7 +3324,7 @@
           <w:rPr>
             <w:noProof/>
           </w:rPr>
-          <w:instrText xml:space="preserve"> PAGEREF _Toc151130227 \h </w:instrText>
+          <w:instrText xml:space="preserve"> PAGEREF _Toc152927236 \h </w:instrText>
         </w:r>
         <w:r>
           <w:rPr>
@@ -3369,7 +3369,7 @@
           <w:lang w:val="nl-BE" w:eastAsia="nl-BE" w:bidi="ar-SA"/>
         </w:rPr>
       </w:pPr>
-      <w:hyperlink w:anchor="_Toc151130228" w:history="1">
+      <w:hyperlink w:anchor="_Toc152927237" w:history="1">
         <w:r>
           <w:rPr>
             <w:rStyle w:val="Hyperlink"/>
@@ -3411,7 +3411,7 @@
           <w:rPr>
             <w:noProof/>
           </w:rPr>
-          <w:instrText xml:space="preserve"> PAGEREF _Toc151130228 \h </w:instrText>
+          <w:instrText xml:space="preserve"> PAGEREF _Toc152927237 \h </w:instrText>
         </w:r>
         <w:r>
           <w:rPr>
@@ -3456,7 +3456,7 @@
           <w:lang w:val="nl-BE" w:eastAsia="nl-BE" w:bidi="ar-SA"/>
         </w:rPr>
       </w:pPr>
-      <w:hyperlink w:anchor="_Toc151130229" w:history="1">
+      <w:hyperlink w:anchor="_Toc152927238" w:history="1">
         <w:r>
           <w:rPr>
             <w:rStyle w:val="Hyperlink"/>
@@ -3498,7 +3498,7 @@
           <w:rPr>
             <w:noProof/>
           </w:rPr>
-          <w:instrText xml:space="preserve"> PAGEREF _Toc151130229 \h </w:instrText>
+          <w:instrText xml:space="preserve"> PAGEREF _Toc152927238 \h </w:instrText>
         </w:r>
         <w:r>
           <w:rPr>
@@ -3543,7 +3543,7 @@
           <w:lang w:val="nl-BE" w:eastAsia="nl-BE" w:bidi="ar-SA"/>
         </w:rPr>
       </w:pPr>
-      <w:hyperlink w:anchor="_Toc151130230" w:history="1">
+      <w:hyperlink w:anchor="_Toc152927239" w:history="1">
         <w:r>
           <w:rPr>
             <w:rStyle w:val="Hyperlink"/>
@@ -3585,7 +3585,7 @@
           <w:rPr>
             <w:noProof/>
           </w:rPr>
-          <w:instrText xml:space="preserve"> PAGEREF _Toc151130230 \h </w:instrText>
+          <w:instrText xml:space="preserve"> PAGEREF _Toc152927239 \h </w:instrText>
         </w:r>
         <w:r>
           <w:rPr>
@@ -3630,7 +3630,7 @@
           <w:lang w:val="nl-BE" w:eastAsia="nl-BE" w:bidi="ar-SA"/>
         </w:rPr>
       </w:pPr>
-      <w:hyperlink w:anchor="_Toc151130231" w:history="1">
+      <w:hyperlink w:anchor="_Toc152927240" w:history="1">
         <w:r>
           <w:rPr>
             <w:rStyle w:val="Hyperlink"/>
@@ -3672,7 +3672,7 @@
           <w:rPr>
             <w:noProof/>
           </w:rPr>
-          <w:instrText xml:space="preserve"> PAGEREF _Toc151130231 \h </w:instrText>
+          <w:instrText xml:space="preserve"> PAGEREF _Toc152927240 \h </w:instrText>
         </w:r>
         <w:r>
           <w:rPr>
@@ -3717,7 +3717,7 @@
           <w:lang w:val="nl-BE" w:eastAsia="nl-BE" w:bidi="ar-SA"/>
         </w:rPr>
       </w:pPr>
-      <w:hyperlink w:anchor="_Toc151130232" w:history="1">
+      <w:hyperlink w:anchor="_Toc152927241" w:history="1">
         <w:r>
           <w:rPr>
             <w:rStyle w:val="Hyperlink"/>
@@ -3759,7 +3759,7 @@
           <w:rPr>
             <w:noProof/>
           </w:rPr>
-          <w:instrText xml:space="preserve"> PAGEREF _Toc151130232 \h </w:instrText>
+          <w:instrText xml:space="preserve"> PAGEREF _Toc152927241 \h </w:instrText>
         </w:r>
         <w:r>
           <w:rPr>
@@ -3804,7 +3804,7 @@
           <w:lang w:val="nl-BE" w:eastAsia="nl-BE" w:bidi="ar-SA"/>
         </w:rPr>
       </w:pPr>
-      <w:hyperlink w:anchor="_Toc151130233" w:history="1">
+      <w:hyperlink w:anchor="_Toc152927242" w:history="1">
         <w:r>
           <w:rPr>
             <w:rStyle w:val="Hyperlink"/>
@@ -3846,7 +3846,7 @@
           <w:rPr>
             <w:noProof/>
           </w:rPr>
-          <w:instrText xml:space="preserve"> PAGEREF _Toc151130233 \h </w:instrText>
+          <w:instrText xml:space="preserve"> PAGEREF _Toc152927242 \h </w:instrText>
         </w:r>
         <w:r>
           <w:rPr>
@@ -3899,7 +3899,7 @@
         </w:rPr>
       </w:pPr>
       <w:bookmarkStart w:id="0" w:name="_Ref118727531"/>
-      <w:bookmarkStart w:id="1" w:name="_Toc151130190"/>
+      <w:bookmarkStart w:id="1" w:name="_Toc152927199"/>
       <w:r>
         <w:lastRenderedPageBreak/>
         <w:t>Install</w:t>
@@ -4000,7 +4000,7 @@
           <w:rFonts w:hint="eastAsia"/>
         </w:rPr>
       </w:pPr>
-      <w:bookmarkStart w:id="2" w:name="_Toc151130191"/>
+      <w:bookmarkStart w:id="2" w:name="_Toc152927200"/>
       <w:r>
         <w:t>Starting ModbusControl</w:t>
       </w:r>
@@ -4131,7 +4131,7 @@
           <w:rFonts w:hint="eastAsia"/>
         </w:rPr>
       </w:pPr>
-      <w:bookmarkStart w:id="3" w:name="_Toc151130192"/>
+      <w:bookmarkStart w:id="3" w:name="_Toc152927201"/>
       <w:r>
         <w:t>The mbc project file</w:t>
       </w:r>
@@ -4223,7 +4223,7 @@
           <w:rFonts w:hint="eastAsia"/>
         </w:rPr>
       </w:pPr>
-      <w:bookmarkStart w:id="4" w:name="_Toc151130193"/>
+      <w:bookmarkStart w:id="4" w:name="_Toc152927202"/>
       <w:r>
         <w:t>Using ModbusControl</w:t>
       </w:r>
@@ -4238,7 +4238,7 @@
         </w:rPr>
       </w:pPr>
       <w:bookmarkStart w:id="5" w:name="_Ref118397727"/>
-      <w:bookmarkStart w:id="6" w:name="_Toc151130194"/>
+      <w:bookmarkStart w:id="6" w:name="_Toc152927203"/>
       <w:r>
         <w:rPr>
           <w:lang w:val="en-GB"/>
@@ -4696,7 +4696,7 @@
           <w:rFonts w:hint="eastAsia"/>
         </w:rPr>
       </w:pPr>
-      <w:bookmarkStart w:id="7" w:name="_Toc151130195"/>
+      <w:bookmarkStart w:id="7" w:name="_Toc152927204"/>
       <w:r>
         <w:lastRenderedPageBreak/>
         <w:t>Import and export</w:t>
@@ -4912,7 +4912,7 @@
         <w:fldChar w:fldCharType="separate"/>
       </w:r>
       <w:r>
-        <w:t>The Import / Export format</w:t>
+        <w:t>The Import/Export format</w:t>
       </w:r>
       <w:r>
         <w:rPr>
@@ -5018,7 +5018,7 @@
         <w:fldChar w:fldCharType="separate"/>
       </w:r>
       <w:r>
-        <w:t>The Import / Export format</w:t>
+        <w:t>The Import/Export format</w:t>
       </w:r>
       <w:r>
         <w:rPr>
@@ -5122,7 +5122,7 @@
         <w:fldChar w:fldCharType="separate"/>
       </w:r>
       <w:r>
-        <w:t>The Import / Export format</w:t>
+        <w:t>The Import/Export format</w:t>
       </w:r>
       <w:r>
         <w:rPr>
@@ -5143,7 +5143,7 @@
           <w:lang w:val="en-GB"/>
         </w:rPr>
       </w:pPr>
-      <w:bookmarkStart w:id="8" w:name="_Toc151130196"/>
+      <w:bookmarkStart w:id="8" w:name="_Toc152927205"/>
       <w:r>
         <w:rPr>
           <w:lang w:val="en-GB"/>
@@ -5202,7 +5202,7 @@
           <w:rFonts w:hint="eastAsia"/>
         </w:rPr>
       </w:pPr>
-      <w:bookmarkStart w:id="10" w:name="_Toc151130197"/>
+      <w:bookmarkStart w:id="10" w:name="_Toc152927206"/>
       <w:r>
         <w:lastRenderedPageBreak/>
         <w:t>Find/Filter</w:t>
@@ -5241,7 +5241,7 @@
           <w:rFonts w:hint="eastAsia"/>
         </w:rPr>
       </w:pPr>
-      <w:bookmarkStart w:id="11" w:name="_Toc151130198"/>
+      <w:bookmarkStart w:id="11" w:name="_Toc152927207"/>
       <w:r>
         <w:t>Diagnostics counters</w:t>
       </w:r>
@@ -5276,7 +5276,7 @@
           <w:rFonts w:hint="eastAsia"/>
         </w:rPr>
       </w:pPr>
-      <w:bookmarkStart w:id="12" w:name="_Toc151130199"/>
+      <w:bookmarkStart w:id="12" w:name="_Toc152927208"/>
       <w:r>
         <w:t>Logging</w:t>
       </w:r>
@@ -5371,7 +5371,7 @@
       </w:pPr>
       <w:bookmarkStart w:id="13" w:name="__RefHeading___Toc43_939433756"/>
       <w:bookmarkStart w:id="14" w:name="_Ref118397833"/>
-      <w:bookmarkStart w:id="15" w:name="_Toc151130200"/>
+      <w:bookmarkStart w:id="15" w:name="_Toc152927209"/>
       <w:bookmarkEnd w:id="13"/>
       <w:r>
         <w:t>Project configuration</w:t>
@@ -5497,7 +5497,7 @@
             <v:path o:extrusionok="f" gradientshapeok="t" o:connecttype="rect"/>
             <o:lock v:ext="edit" aspectratio="t"/>
           </v:shapetype>
-          <v:shape id="_x0000_i1025" type="#_x0000_t75" style="width:409pt;height:56pt;visibility:visible;mso-wrap-style:square">
+          <v:shape id="_x0000_i1025" type="#_x0000_t75" style="width:408.6pt;height:55.8pt;visibility:visible;mso-wrap-style:square">
             <v:imagedata r:id="rId8" o:title=""/>
           </v:shape>
         </w:pict>
@@ -7435,7 +7435,7 @@
           <w:rFonts w:hint="eastAsia"/>
         </w:rPr>
       </w:pPr>
-      <w:bookmarkStart w:id="17" w:name="_Toc151130201"/>
+      <w:bookmarkStart w:id="17" w:name="_Toc152927210"/>
       <w:r>
         <w:t>Options</w:t>
       </w:r>
@@ -8213,7 +8213,7 @@
           <w:rFonts w:hint="eastAsia"/>
         </w:rPr>
       </w:pPr>
-      <w:bookmarkStart w:id="18" w:name="_Toc151130202"/>
+      <w:bookmarkStart w:id="18" w:name="_Toc152927211"/>
       <w:r>
         <w:rPr>
           <w:lang w:val="en-GB"/>
@@ -8428,7 +8428,7 @@
         </w:rPr>
       </w:pPr>
       <w:bookmarkStart w:id="19" w:name="__RefHeading___Toc62_1195957084"/>
-      <w:bookmarkStart w:id="20" w:name="_Toc151130203"/>
+      <w:bookmarkStart w:id="20" w:name="_Toc152927212"/>
       <w:bookmarkEnd w:id="19"/>
       <w:r>
         <w:rPr>
@@ -8493,7 +8493,7 @@
           <w:rFonts w:hint="eastAsia"/>
         </w:rPr>
       </w:pPr>
-      <w:bookmarkStart w:id="21" w:name="_Toc151130204"/>
+      <w:bookmarkStart w:id="21" w:name="_Toc152927213"/>
       <w:r>
         <w:rPr>
           <w:lang w:val="en-GB"/>
@@ -8686,7 +8686,7 @@
           <w:rFonts w:hint="eastAsia"/>
         </w:rPr>
       </w:pPr>
-      <w:bookmarkStart w:id="22" w:name="_Toc151130205"/>
+      <w:bookmarkStart w:id="22" w:name="_Toc152927214"/>
       <w:r>
         <w:rPr>
           <w:lang w:val="en-GB"/>
@@ -8712,7 +8712,7 @@
           <w:rFonts w:hint="eastAsia"/>
         </w:rPr>
       </w:pPr>
-      <w:bookmarkStart w:id="23" w:name="_Toc151130206"/>
+      <w:bookmarkStart w:id="23" w:name="_Toc152927215"/>
       <w:r>
         <w:rPr>
           <w:lang w:val="en-GB"/>
@@ -8809,7 +8809,7 @@
           <w:noProof/>
         </w:rPr>
         <w:pict w14:anchorId="5CABB691">
-          <v:shape id="_x0000_i1026" type="#_x0000_t75" style="width:391.5pt;height:52pt;visibility:visible;mso-wrap-style:square">
+          <v:shape id="_x0000_i1026" type="#_x0000_t75" style="width:391.2pt;height:52.2pt;visibility:visible;mso-wrap-style:square">
             <v:imagedata r:id="rId10" o:title=""/>
           </v:shape>
         </w:pict>
@@ -8854,7 +8854,7 @@
         </w:rPr>
         <w:tab/>
       </w:r>
-      <w:bookmarkStart w:id="24" w:name="_Toc151130207"/>
+      <w:bookmarkStart w:id="24" w:name="_Toc152927216"/>
       <w:r>
         <w:t>The status bar</w:t>
       </w:r>
@@ -8902,7 +8902,7 @@
         </w:rPr>
       </w:pPr>
       <w:bookmarkStart w:id="25" w:name="_Ref117942468"/>
-      <w:bookmarkStart w:id="26" w:name="_Toc151130208"/>
+      <w:bookmarkStart w:id="26" w:name="_Toc152927217"/>
       <w:r>
         <w:t>Mbc project file validation with XSD schema</w:t>
       </w:r>
@@ -9079,7 +9079,7 @@
       </w:pPr>
       <w:bookmarkStart w:id="27" w:name="_Ref117942129"/>
       <w:bookmarkStart w:id="28" w:name="_Ref117942153"/>
-      <w:bookmarkStart w:id="29" w:name="_Toc151130209"/>
+      <w:bookmarkStart w:id="29" w:name="_Toc152927218"/>
       <w:r>
         <w:lastRenderedPageBreak/>
         <w:t>Logging</w:t>
@@ -9251,7 +9251,7 @@
       </w:pPr>
       <w:bookmarkStart w:id="30" w:name="_Ref117942296"/>
       <w:bookmarkStart w:id="31" w:name="_Ref117942768"/>
-      <w:bookmarkStart w:id="32" w:name="_Toc151130210"/>
+      <w:bookmarkStart w:id="32" w:name="_Toc152927219"/>
       <w:r>
         <w:t>Modbus/TCP bridge</w:t>
       </w:r>
@@ -9366,7 +9366,7 @@
           <w:rFonts w:hint="eastAsia"/>
         </w:rPr>
       </w:pPr>
-      <w:bookmarkStart w:id="33" w:name="_Toc151130211"/>
+      <w:bookmarkStart w:id="33" w:name="_Toc152927220"/>
       <w:r>
         <w:t>The Modbus protocol, function codes and word order</w:t>
       </w:r>
@@ -9636,7 +9636,7 @@
         </w:rPr>
       </w:pPr>
       <w:bookmarkStart w:id="34" w:name="_Ref117948934"/>
-      <w:bookmarkStart w:id="35" w:name="_Toc151130212"/>
+      <w:bookmarkStart w:id="35" w:name="_Toc152927221"/>
       <w:r>
         <w:t>ModbusControl c</w:t>
       </w:r>
@@ -10961,7 +10961,7 @@
           <w:rFonts w:hint="eastAsia"/>
         </w:rPr>
       </w:pPr>
-      <w:bookmarkStart w:id="36" w:name="_Toc151130213"/>
+      <w:bookmarkStart w:id="36" w:name="_Toc152927222"/>
       <w:r>
         <w:t>ModbusExport tool</w:t>
       </w:r>
@@ -11037,7 +11037,7 @@
         <w:fldChar w:fldCharType="separate"/>
       </w:r>
       <w:r>
-        <w:t>The Import / Export format</w:t>
+        <w:t>The Import/Export format</w:t>
       </w:r>
       <w:r>
         <w:rPr>
@@ -13044,7 +13044,7 @@
           <w:rFonts w:hint="eastAsia"/>
         </w:rPr>
       </w:pPr>
-      <w:bookmarkStart w:id="37" w:name="_Toc151130214"/>
+      <w:bookmarkStart w:id="37" w:name="_Toc152927223"/>
       <w:r>
         <w:t>ModbusImport tool</w:t>
       </w:r>
@@ -13129,7 +13129,7 @@
         <w:fldChar w:fldCharType="separate"/>
       </w:r>
       <w:r>
-        <w:t>The Import / Export format</w:t>
+        <w:t>The Import/Export format</w:t>
       </w:r>
       <w:r>
         <w:rPr>
@@ -14973,9 +14973,9 @@
       <w:bookmarkStart w:id="38" w:name="_Ref117942219"/>
       <w:bookmarkStart w:id="39" w:name="_Ref117942253"/>
       <w:bookmarkStart w:id="40" w:name="_Ref117942272"/>
-      <w:bookmarkStart w:id="41" w:name="_Toc151130215"/>
-      <w:r>
-        <w:t>The Import / Export format</w:t>
+      <w:bookmarkStart w:id="41" w:name="_Toc152927224"/>
+      <w:r>
+        <w:t>The Import/Export format</w:t>
       </w:r>
       <w:bookmarkEnd w:id="38"/>
       <w:bookmarkEnd w:id="39"/>
@@ -15082,7 +15082,7 @@
         <w:t>")</w:t>
       </w:r>
       <w:r>
-        <w:t xml:space="preserve"> . A field containing the double quote character (</w:t>
+        <w:t>. A field containing the double quote character (</w:t>
       </w:r>
       <w:r>
         <w:rPr>
@@ -15105,19 +15105,45 @@
       </w:r>
     </w:p>
     <w:p>
-      <w:pPr>
-        <w:rPr>
-          <w:rFonts w:hint="eastAsia"/>
-        </w:rPr>
-      </w:pPr>
-      <w:r>
-        <w:t>On export the Windows system default encoding will be used. Which is ANSI codepage 1252 in West</w:t>
+      <w:r>
+        <w:t xml:space="preserve">On export the Windows system default encoding will be used. Which is </w:t>
+      </w:r>
+      <w:r>
+        <w:t xml:space="preserve">usually </w:t>
+      </w:r>
+      <w:r>
+        <w:t>ANSI codepage 1252 in West</w:t>
       </w:r>
       <w:r>
         <w:t xml:space="preserve">ern </w:t>
       </w:r>
       <w:r>
         <w:t xml:space="preserve">Europe. This allows easy import in Excel because Excel uses the Windows default encoding too for import and export. </w:t>
+      </w:r>
+    </w:p>
+    <w:p>
+      <w:pPr>
+        <w:rPr>
+          <w:rFonts w:hint="eastAsia"/>
+        </w:rPr>
+      </w:pPr>
+      <w:r>
+        <w:t>T</w:t>
+      </w:r>
+      <w:r>
+        <w:rPr>
+          <w:rFonts w:hint="eastAsia"/>
+        </w:rPr>
+        <w:t>h</w:t>
+      </w:r>
+      <w:r>
+        <w:t>e import</w:t>
+      </w:r>
+      <w:r>
+        <w:t xml:space="preserve"> ignore</w:t>
+      </w:r>
+      <w:r>
+        <w:t>s empty lines, lines with only spaces and lines with only.</w:t>
       </w:r>
     </w:p>
     <w:p>
@@ -15699,7 +15725,7 @@
           <w:rFonts w:hint="eastAsia"/>
         </w:rPr>
       </w:pPr>
-      <w:bookmarkStart w:id="42" w:name="_Toc151130216"/>
+      <w:bookmarkStart w:id="42" w:name="_Toc152927225"/>
       <w:r>
         <w:t>More about Modbus</w:t>
       </w:r>
@@ -15792,7 +15818,7 @@
           <w:rFonts w:hint="eastAsia"/>
         </w:rPr>
       </w:pPr>
-      <w:bookmarkStart w:id="43" w:name="_Toc151130217"/>
+      <w:bookmarkStart w:id="43" w:name="_Toc152927226"/>
       <w:r>
         <w:t>Editing the mbc project file</w:t>
       </w:r>
@@ -15805,7 +15831,7 @@
           <w:rFonts w:hint="eastAsia"/>
         </w:rPr>
       </w:pPr>
-      <w:bookmarkStart w:id="44" w:name="_Toc151130218"/>
+      <w:bookmarkStart w:id="44" w:name="_Toc152927227"/>
       <w:r>
         <w:rPr>
           <w:lang w:val="en-GB"/>
@@ -15881,7 +15907,7 @@
           <w:rFonts w:hint="eastAsia"/>
         </w:rPr>
       </w:pPr>
-      <w:bookmarkStart w:id="45" w:name="_Toc151130219"/>
+      <w:bookmarkStart w:id="45" w:name="_Toc152927228"/>
       <w:r>
         <w:rPr>
           <w:lang w:val="en-GB"/>
@@ -16223,7 +16249,7 @@
           <w:rFonts w:hint="eastAsia"/>
         </w:rPr>
       </w:pPr>
-      <w:bookmarkStart w:id="46" w:name="_Toc151130220"/>
+      <w:bookmarkStart w:id="46" w:name="_Toc152927229"/>
       <w:r>
         <w:rPr>
           <w:lang w:val="en-GB"/>
@@ -16556,7 +16582,7 @@
           <w:rFonts w:hint="eastAsia"/>
         </w:rPr>
       </w:pPr>
-      <w:bookmarkStart w:id="47" w:name="_Toc151130221"/>
+      <w:bookmarkStart w:id="47" w:name="_Toc152927230"/>
       <w:r>
         <w:rPr>
           <w:lang w:val="en-GB"/>
@@ -18645,7 +18671,7 @@
         </w:rPr>
       </w:pPr>
       <w:bookmarkStart w:id="48" w:name="_Ref146906707"/>
-      <w:bookmarkStart w:id="49" w:name="_Toc151130222"/>
+      <w:bookmarkStart w:id="49" w:name="_Toc152927231"/>
       <w:r>
         <w:rPr>
           <w:lang w:val="en-GB"/>
@@ -19813,7 +19839,7 @@
           <w:lang w:eastAsia="nl-BE"/>
         </w:rPr>
       </w:pPr>
-      <w:bookmarkStart w:id="50" w:name="_Toc151130223"/>
+      <w:bookmarkStart w:id="50" w:name="_Toc152927232"/>
       <w:r>
         <w:rPr>
           <w:lang w:eastAsia="nl-BE"/>
@@ -20438,7 +20464,7 @@
           <w:rFonts w:hint="eastAsia"/>
         </w:rPr>
       </w:pPr>
-      <w:bookmarkStart w:id="51" w:name="_Toc151130224"/>
+      <w:bookmarkStart w:id="51" w:name="_Toc152927233"/>
       <w:r>
         <w:rPr>
           <w:lang w:val="en-GB"/>
@@ -22277,7 +22303,7 @@
       </w:pPr>
       <w:bookmarkStart w:id="52" w:name="_Ref117942545"/>
       <w:bookmarkStart w:id="53" w:name="_Ref117942693"/>
-      <w:bookmarkStart w:id="54" w:name="_Toc151130225"/>
+      <w:bookmarkStart w:id="54" w:name="_Toc152927234"/>
       <w:r>
         <w:rPr>
           <w:lang w:val="en-GB"/>
@@ -22775,7 +22801,7 @@
           <w:rFonts w:hint="eastAsia"/>
         </w:rPr>
       </w:pPr>
-      <w:bookmarkStart w:id="55" w:name="_Toc151130226"/>
+      <w:bookmarkStart w:id="55" w:name="_Toc152927235"/>
       <w:r>
         <w:rPr>
           <w:lang w:val="en-GB"/>
@@ -23199,7 +23225,7 @@
           <w:noProof/>
         </w:rPr>
         <w:pict w14:anchorId="56E75F81">
-          <v:shape id="Afbeelding 1" o:spid="_x0000_i1027" type="#_x0000_t75" style="width:345.5pt;height:52pt;visibility:visible;mso-wrap-style:square">
+          <v:shape id="Afbeelding 1" o:spid="_x0000_i1027" type="#_x0000_t75" style="width:345.6pt;height:52.2pt;visibility:visible;mso-wrap-style:square">
             <v:imagedata r:id="rId14" o:title=""/>
           </v:shape>
         </w:pict>
@@ -23213,7 +23239,7 @@
         </w:rPr>
       </w:pPr>
       <w:bookmarkStart w:id="56" w:name="_Ref117942613"/>
-      <w:bookmarkStart w:id="57" w:name="_Toc151130227"/>
+      <w:bookmarkStart w:id="57" w:name="_Toc152927236"/>
       <w:r>
         <w:rPr>
           <w:lang w:val="en-GB"/>
@@ -23668,7 +23694,7 @@
         </w:rPr>
       </w:pPr>
       <w:bookmarkStart w:id="58" w:name="_Ref117942668"/>
-      <w:bookmarkStart w:id="59" w:name="_Toc151130228"/>
+      <w:bookmarkStart w:id="59" w:name="_Toc152927237"/>
       <w:r>
         <w:rPr>
           <w:lang w:val="en-GB"/>
@@ -24657,7 +24683,7 @@
         </w:rPr>
       </w:pPr>
       <w:bookmarkStart w:id="60" w:name="_Ref117942679"/>
-      <w:bookmarkStart w:id="61" w:name="_Toc151130229"/>
+      <w:bookmarkStart w:id="61" w:name="_Toc152927238"/>
       <w:r>
         <w:rPr>
           <w:lang w:val="en-GB"/>
@@ -26911,7 +26937,7 @@
       <w:bookmarkStart w:id="65" w:name="_Ref117942648"/>
       <w:bookmarkStart w:id="66" w:name="_Ref117942708"/>
       <w:bookmarkStart w:id="67" w:name="_Ref117942720"/>
-      <w:bookmarkStart w:id="68" w:name="_Toc151130230"/>
+      <w:bookmarkStart w:id="68" w:name="_Toc152927239"/>
       <w:r>
         <w:rPr>
           <w:lang w:val="en-GB"/>
@@ -27811,7 +27837,7 @@
           <w:rFonts w:hint="eastAsia"/>
         </w:rPr>
       </w:pPr>
-      <w:bookmarkStart w:id="69" w:name="_Toc151130231"/>
+      <w:bookmarkStart w:id="69" w:name="_Toc152927240"/>
       <w:r>
         <w:rPr>
           <w:lang w:val="en-GB"/>
@@ -28016,7 +28042,7 @@
           <w:rFonts w:hint="eastAsia"/>
         </w:rPr>
       </w:pPr>
-      <w:bookmarkStart w:id="70" w:name="_Toc151130232"/>
+      <w:bookmarkStart w:id="70" w:name="_Toc152927241"/>
       <w:r>
         <w:rPr>
           <w:lang w:val="en-GB"/>
@@ -28250,7 +28276,7 @@
           <w:rFonts w:hint="eastAsia"/>
         </w:rPr>
       </w:pPr>
-      <w:bookmarkStart w:id="71" w:name="_Toc151130233"/>
+      <w:bookmarkStart w:id="71" w:name="_Toc152927242"/>
       <w:r>
         <w:rPr>
           <w:lang w:val="en-GB"/>

</xml_diff>

<commit_message>
ModbusImport: with -verbose and -continue_on_error: CSV line errors are now counted too ModbusExport: with -verbose: did not count error for “illegal function” error responses. No longer shows export counts with file open error. Handleiding improved.
git-svn-id: http://visualsvn.edna.local/EDNA/ModbusControl/V2@4886 03c8d257-35a7-c645-9f01-50f27e98b9e6
</commit_message>
<xml_diff>
--- a/Manuals/ModbusControl - User manual.docx
+++ b/Manuals/ModbusControl - User manual.docx
@@ -1,6 +1,6 @@
 
 <file path=word/document.xml><?xml version="1.0" encoding="utf-8"?>
-<w:document xmlns:wpc="http://schemas.microsoft.com/office/word/2010/wordprocessingCanvas" xmlns:cx="http://schemas.microsoft.com/office/drawing/2014/chartex" xmlns:cx1="http://schemas.microsoft.com/office/drawing/2015/9/8/chartex" xmlns:cx2="http://schemas.microsoft.com/office/drawing/2015/10/21/chartex" xmlns:cx3="http://schemas.microsoft.com/office/drawing/2016/5/9/chartex" xmlns:cx4="http://schemas.microsoft.com/office/drawing/2016/5/10/chartex" xmlns:cx5="http://schemas.microsoft.com/office/drawing/2016/5/11/chartex" xmlns:cx6="http://schemas.microsoft.com/office/drawing/2016/5/12/chartex" xmlns:cx7="http://schemas.microsoft.com/office/drawing/2016/5/13/chartex" xmlns:cx8="http://schemas.microsoft.com/office/drawing/2016/5/14/chartex" xmlns:mc="http://schemas.openxmlformats.org/markup-compatibility/2006" xmlns:aink="http://schemas.microsoft.com/office/drawing/2016/ink" xmlns:am3d="http://schemas.microsoft.com/office/drawing/2017/model3d" xmlns:o="urn:schemas-microsoft-com:office:office" xmlns:oel="http://schemas.microsoft.com/office/2019/extlst" xmlns:r="http://schemas.openxmlformats.org/officeDocument/2006/relationships" xmlns:m="http://schemas.openxmlformats.org/officeDocument/2006/math" xmlns:v="urn:schemas-microsoft-com:vml" xmlns:wp14="http://schemas.microsoft.com/office/word/2010/wordprocessingDrawing" xmlns:wp="http://schemas.openxmlformats.org/drawingml/2006/wordprocessingDrawing" xmlns:w10="urn:schemas-microsoft-com:office:word" xmlns:w="http://schemas.openxmlformats.org/wordprocessingml/2006/main" xmlns:w14="http://schemas.microsoft.com/office/word/2010/wordml" xmlns:w15="http://schemas.microsoft.com/office/word/2012/wordml" xmlns:w16cex="http://schemas.microsoft.com/office/word/2018/wordml/cex" xmlns:w16cid="http://schemas.microsoft.com/office/word/2016/wordml/cid" xmlns:w16="http://schemas.microsoft.com/office/word/2018/wordml" xmlns:w16sdtdh="http://schemas.microsoft.com/office/word/2020/wordml/sdtdatahash" xmlns:w16se="http://schemas.microsoft.com/office/word/2015/wordml/symex" xmlns:wpg="http://schemas.microsoft.com/office/word/2010/wordprocessingGroup" xmlns:wpi="http://schemas.microsoft.com/office/word/2010/wordprocessingInk" xmlns:wne="http://schemas.microsoft.com/office/word/2006/wordml" xmlns:wps="http://schemas.microsoft.com/office/word/2010/wordprocessingShape" mc:Ignorable="w14 w15 w16se w16cid w16 w16cex w16sdtdh wp14">
+<w:document xmlns:wpc="http://schemas.microsoft.com/office/word/2010/wordprocessingCanvas" xmlns:cx="http://schemas.microsoft.com/office/drawing/2014/chartex" xmlns:cx1="http://schemas.microsoft.com/office/drawing/2015/9/8/chartex" xmlns:cx2="http://schemas.microsoft.com/office/drawing/2015/10/21/chartex" xmlns:cx3="http://schemas.microsoft.com/office/drawing/2016/5/9/chartex" xmlns:cx4="http://schemas.microsoft.com/office/drawing/2016/5/10/chartex" xmlns:cx5="http://schemas.microsoft.com/office/drawing/2016/5/11/chartex" xmlns:cx6="http://schemas.microsoft.com/office/drawing/2016/5/12/chartex" xmlns:cx7="http://schemas.microsoft.com/office/drawing/2016/5/13/chartex" xmlns:cx8="http://schemas.microsoft.com/office/drawing/2016/5/14/chartex" xmlns:mc="http://schemas.openxmlformats.org/markup-compatibility/2006" xmlns:aink="http://schemas.microsoft.com/office/drawing/2016/ink" xmlns:am3d="http://schemas.microsoft.com/office/drawing/2017/model3d" xmlns:o="urn:schemas-microsoft-com:office:office" xmlns:oel="http://schemas.microsoft.com/office/2019/extlst" xmlns:r="http://schemas.openxmlformats.org/officeDocument/2006/relationships" xmlns:m="http://schemas.openxmlformats.org/officeDocument/2006/math" xmlns:v="urn:schemas-microsoft-com:vml" xmlns:wp14="http://schemas.microsoft.com/office/word/2010/wordprocessingDrawing" xmlns:wp="http://schemas.openxmlformats.org/drawingml/2006/wordprocessingDrawing" xmlns:w10="urn:schemas-microsoft-com:office:word" xmlns:w="http://schemas.openxmlformats.org/wordprocessingml/2006/main" xmlns:w14="http://schemas.microsoft.com/office/word/2010/wordml" xmlns:w15="http://schemas.microsoft.com/office/word/2012/wordml" xmlns:w16cex="http://schemas.microsoft.com/office/word/2018/wordml/cex" xmlns:w16cid="http://schemas.microsoft.com/office/word/2016/wordml/cid" xmlns:w16="http://schemas.microsoft.com/office/word/2018/wordml" xmlns:w16du="http://schemas.microsoft.com/office/word/2023/wordml/word16du" xmlns:w16sdtdh="http://schemas.microsoft.com/office/word/2020/wordml/sdtdatahash" xmlns:w16se="http://schemas.microsoft.com/office/word/2015/wordml/symex" xmlns:wpg="http://schemas.microsoft.com/office/word/2010/wordprocessingGroup" xmlns:wpi="http://schemas.microsoft.com/office/word/2010/wordprocessingInk" xmlns:wne="http://schemas.microsoft.com/office/word/2006/wordml" xmlns:wps="http://schemas.microsoft.com/office/word/2010/wordprocessingShape" mc:Ignorable="w14 w15 w16se w16cid w16 w16cex w16sdtdh w16du wp14">
   <w:background w:color="FFFFFF"/>
   <w:body>
     <w:p>
@@ -112,7 +112,6 @@
         </w:r>
         <w:r>
           <w:rPr>
-            <w:rFonts w:hint="eastAsia"/>
             <w:noProof/>
           </w:rPr>
           <w:fldChar w:fldCharType="separate"/>
@@ -199,7 +198,6 @@
         </w:r>
         <w:r>
           <w:rPr>
-            <w:rFonts w:hint="eastAsia"/>
             <w:noProof/>
           </w:rPr>
           <w:fldChar w:fldCharType="separate"/>
@@ -286,7 +284,6 @@
         </w:r>
         <w:r>
           <w:rPr>
-            <w:rFonts w:hint="eastAsia"/>
             <w:noProof/>
           </w:rPr>
           <w:fldChar w:fldCharType="separate"/>
@@ -373,7 +370,6 @@
         </w:r>
         <w:r>
           <w:rPr>
-            <w:rFonts w:hint="eastAsia"/>
             <w:noProof/>
           </w:rPr>
           <w:fldChar w:fldCharType="separate"/>
@@ -460,7 +456,6 @@
         </w:r>
         <w:r>
           <w:rPr>
-            <w:rFonts w:hint="eastAsia"/>
             <w:noProof/>
           </w:rPr>
           <w:fldChar w:fldCharType="separate"/>
@@ -547,7 +542,6 @@
         </w:r>
         <w:r>
           <w:rPr>
-            <w:rFonts w:hint="eastAsia"/>
             <w:noProof/>
           </w:rPr>
           <w:fldChar w:fldCharType="separate"/>
@@ -634,7 +628,6 @@
         </w:r>
         <w:r>
           <w:rPr>
-            <w:rFonts w:hint="eastAsia"/>
             <w:noProof/>
           </w:rPr>
           <w:fldChar w:fldCharType="separate"/>
@@ -721,7 +714,6 @@
         </w:r>
         <w:r>
           <w:rPr>
-            <w:rFonts w:hint="eastAsia"/>
             <w:noProof/>
           </w:rPr>
           <w:fldChar w:fldCharType="separate"/>
@@ -808,7 +800,6 @@
         </w:r>
         <w:r>
           <w:rPr>
-            <w:rFonts w:hint="eastAsia"/>
             <w:noProof/>
           </w:rPr>
           <w:fldChar w:fldCharType="separate"/>
@@ -895,7 +886,6 @@
         </w:r>
         <w:r>
           <w:rPr>
-            <w:rFonts w:hint="eastAsia"/>
             <w:noProof/>
           </w:rPr>
           <w:fldChar w:fldCharType="separate"/>
@@ -982,7 +972,6 @@
         </w:r>
         <w:r>
           <w:rPr>
-            <w:rFonts w:hint="eastAsia"/>
             <w:noProof/>
           </w:rPr>
           <w:fldChar w:fldCharType="separate"/>
@@ -1069,7 +1058,6 @@
         </w:r>
         <w:r>
           <w:rPr>
-            <w:rFonts w:hint="eastAsia"/>
             <w:noProof/>
           </w:rPr>
           <w:fldChar w:fldCharType="separate"/>
@@ -1156,7 +1144,6 @@
         </w:r>
         <w:r>
           <w:rPr>
-            <w:rFonts w:hint="eastAsia"/>
             <w:noProof/>
           </w:rPr>
           <w:fldChar w:fldCharType="separate"/>
@@ -1243,7 +1230,6 @@
         </w:r>
         <w:r>
           <w:rPr>
-            <w:rFonts w:hint="eastAsia"/>
             <w:noProof/>
           </w:rPr>
           <w:fldChar w:fldCharType="separate"/>
@@ -1330,7 +1316,6 @@
         </w:r>
         <w:r>
           <w:rPr>
-            <w:rFonts w:hint="eastAsia"/>
             <w:noProof/>
           </w:rPr>
           <w:fldChar w:fldCharType="separate"/>
@@ -1417,7 +1402,6 @@
         </w:r>
         <w:r>
           <w:rPr>
-            <w:rFonts w:hint="eastAsia"/>
             <w:noProof/>
           </w:rPr>
           <w:fldChar w:fldCharType="separate"/>
@@ -1504,7 +1488,6 @@
         </w:r>
         <w:r>
           <w:rPr>
-            <w:rFonts w:hint="eastAsia"/>
             <w:noProof/>
           </w:rPr>
           <w:fldChar w:fldCharType="separate"/>
@@ -1591,7 +1574,6 @@
         </w:r>
         <w:r>
           <w:rPr>
-            <w:rFonts w:hint="eastAsia"/>
             <w:noProof/>
           </w:rPr>
           <w:fldChar w:fldCharType="separate"/>
@@ -1678,7 +1660,6 @@
         </w:r>
         <w:r>
           <w:rPr>
-            <w:rFonts w:hint="eastAsia"/>
             <w:noProof/>
           </w:rPr>
           <w:fldChar w:fldCharType="separate"/>
@@ -1765,7 +1746,6 @@
         </w:r>
         <w:r>
           <w:rPr>
-            <w:rFonts w:hint="eastAsia"/>
             <w:noProof/>
           </w:rPr>
           <w:fldChar w:fldCharType="separate"/>
@@ -1852,7 +1832,6 @@
         </w:r>
         <w:r>
           <w:rPr>
-            <w:rFonts w:hint="eastAsia"/>
             <w:noProof/>
           </w:rPr>
           <w:fldChar w:fldCharType="separate"/>
@@ -1939,7 +1918,6 @@
         </w:r>
         <w:r>
           <w:rPr>
-            <w:rFonts w:hint="eastAsia"/>
             <w:noProof/>
           </w:rPr>
           <w:fldChar w:fldCharType="separate"/>
@@ -2026,7 +2004,6 @@
         </w:r>
         <w:r>
           <w:rPr>
-            <w:rFonts w:hint="eastAsia"/>
             <w:noProof/>
           </w:rPr>
           <w:fldChar w:fldCharType="separate"/>
@@ -2113,7 +2090,6 @@
         </w:r>
         <w:r>
           <w:rPr>
-            <w:rFonts w:hint="eastAsia"/>
             <w:noProof/>
           </w:rPr>
           <w:fldChar w:fldCharType="separate"/>
@@ -2200,7 +2176,6 @@
         </w:r>
         <w:r>
           <w:rPr>
-            <w:rFonts w:hint="eastAsia"/>
             <w:noProof/>
           </w:rPr>
           <w:fldChar w:fldCharType="separate"/>
@@ -2287,7 +2262,6 @@
         </w:r>
         <w:r>
           <w:rPr>
-            <w:rFonts w:hint="eastAsia"/>
             <w:noProof/>
           </w:rPr>
           <w:fldChar w:fldCharType="separate"/>
@@ -2374,7 +2348,6 @@
         </w:r>
         <w:r>
           <w:rPr>
-            <w:rFonts w:hint="eastAsia"/>
             <w:noProof/>
           </w:rPr>
           <w:fldChar w:fldCharType="separate"/>
@@ -2461,7 +2434,6 @@
         </w:r>
         <w:r>
           <w:rPr>
-            <w:rFonts w:hint="eastAsia"/>
             <w:noProof/>
           </w:rPr>
           <w:fldChar w:fldCharType="separate"/>
@@ -2548,7 +2520,6 @@
         </w:r>
         <w:r>
           <w:rPr>
-            <w:rFonts w:hint="eastAsia"/>
             <w:noProof/>
           </w:rPr>
           <w:fldChar w:fldCharType="separate"/>
@@ -2635,7 +2606,6 @@
         </w:r>
         <w:r>
           <w:rPr>
-            <w:rFonts w:hint="eastAsia"/>
             <w:noProof/>
           </w:rPr>
           <w:fldChar w:fldCharType="separate"/>
@@ -2722,7 +2692,6 @@
         </w:r>
         <w:r>
           <w:rPr>
-            <w:rFonts w:hint="eastAsia"/>
             <w:noProof/>
           </w:rPr>
           <w:fldChar w:fldCharType="separate"/>
@@ -2809,7 +2778,6 @@
         </w:r>
         <w:r>
           <w:rPr>
-            <w:rFonts w:hint="eastAsia"/>
             <w:noProof/>
           </w:rPr>
           <w:fldChar w:fldCharType="separate"/>
@@ -2896,7 +2864,6 @@
         </w:r>
         <w:r>
           <w:rPr>
-            <w:rFonts w:hint="eastAsia"/>
             <w:noProof/>
           </w:rPr>
           <w:fldChar w:fldCharType="separate"/>
@@ -2985,7 +2952,6 @@
         </w:r>
         <w:r>
           <w:rPr>
-            <w:rFonts w:hint="eastAsia"/>
             <w:noProof/>
           </w:rPr>
           <w:fldChar w:fldCharType="separate"/>
@@ -3072,7 +3038,6 @@
         </w:r>
         <w:r>
           <w:rPr>
-            <w:rFonts w:hint="eastAsia"/>
             <w:noProof/>
           </w:rPr>
           <w:fldChar w:fldCharType="separate"/>
@@ -3159,7 +3124,6 @@
         </w:r>
         <w:r>
           <w:rPr>
-            <w:rFonts w:hint="eastAsia"/>
             <w:noProof/>
           </w:rPr>
           <w:fldChar w:fldCharType="separate"/>
@@ -3246,7 +3210,6 @@
         </w:r>
         <w:r>
           <w:rPr>
-            <w:rFonts w:hint="eastAsia"/>
             <w:noProof/>
           </w:rPr>
           <w:fldChar w:fldCharType="separate"/>
@@ -3333,7 +3296,6 @@
         </w:r>
         <w:r>
           <w:rPr>
-            <w:rFonts w:hint="eastAsia"/>
             <w:noProof/>
           </w:rPr>
           <w:fldChar w:fldCharType="separate"/>
@@ -3420,7 +3382,6 @@
         </w:r>
         <w:r>
           <w:rPr>
-            <w:rFonts w:hint="eastAsia"/>
             <w:noProof/>
           </w:rPr>
           <w:fldChar w:fldCharType="separate"/>
@@ -3507,7 +3468,6 @@
         </w:r>
         <w:r>
           <w:rPr>
-            <w:rFonts w:hint="eastAsia"/>
             <w:noProof/>
           </w:rPr>
           <w:fldChar w:fldCharType="separate"/>
@@ -3594,7 +3554,6 @@
         </w:r>
         <w:r>
           <w:rPr>
-            <w:rFonts w:hint="eastAsia"/>
             <w:noProof/>
           </w:rPr>
           <w:fldChar w:fldCharType="separate"/>
@@ -3681,7 +3640,6 @@
         </w:r>
         <w:r>
           <w:rPr>
-            <w:rFonts w:hint="eastAsia"/>
             <w:noProof/>
           </w:rPr>
           <w:fldChar w:fldCharType="separate"/>
@@ -3768,7 +3726,6 @@
         </w:r>
         <w:r>
           <w:rPr>
-            <w:rFonts w:hint="eastAsia"/>
             <w:noProof/>
           </w:rPr>
           <w:fldChar w:fldCharType="separate"/>
@@ -3855,7 +3812,6 @@
         </w:r>
         <w:r>
           <w:rPr>
-            <w:rFonts w:hint="eastAsia"/>
             <w:noProof/>
           </w:rPr>
           <w:fldChar w:fldCharType="separate"/>
@@ -3937,11 +3893,9 @@
       <w:r>
         <w:t>“</w:t>
       </w:r>
-      <w:proofErr w:type="spellStart"/>
       <w:r>
         <w:t>Demo.mbc</w:t>
       </w:r>
-      <w:proofErr w:type="spellEnd"/>
       <w:r>
         <w:t>”</w:t>
       </w:r>
@@ -4778,15 +4732,7 @@
         <w:t>The order is which the tab pages are exported to CSV</w:t>
       </w:r>
       <w:r>
-        <w:t xml:space="preserve"> can be controlled with the &lt;</w:t>
-      </w:r>
-      <w:proofErr w:type="spellStart"/>
-      <w:r>
-        <w:t>exportorder</w:t>
-      </w:r>
-      <w:proofErr w:type="spellEnd"/>
-      <w:r>
-        <w:t xml:space="preserve">&gt; element. </w:t>
+        <w:t xml:space="preserve"> can be controlled with the &lt;exportorder&gt; element. </w:t>
       </w:r>
       <w:r>
         <w:rPr>
@@ -4840,26 +4786,10 @@
         <w:t xml:space="preserve">] </w:t>
       </w:r>
       <w:r>
-        <w:t>&lt;</w:t>
-      </w:r>
-      <w:proofErr w:type="spellStart"/>
-      <w:r>
-        <w:t>exportorder</w:t>
-      </w:r>
-      <w:proofErr w:type="spellEnd"/>
-      <w:r>
-        <w:t xml:space="preserve">&gt; </w:t>
-      </w:r>
-      <w:r>
-        <w:t>for more information on &lt;</w:t>
-      </w:r>
-      <w:proofErr w:type="spellStart"/>
-      <w:r>
-        <w:t>exportorder</w:t>
-      </w:r>
-      <w:proofErr w:type="spellEnd"/>
-      <w:r>
-        <w:t>&gt;.</w:t>
+        <w:t xml:space="preserve">&lt;exportorder&gt; </w:t>
+      </w:r>
+      <w:r>
+        <w:t>for more information on &lt;exportorder&gt;.</w:t>
       </w:r>
     </w:p>
     <w:p>
@@ -5497,7 +5427,7 @@
             <v:path o:extrusionok="f" gradientshapeok="t" o:connecttype="rect"/>
             <o:lock v:ext="edit" aspectratio="t"/>
           </v:shapetype>
-          <v:shape id="_x0000_i1025" type="#_x0000_t75" style="width:408.9pt;height:55.85pt;visibility:visible;mso-wrap-style:square">
+          <v:shape id="_x0000_i1025" type="#_x0000_t75" style="width:408.6pt;height:55.8pt;visibility:visible;mso-wrap-style:square">
             <v:imagedata r:id="rId8" o:title=""/>
           </v:shape>
         </w:pict>
@@ -6381,13 +6311,8 @@
               </w:rPr>
             </w:pPr>
             <w:bookmarkStart w:id="16" w:name="Functioncodetowriteholdingregisters"/>
-            <w:proofErr w:type="spellStart"/>
-            <w:r>
-              <w:t>Functioncode</w:t>
-            </w:r>
-            <w:proofErr w:type="spellEnd"/>
-            <w:r>
-              <w:t xml:space="preserve"> to write holding registers</w:t>
+            <w:r>
+              <w:t>Functioncode to write holding registers</w:t>
             </w:r>
             <w:bookmarkEnd w:id="16"/>
             <w:r>
@@ -7070,15 +6995,7 @@
               </w:rPr>
             </w:pPr>
             <w:r>
-              <w:t>Sample rate (</w:t>
-            </w:r>
-            <w:proofErr w:type="spellStart"/>
-            <w:r>
-              <w:t>ms</w:t>
-            </w:r>
-            <w:proofErr w:type="spellEnd"/>
-            <w:r>
-              <w:t>):</w:t>
+              <w:t>Sample rate (ms):</w:t>
             </w:r>
           </w:p>
         </w:tc>
@@ -8455,15 +8372,7 @@
         </w:rPr>
       </w:pPr>
       <w:r>
-        <w:t xml:space="preserve">To open a demo project file named </w:t>
-      </w:r>
-      <w:proofErr w:type="spellStart"/>
-      <w:r>
-        <w:t>Demo.mbc</w:t>
-      </w:r>
-      <w:proofErr w:type="spellEnd"/>
-      <w:r>
-        <w:t>.</w:t>
+        <w:t>To open a demo project file named Demo.mbc.</w:t>
       </w:r>
     </w:p>
     <w:p>
@@ -8519,15 +8428,7 @@
         </w:rPr>
       </w:pPr>
       <w:r>
-        <w:t xml:space="preserve">Right-click the mouse on the Register or Description column to change the background </w:t>
-      </w:r>
-      <w:proofErr w:type="spellStart"/>
-      <w:r>
-        <w:t>color</w:t>
-      </w:r>
-      <w:proofErr w:type="spellEnd"/>
-      <w:r>
-        <w:t xml:space="preserve"> of the line. This allows to highlight the registers you are currently focusing on. </w:t>
+        <w:t xml:space="preserve">Right-click the mouse on the Register or Description column to change the background color of the line. This allows to highlight the registers you are currently focusing on. </w:t>
       </w:r>
       <w:r>
         <w:br/>
@@ -8584,13 +8485,8 @@
           <w:rFonts w:hint="eastAsia"/>
         </w:rPr>
       </w:pPr>
-      <w:proofErr w:type="spellStart"/>
-      <w:r>
-        <w:t>UInt</w:t>
-      </w:r>
-      <w:proofErr w:type="spellEnd"/>
-      <w:r>
-        <w:t>: show as unsigned integer</w:t>
+      <w:r>
+        <w:t>UInt: show as unsigned integer</w:t>
       </w:r>
     </w:p>
     <w:p>
@@ -8809,7 +8705,7 @@
           <w:noProof/>
         </w:rPr>
         <w:pict w14:anchorId="5CABB691">
-          <v:shape id="_x0000_i1026" type="#_x0000_t75" style="width:391.4pt;height:52.15pt;visibility:visible;mso-wrap-style:square">
+          <v:shape id="_x0000_i1026" type="#_x0000_t75" style="width:391.2pt;height:52.2pt;visibility:visible;mso-wrap-style:square">
             <v:imagedata r:id="rId10" o:title=""/>
           </v:shape>
         </w:pict>
@@ -9221,15 +9117,7 @@
         </w:rPr>
       </w:pPr>
       <w:r>
-        <w:t xml:space="preserve">Bridge decode: the Modbus/TCP frames received and sent over the bridge decoded to human-readable messages like “Slave=1, Read holding registers: </w:t>
-      </w:r>
-      <w:proofErr w:type="spellStart"/>
-      <w:r>
-        <w:t>addr</w:t>
-      </w:r>
-      <w:proofErr w:type="spellEnd"/>
-      <w:r>
-        <w:t>=100, quant=15”</w:t>
+        <w:t>Bridge decode: the Modbus/TCP frames received and sent over the bridge decoded to human-readable messages like “Slave=1, Read holding registers: addr=100, quant=15”</w:t>
       </w:r>
     </w:p>
     <w:p>
@@ -9266,15 +9154,7 @@
         </w:rPr>
       </w:pPr>
       <w:r>
-        <w:t xml:space="preserve">ModbusControl has a built-in Modbus/TCP server that acts as a bridge to the connected modbus device. This allows Modbus/TCP clients like </w:t>
-      </w:r>
-      <w:proofErr w:type="spellStart"/>
-      <w:r>
-        <w:t>ModbusScope</w:t>
-      </w:r>
-      <w:proofErr w:type="spellEnd"/>
-      <w:r>
-        <w:t xml:space="preserve"> to communicate with the serial modbus device as well. It also allows multiple Modbus/TCP clients or more copies of ModbusControl to be connected to the modbus device simultaneously. Works for all connection types to the modbus device, not only the serial line.</w:t>
+        <w:t>ModbusControl has a built-in Modbus/TCP server that acts as a bridge to the connected modbus device. This allows Modbus/TCP clients like ModbusScope to communicate with the serial modbus device as well. It also allows multiple Modbus/TCP clients or more copies of ModbusControl to be connected to the modbus device simultaneously. Works for all connection types to the modbus device, not only the serial line.</w:t>
       </w:r>
     </w:p>
     <w:p>
@@ -9423,15 +9303,7 @@
         </w:rPr>
       </w:pPr>
       <w:r>
-        <w:t>In a Modbus command message, registers are addressed starting at zero. The first holding register is referred to as address 0 in the query message. For historic reasons 16-bit holding registers are often referred to as registers 40001..49999. The base for the register numbering is defined in the mbc project file with the &lt;</w:t>
-      </w:r>
-      <w:proofErr w:type="spellStart"/>
-      <w:r>
-        <w:t>holdingregisterstart</w:t>
-      </w:r>
-      <w:proofErr w:type="spellEnd"/>
-      <w:r>
-        <w:t>&gt; element. It usually is 40001</w:t>
+        <w:t>In a Modbus command message, registers are addressed starting at zero. The first holding register is referred to as address 0 in the query message. For historic reasons 16-bit holding registers are often referred to as registers 40001..49999. The base for the register numbering is defined in the mbc project file with the &lt;holdingregisterstart&gt; element. It usually is 40001</w:t>
       </w:r>
       <w:r>
         <w:t xml:space="preserve"> or</w:t>
@@ -9490,7 +9362,6 @@
       <w:r>
         <w:t>See [</w:t>
       </w:r>
-      <w:proofErr w:type="spellStart"/>
       <w:r>
         <w:rPr>
           <w:rFonts w:hint="eastAsia"/>
@@ -9524,11 +9395,7 @@
         <w:fldChar w:fldCharType="separate"/>
       </w:r>
       <w:r>
-        <w:t>Functioncode</w:t>
-      </w:r>
-      <w:proofErr w:type="spellEnd"/>
-      <w:r>
-        <w:t xml:space="preserve"> to write holding registers</w:t>
+        <w:t>Functioncode to write holding registers</w:t>
       </w:r>
       <w:r>
         <w:rPr>
@@ -10210,21 +10077,7 @@
               <w:rPr>
                 <w:rFonts w:hint="eastAsia"/>
               </w:rPr>
-              <w:t>end-of-message timeout (</w:t>
-            </w:r>
-            <w:proofErr w:type="spellStart"/>
-            <w:r>
-              <w:rPr>
-                <w:rFonts w:hint="eastAsia"/>
-              </w:rPr>
-              <w:t>ms</w:t>
-            </w:r>
-            <w:proofErr w:type="spellEnd"/>
-            <w:r>
-              <w:rPr>
-                <w:rFonts w:hint="eastAsia"/>
-              </w:rPr>
-              <w:t>)</w:t>
+              <w:t>end-of-message timeout (ms)</w:t>
             </w:r>
             <w:r>
               <w:t>.</w:t>
@@ -10613,21 +10466,7 @@
               <w:rPr>
                 <w:rFonts w:hint="eastAsia"/>
               </w:rPr>
-              <w:t>Maximum wait time for first byte of response (</w:t>
-            </w:r>
-            <w:proofErr w:type="spellStart"/>
-            <w:r>
-              <w:rPr>
-                <w:rFonts w:hint="eastAsia"/>
-              </w:rPr>
-              <w:t>ms</w:t>
-            </w:r>
-            <w:proofErr w:type="spellEnd"/>
-            <w:r>
-              <w:rPr>
-                <w:rFonts w:hint="eastAsia"/>
-              </w:rPr>
-              <w:t>)</w:t>
+              <w:t>Maximum wait time for first byte of response (ms)</w:t>
             </w:r>
             <w:r>
               <w:t>.</w:t>
@@ -10680,21 +10519,7 @@
               <w:rPr>
                 <w:rFonts w:hint="eastAsia"/>
               </w:rPr>
-              <w:t>Delay before sending next query (</w:t>
-            </w:r>
-            <w:proofErr w:type="spellStart"/>
-            <w:r>
-              <w:rPr>
-                <w:rFonts w:hint="eastAsia"/>
-              </w:rPr>
-              <w:t>ms</w:t>
-            </w:r>
-            <w:proofErr w:type="spellEnd"/>
-            <w:r>
-              <w:rPr>
-                <w:rFonts w:hint="eastAsia"/>
-              </w:rPr>
-              <w:t>)</w:t>
+              <w:t>Delay before sending next query (ms)</w:t>
             </w:r>
             <w:r>
               <w:t>.</w:t>
@@ -10843,15 +10668,7 @@
               <w:t>period for reading the registers from the slave/server</w:t>
             </w:r>
             <w:r>
-              <w:t xml:space="preserve"> (</w:t>
-            </w:r>
-            <w:proofErr w:type="spellStart"/>
-            <w:r>
-              <w:t>ms</w:t>
-            </w:r>
-            <w:proofErr w:type="spellEnd"/>
-            <w:r>
-              <w:t>)</w:t>
+              <w:t xml:space="preserve"> (ms)</w:t>
             </w:r>
             <w:r>
               <w:t>.</w:t>
@@ -11143,7 +10960,16 @@
         <w:t xml:space="preserve"> (or path)</w:t>
       </w:r>
       <w:r>
-        <w:t xml:space="preserve"> is required. </w:t>
+        <w:t xml:space="preserve"> is required</w:t>
+      </w:r>
+      <w:r>
+        <w:t xml:space="preserve">. Connection parameters in the mbc file </w:t>
+      </w:r>
+      <w:r>
+        <w:t>can be overridden by command line options.</w:t>
+      </w:r>
+      <w:r>
+        <w:t xml:space="preserve"> </w:t>
       </w:r>
     </w:p>
     <w:p>
@@ -11630,21 +11456,7 @@
               <w:rPr>
                 <w:rFonts w:hint="eastAsia"/>
               </w:rPr>
-              <w:t>end-of-message timeout (</w:t>
-            </w:r>
-            <w:proofErr w:type="spellStart"/>
-            <w:r>
-              <w:rPr>
-                <w:rFonts w:hint="eastAsia"/>
-              </w:rPr>
-              <w:t>ms</w:t>
-            </w:r>
-            <w:proofErr w:type="spellEnd"/>
-            <w:r>
-              <w:rPr>
-                <w:rFonts w:hint="eastAsia"/>
-              </w:rPr>
-              <w:t>)</w:t>
+              <w:t>end-of-message timeout (ms)</w:t>
             </w:r>
             <w:r>
               <w:t>.</w:t>
@@ -11996,21 +11808,7 @@
               <w:rPr>
                 <w:rFonts w:hint="eastAsia"/>
               </w:rPr>
-              <w:t>Maximum wait time for first byte of response (</w:t>
-            </w:r>
-            <w:proofErr w:type="spellStart"/>
-            <w:r>
-              <w:rPr>
-                <w:rFonts w:hint="eastAsia"/>
-              </w:rPr>
-              <w:t>ms</w:t>
-            </w:r>
-            <w:proofErr w:type="spellEnd"/>
-            <w:r>
-              <w:rPr>
-                <w:rFonts w:hint="eastAsia"/>
-              </w:rPr>
-              <w:t>)</w:t>
+              <w:t>Maximum wait time for first byte of response (ms)</w:t>
             </w:r>
             <w:r>
               <w:t>.</w:t>
@@ -12057,21 +11855,7 @@
               <w:rPr>
                 <w:rFonts w:hint="eastAsia"/>
               </w:rPr>
-              <w:t>Delay before sending next query (</w:t>
-            </w:r>
-            <w:proofErr w:type="spellStart"/>
-            <w:r>
-              <w:rPr>
-                <w:rFonts w:hint="eastAsia"/>
-              </w:rPr>
-              <w:t>ms</w:t>
-            </w:r>
-            <w:proofErr w:type="spellEnd"/>
-            <w:r>
-              <w:rPr>
-                <w:rFonts w:hint="eastAsia"/>
-              </w:rPr>
-              <w:t>)</w:t>
+              <w:t>Delay before sending next query (ms)</w:t>
             </w:r>
             <w:r>
               <w:t>.</w:t>
@@ -12613,7 +12397,6 @@
               </w:rPr>
               <w:t>-tabs &lt;</w:t>
             </w:r>
-            <w:proofErr w:type="spellStart"/>
             <w:r>
               <w:rPr>
                 <w:rFonts w:hint="eastAsia"/>
@@ -12622,14 +12405,12 @@
               </w:rPr>
               <w:t>tabname</w:t>
             </w:r>
-            <w:proofErr w:type="spellEnd"/>
             <w:r>
               <w:rPr>
                 <w:rFonts w:hint="eastAsia"/>
               </w:rPr>
               <w:t>&gt; [</w:t>
             </w:r>
-            <w:proofErr w:type="spellStart"/>
             <w:r>
               <w:rPr>
                 <w:rFonts w:hint="eastAsia"/>
@@ -12638,7 +12419,6 @@
               </w:rPr>
               <w:t>tabname</w:t>
             </w:r>
-            <w:proofErr w:type="spellEnd"/>
             <w:r>
               <w:rPr>
                 <w:rFonts w:hint="eastAsia"/>
@@ -12763,13 +12543,8 @@
               </w:rPr>
             </w:pPr>
             <w:r>
-              <w:t>-</w:t>
-            </w:r>
-            <w:proofErr w:type="spellStart"/>
-            <w:r>
-              <w:t>logtime</w:t>
-            </w:r>
-            <w:proofErr w:type="spellEnd"/>
+              <w:t>-logtime</w:t>
+            </w:r>
           </w:p>
         </w:tc>
         <w:tc>
@@ -13744,21 +13519,7 @@
               <w:rPr>
                 <w:rFonts w:hint="eastAsia"/>
               </w:rPr>
-              <w:t>end-of-message timeout (</w:t>
-            </w:r>
-            <w:proofErr w:type="spellStart"/>
-            <w:r>
-              <w:rPr>
-                <w:rFonts w:hint="eastAsia"/>
-              </w:rPr>
-              <w:t>ms</w:t>
-            </w:r>
-            <w:proofErr w:type="spellEnd"/>
-            <w:r>
-              <w:rPr>
-                <w:rFonts w:hint="eastAsia"/>
-              </w:rPr>
-              <w:t>)</w:t>
+              <w:t>end-of-message timeout (ms)</w:t>
             </w:r>
             <w:r>
               <w:t>.</w:t>
@@ -14098,21 +13859,7 @@
               <w:rPr>
                 <w:rFonts w:hint="eastAsia"/>
               </w:rPr>
-              <w:t>Maximum wait time for first byte of response (</w:t>
-            </w:r>
-            <w:proofErr w:type="spellStart"/>
-            <w:r>
-              <w:rPr>
-                <w:rFonts w:hint="eastAsia"/>
-              </w:rPr>
-              <w:t>ms</w:t>
-            </w:r>
-            <w:proofErr w:type="spellEnd"/>
-            <w:r>
-              <w:rPr>
-                <w:rFonts w:hint="eastAsia"/>
-              </w:rPr>
-              <w:t>)</w:t>
+              <w:t>Maximum wait time for first byte of response (ms)</w:t>
             </w:r>
             <w:r>
               <w:t>.</w:t>
@@ -14271,21 +14018,7 @@
               <w:rPr>
                 <w:rFonts w:hint="eastAsia"/>
               </w:rPr>
-              <w:t>Delay before sending next query (</w:t>
-            </w:r>
-            <w:proofErr w:type="spellStart"/>
-            <w:r>
-              <w:rPr>
-                <w:rFonts w:hint="eastAsia"/>
-              </w:rPr>
-              <w:t>ms</w:t>
-            </w:r>
-            <w:proofErr w:type="spellEnd"/>
-            <w:r>
-              <w:rPr>
-                <w:rFonts w:hint="eastAsia"/>
-              </w:rPr>
-              <w:t>)</w:t>
+              <w:t>Delay before sending next query (ms)</w:t>
             </w:r>
             <w:r>
               <w:t>.</w:t>
@@ -14537,7 +14270,6 @@
               </w:rPr>
               <w:t>-tabs &lt;</w:t>
             </w:r>
-            <w:proofErr w:type="spellStart"/>
             <w:r>
               <w:rPr>
                 <w:rFonts w:hint="eastAsia"/>
@@ -14546,14 +14278,12 @@
               </w:rPr>
               <w:t>tabname</w:t>
             </w:r>
-            <w:proofErr w:type="spellEnd"/>
             <w:r>
               <w:rPr>
                 <w:rFonts w:hint="eastAsia"/>
               </w:rPr>
               <w:t>&gt; [</w:t>
             </w:r>
-            <w:proofErr w:type="spellStart"/>
             <w:r>
               <w:rPr>
                 <w:rFonts w:hint="eastAsia"/>
@@ -14562,7 +14292,6 @@
               </w:rPr>
               <w:t>tabname</w:t>
             </w:r>
-            <w:proofErr w:type="spellEnd"/>
             <w:r>
               <w:rPr>
                 <w:rFonts w:hint="eastAsia"/>
@@ -14684,13 +14413,8 @@
               </w:rPr>
             </w:pPr>
             <w:r>
-              <w:t>-</w:t>
-            </w:r>
-            <w:proofErr w:type="spellStart"/>
-            <w:r>
-              <w:t>logtime</w:t>
-            </w:r>
-            <w:proofErr w:type="spellEnd"/>
+              <w:t>-logtime</w:t>
+            </w:r>
           </w:p>
         </w:tc>
         <w:tc>
@@ -15354,25 +15078,7 @@
           <w:sz w:val="18"/>
           <w:szCs w:val="18"/>
         </w:rPr>
-        <w:t xml:space="preserve">Format (Int, </w:t>
-      </w:r>
-      <w:proofErr w:type="spellStart"/>
-      <w:r>
-        <w:rPr>
-          <w:rFonts w:cs="Liberation Serif"/>
-          <w:sz w:val="18"/>
-          <w:szCs w:val="18"/>
-        </w:rPr>
-        <w:t>UInt</w:t>
-      </w:r>
-      <w:proofErr w:type="spellEnd"/>
-      <w:r>
-        <w:rPr>
-          <w:rFonts w:cs="Liberation Serif"/>
-          <w:sz w:val="18"/>
-          <w:szCs w:val="18"/>
-        </w:rPr>
-        <w:t>, Hex, Binary, Float, ASCII</w:t>
+        <w:t>Format (Int, UInt, Hex, Binary, Float, ASCII</w:t>
       </w:r>
       <w:r>
         <w:rPr>
@@ -15852,15 +15558,7 @@
         </w:rPr>
       </w:pPr>
       <w:r>
-        <w:t xml:space="preserve">The mbc project file is an XML formatted text file that is both human-readable and machine-readable. ModbusControl does not (yet) support creation of a project file so it has to be edited manually. You can also use the example project </w:t>
-      </w:r>
-      <w:proofErr w:type="spellStart"/>
-      <w:r>
-        <w:t>Demo.mbc</w:t>
-      </w:r>
-      <w:proofErr w:type="spellEnd"/>
-      <w:r>
-        <w:t xml:space="preserve"> to start from. You</w:t>
+        <w:t>The mbc project file is an XML formatted text file that is both human-readable and machine-readable. ModbusControl does not (yet) support creation of a project file so it has to be edited manually. You can also use the example project Demo.mbc to start from. You</w:t>
       </w:r>
       <w:r>
         <w:t>’</w:t>
@@ -15876,33 +15574,17 @@
         </w:rPr>
       </w:pPr>
       <w:r>
-        <w:t xml:space="preserve">Some editors like Notepad++ recognize an XML file and apply XML syntax </w:t>
-      </w:r>
-      <w:proofErr w:type="spellStart"/>
-      <w:r>
-        <w:t>coloring</w:t>
-      </w:r>
-      <w:proofErr w:type="spellEnd"/>
-      <w:r>
-        <w:t xml:space="preserve">. This makes the editing easier. </w:t>
-      </w:r>
-    </w:p>
-    <w:p>
-      <w:pPr>
-        <w:rPr>
-          <w:rFonts w:hint="eastAsia"/>
-        </w:rPr>
-      </w:pPr>
-      <w:r>
-        <w:t>XML tags are case sensitive! Nowadays ModbusControl uses all lowercase XML tags, but older versions used a mix of camel-case tags like “</w:t>
-      </w:r>
-      <w:proofErr w:type="spellStart"/>
-      <w:r>
-        <w:t>SampleRate</w:t>
-      </w:r>
-      <w:proofErr w:type="spellEnd"/>
-      <w:r>
-        <w:t>” and lowercase tags. It is recommended to use all lowercase tags now. ModbusControl still recognizes the old camel-case tags for compatibility.</w:t>
+        <w:t xml:space="preserve">Some editors like Notepad++ recognize an XML file and apply XML syntax coloring. This makes the editing easier. </w:t>
+      </w:r>
+    </w:p>
+    <w:p>
+      <w:pPr>
+        <w:rPr>
+          <w:rFonts w:hint="eastAsia"/>
+        </w:rPr>
+      </w:pPr>
+      <w:r>
+        <w:t>XML tags are case sensitive! Nowadays ModbusControl uses all lowercase XML tags, but older versions used a mix of camel-case tags like “SampleRate” and lowercase tags. It is recommended to use all lowercase tags now. ModbusControl still recognizes the old camel-case tags for compatibility.</w:t>
       </w:r>
     </w:p>
     <w:p>
@@ -15917,21 +15599,7 @@
         <w:rPr>
           <w:lang w:val="en-GB"/>
         </w:rPr>
-        <w:t>The &lt;</w:t>
-      </w:r>
-      <w:proofErr w:type="spellStart"/>
-      <w:r>
-        <w:rPr>
-          <w:lang w:val="en-GB"/>
-        </w:rPr>
-        <w:t>modbuscontrol</w:t>
-      </w:r>
-      <w:proofErr w:type="spellEnd"/>
-      <w:r>
-        <w:rPr>
-          <w:lang w:val="en-GB"/>
-        </w:rPr>
-        <w:t>&gt; root element</w:t>
+        <w:t>The &lt;modbuscontrol&gt; root element</w:t>
       </w:r>
       <w:bookmarkEnd w:id="45"/>
     </w:p>
@@ -15945,15 +15613,7 @@
         <w:t xml:space="preserve">An XML file requires a single </w:t>
       </w:r>
       <w:r>
-        <w:t>&lt;</w:t>
-      </w:r>
-      <w:proofErr w:type="spellStart"/>
-      <w:r>
-        <w:t>modbuscontrol</w:t>
-      </w:r>
-      <w:proofErr w:type="spellEnd"/>
-      <w:r>
-        <w:t xml:space="preserve">&gt; </w:t>
+        <w:t xml:space="preserve">&lt;modbuscontrol&gt; </w:t>
       </w:r>
       <w:r>
         <w:t>root element that contains all the other elements. It supports the following elements:</w:t>
@@ -16069,21 +15729,7 @@
                 <w:lang w:val="en-GB"/>
               </w:rPr>
               <w:lastRenderedPageBreak/>
-              <w:t>&lt;</w:t>
-            </w:r>
-            <w:proofErr w:type="spellStart"/>
-            <w:r>
-              <w:rPr>
-                <w:lang w:val="en-GB"/>
-              </w:rPr>
-              <w:t>modbustcpserver</w:t>
-            </w:r>
-            <w:proofErr w:type="spellEnd"/>
-            <w:r>
-              <w:rPr>
-                <w:lang w:val="en-GB"/>
-              </w:rPr>
-              <w:t>&gt;</w:t>
+              <w:t>&lt;modbustcpserver&gt;</w:t>
             </w:r>
           </w:p>
         </w:tc>
@@ -16122,21 +15768,7 @@
               <w:rPr>
                 <w:lang w:val="en-GB"/>
               </w:rPr>
-              <w:t>&lt;</w:t>
-            </w:r>
-            <w:proofErr w:type="spellStart"/>
-            <w:r>
-              <w:rPr>
-                <w:lang w:val="en-GB"/>
-              </w:rPr>
-              <w:t>autostart</w:t>
-            </w:r>
-            <w:proofErr w:type="spellEnd"/>
-            <w:r>
-              <w:rPr>
-                <w:lang w:val="en-GB"/>
-              </w:rPr>
-              <w:t>&gt;</w:t>
+              <w:t>&lt;autostart&gt;</w:t>
             </w:r>
           </w:p>
         </w:tc>
@@ -16747,15 +16379,7 @@
               </w:rPr>
             </w:pPr>
             <w:r>
-              <w:t>Value “serial/</w:t>
-            </w:r>
-            <w:proofErr w:type="spellStart"/>
-            <w:r>
-              <w:t>rtu</w:t>
-            </w:r>
-            <w:proofErr w:type="spellEnd"/>
-            <w:r>
-              <w:t>” for serial port with RTU protocol.</w:t>
+              <w:t>Value “serial/rtu” for serial port with RTU protocol.</w:t>
             </w:r>
           </w:p>
           <w:p>
@@ -16766,15 +16390,7 @@
               </w:rPr>
             </w:pPr>
             <w:r>
-              <w:t>Value “modbus/</w:t>
-            </w:r>
-            <w:proofErr w:type="spellStart"/>
-            <w:r>
-              <w:t>tcp</w:t>
-            </w:r>
-            <w:proofErr w:type="spellEnd"/>
-            <w:r>
-              <w:t>” for TCP connection with Modbus/TCP protocol.</w:t>
+              <w:t>Value “modbus/tcp” for TCP connection with Modbus/TCP protocol.</w:t>
             </w:r>
           </w:p>
           <w:p>
@@ -16785,23 +16401,7 @@
               </w:rPr>
             </w:pPr>
             <w:r>
-              <w:t>Value “</w:t>
-            </w:r>
-            <w:proofErr w:type="spellStart"/>
-            <w:r>
-              <w:t>rtu</w:t>
-            </w:r>
-            <w:proofErr w:type="spellEnd"/>
-            <w:r>
-              <w:t>/</w:t>
-            </w:r>
-            <w:proofErr w:type="spellStart"/>
-            <w:r>
-              <w:t>tcp</w:t>
-            </w:r>
-            <w:proofErr w:type="spellEnd"/>
-            <w:r>
-              <w:t>” for TCP connection with RTU protocol.</w:t>
+              <w:t>Value “rtu/tcp” for TCP connection with RTU protocol.</w:t>
             </w:r>
           </w:p>
         </w:tc>
@@ -17188,21 +16788,7 @@
               <w:rPr>
                 <w:lang w:val="en-GB"/>
               </w:rPr>
-              <w:t>&lt;</w:t>
-            </w:r>
-            <w:proofErr w:type="spellStart"/>
-            <w:r>
-              <w:rPr>
-                <w:lang w:val="en-GB"/>
-              </w:rPr>
-              <w:t>maximumframesize</w:t>
-            </w:r>
-            <w:proofErr w:type="spellEnd"/>
-            <w:r>
-              <w:rPr>
-                <w:lang w:val="en-GB"/>
-              </w:rPr>
-              <w:t>&gt;</w:t>
+              <w:t>&lt;maximumframesize&gt;</w:t>
             </w:r>
           </w:p>
         </w:tc>
@@ -17307,21 +16893,7 @@
               <w:rPr>
                 <w:lang w:val="en-GB"/>
               </w:rPr>
-              <w:t>&lt;</w:t>
-            </w:r>
-            <w:proofErr w:type="spellStart"/>
-            <w:r>
-              <w:rPr>
-                <w:lang w:val="en-GB"/>
-              </w:rPr>
-              <w:t>writeholdingregisterfc</w:t>
-            </w:r>
-            <w:proofErr w:type="spellEnd"/>
-            <w:r>
-              <w:rPr>
-                <w:lang w:val="en-GB"/>
-              </w:rPr>
-              <w:t>&gt;</w:t>
+              <w:t>&lt;writeholdingregisterfc&gt;</w:t>
             </w:r>
           </w:p>
         </w:tc>
@@ -17625,21 +17197,7 @@
               <w:rPr>
                 <w:lang w:val="en-GB"/>
               </w:rPr>
-              <w:t>&lt;</w:t>
-            </w:r>
-            <w:proofErr w:type="spellStart"/>
-            <w:r>
-              <w:rPr>
-                <w:lang w:val="en-GB"/>
-              </w:rPr>
-              <w:t>holdingregisterstart</w:t>
-            </w:r>
-            <w:proofErr w:type="spellEnd"/>
-            <w:r>
-              <w:rPr>
-                <w:lang w:val="en-GB"/>
-              </w:rPr>
-              <w:t>&gt;</w:t>
+              <w:t>&lt;holdingregisterstart&gt;</w:t>
             </w:r>
           </w:p>
         </w:tc>
@@ -17824,17 +17382,73 @@
           <w:rStyle w:val="XMLContent"/>
           <w:lang w:val="en-GB"/>
         </w:rPr>
-        <w:t>serial/</w:t>
-      </w:r>
-      <w:proofErr w:type="spellStart"/>
+        <w:t>serial/rtu</w:t>
+      </w:r>
+      <w:r>
+        <w:rPr>
+          <w:rStyle w:val="XMLBracket"/>
+          <w:lang w:val="en-GB"/>
+        </w:rPr>
+        <w:t>&lt;/</w:t>
+      </w:r>
+      <w:r>
+        <w:rPr>
+          <w:rStyle w:val="XMLElement"/>
+          <w:lang w:val="en-GB"/>
+        </w:rPr>
+        <w:t>connection</w:t>
+      </w:r>
+      <w:r>
+        <w:rPr>
+          <w:rStyle w:val="XMLBracket"/>
+          <w:lang w:val="en-GB"/>
+        </w:rPr>
+        <w:t>&gt;</w:t>
+      </w:r>
+    </w:p>
+    <w:p>
+      <w:pPr>
+        <w:pStyle w:val="XMLvoorbeeld"/>
+        <w:rPr>
+          <w:lang w:val="en-GB"/>
+        </w:rPr>
+      </w:pPr>
+      <w:r>
+        <w:rPr>
+          <w:rStyle w:val="XMLBracket"/>
+          <w:rFonts w:eastAsia="Courier New"/>
+          <w:lang w:val="en-GB"/>
+        </w:rPr>
+        <w:t xml:space="preserve">  </w:t>
+      </w:r>
+      <w:r>
+        <w:rPr>
+          <w:rStyle w:val="XMLBracket"/>
+          <w:lang w:val="en-GB"/>
+        </w:rPr>
+        <w:t>&lt;</w:t>
+      </w:r>
+      <w:r>
+        <w:rPr>
+          <w:rStyle w:val="XMLElement"/>
+          <w:lang w:val="en-GB"/>
+        </w:rPr>
+        <w:t>port</w:t>
+      </w:r>
+      <w:r>
+        <w:rPr>
+          <w:rStyle w:val="XMLBracket"/>
+          <w:lang w:val="en-GB"/>
+        </w:rPr>
+        <w:t>&gt;</w:t>
+      </w:r>
       <w:r>
         <w:rPr>
           <w:rStyle w:val="XMLContent"/>
           <w:lang w:val="en-GB"/>
         </w:rPr>
-        <w:t>rtu</w:t>
-      </w:r>
-      <w:proofErr w:type="spellEnd"/>
+        <w:t>COM1</w:t>
+      </w:r>
       <w:r>
         <w:rPr>
           <w:rStyle w:val="XMLBracket"/>
@@ -17847,7 +17461,7 @@
           <w:rStyle w:val="XMLElement"/>
           <w:lang w:val="en-GB"/>
         </w:rPr>
-        <w:t>connection</w:t>
+        <w:t>port</w:t>
       </w:r>
       <w:r>
         <w:rPr>
@@ -17884,7 +17498,7 @@
           <w:rStyle w:val="XMLElement"/>
           <w:lang w:val="en-GB"/>
         </w:rPr>
-        <w:t>port</w:t>
+        <w:t>baudrate</w:t>
       </w:r>
       <w:r>
         <w:rPr>
@@ -17898,7 +17512,7 @@
           <w:rStyle w:val="XMLContent"/>
           <w:lang w:val="en-GB"/>
         </w:rPr>
-        <w:t>COM1</w:t>
+        <w:t>19200</w:t>
       </w:r>
       <w:r>
         <w:rPr>
@@ -17912,7 +17526,7 @@
           <w:rStyle w:val="XMLElement"/>
           <w:lang w:val="en-GB"/>
         </w:rPr>
-        <w:t>port</w:t>
+        <w:t>baudrate</w:t>
       </w:r>
       <w:r>
         <w:rPr>
@@ -17949,7 +17563,7 @@
           <w:rStyle w:val="XMLElement"/>
           <w:lang w:val="en-GB"/>
         </w:rPr>
-        <w:t>baudrate</w:t>
+        <w:t>parity</w:t>
       </w:r>
       <w:r>
         <w:rPr>
@@ -17963,7 +17577,7 @@
           <w:rStyle w:val="XMLContent"/>
           <w:lang w:val="en-GB"/>
         </w:rPr>
-        <w:t>19200</w:t>
+        <w:t>none</w:t>
       </w:r>
       <w:r>
         <w:rPr>
@@ -17977,7 +17591,7 @@
           <w:rStyle w:val="XMLElement"/>
           <w:lang w:val="en-GB"/>
         </w:rPr>
-        <w:t>baudrate</w:t>
+        <w:t>parity</w:t>
       </w:r>
       <w:r>
         <w:rPr>
@@ -18014,7 +17628,7 @@
           <w:rStyle w:val="XMLElement"/>
           <w:lang w:val="en-GB"/>
         </w:rPr>
-        <w:t>parity</w:t>
+        <w:t>endofmessagetimeout</w:t>
       </w:r>
       <w:r>
         <w:rPr>
@@ -18028,7 +17642,7 @@
           <w:rStyle w:val="XMLContent"/>
           <w:lang w:val="en-GB"/>
         </w:rPr>
-        <w:t>none</w:t>
+        <w:t>100</w:t>
       </w:r>
       <w:r>
         <w:rPr>
@@ -18042,7 +17656,7 @@
           <w:rStyle w:val="XMLElement"/>
           <w:lang w:val="en-GB"/>
         </w:rPr>
-        <w:t>parity</w:t>
+        <w:t>endofmessagetimeout</w:t>
       </w:r>
       <w:r>
         <w:rPr>
@@ -18079,7 +17693,7 @@
           <w:rStyle w:val="XMLElement"/>
           <w:lang w:val="en-GB"/>
         </w:rPr>
-        <w:t>endofmessagetimeout</w:t>
+        <w:t>slaveid</w:t>
       </w:r>
       <w:r>
         <w:rPr>
@@ -18093,7 +17707,7 @@
           <w:rStyle w:val="XMLContent"/>
           <w:lang w:val="en-GB"/>
         </w:rPr>
-        <w:t>100</w:t>
+        <w:t>1</w:t>
       </w:r>
       <w:r>
         <w:rPr>
@@ -18107,7 +17721,7 @@
           <w:rStyle w:val="XMLElement"/>
           <w:lang w:val="en-GB"/>
         </w:rPr>
-        <w:t>endofmessagetimeout</w:t>
+        <w:t>slaveid</w:t>
       </w:r>
       <w:r>
         <w:rPr>
@@ -18144,7 +17758,7 @@
           <w:rStyle w:val="XMLElement"/>
           <w:lang w:val="en-GB"/>
         </w:rPr>
-        <w:t>slaveid</w:t>
+        <w:t>responsetimeout</w:t>
       </w:r>
       <w:r>
         <w:rPr>
@@ -18158,7 +17772,7 @@
           <w:rStyle w:val="XMLContent"/>
           <w:lang w:val="en-GB"/>
         </w:rPr>
-        <w:t>1</w:t>
+        <w:t>1000</w:t>
       </w:r>
       <w:r>
         <w:rPr>
@@ -18172,7 +17786,7 @@
           <w:rStyle w:val="XMLElement"/>
           <w:lang w:val="en-GB"/>
         </w:rPr>
-        <w:t>slaveid</w:t>
+        <w:t>responsetimeout</w:t>
       </w:r>
       <w:r>
         <w:rPr>
@@ -18209,7 +17823,7 @@
           <w:rStyle w:val="XMLElement"/>
           <w:lang w:val="en-GB"/>
         </w:rPr>
-        <w:t>responsetimeout</w:t>
+        <w:t>maximumframesize</w:t>
       </w:r>
       <w:r>
         <w:rPr>
@@ -18223,7 +17837,7 @@
           <w:rStyle w:val="XMLContent"/>
           <w:lang w:val="en-GB"/>
         </w:rPr>
-        <w:t>1000</w:t>
+        <w:t>256</w:t>
       </w:r>
       <w:r>
         <w:rPr>
@@ -18237,7 +17851,7 @@
           <w:rStyle w:val="XMLElement"/>
           <w:lang w:val="en-GB"/>
         </w:rPr>
-        <w:t>responsetimeout</w:t>
+        <w:t>maximumframesize</w:t>
       </w:r>
       <w:r>
         <w:rPr>
@@ -18269,15 +17883,13 @@
         </w:rPr>
         <w:t>&lt;</w:t>
       </w:r>
-      <w:proofErr w:type="spellStart"/>
       <w:r>
         <w:rPr>
           <w:rStyle w:val="XMLElement"/>
           <w:lang w:val="en-GB"/>
         </w:rPr>
-        <w:t>maximumframesize</w:t>
-      </w:r>
-      <w:proofErr w:type="spellEnd"/>
+        <w:t>writeholdingregisterfc</w:t>
+      </w:r>
       <w:r>
         <w:rPr>
           <w:rStyle w:val="XMLBracket"/>
@@ -18290,7 +17902,7 @@
           <w:rStyle w:val="XMLContent"/>
           <w:lang w:val="en-GB"/>
         </w:rPr>
-        <w:t>256</w:t>
+        <w:t>16</w:t>
       </w:r>
       <w:r>
         <w:rPr>
@@ -18299,84 +17911,13 @@
         </w:rPr>
         <w:t>&lt;/</w:t>
       </w:r>
-      <w:proofErr w:type="spellStart"/>
       <w:r>
         <w:rPr>
           <w:rStyle w:val="XMLElement"/>
           <w:lang w:val="en-GB"/>
         </w:rPr>
-        <w:t>maximumframesize</w:t>
-      </w:r>
-      <w:proofErr w:type="spellEnd"/>
-      <w:r>
-        <w:rPr>
-          <w:rStyle w:val="XMLBracket"/>
-          <w:lang w:val="en-GB"/>
-        </w:rPr>
-        <w:t>&gt;</w:t>
-      </w:r>
-    </w:p>
-    <w:p>
-      <w:pPr>
-        <w:pStyle w:val="XMLvoorbeeld"/>
-        <w:rPr>
-          <w:lang w:val="en-GB"/>
-        </w:rPr>
-      </w:pPr>
-      <w:r>
-        <w:rPr>
-          <w:rStyle w:val="XMLBracket"/>
-          <w:rFonts w:eastAsia="Courier New"/>
-          <w:lang w:val="en-GB"/>
-        </w:rPr>
-        <w:t xml:space="preserve">  </w:t>
-      </w:r>
-      <w:r>
-        <w:rPr>
-          <w:rStyle w:val="XMLBracket"/>
-          <w:lang w:val="en-GB"/>
-        </w:rPr>
-        <w:t>&lt;</w:t>
-      </w:r>
-      <w:proofErr w:type="spellStart"/>
-      <w:r>
-        <w:rPr>
-          <w:rStyle w:val="XMLElement"/>
-          <w:lang w:val="en-GB"/>
-        </w:rPr>
         <w:t>writeholdingregisterfc</w:t>
       </w:r>
-      <w:proofErr w:type="spellEnd"/>
-      <w:r>
-        <w:rPr>
-          <w:rStyle w:val="XMLBracket"/>
-          <w:lang w:val="en-GB"/>
-        </w:rPr>
-        <w:t>&gt;</w:t>
-      </w:r>
-      <w:r>
-        <w:rPr>
-          <w:rStyle w:val="XMLContent"/>
-          <w:lang w:val="en-GB"/>
-        </w:rPr>
-        <w:t>16</w:t>
-      </w:r>
-      <w:r>
-        <w:rPr>
-          <w:rStyle w:val="XMLBracket"/>
-          <w:lang w:val="en-GB"/>
-        </w:rPr>
-        <w:t>&lt;/</w:t>
-      </w:r>
-      <w:proofErr w:type="spellStart"/>
-      <w:r>
-        <w:rPr>
-          <w:rStyle w:val="XMLElement"/>
-          <w:lang w:val="en-GB"/>
-        </w:rPr>
-        <w:t>writeholdingregisterfc</w:t>
-      </w:r>
-      <w:proofErr w:type="spellEnd"/>
       <w:r>
         <w:rPr>
           <w:rStyle w:val="XMLBracket"/>
@@ -18770,21 +18311,7 @@
               <w:rPr>
                 <w:lang w:val="en-GB"/>
               </w:rPr>
-              <w:t>&lt;</w:t>
-            </w:r>
-            <w:proofErr w:type="spellStart"/>
-            <w:r>
-              <w:rPr>
-                <w:lang w:val="en-GB"/>
-              </w:rPr>
-              <w:t>exportorder</w:t>
-            </w:r>
-            <w:proofErr w:type="spellEnd"/>
-            <w:r>
-              <w:rPr>
-                <w:lang w:val="en-GB"/>
-              </w:rPr>
-              <w:t>&gt;</w:t>
+              <w:t>&lt;exportorder&gt;</w:t>
             </w:r>
           </w:p>
         </w:tc>
@@ -18834,25 +18361,21 @@
             <w:r>
               <w:t xml:space="preserve">. The tab pages are exported in order of ascending </w:t>
             </w:r>
-            <w:proofErr w:type="spellStart"/>
             <w:r>
               <w:rPr>
                 <w:rFonts w:ascii="Courier New" w:hAnsi="Courier New" w:cs="Courier New"/>
               </w:rPr>
               <w:t>exportorder</w:t>
             </w:r>
-            <w:proofErr w:type="spellEnd"/>
             <w:r>
               <w:t xml:space="preserve"> number. Tab pages that do not have an </w:t>
             </w:r>
-            <w:proofErr w:type="spellStart"/>
             <w:r>
               <w:rPr>
                 <w:rFonts w:ascii="Courier New" w:hAnsi="Courier New" w:cs="Courier New"/>
               </w:rPr>
               <w:t>exportorder</w:t>
             </w:r>
-            <w:proofErr w:type="spellEnd"/>
             <w:r>
               <w:t xml:space="preserve"> number are exported lastly, and in order of appearance in the mbc file.</w:t>
             </w:r>
@@ -18877,21 +18400,7 @@
               <w:rPr>
                 <w:lang w:val="en-GB"/>
               </w:rPr>
-              <w:t>&lt;</w:t>
-            </w:r>
-            <w:proofErr w:type="spellStart"/>
-            <w:r>
-              <w:rPr>
-                <w:lang w:val="en-GB"/>
-              </w:rPr>
-              <w:t>fcol</w:t>
-            </w:r>
-            <w:proofErr w:type="spellEnd"/>
-            <w:r>
-              <w:rPr>
-                <w:lang w:val="en-GB"/>
-              </w:rPr>
-              <w:t>&gt;</w:t>
+              <w:t>&lt;fcol&gt;</w:t>
             </w:r>
           </w:p>
         </w:tc>
@@ -18908,15 +18417,7 @@
               </w:rPr>
             </w:pPr>
             <w:r>
-              <w:t xml:space="preserve">Sets the default font (text) </w:t>
-            </w:r>
-            <w:proofErr w:type="spellStart"/>
-            <w:r>
-              <w:t>color</w:t>
-            </w:r>
-            <w:proofErr w:type="spellEnd"/>
-            <w:r>
-              <w:t xml:space="preserve"> for all &lt;var&gt; on this tab page.</w:t>
+              <w:t>Sets the default font (text) color for all &lt;var&gt; on this tab page.</w:t>
             </w:r>
           </w:p>
           <w:p>
@@ -18970,23 +18471,7 @@
               <w:fldChar w:fldCharType="separate"/>
             </w:r>
             <w:r>
-              <w:t>The &lt;</w:t>
-            </w:r>
-            <w:proofErr w:type="spellStart"/>
-            <w:r>
-              <w:t>fcol</w:t>
-            </w:r>
-            <w:proofErr w:type="spellEnd"/>
-            <w:r>
-              <w:t>&gt; and &lt;</w:t>
-            </w:r>
-            <w:proofErr w:type="spellStart"/>
-            <w:r>
-              <w:t>bcol</w:t>
-            </w:r>
-            <w:proofErr w:type="spellEnd"/>
-            <w:r>
-              <w:t>&gt; elements</w:t>
+              <w:t>The &lt;fcol&gt; and &lt;bcol&gt; elements</w:t>
             </w:r>
             <w:r>
               <w:rPr>
@@ -19026,21 +18511,7 @@
               <w:rPr>
                 <w:lang w:val="en-GB"/>
               </w:rPr>
-              <w:t>&lt;</w:t>
-            </w:r>
-            <w:proofErr w:type="spellStart"/>
-            <w:r>
-              <w:rPr>
-                <w:lang w:val="en-GB"/>
-              </w:rPr>
-              <w:t>bcol</w:t>
-            </w:r>
-            <w:proofErr w:type="spellEnd"/>
-            <w:r>
-              <w:rPr>
-                <w:lang w:val="en-GB"/>
-              </w:rPr>
-              <w:t xml:space="preserve">&gt; </w:t>
+              <w:t xml:space="preserve">&lt;bcol&gt; </w:t>
             </w:r>
           </w:p>
         </w:tc>
@@ -19057,15 +18528,7 @@
               </w:rPr>
             </w:pPr>
             <w:r>
-              <w:t xml:space="preserve">Sets the default background </w:t>
-            </w:r>
-            <w:proofErr w:type="spellStart"/>
-            <w:r>
-              <w:t>color</w:t>
-            </w:r>
-            <w:proofErr w:type="spellEnd"/>
-            <w:r>
-              <w:t xml:space="preserve"> for all &lt;var&gt; on this tab page. See [</w:t>
+              <w:t>Sets the default background color for all &lt;var&gt; on this tab page. See [</w:t>
             </w:r>
             <w:r>
               <w:rPr>
@@ -19108,23 +18571,7 @@
               <w:fldChar w:fldCharType="separate"/>
             </w:r>
             <w:r>
-              <w:t>The &lt;</w:t>
-            </w:r>
-            <w:proofErr w:type="spellStart"/>
-            <w:r>
-              <w:t>fcol</w:t>
-            </w:r>
-            <w:proofErr w:type="spellEnd"/>
-            <w:r>
-              <w:t>&gt; and &lt;</w:t>
-            </w:r>
-            <w:proofErr w:type="spellStart"/>
-            <w:r>
-              <w:t>bcol</w:t>
-            </w:r>
-            <w:proofErr w:type="spellEnd"/>
-            <w:r>
-              <w:t>&gt; elements</w:t>
+              <w:t>The &lt;fcol&gt; and &lt;bcol&gt; elements</w:t>
             </w:r>
             <w:r>
               <w:rPr>
@@ -19164,21 +18611,7 @@
               <w:rPr>
                 <w:lang w:val="en-GB"/>
               </w:rPr>
-              <w:t>&lt;</w:t>
-            </w:r>
-            <w:proofErr w:type="spellStart"/>
-            <w:r>
-              <w:rPr>
-                <w:lang w:val="en-GB"/>
-              </w:rPr>
-              <w:t>expandfields</w:t>
-            </w:r>
-            <w:proofErr w:type="spellEnd"/>
-            <w:r>
-              <w:rPr>
-                <w:lang w:val="en-GB"/>
-              </w:rPr>
-              <w:t>&gt;</w:t>
+              <w:t>&lt;expandfields&gt;</w:t>
             </w:r>
           </w:p>
         </w:tc>
@@ -19523,7 +18956,6 @@
         </w:rPr>
         <w:t>&lt;</w:t>
       </w:r>
-      <w:proofErr w:type="spellStart"/>
       <w:r>
         <w:rPr>
           <w:rStyle w:val="XMLElement"/>
@@ -19531,7 +18963,6 @@
         </w:rPr>
         <w:t>rw</w:t>
       </w:r>
-      <w:proofErr w:type="spellEnd"/>
       <w:r>
         <w:rPr>
           <w:rStyle w:val="XMLBracket"/>
@@ -19553,7 +18984,6 @@
         </w:rPr>
         <w:t>&lt;/</w:t>
       </w:r>
-      <w:proofErr w:type="spellStart"/>
       <w:r>
         <w:rPr>
           <w:rStyle w:val="XMLElement"/>
@@ -19561,7 +18991,6 @@
         </w:rPr>
         <w:t>rw</w:t>
       </w:r>
-      <w:proofErr w:type="spellEnd"/>
       <w:r>
         <w:rPr>
           <w:rStyle w:val="XMLBracket"/>
@@ -19753,7 +19182,6 @@
         </w:rPr>
         <w:t>&lt;</w:t>
       </w:r>
-      <w:proofErr w:type="spellStart"/>
       <w:r>
         <w:rPr>
           <w:rStyle w:val="XMLElement"/>
@@ -19761,7 +19189,6 @@
         </w:rPr>
         <w:t>rw</w:t>
       </w:r>
-      <w:proofErr w:type="spellEnd"/>
       <w:r>
         <w:rPr>
           <w:rStyle w:val="XMLBracket"/>
@@ -19783,7 +19210,6 @@
         </w:rPr>
         <w:t>&lt;/</w:t>
       </w:r>
-      <w:proofErr w:type="spellStart"/>
       <w:r>
         <w:rPr>
           <w:rStyle w:val="XMLElement"/>
@@ -19791,7 +19217,6 @@
         </w:rPr>
         <w:t>rw</w:t>
       </w:r>
-      <w:proofErr w:type="spellEnd"/>
       <w:r>
         <w:rPr>
           <w:rStyle w:val="XMLBracket"/>
@@ -20065,14 +19490,12 @@
               </w:rPr>
               <w:t>&lt;</w:t>
             </w:r>
-            <w:proofErr w:type="spellStart"/>
             <w:r>
               <w:rPr>
                 <w:rFonts w:hint="eastAsia"/>
               </w:rPr>
               <w:t>required</w:t>
             </w:r>
-            <w:proofErr w:type="spellEnd"/>
             <w:r>
               <w:rPr>
                 <w:lang w:val="en-GB"/>
@@ -20167,23 +19590,7 @@
           <w:rStyle w:val="XMLElement"/>
           <w:rFonts w:hint="eastAsia"/>
         </w:rPr>
-        <w:t>&lt;</w:t>
-      </w:r>
-      <w:proofErr w:type="spellStart"/>
-      <w:r>
-        <w:rPr>
-          <w:rStyle w:val="XMLElement"/>
-          <w:rFonts w:hint="eastAsia"/>
-        </w:rPr>
-        <w:t>include</w:t>
-      </w:r>
-      <w:proofErr w:type="spellEnd"/>
-      <w:r>
-        <w:rPr>
-          <w:rStyle w:val="XMLElement"/>
-          <w:rFonts w:hint="eastAsia"/>
-        </w:rPr>
-        <w:t>&gt;</w:t>
+        <w:t>&lt;include&gt;</w:t>
       </w:r>
     </w:p>
     <w:p>
@@ -20204,7 +19611,6 @@
         </w:rPr>
         <w:t>file&gt;</w:t>
       </w:r>
-      <w:proofErr w:type="spellStart"/>
       <w:r>
         <w:t>Configuration</w:t>
       </w:r>
@@ -20214,7 +19620,6 @@
         </w:rPr>
         <w:t>.mbc</w:t>
       </w:r>
-      <w:proofErr w:type="spellEnd"/>
       <w:r>
         <w:rPr>
           <w:rStyle w:val="XMLElement"/>
@@ -20241,122 +19646,58 @@
           <w:rStyle w:val="XMLElement"/>
           <w:rFonts w:hint="eastAsia"/>
         </w:rPr>
-        <w:t>&lt;</w:t>
-      </w:r>
-      <w:proofErr w:type="spellStart"/>
+        <w:t>&lt;required&gt;</w:t>
+      </w:r>
+      <w:r>
+        <w:rPr>
+          <w:rStyle w:val="XMLContent"/>
+          <w:rFonts w:hint="eastAsia"/>
+          <w:lang w:val="en-GB"/>
+        </w:rPr>
+        <w:t>false</w:t>
+      </w:r>
       <w:r>
         <w:rPr>
           <w:rStyle w:val="XMLElement"/>
           <w:rFonts w:hint="eastAsia"/>
         </w:rPr>
-        <w:t>required</w:t>
-      </w:r>
-      <w:proofErr w:type="spellEnd"/>
-      <w:r>
+        <w:t>&lt;/required&gt;</w:t>
+      </w:r>
+    </w:p>
+    <w:p>
+      <w:pPr>
+        <w:pStyle w:val="XMLvoorbeeld"/>
         <w:rPr>
           <w:rStyle w:val="XMLElement"/>
-          <w:rFonts w:hint="eastAsia"/>
-        </w:rPr>
-        <w:t>&gt;</w:t>
-      </w:r>
-      <w:r>
-        <w:rPr>
-          <w:rStyle w:val="XMLContent"/>
-          <w:rFonts w:hint="eastAsia"/>
-          <w:lang w:val="en-GB"/>
-        </w:rPr>
-        <w:t>false</w:t>
-      </w:r>
+        </w:rPr>
+      </w:pPr>
       <w:r>
         <w:rPr>
           <w:rStyle w:val="XMLElement"/>
           <w:rFonts w:hint="eastAsia"/>
         </w:rPr>
-        <w:t>&lt;/</w:t>
-      </w:r>
-      <w:proofErr w:type="spellStart"/>
+        <w:t>&lt;/include&gt;</w:t>
+      </w:r>
       <w:r>
         <w:rPr>
           <w:rStyle w:val="XMLElement"/>
-          <w:rFonts w:hint="eastAsia"/>
-        </w:rPr>
-        <w:t>required</w:t>
-      </w:r>
-      <w:proofErr w:type="spellEnd"/>
-      <w:r>
+        </w:rPr>
+        <w:br/>
+      </w:r>
+    </w:p>
+    <w:p>
+      <w:pPr>
+        <w:pStyle w:val="XMLvoorbeeld"/>
         <w:rPr>
           <w:rStyle w:val="XMLElement"/>
-          <w:rFonts w:hint="eastAsia"/>
-        </w:rPr>
-        <w:t>&gt;</w:t>
-      </w:r>
-    </w:p>
-    <w:p>
-      <w:pPr>
-        <w:pStyle w:val="XMLvoorbeeld"/>
+        </w:rPr>
+      </w:pPr>
+      <w:r>
         <w:rPr>
           <w:rStyle w:val="XMLElement"/>
-        </w:rPr>
-      </w:pPr>
-      <w:r>
-        <w:rPr>
-          <w:rStyle w:val="XMLElement"/>
-          <w:rFonts w:hint="eastAsia"/>
-        </w:rPr>
-        <w:t>&lt;/</w:t>
-      </w:r>
-      <w:proofErr w:type="spellStart"/>
-      <w:r>
-        <w:rPr>
-          <w:rStyle w:val="XMLElement"/>
-          <w:rFonts w:hint="eastAsia"/>
-        </w:rPr>
-        <w:t>include</w:t>
-      </w:r>
-      <w:proofErr w:type="spellEnd"/>
-      <w:r>
-        <w:rPr>
-          <w:rStyle w:val="XMLElement"/>
-          <w:rFonts w:hint="eastAsia"/>
-        </w:rPr>
-        <w:t>&gt;</w:t>
-      </w:r>
-      <w:r>
-        <w:rPr>
-          <w:rStyle w:val="XMLElement"/>
-        </w:rPr>
-        <w:br/>
-      </w:r>
-    </w:p>
-    <w:p>
-      <w:pPr>
-        <w:pStyle w:val="XMLvoorbeeld"/>
-        <w:rPr>
-          <w:rStyle w:val="XMLElement"/>
-        </w:rPr>
-      </w:pPr>
-      <w:r>
-        <w:rPr>
-          <w:rStyle w:val="XMLElement"/>
-          <w:rFonts w:hint="eastAsia"/>
-        </w:rPr>
-        <w:t>&lt;</w:t>
-      </w:r>
-      <w:proofErr w:type="spellStart"/>
-      <w:r>
-        <w:rPr>
-          <w:rStyle w:val="XMLElement"/>
-          <w:rFonts w:hint="eastAsia"/>
-        </w:rPr>
-        <w:t>includex</w:t>
-      </w:r>
-      <w:proofErr w:type="spellEnd"/>
-      <w:r>
-        <w:rPr>
-          <w:rStyle w:val="XMLElement"/>
-          <w:rFonts w:hint="eastAsia"/>
-        </w:rPr>
-        <w:t>&gt;</w:t>
+          <w:rFonts w:hint="eastAsia"/>
+        </w:rPr>
+        <w:t>&lt;includex&gt;</w:t>
       </w:r>
     </w:p>
     <w:p>
@@ -20405,7 +19746,6 @@
         </w:rPr>
         <w:t>\</w:t>
       </w:r>
-      <w:proofErr w:type="spellStart"/>
       <w:r>
         <w:rPr>
           <w:rStyle w:val="XMLContent"/>
@@ -20421,7 +19761,6 @@
         </w:rPr>
         <w:t>.mbc</w:t>
       </w:r>
-      <w:proofErr w:type="spellEnd"/>
       <w:r>
         <w:rPr>
           <w:rStyle w:val="XMLElement"/>
@@ -20443,23 +19782,7 @@
           <w:rStyle w:val="XMLElement"/>
           <w:rFonts w:hint="eastAsia"/>
         </w:rPr>
-        <w:t>&lt;/</w:t>
-      </w:r>
-      <w:proofErr w:type="spellStart"/>
-      <w:r>
-        <w:rPr>
-          <w:rStyle w:val="XMLElement"/>
-          <w:rFonts w:hint="eastAsia"/>
-        </w:rPr>
-        <w:t>include</w:t>
-      </w:r>
-      <w:proofErr w:type="spellEnd"/>
-      <w:r>
-        <w:rPr>
-          <w:rStyle w:val="XMLElement"/>
-          <w:rFonts w:hint="eastAsia"/>
-        </w:rPr>
-        <w:t>&gt;</w:t>
+        <w:t>&lt;/include&gt;</w:t>
       </w:r>
     </w:p>
     <w:p>
@@ -20543,15 +19866,7 @@
               </w:rPr>
             </w:pPr>
             <w:r>
-              <w:t>The modbus register number. Numbering depends on the &lt;</w:t>
-            </w:r>
-            <w:proofErr w:type="spellStart"/>
-            <w:r>
-              <w:t>holdingregisterstart</w:t>
-            </w:r>
-            <w:proofErr w:type="spellEnd"/>
-            <w:r>
-              <w:t>&gt; element. Holding registers numbering usually starts at 40001.</w:t>
+              <w:t>The modbus register number. Numbering depends on the &lt;holdingregisterstart&gt; element. Holding registers numbering usually starts at 40001.</w:t>
             </w:r>
           </w:p>
         </w:tc>
@@ -20673,22 +19988,14 @@
               <w:rPr>
                 <w:lang w:val="en-GB"/>
               </w:rPr>
-              <w:t>&lt;</w:t>
-            </w:r>
-            <w:proofErr w:type="spellStart"/>
+              <w:t>&lt;longdesc</w:t>
+            </w:r>
             <w:r>
               <w:rPr>
                 <w:lang w:val="en-GB"/>
               </w:rPr>
-              <w:t>longdesc</w:t>
-            </w:r>
-            <w:r>
-              <w:rPr>
-                <w:lang w:val="en-GB"/>
-              </w:rPr>
               <w:t>r</w:t>
             </w:r>
-            <w:proofErr w:type="spellEnd"/>
             <w:r>
               <w:rPr>
                 <w:lang w:val="en-GB"/>
@@ -20835,21 +20142,7 @@
               <w:rPr>
                 <w:lang w:val="en-GB"/>
               </w:rPr>
-              <w:t>&lt;</w:t>
-            </w:r>
-            <w:proofErr w:type="spellStart"/>
-            <w:r>
-              <w:rPr>
-                <w:lang w:val="en-GB"/>
-              </w:rPr>
-              <w:t>minlen</w:t>
-            </w:r>
-            <w:proofErr w:type="spellEnd"/>
-            <w:r>
-              <w:rPr>
-                <w:lang w:val="en-GB"/>
-              </w:rPr>
-              <w:t>&gt;</w:t>
+              <w:t>&lt;minlen&gt;</w:t>
             </w:r>
           </w:p>
         </w:tc>
@@ -20866,15 +20159,7 @@
               </w:rPr>
             </w:pPr>
             <w:r>
-              <w:t xml:space="preserve">Determines the minimum number of digits shown for the value. It adds leading zeros if needed. It is useful when showing a register value in binary or hexadecimal format to avoid that the value jumps left and right when the upper bits change. Example: 15 (decimal) with hex format and </w:t>
-            </w:r>
-            <w:proofErr w:type="spellStart"/>
-            <w:r>
-              <w:t>minlen</w:t>
-            </w:r>
-            <w:proofErr w:type="spellEnd"/>
-            <w:r>
-              <w:t xml:space="preserve">=4 will be </w:t>
+              <w:t xml:space="preserve">Determines the minimum number of digits shown for the value. It adds leading zeros if needed. It is useful when showing a register value in binary or hexadecimal format to avoid that the value jumps left and right when the upper bits change. Example: 15 (decimal) with hex format and minlen=4 will be </w:t>
             </w:r>
             <w:r>
               <w:lastRenderedPageBreak/>
@@ -20909,21 +20194,7 @@
                 <w:lang w:val="en-GB"/>
               </w:rPr>
               <w:lastRenderedPageBreak/>
-              <w:t>&lt;</w:t>
-            </w:r>
-            <w:proofErr w:type="spellStart"/>
-            <w:r>
-              <w:rPr>
-                <w:lang w:val="en-GB"/>
-              </w:rPr>
-              <w:t>rw</w:t>
-            </w:r>
-            <w:proofErr w:type="spellEnd"/>
-            <w:r>
-              <w:rPr>
-                <w:lang w:val="en-GB"/>
-              </w:rPr>
-              <w:t>&gt;</w:t>
+              <w:t>&lt;rw&gt;</w:t>
             </w:r>
           </w:p>
         </w:tc>
@@ -20940,15 +20211,7 @@
               </w:rPr>
             </w:pPr>
             <w:r>
-              <w:t>Determines if the register if read only, write only or read/write. Can be “r”, “w” or “</w:t>
-            </w:r>
-            <w:proofErr w:type="spellStart"/>
-            <w:r>
-              <w:t>rw</w:t>
-            </w:r>
-            <w:proofErr w:type="spellEnd"/>
-            <w:r>
-              <w:t>”. ModbusControl will only attempt to read registers that have the “r” property, and it will only allow writing of registers that have the “w” property.</w:t>
+              <w:t>Determines if the register if read only, write only or read/write. Can be “r”, “w” or “rw”. ModbusControl will only attempt to read registers that have the “r” property, and it will only allow writing of registers that have the “w” property.</w:t>
             </w:r>
           </w:p>
           <w:p>
@@ -20978,21 +20241,7 @@
               <w:rPr>
                 <w:lang w:val="en-GB"/>
               </w:rPr>
-              <w:t>&lt;</w:t>
-            </w:r>
-            <w:proofErr w:type="spellStart"/>
-            <w:r>
-              <w:rPr>
-                <w:lang w:val="en-GB"/>
-              </w:rPr>
-              <w:t>fcol</w:t>
-            </w:r>
-            <w:proofErr w:type="spellEnd"/>
-            <w:r>
-              <w:rPr>
-                <w:lang w:val="en-GB"/>
-              </w:rPr>
-              <w:t>&gt;</w:t>
+              <w:t>&lt;fcol&gt;</w:t>
             </w:r>
           </w:p>
         </w:tc>
@@ -21009,15 +20258,7 @@
               </w:rPr>
             </w:pPr>
             <w:r>
-              <w:t xml:space="preserve">Sets the font (text) </w:t>
-            </w:r>
-            <w:proofErr w:type="spellStart"/>
-            <w:r>
-              <w:t>color</w:t>
-            </w:r>
-            <w:proofErr w:type="spellEnd"/>
-            <w:r>
-              <w:t xml:space="preserve"> of the register, description and value. </w:t>
+              <w:t xml:space="preserve">Sets the font (text) color of the register, description and value. </w:t>
             </w:r>
           </w:p>
           <w:p>
@@ -21071,23 +20312,7 @@
               <w:fldChar w:fldCharType="separate"/>
             </w:r>
             <w:r>
-              <w:t>The &lt;</w:t>
-            </w:r>
-            <w:proofErr w:type="spellStart"/>
-            <w:r>
-              <w:t>fcol</w:t>
-            </w:r>
-            <w:proofErr w:type="spellEnd"/>
-            <w:r>
-              <w:t>&gt; and &lt;</w:t>
-            </w:r>
-            <w:proofErr w:type="spellStart"/>
-            <w:r>
-              <w:t>bcol</w:t>
-            </w:r>
-            <w:proofErr w:type="spellEnd"/>
-            <w:r>
-              <w:t>&gt; elements</w:t>
+              <w:t>The &lt;fcol&gt; and &lt;bcol&gt; elements</w:t>
             </w:r>
             <w:r>
               <w:rPr>
@@ -21127,21 +20352,7 @@
               <w:rPr>
                 <w:lang w:val="en-GB"/>
               </w:rPr>
-              <w:t>&lt;</w:t>
-            </w:r>
-            <w:proofErr w:type="spellStart"/>
-            <w:r>
-              <w:rPr>
-                <w:lang w:val="en-GB"/>
-              </w:rPr>
-              <w:t>bcol</w:t>
-            </w:r>
-            <w:proofErr w:type="spellEnd"/>
-            <w:r>
-              <w:rPr>
-                <w:lang w:val="en-GB"/>
-              </w:rPr>
-              <w:t xml:space="preserve">&gt; </w:t>
+              <w:t xml:space="preserve">&lt;bcol&gt; </w:t>
             </w:r>
           </w:p>
         </w:tc>
@@ -21158,15 +20369,7 @@
               </w:rPr>
             </w:pPr>
             <w:r>
-              <w:t xml:space="preserve">Sets the background </w:t>
-            </w:r>
-            <w:proofErr w:type="spellStart"/>
-            <w:r>
-              <w:t>color</w:t>
-            </w:r>
-            <w:proofErr w:type="spellEnd"/>
-            <w:r>
-              <w:t xml:space="preserve"> of the register, description and value.</w:t>
+              <w:t>Sets the background color of the register, description and value.</w:t>
             </w:r>
           </w:p>
           <w:p>
@@ -21220,23 +20423,7 @@
               <w:fldChar w:fldCharType="separate"/>
             </w:r>
             <w:r>
-              <w:t>The &lt;</w:t>
-            </w:r>
-            <w:proofErr w:type="spellStart"/>
-            <w:r>
-              <w:t>fcol</w:t>
-            </w:r>
-            <w:proofErr w:type="spellEnd"/>
-            <w:r>
-              <w:t>&gt; and &lt;</w:t>
-            </w:r>
-            <w:proofErr w:type="spellStart"/>
-            <w:r>
-              <w:t>bcol</w:t>
-            </w:r>
-            <w:proofErr w:type="spellEnd"/>
-            <w:r>
-              <w:t>&gt; elements</w:t>
+              <w:t>The &lt;fcol&gt; and &lt;bcol&gt; elements</w:t>
             </w:r>
             <w:r>
               <w:rPr>
@@ -21304,15 +20491,7 @@
               </w:rPr>
             </w:pPr>
             <w:r>
-              <w:t xml:space="preserve">Allowed only for Int and </w:t>
-            </w:r>
-            <w:proofErr w:type="spellStart"/>
-            <w:r>
-              <w:t>UInt</w:t>
-            </w:r>
-            <w:proofErr w:type="spellEnd"/>
-            <w:r>
-              <w:t xml:space="preserve"> types.</w:t>
+              <w:t>Allowed only for Int and UInt types.</w:t>
             </w:r>
           </w:p>
           <w:p>
@@ -21576,21 +20755,7 @@
               <w:rPr>
                 <w:lang w:val="en-GB"/>
               </w:rPr>
-              <w:t>&lt;</w:t>
-            </w:r>
-            <w:proofErr w:type="spellStart"/>
-            <w:r>
-              <w:rPr>
-                <w:lang w:val="en-GB"/>
-              </w:rPr>
-              <w:t>expandfields</w:t>
-            </w:r>
-            <w:proofErr w:type="spellEnd"/>
-            <w:r>
-              <w:rPr>
-                <w:lang w:val="en-GB"/>
-              </w:rPr>
-              <w:t>&gt;</w:t>
+              <w:t>&lt;expandfields&gt;</w:t>
             </w:r>
           </w:p>
         </w:tc>
@@ -21816,7 +20981,6 @@
         </w:rPr>
         <w:t>&lt;</w:t>
       </w:r>
-      <w:proofErr w:type="spellStart"/>
       <w:r>
         <w:rPr>
           <w:rStyle w:val="XMLElement"/>
@@ -21824,7 +20988,6 @@
         </w:rPr>
         <w:t>rw</w:t>
       </w:r>
-      <w:proofErr w:type="spellEnd"/>
       <w:r>
         <w:rPr>
           <w:rStyle w:val="XMLBracket"/>
@@ -21832,7 +20995,6 @@
         </w:rPr>
         <w:t>&gt;</w:t>
       </w:r>
-      <w:proofErr w:type="spellStart"/>
       <w:r>
         <w:rPr>
           <w:rStyle w:val="XMLContent"/>
@@ -21840,7 +21002,6 @@
         </w:rPr>
         <w:t>rw</w:t>
       </w:r>
-      <w:proofErr w:type="spellEnd"/>
       <w:r>
         <w:rPr>
           <w:rStyle w:val="XMLBracket"/>
@@ -21848,7 +21009,6 @@
         </w:rPr>
         <w:t>&lt;/</w:t>
       </w:r>
-      <w:proofErr w:type="spellStart"/>
       <w:r>
         <w:rPr>
           <w:rStyle w:val="XMLElement"/>
@@ -21856,7 +21016,6 @@
         </w:rPr>
         <w:t>rw</w:t>
       </w:r>
-      <w:proofErr w:type="spellEnd"/>
       <w:r>
         <w:rPr>
           <w:rStyle w:val="XMLBracket"/>
@@ -21972,7 +21131,6 @@
         </w:rPr>
         <w:t>&gt;&lt;</w:t>
       </w:r>
-      <w:proofErr w:type="spellStart"/>
       <w:r>
         <w:rPr>
           <w:rStyle w:val="XMLElement"/>
@@ -21981,7 +21139,6 @@
         </w:rPr>
         <w:t>text</w:t>
       </w:r>
-      <w:proofErr w:type="spellEnd"/>
       <w:r>
         <w:rPr>
           <w:rStyle w:val="XMLBracket"/>
@@ -21996,25 +21153,121 @@
           <w:szCs w:val="18"/>
           <w:lang w:val="en-GB" w:eastAsia="zh-CN"/>
         </w:rPr>
-        <w:t xml:space="preserve">Temperature 1 (0,1 </w:t>
-      </w:r>
-      <w:proofErr w:type="spellStart"/>
+        <w:t>Temperature 1 (0,1 deg)</w:t>
+      </w:r>
+      <w:r>
+        <w:rPr>
+          <w:rStyle w:val="XMLBracket"/>
+          <w:szCs w:val="18"/>
+          <w:lang w:eastAsia="zh-CN"/>
+        </w:rPr>
+        <w:t>&lt;/</w:t>
+      </w:r>
+      <w:r>
+        <w:rPr>
+          <w:rStyle w:val="XMLElement"/>
+          <w:szCs w:val="18"/>
+          <w:lang w:eastAsia="zh-CN"/>
+        </w:rPr>
+        <w:t>text</w:t>
+      </w:r>
+      <w:r>
+        <w:rPr>
+          <w:rStyle w:val="XMLBracket"/>
+          <w:szCs w:val="18"/>
+          <w:lang w:eastAsia="zh-CN"/>
+        </w:rPr>
+        <w:t>&gt;&lt;</w:t>
+      </w:r>
+      <w:r>
+        <w:rPr>
+          <w:rStyle w:val="XMLKeyWord"/>
+          <w:szCs w:val="18"/>
+          <w:lang w:eastAsia="zh-CN"/>
+        </w:rPr>
+        <w:t>type</w:t>
+      </w:r>
+      <w:r>
+        <w:rPr>
+          <w:rStyle w:val="XMLBracket"/>
+          <w:szCs w:val="18"/>
+          <w:lang w:eastAsia="zh-CN"/>
+        </w:rPr>
+        <w:t>&gt;</w:t>
+      </w:r>
       <w:r>
         <w:rPr>
           <w:rStyle w:val="XMLContent"/>
           <w:szCs w:val="18"/>
           <w:lang w:val="en-GB" w:eastAsia="zh-CN"/>
         </w:rPr>
-        <w:t>deg</w:t>
-      </w:r>
-      <w:proofErr w:type="spellEnd"/>
+        <w:t>int16</w:t>
+      </w:r>
+      <w:r>
+        <w:rPr>
+          <w:rStyle w:val="XMLBracket"/>
+          <w:szCs w:val="18"/>
+          <w:lang w:eastAsia="zh-CN"/>
+        </w:rPr>
+        <w:t>&lt;/</w:t>
+      </w:r>
+      <w:r>
+        <w:rPr>
+          <w:rStyle w:val="XMLKeyWord"/>
+          <w:szCs w:val="18"/>
+          <w:lang w:eastAsia="zh-CN"/>
+        </w:rPr>
+        <w:t>type</w:t>
+      </w:r>
+      <w:r>
+        <w:rPr>
+          <w:rStyle w:val="XMLBracket"/>
+          <w:szCs w:val="18"/>
+          <w:lang w:eastAsia="zh-CN"/>
+        </w:rPr>
+        <w:t>&gt;</w:t>
+      </w:r>
+      <w:r>
+        <w:rPr>
+          <w:rStyle w:val="XMLBracket"/>
+          <w:rFonts w:cs="Mangal"/>
+          <w:szCs w:val="18"/>
+          <w:lang w:val="en-GB" w:eastAsia="zh-CN"/>
+        </w:rPr>
+        <w:br/>
+        <w:t xml:space="preserve"> </w:t>
+      </w:r>
+      <w:r>
+        <w:rPr>
+          <w:rStyle w:val="XMLBracket"/>
+          <w:szCs w:val="18"/>
+          <w:lang w:eastAsia="zh-CN"/>
+        </w:rPr>
+        <w:t>&lt;</w:t>
+      </w:r>
+      <w:r>
+        <w:rPr>
+          <w:rStyle w:val="XMLElement"/>
+          <w:szCs w:val="18"/>
+          <w:lang w:eastAsia="zh-CN"/>
+        </w:rPr>
+        <w:t>decimals</w:t>
+      </w:r>
+      <w:r>
+        <w:rPr>
+          <w:rStyle w:val="XMLBracket"/>
+          <w:szCs w:val="18"/>
+          <w:lang w:eastAsia="zh-CN"/>
+        </w:rPr>
+        <w:t>&gt;</w:t>
+      </w:r>
       <w:r>
         <w:rPr>
           <w:rStyle w:val="XMLContent"/>
           <w:szCs w:val="18"/>
           <w:lang w:val="en-GB" w:eastAsia="zh-CN"/>
         </w:rPr>
-        <w:t>)</w:t>
+        <w:t>1</w:t>
       </w:r>
       <w:r>
         <w:rPr>
@@ -22024,16 +21277,14 @@
         </w:rPr>
         <w:t>&lt;/</w:t>
       </w:r>
-      <w:proofErr w:type="spellStart"/>
       <w:r>
         <w:rPr>
           <w:rStyle w:val="XMLElement"/>
           <w:szCs w:val="18"/>
           <w:lang w:eastAsia="zh-CN"/>
         </w:rPr>
-        <w:t>text</w:t>
-      </w:r>
-      <w:proofErr w:type="spellEnd"/>
+        <w:t>decimals</w:t>
+      </w:r>
       <w:r>
         <w:rPr>
           <w:rStyle w:val="XMLBracket"/>
@@ -22044,11 +21295,11 @@
       </w:r>
       <w:r>
         <w:rPr>
-          <w:rStyle w:val="XMLKeyWord"/>
+          <w:rStyle w:val="XMLElement"/>
           <w:szCs w:val="18"/>
           <w:lang w:eastAsia="zh-CN"/>
         </w:rPr>
-        <w:t>type</w:t>
+        <w:t>rw</w:t>
       </w:r>
       <w:r>
         <w:rPr>
@@ -22064,7 +21315,7 @@
           <w:szCs w:val="18"/>
           <w:lang w:val="en-GB" w:eastAsia="zh-CN"/>
         </w:rPr>
-        <w:t>int16</w:t>
+        <w:t>r</w:t>
       </w:r>
       <w:r>
         <w:rPr>
@@ -22074,50 +21325,30 @@
         </w:rPr>
         <w:t>&lt;/</w:t>
       </w:r>
-      <w:r>
-        <w:rPr>
-          <w:rStyle w:val="XMLKeyWord"/>
-          <w:szCs w:val="18"/>
-          <w:lang w:eastAsia="zh-CN"/>
-        </w:rPr>
-        <w:t>type</w:t>
-      </w:r>
-      <w:r>
-        <w:rPr>
-          <w:rStyle w:val="XMLBracket"/>
-          <w:szCs w:val="18"/>
-          <w:lang w:eastAsia="zh-CN"/>
-        </w:rPr>
-        <w:t>&gt;</w:t>
-      </w:r>
-      <w:r>
-        <w:rPr>
-          <w:rStyle w:val="XMLBracket"/>
-          <w:rFonts w:cs="Mangal"/>
-          <w:szCs w:val="18"/>
-          <w:lang w:val="en-GB" w:eastAsia="zh-CN"/>
-        </w:rPr>
-        <w:br/>
-        <w:t xml:space="preserve"> </w:t>
-      </w:r>
-      <w:r>
-        <w:rPr>
-          <w:rStyle w:val="XMLBracket"/>
-          <w:szCs w:val="18"/>
-          <w:lang w:eastAsia="zh-CN"/>
-        </w:rPr>
-        <w:t>&lt;</w:t>
-      </w:r>
-      <w:proofErr w:type="spellStart"/>
       <w:r>
         <w:rPr>
           <w:rStyle w:val="XMLElement"/>
           <w:szCs w:val="18"/>
           <w:lang w:eastAsia="zh-CN"/>
         </w:rPr>
-        <w:t>decimals</w:t>
-      </w:r>
-      <w:proofErr w:type="spellEnd"/>
+        <w:t>rw</w:t>
+      </w:r>
+      <w:r>
+        <w:rPr>
+          <w:rStyle w:val="XMLBracket"/>
+          <w:szCs w:val="18"/>
+          <w:lang w:eastAsia="zh-CN"/>
+        </w:rPr>
+        <w:t>&gt;&lt;</w:t>
+      </w:r>
+      <w:r>
+        <w:rPr>
+          <w:rStyle w:val="XMLElement"/>
+          <w:szCs w:val="18"/>
+          <w:lang w:eastAsia="zh-CN"/>
+        </w:rPr>
+        <w:t>bcol</w:t>
+      </w:r>
       <w:r>
         <w:rPr>
           <w:rStyle w:val="XMLBracket"/>
@@ -22132,7 +21363,7 @@
           <w:szCs w:val="18"/>
           <w:lang w:val="en-GB" w:eastAsia="zh-CN"/>
         </w:rPr>
-        <w:t>1</w:t>
+        <w:t>255,200,200</w:t>
       </w:r>
       <w:r>
         <w:rPr>
@@ -22142,120 +21373,14 @@
         </w:rPr>
         <w:t>&lt;/</w:t>
       </w:r>
-      <w:proofErr w:type="spellStart"/>
       <w:r>
         <w:rPr>
           <w:rStyle w:val="XMLElement"/>
           <w:szCs w:val="18"/>
           <w:lang w:eastAsia="zh-CN"/>
         </w:rPr>
-        <w:t>decimals</w:t>
-      </w:r>
-      <w:proofErr w:type="spellEnd"/>
-      <w:r>
-        <w:rPr>
-          <w:rStyle w:val="XMLBracket"/>
-          <w:szCs w:val="18"/>
-          <w:lang w:eastAsia="zh-CN"/>
-        </w:rPr>
-        <w:t>&gt;&lt;</w:t>
-      </w:r>
-      <w:proofErr w:type="spellStart"/>
-      <w:r>
-        <w:rPr>
-          <w:rStyle w:val="XMLElement"/>
-          <w:szCs w:val="18"/>
-          <w:lang w:eastAsia="zh-CN"/>
-        </w:rPr>
-        <w:t>rw</w:t>
-      </w:r>
-      <w:proofErr w:type="spellEnd"/>
-      <w:r>
-        <w:rPr>
-          <w:rStyle w:val="XMLBracket"/>
-          <w:szCs w:val="18"/>
-          <w:lang w:eastAsia="zh-CN"/>
-        </w:rPr>
-        <w:t>&gt;</w:t>
-      </w:r>
-      <w:r>
-        <w:rPr>
-          <w:rStyle w:val="XMLContent"/>
-          <w:szCs w:val="18"/>
-          <w:lang w:val="en-GB" w:eastAsia="zh-CN"/>
-        </w:rPr>
-        <w:t>r</w:t>
-      </w:r>
-      <w:r>
-        <w:rPr>
-          <w:rStyle w:val="XMLBracket"/>
-          <w:szCs w:val="18"/>
-          <w:lang w:eastAsia="zh-CN"/>
-        </w:rPr>
-        <w:t>&lt;/</w:t>
-      </w:r>
-      <w:proofErr w:type="spellStart"/>
-      <w:r>
-        <w:rPr>
-          <w:rStyle w:val="XMLElement"/>
-          <w:szCs w:val="18"/>
-          <w:lang w:eastAsia="zh-CN"/>
-        </w:rPr>
-        <w:t>rw</w:t>
-      </w:r>
-      <w:proofErr w:type="spellEnd"/>
-      <w:r>
-        <w:rPr>
-          <w:rStyle w:val="XMLBracket"/>
-          <w:szCs w:val="18"/>
-          <w:lang w:eastAsia="zh-CN"/>
-        </w:rPr>
-        <w:t>&gt;&lt;</w:t>
-      </w:r>
-      <w:proofErr w:type="spellStart"/>
-      <w:r>
-        <w:rPr>
-          <w:rStyle w:val="XMLElement"/>
-          <w:szCs w:val="18"/>
-          <w:lang w:eastAsia="zh-CN"/>
-        </w:rPr>
         <w:t>bcol</w:t>
       </w:r>
-      <w:proofErr w:type="spellEnd"/>
-      <w:r>
-        <w:rPr>
-          <w:rStyle w:val="XMLBracket"/>
-          <w:szCs w:val="18"/>
-          <w:lang w:eastAsia="zh-CN"/>
-        </w:rPr>
-        <w:t>&gt;</w:t>
-      </w:r>
-      <w:r>
-        <w:rPr>
-          <w:rStyle w:val="XMLContent"/>
-          <w:szCs w:val="18"/>
-          <w:lang w:val="en-GB" w:eastAsia="zh-CN"/>
-        </w:rPr>
-        <w:t>255,200,200</w:t>
-      </w:r>
-      <w:r>
-        <w:rPr>
-          <w:rStyle w:val="XMLBracket"/>
-          <w:szCs w:val="18"/>
-          <w:lang w:eastAsia="zh-CN"/>
-        </w:rPr>
-        <w:t>&lt;/</w:t>
-      </w:r>
-      <w:proofErr w:type="spellStart"/>
-      <w:r>
-        <w:rPr>
-          <w:rStyle w:val="XMLElement"/>
-          <w:szCs w:val="18"/>
-          <w:lang w:eastAsia="zh-CN"/>
-        </w:rPr>
-        <w:t>bcol</w:t>
-      </w:r>
-      <w:proofErr w:type="spellEnd"/>
       <w:r>
         <w:rPr>
           <w:rStyle w:val="XMLBracket"/>
@@ -22381,21 +21506,7 @@
               <w:rPr>
                 <w:lang w:val="en-GB"/>
               </w:rPr>
-              <w:t>&amp;</w:t>
-            </w:r>
-            <w:proofErr w:type="spellStart"/>
-            <w:r>
-              <w:rPr>
-                <w:lang w:val="en-GB"/>
-              </w:rPr>
-              <w:t>lt</w:t>
-            </w:r>
-            <w:proofErr w:type="spellEnd"/>
-            <w:r>
-              <w:rPr>
-                <w:lang w:val="en-GB"/>
-              </w:rPr>
-              <w:t>;</w:t>
+              <w:t>&amp;lt;</w:t>
             </w:r>
           </w:p>
         </w:tc>
@@ -22438,21 +21549,7 @@
                 <w:lang w:val="en-GB"/>
               </w:rPr>
               <w:lastRenderedPageBreak/>
-              <w:t>&amp;</w:t>
-            </w:r>
-            <w:proofErr w:type="spellStart"/>
-            <w:r>
-              <w:rPr>
-                <w:lang w:val="en-GB"/>
-              </w:rPr>
-              <w:t>gt</w:t>
-            </w:r>
-            <w:proofErr w:type="spellEnd"/>
-            <w:r>
-              <w:rPr>
-                <w:lang w:val="en-GB"/>
-              </w:rPr>
-              <w:t>;</w:t>
+              <w:t>&amp;gt;</w:t>
             </w:r>
           </w:p>
         </w:tc>
@@ -22578,21 +21675,7 @@
               <w:rPr>
                 <w:lang w:val="en-GB"/>
               </w:rPr>
-              <w:t>&amp;</w:t>
-            </w:r>
-            <w:proofErr w:type="spellStart"/>
-            <w:r>
-              <w:rPr>
-                <w:lang w:val="en-GB"/>
-              </w:rPr>
-              <w:t>quot</w:t>
-            </w:r>
-            <w:proofErr w:type="spellEnd"/>
-            <w:r>
-              <w:rPr>
-                <w:lang w:val="en-GB"/>
-              </w:rPr>
-              <w:t>;</w:t>
+              <w:t>&amp;quot;</w:t>
             </w:r>
           </w:p>
         </w:tc>
@@ -22811,14 +21894,7 @@
         <w:rPr>
           <w:lang w:val="en-GB"/>
         </w:rPr>
-        <w:t>The &lt;</w:t>
-      </w:r>
-      <w:proofErr w:type="spellStart"/>
-      <w:r>
-        <w:rPr>
-          <w:lang w:val="en-GB"/>
-        </w:rPr>
-        <w:t>longdesc</w:t>
+        <w:t>The &lt;longdesc</w:t>
       </w:r>
       <w:r>
         <w:rPr>
@@ -22826,7 +21902,6 @@
         </w:rPr>
         <w:t>r</w:t>
       </w:r>
-      <w:proofErr w:type="spellEnd"/>
       <w:r>
         <w:rPr>
           <w:lang w:val="en-GB"/>
@@ -22842,16 +21917,11 @@
         </w:rPr>
       </w:pPr>
       <w:r>
-        <w:t>The &lt;</w:t>
-      </w:r>
-      <w:proofErr w:type="spellStart"/>
-      <w:r>
-        <w:t>longdesc</w:t>
+        <w:t>The &lt;longdesc</w:t>
       </w:r>
       <w:r>
         <w:t>r</w:t>
       </w:r>
-      <w:proofErr w:type="spellEnd"/>
       <w:r>
         <w:t xml:space="preserve">&gt; element </w:t>
       </w:r>
@@ -22923,22 +21993,14 @@
               <w:rPr>
                 <w:lang w:val="en-GB"/>
               </w:rPr>
-              <w:t>&lt;</w:t>
-            </w:r>
-            <w:proofErr w:type="spellStart"/>
+              <w:t>&lt;longdesc</w:t>
+            </w:r>
             <w:r>
               <w:rPr>
                 <w:lang w:val="en-GB"/>
               </w:rPr>
-              <w:t>longdesc</w:t>
-            </w:r>
-            <w:r>
-              <w:rPr>
-                <w:lang w:val="en-GB"/>
-              </w:rPr>
               <w:t>r</w:t>
             </w:r>
-            <w:proofErr w:type="spellEnd"/>
             <w:r>
               <w:rPr>
                 <w:lang w:val="en-GB"/>
@@ -23108,60 +22170,24 @@
           <w:lang w:val="en-GB"/>
         </w:rPr>
         <w:tab/>
-        <w:t>&lt;</w:t>
-      </w:r>
-      <w:proofErr w:type="spellStart"/>
+        <w:t>&lt;longdescr&gt;</w:t>
+      </w:r>
       <w:r>
         <w:rPr>
           <w:rStyle w:val="XMLElement"/>
           <w:rFonts w:hint="eastAsia"/>
-          <w:lang w:val="en-GB"/>
-        </w:rPr>
-        <w:t>longdescr</w:t>
-      </w:r>
-      <w:proofErr w:type="spellEnd"/>
+          <w:color w:val="auto"/>
+          <w:lang w:val="en-GB"/>
+        </w:rPr>
+        <w:t>Digital inputs bitmap. &amp;#13;Each bit in this register corresponds to the on/off state of a digital input.</w:t>
+      </w:r>
       <w:r>
         <w:rPr>
           <w:rStyle w:val="XMLElement"/>
           <w:rFonts w:hint="eastAsia"/>
           <w:lang w:val="en-GB"/>
         </w:rPr>
-        <w:t>&gt;</w:t>
-      </w:r>
-      <w:r>
-        <w:rPr>
-          <w:rStyle w:val="XMLElement"/>
-          <w:rFonts w:hint="eastAsia"/>
-          <w:color w:val="auto"/>
-          <w:lang w:val="en-GB"/>
-        </w:rPr>
-        <w:t>Digital inputs bitmap. &amp;#13;Each bit in this register corresponds to the on/off state of a digital input.</w:t>
-      </w:r>
-      <w:r>
-        <w:rPr>
-          <w:rStyle w:val="XMLElement"/>
-          <w:rFonts w:hint="eastAsia"/>
-          <w:lang w:val="en-GB"/>
-        </w:rPr>
-        <w:t>&lt;/</w:t>
-      </w:r>
-      <w:proofErr w:type="spellStart"/>
-      <w:r>
-        <w:rPr>
-          <w:rStyle w:val="XMLElement"/>
-          <w:rFonts w:hint="eastAsia"/>
-          <w:lang w:val="en-GB"/>
-        </w:rPr>
-        <w:t>longdescr</w:t>
-      </w:r>
-      <w:proofErr w:type="spellEnd"/>
-      <w:r>
-        <w:rPr>
-          <w:rStyle w:val="XMLElement"/>
-          <w:rFonts w:hint="eastAsia"/>
-          <w:lang w:val="en-GB"/>
-        </w:rPr>
-        <w:t>&gt;</w:t>
+        <w:t>&lt;/longdescr&gt;</w:t>
       </w:r>
     </w:p>
     <w:p>
@@ -23230,7 +22256,7 @@
           <w:noProof/>
         </w:rPr>
         <w:pict w14:anchorId="56E75F81">
-          <v:shape id="Afbeelding 1" o:spid="_x0000_i1027" type="#_x0000_t75" style="width:345.7pt;height:52.15pt;visibility:visible;mso-wrap-style:square">
+          <v:shape id="Afbeelding 1" o:spid="_x0000_i1027" type="#_x0000_t75" style="width:345.6pt;height:52.2pt;visibility:visible;mso-wrap-style:square">
             <v:imagedata r:id="rId14" o:title=""/>
           </v:shape>
         </w:pict>
@@ -24749,21 +23775,7 @@
               <w:rPr>
                 <w:lang w:val="en-GB"/>
               </w:rPr>
-              <w:t>&lt;</w:t>
-            </w:r>
-            <w:proofErr w:type="spellStart"/>
-            <w:r>
-              <w:rPr>
-                <w:lang w:val="en-GB"/>
-              </w:rPr>
-              <w:t>pos</w:t>
-            </w:r>
-            <w:proofErr w:type="spellEnd"/>
-            <w:r>
-              <w:rPr>
-                <w:lang w:val="en-GB"/>
-              </w:rPr>
-              <w:t>&gt;</w:t>
+              <w:t>&lt;pos&gt;</w:t>
             </w:r>
           </w:p>
         </w:tc>
@@ -24949,22 +23961,14 @@
               <w:rPr>
                 <w:lang w:val="en-GB"/>
               </w:rPr>
-              <w:t>&lt;</w:t>
-            </w:r>
-            <w:proofErr w:type="spellStart"/>
+              <w:t>&lt;longdesc</w:t>
+            </w:r>
             <w:r>
               <w:rPr>
                 <w:lang w:val="en-GB"/>
               </w:rPr>
-              <w:t>longdesc</w:t>
-            </w:r>
-            <w:r>
-              <w:rPr>
-                <w:lang w:val="en-GB"/>
-              </w:rPr>
               <w:t>r</w:t>
             </w:r>
-            <w:proofErr w:type="spellEnd"/>
             <w:r>
               <w:rPr>
                 <w:lang w:val="en-GB"/>
@@ -25131,21 +24135,7 @@
               <w:rPr>
                 <w:lang w:val="en-GB"/>
               </w:rPr>
-              <w:t>&lt;</w:t>
-            </w:r>
-            <w:proofErr w:type="spellStart"/>
-            <w:r>
-              <w:rPr>
-                <w:lang w:val="en-GB"/>
-              </w:rPr>
-              <w:t>minlen</w:t>
-            </w:r>
-            <w:proofErr w:type="spellEnd"/>
-            <w:r>
-              <w:rPr>
-                <w:lang w:val="en-GB"/>
-              </w:rPr>
-              <w:t>&gt;</w:t>
+              <w:t>&lt;minlen&gt;</w:t>
             </w:r>
           </w:p>
         </w:tc>
@@ -25192,21 +24182,7 @@
               <w:rPr>
                 <w:lang w:val="en-GB"/>
               </w:rPr>
-              <w:t>&lt;</w:t>
-            </w:r>
-            <w:proofErr w:type="spellStart"/>
-            <w:r>
-              <w:rPr>
-                <w:lang w:val="en-GB"/>
-              </w:rPr>
-              <w:t>fcol</w:t>
-            </w:r>
-            <w:proofErr w:type="spellEnd"/>
-            <w:r>
-              <w:rPr>
-                <w:lang w:val="en-GB"/>
-              </w:rPr>
-              <w:t>&gt;</w:t>
+              <w:t>&lt;fcol&gt;</w:t>
             </w:r>
           </w:p>
         </w:tc>
@@ -25223,15 +24199,7 @@
               </w:rPr>
             </w:pPr>
             <w:r>
-              <w:t xml:space="preserve">Sets the font (text) </w:t>
-            </w:r>
-            <w:proofErr w:type="spellStart"/>
-            <w:r>
-              <w:t>color</w:t>
-            </w:r>
-            <w:proofErr w:type="spellEnd"/>
-            <w:r>
-              <w:t xml:space="preserve"> of the bit field, description and value. </w:t>
+              <w:t xml:space="preserve">Sets the font (text) color of the bit field, description and value. </w:t>
             </w:r>
           </w:p>
           <w:p>
@@ -25285,23 +24253,7 @@
               <w:fldChar w:fldCharType="separate"/>
             </w:r>
             <w:r>
-              <w:t>The &lt;</w:t>
-            </w:r>
-            <w:proofErr w:type="spellStart"/>
-            <w:r>
-              <w:t>fcol</w:t>
-            </w:r>
-            <w:proofErr w:type="spellEnd"/>
-            <w:r>
-              <w:t>&gt; and &lt;</w:t>
-            </w:r>
-            <w:proofErr w:type="spellStart"/>
-            <w:r>
-              <w:t>bcol</w:t>
-            </w:r>
-            <w:proofErr w:type="spellEnd"/>
-            <w:r>
-              <w:t>&gt; elements</w:t>
+              <w:t>The &lt;fcol&gt; and &lt;bcol&gt; elements</w:t>
             </w:r>
             <w:r>
               <w:rPr>
@@ -25344,21 +24296,7 @@
               <w:rPr>
                 <w:lang w:val="en-GB"/>
               </w:rPr>
-              <w:t>&lt;</w:t>
-            </w:r>
-            <w:proofErr w:type="spellStart"/>
-            <w:r>
-              <w:rPr>
-                <w:lang w:val="en-GB"/>
-              </w:rPr>
-              <w:t>bcol</w:t>
-            </w:r>
-            <w:proofErr w:type="spellEnd"/>
-            <w:r>
-              <w:rPr>
-                <w:lang w:val="en-GB"/>
-              </w:rPr>
-              <w:t xml:space="preserve">&gt; </w:t>
+              <w:t xml:space="preserve">&lt;bcol&gt; </w:t>
             </w:r>
           </w:p>
         </w:tc>
@@ -25375,15 +24313,7 @@
               </w:rPr>
             </w:pPr>
             <w:r>
-              <w:t xml:space="preserve">Sets the background </w:t>
-            </w:r>
-            <w:proofErr w:type="spellStart"/>
-            <w:r>
-              <w:t>color</w:t>
-            </w:r>
-            <w:proofErr w:type="spellEnd"/>
-            <w:r>
-              <w:t xml:space="preserve"> of the bit field, description and value. </w:t>
+              <w:t xml:space="preserve">Sets the background color of the bit field, description and value. </w:t>
             </w:r>
           </w:p>
           <w:p>
@@ -25437,23 +24367,7 @@
               <w:fldChar w:fldCharType="separate"/>
             </w:r>
             <w:r>
-              <w:t>The &lt;</w:t>
-            </w:r>
-            <w:proofErr w:type="spellStart"/>
-            <w:r>
-              <w:t>fcol</w:t>
-            </w:r>
-            <w:proofErr w:type="spellEnd"/>
-            <w:r>
-              <w:t>&gt; and &lt;</w:t>
-            </w:r>
-            <w:proofErr w:type="spellStart"/>
-            <w:r>
-              <w:t>bcol</w:t>
-            </w:r>
-            <w:proofErr w:type="spellEnd"/>
-            <w:r>
-              <w:t>&gt; elements</w:t>
+              <w:t>The &lt;fcol&gt; and &lt;bcol&gt; elements</w:t>
             </w:r>
             <w:r>
               <w:rPr>
@@ -25525,7 +24439,6 @@
         </w:rPr>
         <w:t>&gt;&lt;</w:t>
       </w:r>
-      <w:proofErr w:type="spellStart"/>
       <w:r>
         <w:rPr>
           <w:rStyle w:val="XMLElement"/>
@@ -25533,7 +24446,6 @@
         </w:rPr>
         <w:t>pos</w:t>
       </w:r>
-      <w:proofErr w:type="spellEnd"/>
       <w:r>
         <w:rPr>
           <w:rStyle w:val="XMLBracket"/>
@@ -25555,7 +24467,6 @@
         </w:rPr>
         <w:t>&lt;/</w:t>
       </w:r>
-      <w:proofErr w:type="spellStart"/>
       <w:r>
         <w:rPr>
           <w:rStyle w:val="XMLElement"/>
@@ -25563,7 +24474,6 @@
         </w:rPr>
         <w:t>pos</w:t>
       </w:r>
-      <w:proofErr w:type="spellEnd"/>
       <w:r>
         <w:rPr>
           <w:rStyle w:val="XMLBracket"/>
@@ -26080,7 +24990,6 @@
         </w:rPr>
         <w:t>&gt;&lt;</w:t>
       </w:r>
-      <w:proofErr w:type="spellStart"/>
       <w:r>
         <w:rPr>
           <w:rStyle w:val="XMLElement"/>
@@ -26090,7 +24999,6 @@
         </w:rPr>
         <w:t>minlen</w:t>
       </w:r>
-      <w:proofErr w:type="spellEnd"/>
       <w:r>
         <w:rPr>
           <w:rStyle w:val="XMLBracket"/>
@@ -26118,7 +25026,6 @@
         </w:rPr>
         <w:t>&lt;/</w:t>
       </w:r>
-      <w:proofErr w:type="spellStart"/>
       <w:r>
         <w:rPr>
           <w:rStyle w:val="XMLElement"/>
@@ -26128,7 +25035,6 @@
         </w:rPr>
         <w:t>minlen</w:t>
       </w:r>
-      <w:proofErr w:type="spellEnd"/>
       <w:r>
         <w:rPr>
           <w:rStyle w:val="XMLBracket"/>
@@ -26138,7 +25044,6 @@
         </w:rPr>
         <w:t>&gt;&lt;</w:t>
       </w:r>
-      <w:proofErr w:type="spellStart"/>
       <w:r>
         <w:rPr>
           <w:rStyle w:val="XMLElement"/>
@@ -26148,7 +25053,6 @@
         </w:rPr>
         <w:t>rw</w:t>
       </w:r>
-      <w:proofErr w:type="spellEnd"/>
       <w:r>
         <w:rPr>
           <w:rStyle w:val="XMLBracket"/>
@@ -26176,7 +25080,6 @@
         </w:rPr>
         <w:t>&lt;/</w:t>
       </w:r>
-      <w:proofErr w:type="spellStart"/>
       <w:r>
         <w:rPr>
           <w:rStyle w:val="XMLElement"/>
@@ -26186,7 +25089,6 @@
         </w:rPr>
         <w:t>rw</w:t>
       </w:r>
-      <w:proofErr w:type="spellEnd"/>
       <w:r>
         <w:rPr>
           <w:rStyle w:val="XMLBracket"/>
@@ -26242,7 +25144,6 @@
         </w:rPr>
         <w:t>&gt;&lt;</w:t>
       </w:r>
-      <w:proofErr w:type="spellStart"/>
       <w:r>
         <w:rPr>
           <w:rStyle w:val="XMLElement"/>
@@ -26252,7 +25153,6 @@
         </w:rPr>
         <w:t>pos</w:t>
       </w:r>
-      <w:proofErr w:type="spellEnd"/>
       <w:r>
         <w:rPr>
           <w:rStyle w:val="XMLBracket"/>
@@ -26280,7 +25180,6 @@
         </w:rPr>
         <w:t>&lt;/</w:t>
       </w:r>
-      <w:proofErr w:type="spellStart"/>
       <w:r>
         <w:rPr>
           <w:rStyle w:val="XMLElement"/>
@@ -26290,7 +25189,6 @@
         </w:rPr>
         <w:t>pos</w:t>
       </w:r>
-      <w:proofErr w:type="spellEnd"/>
       <w:r>
         <w:rPr>
           <w:rStyle w:val="XMLBracket"/>
@@ -26418,7 +25316,6 @@
         </w:rPr>
         <w:t>&gt;&lt;</w:t>
       </w:r>
-      <w:proofErr w:type="spellStart"/>
       <w:r>
         <w:rPr>
           <w:rStyle w:val="XMLElement"/>
@@ -26428,7 +25325,6 @@
         </w:rPr>
         <w:t>pos</w:t>
       </w:r>
-      <w:proofErr w:type="spellEnd"/>
       <w:r>
         <w:rPr>
           <w:rStyle w:val="XMLBracket"/>
@@ -26456,7 +25352,6 @@
         </w:rPr>
         <w:t>&lt;/</w:t>
       </w:r>
-      <w:proofErr w:type="spellStart"/>
       <w:r>
         <w:rPr>
           <w:rStyle w:val="XMLElement"/>
@@ -26466,7 +25361,6 @@
         </w:rPr>
         <w:t>pos</w:t>
       </w:r>
-      <w:proofErr w:type="spellEnd"/>
       <w:r>
         <w:rPr>
           <w:rStyle w:val="XMLBracket"/>
@@ -26594,7 +25488,6 @@
         </w:rPr>
         <w:t>&gt;&lt;</w:t>
       </w:r>
-      <w:proofErr w:type="spellStart"/>
       <w:r>
         <w:rPr>
           <w:rStyle w:val="XMLElement"/>
@@ -26604,7 +25497,6 @@
         </w:rPr>
         <w:t>pos</w:t>
       </w:r>
-      <w:proofErr w:type="spellEnd"/>
       <w:r>
         <w:rPr>
           <w:rStyle w:val="XMLBracket"/>
@@ -26632,7 +25524,6 @@
         </w:rPr>
         <w:t>&lt;/</w:t>
       </w:r>
-      <w:proofErr w:type="spellStart"/>
       <w:r>
         <w:rPr>
           <w:rStyle w:val="XMLElement"/>
@@ -26642,7 +25533,6 @@
         </w:rPr>
         <w:t>pos</w:t>
       </w:r>
-      <w:proofErr w:type="spellEnd"/>
       <w:r>
         <w:rPr>
           <w:rStyle w:val="XMLBracket"/>
@@ -26770,7 +25660,6 @@
         </w:rPr>
         <w:t>&gt;&lt;</w:t>
       </w:r>
-      <w:proofErr w:type="spellStart"/>
       <w:r>
         <w:rPr>
           <w:rStyle w:val="XMLElement"/>
@@ -26780,7 +25669,6 @@
         </w:rPr>
         <w:t>pos</w:t>
       </w:r>
-      <w:proofErr w:type="spellEnd"/>
       <w:r>
         <w:rPr>
           <w:rStyle w:val="XMLBracket"/>
@@ -26808,7 +25696,6 @@
         </w:rPr>
         <w:t>&lt;/</w:t>
       </w:r>
-      <w:proofErr w:type="spellStart"/>
       <w:r>
         <w:rPr>
           <w:rStyle w:val="XMLElement"/>
@@ -26818,7 +25705,6 @@
         </w:rPr>
         <w:t>pos</w:t>
       </w:r>
-      <w:proofErr w:type="spellEnd"/>
       <w:r>
         <w:rPr>
           <w:rStyle w:val="XMLBracket"/>
@@ -26947,35 +25833,7 @@
         <w:rPr>
           <w:lang w:val="en-GB"/>
         </w:rPr>
-        <w:t>The &lt;</w:t>
-      </w:r>
-      <w:proofErr w:type="spellStart"/>
-      <w:r>
-        <w:rPr>
-          <w:lang w:val="en-GB"/>
-        </w:rPr>
-        <w:t>fcol</w:t>
-      </w:r>
-      <w:proofErr w:type="spellEnd"/>
-      <w:r>
-        <w:rPr>
-          <w:lang w:val="en-GB"/>
-        </w:rPr>
-        <w:t>&gt; and &lt;</w:t>
-      </w:r>
-      <w:proofErr w:type="spellStart"/>
-      <w:r>
-        <w:rPr>
-          <w:lang w:val="en-GB"/>
-        </w:rPr>
-        <w:t>bcol</w:t>
-      </w:r>
-      <w:proofErr w:type="spellEnd"/>
-      <w:r>
-        <w:rPr>
-          <w:lang w:val="en-GB"/>
-        </w:rPr>
-        <w:t>&gt; elements</w:t>
+        <w:t>The &lt;fcol&gt; and &lt;bcol&gt; elements</w:t>
       </w:r>
       <w:bookmarkEnd w:id="62"/>
       <w:bookmarkEnd w:id="63"/>
@@ -26992,39 +25850,7 @@
         </w:rPr>
       </w:pPr>
       <w:r>
-        <w:t>The &lt;</w:t>
-      </w:r>
-      <w:proofErr w:type="spellStart"/>
-      <w:r>
-        <w:t>fcol</w:t>
-      </w:r>
-      <w:proofErr w:type="spellEnd"/>
-      <w:r>
-        <w:t>&gt; and &lt;</w:t>
-      </w:r>
-      <w:proofErr w:type="spellStart"/>
-      <w:r>
-        <w:t>bcol</w:t>
-      </w:r>
-      <w:proofErr w:type="spellEnd"/>
-      <w:r>
-        <w:t xml:space="preserve">&gt; elements define the font (text) and background </w:t>
-      </w:r>
-      <w:proofErr w:type="spellStart"/>
-      <w:r>
-        <w:t>colors</w:t>
-      </w:r>
-      <w:proofErr w:type="spellEnd"/>
-      <w:r>
-        <w:t xml:space="preserve">. A </w:t>
-      </w:r>
-      <w:proofErr w:type="spellStart"/>
-      <w:r>
-        <w:t>color</w:t>
-      </w:r>
-      <w:proofErr w:type="spellEnd"/>
-      <w:r>
-        <w:t xml:space="preserve"> can be specified in 3 ways:</w:t>
+        <w:t>The &lt;fcol&gt; and &lt;bcol&gt; elements define the font (text) and background colors. A color can be specified in 3 ways:</w:t>
       </w:r>
     </w:p>
     <w:p>
@@ -27080,7 +25906,6 @@
               </w:rPr>
               <w:t>&lt;</w:t>
             </w:r>
-            <w:proofErr w:type="spellStart"/>
             <w:r>
               <w:rPr>
                 <w:rStyle w:val="XMLElement"/>
@@ -27088,7 +25913,6 @@
               </w:rPr>
               <w:t>bcol</w:t>
             </w:r>
-            <w:proofErr w:type="spellEnd"/>
             <w:r>
               <w:rPr>
                 <w:rStyle w:val="XMLBracket"/>
@@ -27110,7 +25934,6 @@
               </w:rPr>
               <w:t>&lt;/</w:t>
             </w:r>
-            <w:proofErr w:type="spellStart"/>
             <w:r>
               <w:rPr>
                 <w:rStyle w:val="XMLElement"/>
@@ -27118,7 +25941,6 @@
               </w:rPr>
               <w:t>bcol</w:t>
             </w:r>
-            <w:proofErr w:type="spellEnd"/>
             <w:r>
               <w:rPr>
                 <w:rStyle w:val="XMLBracket"/>
@@ -27163,7 +25985,6 @@
               </w:rPr>
               <w:t>&lt;</w:t>
             </w:r>
-            <w:proofErr w:type="spellStart"/>
             <w:r>
               <w:rPr>
                 <w:rStyle w:val="XMLElement"/>
@@ -27171,7 +25992,6 @@
               </w:rPr>
               <w:t>bcol</w:t>
             </w:r>
-            <w:proofErr w:type="spellEnd"/>
             <w:r>
               <w:rPr>
                 <w:rStyle w:val="XMLBracket"/>
@@ -27193,7 +26013,6 @@
               </w:rPr>
               <w:t>&lt;/</w:t>
             </w:r>
-            <w:proofErr w:type="spellStart"/>
             <w:r>
               <w:rPr>
                 <w:rStyle w:val="XMLElement"/>
@@ -27201,7 +26020,6 @@
               </w:rPr>
               <w:t>bcol</w:t>
             </w:r>
-            <w:proofErr w:type="spellEnd"/>
             <w:r>
               <w:rPr>
                 <w:rStyle w:val="XMLBracket"/>
@@ -27246,7 +26064,6 @@
               </w:rPr>
               <w:t>&lt;</w:t>
             </w:r>
-            <w:proofErr w:type="spellStart"/>
             <w:r>
               <w:rPr>
                 <w:rStyle w:val="XMLElement"/>
@@ -27254,7 +26071,6 @@
               </w:rPr>
               <w:t>bcol</w:t>
             </w:r>
-            <w:proofErr w:type="spellEnd"/>
             <w:r>
               <w:rPr>
                 <w:rStyle w:val="XMLBracket"/>
@@ -27276,7 +26092,6 @@
               </w:rPr>
               <w:t>&lt;/</w:t>
             </w:r>
-            <w:proofErr w:type="spellStart"/>
             <w:r>
               <w:rPr>
                 <w:rStyle w:val="XMLElement"/>
@@ -27284,7 +26099,6 @@
               </w:rPr>
               <w:t>bcol</w:t>
             </w:r>
-            <w:proofErr w:type="spellEnd"/>
             <w:r>
               <w:rPr>
                 <w:rStyle w:val="XMLBracket"/>
@@ -27325,15 +26139,7 @@
         </w:rPr>
       </w:pPr>
       <w:r>
-        <w:t xml:space="preserve">As a HTML </w:t>
-      </w:r>
-      <w:proofErr w:type="spellStart"/>
-      <w:r>
-        <w:t>color</w:t>
-      </w:r>
-      <w:proofErr w:type="spellEnd"/>
-      <w:r>
-        <w:t xml:space="preserve"> specification, as #RRGGBB. Where RR, GG and BB are 2 hexadecimal digits each, with range 00 .. FF. </w:t>
+        <w:t xml:space="preserve">As a HTML color specification, as #RRGGBB. Where RR, GG and BB are 2 hexadecimal digits each, with range 00 .. FF. </w:t>
       </w:r>
       <w:r>
         <w:br/>
@@ -27374,7 +26180,6 @@
               </w:rPr>
               <w:t>&lt;</w:t>
             </w:r>
-            <w:proofErr w:type="spellStart"/>
             <w:r>
               <w:rPr>
                 <w:rStyle w:val="XMLElement"/>
@@ -27382,7 +26187,6 @@
               </w:rPr>
               <w:t>bcol</w:t>
             </w:r>
-            <w:proofErr w:type="spellEnd"/>
             <w:r>
               <w:rPr>
                 <w:rStyle w:val="XMLBracket"/>
@@ -27455,7 +26259,6 @@
               </w:rPr>
               <w:t>&lt;</w:t>
             </w:r>
-            <w:proofErr w:type="spellStart"/>
             <w:r>
               <w:rPr>
                 <w:rStyle w:val="XMLElement"/>
@@ -27463,7 +26266,6 @@
               </w:rPr>
               <w:t>bcol</w:t>
             </w:r>
-            <w:proofErr w:type="spellEnd"/>
             <w:r>
               <w:rPr>
                 <w:rStyle w:val="XMLBracket"/>
@@ -27536,7 +26338,6 @@
               </w:rPr>
               <w:t>&lt;</w:t>
             </w:r>
-            <w:proofErr w:type="spellStart"/>
             <w:r>
               <w:rPr>
                 <w:rStyle w:val="XMLElement"/>
@@ -27544,7 +26345,6 @@
               </w:rPr>
               <w:t>bcol</w:t>
             </w:r>
-            <w:proofErr w:type="spellEnd"/>
             <w:r>
               <w:rPr>
                 <w:rStyle w:val="XMLBracket"/>
@@ -27613,63 +26413,7 @@
         </w:rPr>
       </w:pPr>
       <w:r>
-        <w:t xml:space="preserve">By </w:t>
-      </w:r>
-      <w:proofErr w:type="spellStart"/>
-      <w:r>
-        <w:t>color</w:t>
-      </w:r>
-      <w:proofErr w:type="spellEnd"/>
-      <w:r>
-        <w:t xml:space="preserve"> name. Like Red, Green, Aqua, Gold, </w:t>
-      </w:r>
-      <w:proofErr w:type="spellStart"/>
-      <w:r>
-        <w:t>Royalblue</w:t>
-      </w:r>
-      <w:proofErr w:type="spellEnd"/>
-      <w:r>
-        <w:t xml:space="preserve">, </w:t>
-      </w:r>
-      <w:proofErr w:type="spellStart"/>
-      <w:r>
-        <w:t>Steelblue</w:t>
-      </w:r>
-      <w:proofErr w:type="spellEnd"/>
-      <w:r>
-        <w:t xml:space="preserve">, </w:t>
-      </w:r>
-      <w:proofErr w:type="spellStart"/>
-      <w:r>
-        <w:t>Mediumblue</w:t>
-      </w:r>
-      <w:proofErr w:type="spellEnd"/>
-      <w:r>
-        <w:t xml:space="preserve">, </w:t>
-      </w:r>
-      <w:proofErr w:type="spellStart"/>
-      <w:r>
-        <w:t>Darkblue</w:t>
-      </w:r>
-      <w:proofErr w:type="spellEnd"/>
-      <w:r>
-        <w:t xml:space="preserve">, </w:t>
-      </w:r>
-      <w:proofErr w:type="spellStart"/>
-      <w:r>
-        <w:t>Royalblue</w:t>
-      </w:r>
-      <w:proofErr w:type="spellEnd"/>
-      <w:r>
-        <w:t xml:space="preserve">, </w:t>
-      </w:r>
-      <w:proofErr w:type="spellStart"/>
-      <w:r>
-        <w:t>Deepskyblue</w:t>
-      </w:r>
-      <w:proofErr w:type="spellEnd"/>
-      <w:r>
-        <w:t>, etc…</w:t>
+        <w:t>By color name. Like Red, Green, Aqua, Gold, Royalblue, Steelblue, Mediumblue, Darkblue, Royalblue, Deepskyblue, etc…</w:t>
       </w:r>
     </w:p>
     <w:tbl>
@@ -27705,21 +26449,18 @@
               </w:rPr>
               <w:t>&lt;</w:t>
             </w:r>
-            <w:proofErr w:type="spellStart"/>
             <w:r>
               <w:rPr>
                 <w:rStyle w:val="XMLElement"/>
               </w:rPr>
               <w:t>bcol</w:t>
             </w:r>
-            <w:proofErr w:type="spellEnd"/>
             <w:r>
               <w:rPr>
                 <w:rStyle w:val="XMLBracket"/>
               </w:rPr>
               <w:t>&gt;</w:t>
             </w:r>
-            <w:proofErr w:type="spellStart"/>
             <w:r>
               <w:rPr>
                 <w:rStyle w:val="XMLContent"/>
@@ -27727,21 +26468,18 @@
               </w:rPr>
               <w:t>royalblue</w:t>
             </w:r>
-            <w:proofErr w:type="spellEnd"/>
             <w:r>
               <w:rPr>
                 <w:rStyle w:val="XMLBracket"/>
               </w:rPr>
               <w:t>&lt;/</w:t>
             </w:r>
-            <w:proofErr w:type="spellStart"/>
             <w:r>
               <w:rPr>
                 <w:rStyle w:val="XMLElement"/>
               </w:rPr>
               <w:t>bcol</w:t>
             </w:r>
-            <w:proofErr w:type="spellEnd"/>
             <w:r>
               <w:rPr>
                 <w:rStyle w:val="XMLBracket"/>
@@ -27796,15 +26534,7 @@
         <w:t>’</w:t>
       </w:r>
       <w:r>
-        <w:t xml:space="preserve">s a chart showing all </w:t>
-      </w:r>
-      <w:proofErr w:type="spellStart"/>
-      <w:r>
-        <w:t>colors</w:t>
-      </w:r>
-      <w:proofErr w:type="spellEnd"/>
-      <w:r>
-        <w:t xml:space="preserve"> with their names and RGB values. Zoom in to read the </w:t>
+        <w:t xml:space="preserve">s a chart showing all colors with their names and RGB values. Zoom in to read the </w:t>
       </w:r>
       <w:r>
         <w:lastRenderedPageBreak/>
@@ -27847,21 +26577,7 @@
         <w:rPr>
           <w:lang w:val="en-GB"/>
         </w:rPr>
-        <w:t>The &lt;</w:t>
-      </w:r>
-      <w:proofErr w:type="spellStart"/>
-      <w:r>
-        <w:rPr>
-          <w:lang w:val="en-GB"/>
-        </w:rPr>
-        <w:t>autostart</w:t>
-      </w:r>
-      <w:proofErr w:type="spellEnd"/>
-      <w:r>
-        <w:rPr>
-          <w:lang w:val="en-GB"/>
-        </w:rPr>
-        <w:t>&gt; element</w:t>
+        <w:t>The &lt;autostart&gt; element</w:t>
       </w:r>
       <w:bookmarkEnd w:id="69"/>
     </w:p>
@@ -27873,15 +26589,7 @@
         </w:rPr>
       </w:pPr>
       <w:r>
-        <w:t>The &lt;</w:t>
-      </w:r>
-      <w:proofErr w:type="spellStart"/>
-      <w:r>
-        <w:t>autostart</w:t>
-      </w:r>
-      <w:proofErr w:type="spellEnd"/>
-      <w:r>
-        <w:t xml:space="preserve">&gt; element defines if the communication is started automatically when the project is opened, and optionally which tab page is shown. </w:t>
+        <w:t xml:space="preserve">The &lt;autostart&gt; element defines if the communication is started automatically when the project is opened, and optionally which tab page is shown. </w:t>
       </w:r>
     </w:p>
     <w:p>
@@ -27892,31 +26600,7 @@
         </w:rPr>
       </w:pPr>
       <w:r>
-        <w:t>When there is no &lt;</w:t>
-      </w:r>
-      <w:proofErr w:type="spellStart"/>
-      <w:r>
-        <w:t>autostart</w:t>
-      </w:r>
-      <w:proofErr w:type="spellEnd"/>
-      <w:r>
-        <w:t>&gt; element the communication is started automatically and the first tab page is shown. This is for compatibility with older versions. When an &lt;</w:t>
-      </w:r>
-      <w:proofErr w:type="spellStart"/>
-      <w:r>
-        <w:t>autostart</w:t>
-      </w:r>
-      <w:proofErr w:type="spellEnd"/>
-      <w:r>
-        <w:t xml:space="preserve">&gt; element is defined then </w:t>
-      </w:r>
-      <w:proofErr w:type="spellStart"/>
-      <w:r>
-        <w:t>autostart</w:t>
-      </w:r>
-      <w:proofErr w:type="spellEnd"/>
-      <w:r>
-        <w:t xml:space="preserve"> is determined by the &lt;enable&gt; element.</w:t>
+        <w:t>When there is no &lt;autostart&gt; element the communication is started automatically and the first tab page is shown. This is for compatibility with older versions. When an &lt;autostart&gt; element is defined then autostart is determined by the &lt;enable&gt; element.</w:t>
       </w:r>
     </w:p>
     <w:tbl>
@@ -27967,15 +26651,7 @@
               </w:rPr>
             </w:pPr>
             <w:r>
-              <w:t xml:space="preserve">Enables or disables the </w:t>
-            </w:r>
-            <w:proofErr w:type="spellStart"/>
-            <w:r>
-              <w:t>autostart</w:t>
-            </w:r>
-            <w:proofErr w:type="spellEnd"/>
-            <w:r>
-              <w:t>. Valid values are “true” and “false”.</w:t>
+              <w:t>Enables or disables the autostart. Valid values are “true” and “false”.</w:t>
             </w:r>
             <w:r>
               <w:br/>
@@ -28015,15 +26691,7 @@
               </w:rPr>
             </w:pPr>
             <w:r>
-              <w:t xml:space="preserve">Defines which tab page is shown on </w:t>
-            </w:r>
-            <w:proofErr w:type="spellStart"/>
-            <w:r>
-              <w:t>autostart</w:t>
-            </w:r>
-            <w:proofErr w:type="spellEnd"/>
-            <w:r>
-              <w:t>. This can be the name of the tab page like “Inputs”, or the tab page number starting from 1.</w:t>
+              <w:t>Defines which tab page is shown on autostart. This can be the name of the tab page like “Inputs”, or the tab page number starting from 1.</w:t>
             </w:r>
           </w:p>
           <w:p>
@@ -28052,21 +26720,7 @@
         <w:rPr>
           <w:lang w:val="en-GB"/>
         </w:rPr>
-        <w:t>The &lt;</w:t>
-      </w:r>
-      <w:proofErr w:type="spellStart"/>
-      <w:r>
-        <w:rPr>
-          <w:lang w:val="en-GB"/>
-        </w:rPr>
-        <w:t>modbustcpserver</w:t>
-      </w:r>
-      <w:proofErr w:type="spellEnd"/>
-      <w:r>
-        <w:rPr>
-          <w:lang w:val="en-GB"/>
-        </w:rPr>
-        <w:t>&gt; element</w:t>
+        <w:t>The &lt;modbustcpserver&gt; element</w:t>
       </w:r>
       <w:bookmarkEnd w:id="70"/>
     </w:p>
@@ -28078,15 +26732,7 @@
         </w:rPr>
       </w:pPr>
       <w:r>
-        <w:t>The &lt;</w:t>
-      </w:r>
-      <w:proofErr w:type="spellStart"/>
-      <w:r>
-        <w:t>modbustcpserver</w:t>
-      </w:r>
-      <w:proofErr w:type="spellEnd"/>
-      <w:r>
-        <w:t xml:space="preserve">&gt; element configures the built-in Modbus/TCP server that acts as a bridge to the connected modbus device. This allows other Modbus/TCP clients to be connected to the serial modbus device simultaneously. </w:t>
+        <w:t xml:space="preserve">The &lt;modbustcpserver&gt; element configures the built-in Modbus/TCP server that acts as a bridge to the connected modbus device. This allows other Modbus/TCP clients to be connected to the serial modbus device simultaneously. </w:t>
       </w:r>
     </w:p>
     <w:p>
@@ -28189,15 +26835,7 @@
               <w:pStyle w:val="Xmlgridtag"/>
             </w:pPr>
             <w:r>
-              <w:t>&lt;</w:t>
-            </w:r>
-            <w:proofErr w:type="spellStart"/>
-            <w:r>
-              <w:t>enable</w:t>
-            </w:r>
-            <w:proofErr w:type="spellEnd"/>
-            <w:r>
-              <w:t>&gt;</w:t>
+              <w:t>&lt;enable&gt;</w:t>
             </w:r>
           </w:p>
         </w:tc>
@@ -28529,7 +27167,6 @@
         </w:rPr>
         <w:t>&gt;&lt;</w:t>
       </w:r>
-      <w:proofErr w:type="spellStart"/>
       <w:r>
         <w:rPr>
           <w:rStyle w:val="XMLElement"/>
@@ -28537,7 +27174,6 @@
         </w:rPr>
         <w:t>rw</w:t>
       </w:r>
-      <w:proofErr w:type="spellEnd"/>
       <w:r>
         <w:rPr>
           <w:rStyle w:val="XMLBracket"/>
@@ -28559,7 +27195,6 @@
         </w:rPr>
         <w:t>&lt;/</w:t>
       </w:r>
-      <w:proofErr w:type="spellStart"/>
       <w:r>
         <w:rPr>
           <w:rStyle w:val="XMLElement"/>
@@ -28567,7 +27202,6 @@
         </w:rPr>
         <w:t>rw</w:t>
       </w:r>
-      <w:proofErr w:type="spellEnd"/>
       <w:r>
         <w:rPr>
           <w:rStyle w:val="XMLBracket"/>
@@ -28625,304 +27259,236 @@
           <w:rStyle w:val="XMLComment"/>
           <w:lang w:val="en-GB"/>
         </w:rPr>
-        <w:t>var&gt;&lt;reg&gt;40007&lt;/reg&gt;&lt;text&gt;Analog in 2&lt;/text&gt;&lt;type&gt;uint16&lt;/type&gt;&lt;</w:t>
-      </w:r>
-      <w:proofErr w:type="spellStart"/>
+        <w:t>var&gt;&lt;reg&gt;40007&lt;/reg&gt;&lt;text&gt;Analog in 2&lt;/text&gt;&lt;type&gt;uint16&lt;/type&gt;&lt;rw&gt;r&lt;/rw&gt;&lt;/var&gt;</w:t>
+      </w:r>
+    </w:p>
+    <w:p>
+      <w:pPr>
+        <w:pStyle w:val="XMLvoorbeeld"/>
+        <w:rPr>
+          <w:lang w:val="en-GB"/>
+        </w:rPr>
+      </w:pPr>
+      <w:r>
+        <w:rPr>
+          <w:color w:val="999999"/>
+          <w:lang w:val="en-GB"/>
+        </w:rPr>
+        <w:t>&lt;</w:t>
+      </w:r>
       <w:r>
         <w:rPr>
           <w:rStyle w:val="XMLComment"/>
           <w:lang w:val="en-GB"/>
         </w:rPr>
+        <w:t>var&gt;&lt;reg&gt;40008&lt;/reg&gt;&lt;text&gt;Analog in 3&lt;/text&gt;&lt;type&gt;uint16&lt;/type&gt;&lt;rw&gt;r&lt;/rw&gt;&lt;/var&gt;</w:t>
+      </w:r>
+    </w:p>
+    <w:p>
+      <w:pPr>
+        <w:pStyle w:val="XMLvoorbeeld"/>
+        <w:rPr>
+          <w:lang w:val="en-GB"/>
+        </w:rPr>
+      </w:pPr>
+      <w:r>
+        <w:rPr>
+          <w:rStyle w:val="XMLBracket"/>
+          <w:color w:val="CE181E"/>
+          <w:lang w:val="en-GB"/>
+        </w:rPr>
+        <w:t>--&gt;</w:t>
+      </w:r>
+    </w:p>
+    <w:p>
+      <w:pPr>
+        <w:pStyle w:val="XMLvoorbeeld"/>
+        <w:rPr>
+          <w:lang w:val="en-GB"/>
+        </w:rPr>
+      </w:pPr>
+      <w:r>
+        <w:rPr>
+          <w:rStyle w:val="XMLBracket"/>
+          <w:lang w:val="en-GB"/>
+        </w:rPr>
+        <w:t>&lt;</w:t>
+      </w:r>
+      <w:r>
+        <w:rPr>
+          <w:rStyle w:val="XMLElement"/>
+          <w:lang w:val="en-GB"/>
+        </w:rPr>
+        <w:t>var</w:t>
+      </w:r>
+      <w:r>
+        <w:rPr>
+          <w:rStyle w:val="XMLBracket"/>
+          <w:lang w:val="en-GB"/>
+        </w:rPr>
+        <w:t>&gt;&lt;</w:t>
+      </w:r>
+      <w:r>
+        <w:rPr>
+          <w:rStyle w:val="XMLElement"/>
+          <w:lang w:val="en-GB"/>
+        </w:rPr>
+        <w:t>reg</w:t>
+      </w:r>
+      <w:r>
+        <w:rPr>
+          <w:rStyle w:val="XMLBracket"/>
+          <w:lang w:val="en-GB"/>
+        </w:rPr>
+        <w:t>&gt;</w:t>
+      </w:r>
+      <w:r>
+        <w:rPr>
+          <w:rStyle w:val="XMLContent"/>
+          <w:lang w:val="en-GB"/>
+        </w:rPr>
+        <w:t>40009</w:t>
+      </w:r>
+      <w:r>
+        <w:rPr>
+          <w:rStyle w:val="XMLBracket"/>
+          <w:lang w:val="en-GB"/>
+        </w:rPr>
+        <w:t>&lt;/</w:t>
+      </w:r>
+      <w:r>
+        <w:rPr>
+          <w:rStyle w:val="XMLElement"/>
+          <w:lang w:val="en-GB"/>
+        </w:rPr>
+        <w:t>reg</w:t>
+      </w:r>
+      <w:r>
+        <w:rPr>
+          <w:rStyle w:val="XMLBracket"/>
+          <w:lang w:val="en-GB"/>
+        </w:rPr>
+        <w:t>&gt;&lt;</w:t>
+      </w:r>
+      <w:r>
+        <w:rPr>
+          <w:rStyle w:val="XMLElement"/>
+          <w:lang w:val="en-GB"/>
+        </w:rPr>
+        <w:t>text</w:t>
+      </w:r>
+      <w:r>
+        <w:rPr>
+          <w:rStyle w:val="XMLBracket"/>
+          <w:lang w:val="en-GB"/>
+        </w:rPr>
+        <w:t>&gt;</w:t>
+      </w:r>
+      <w:r>
+        <w:rPr>
+          <w:rStyle w:val="XMLContent"/>
+          <w:lang w:val="en-GB"/>
+        </w:rPr>
+        <w:t>Analog in 4</w:t>
+      </w:r>
+      <w:r>
+        <w:rPr>
+          <w:rStyle w:val="XMLBracket"/>
+          <w:lang w:val="en-GB"/>
+        </w:rPr>
+        <w:t>&lt;/</w:t>
+      </w:r>
+      <w:r>
+        <w:rPr>
+          <w:rStyle w:val="XMLElement"/>
+          <w:lang w:val="en-GB"/>
+        </w:rPr>
+        <w:t>text</w:t>
+      </w:r>
+      <w:r>
+        <w:rPr>
+          <w:rStyle w:val="XMLBracket"/>
+          <w:lang w:val="en-GB"/>
+        </w:rPr>
+        <w:t>&gt;&lt;</w:t>
+      </w:r>
+      <w:r>
+        <w:rPr>
+          <w:rStyle w:val="XMLKeyWord"/>
+          <w:lang w:val="en-GB"/>
+        </w:rPr>
+        <w:t>type</w:t>
+      </w:r>
+      <w:r>
+        <w:rPr>
+          <w:rStyle w:val="XMLBracket"/>
+          <w:lang w:val="en-GB"/>
+        </w:rPr>
+        <w:t>&gt;</w:t>
+      </w:r>
+      <w:r>
+        <w:rPr>
+          <w:rStyle w:val="XMLContent"/>
+          <w:lang w:val="en-GB"/>
+        </w:rPr>
+        <w:t>uint16</w:t>
+      </w:r>
+      <w:r>
+        <w:rPr>
+          <w:rStyle w:val="XMLBracket"/>
+          <w:lang w:val="en-GB"/>
+        </w:rPr>
+        <w:t>&lt;/</w:t>
+      </w:r>
+      <w:r>
+        <w:rPr>
+          <w:rStyle w:val="XMLKeyWord"/>
+          <w:lang w:val="en-GB"/>
+        </w:rPr>
+        <w:t>type</w:t>
+      </w:r>
+      <w:r>
+        <w:rPr>
+          <w:rStyle w:val="XMLBracket"/>
+          <w:lang w:val="en-GB"/>
+        </w:rPr>
+        <w:t>&gt;&lt;</w:t>
+      </w:r>
+      <w:r>
+        <w:rPr>
+          <w:rStyle w:val="XMLElement"/>
+          <w:lang w:val="en-GB"/>
+        </w:rPr>
         <w:t>rw</w:t>
       </w:r>
-      <w:proofErr w:type="spellEnd"/>
-      <w:r>
-        <w:rPr>
-          <w:rStyle w:val="XMLComment"/>
-          <w:lang w:val="en-GB"/>
-        </w:rPr>
-        <w:t>&gt;r&lt;/</w:t>
-      </w:r>
-      <w:proofErr w:type="spellStart"/>
-      <w:r>
-        <w:rPr>
-          <w:rStyle w:val="XMLComment"/>
+      <w:r>
+        <w:rPr>
+          <w:rStyle w:val="XMLBracket"/>
+          <w:lang w:val="en-GB"/>
+        </w:rPr>
+        <w:t>&gt;</w:t>
+      </w:r>
+      <w:r>
+        <w:rPr>
+          <w:rStyle w:val="XMLContent"/>
+          <w:lang w:val="en-GB"/>
+        </w:rPr>
+        <w:t>r</w:t>
+      </w:r>
+      <w:r>
+        <w:rPr>
+          <w:rStyle w:val="XMLBracket"/>
+          <w:lang w:val="en-GB"/>
+        </w:rPr>
+        <w:t>&lt;/</w:t>
+      </w:r>
+      <w:r>
+        <w:rPr>
+          <w:rStyle w:val="XMLElement"/>
           <w:lang w:val="en-GB"/>
         </w:rPr>
         <w:t>rw</w:t>
       </w:r>
-      <w:proofErr w:type="spellEnd"/>
-      <w:r>
-        <w:rPr>
-          <w:rStyle w:val="XMLComment"/>
-          <w:lang w:val="en-GB"/>
-        </w:rPr>
-        <w:t>&gt;&lt;/var&gt;</w:t>
-      </w:r>
-    </w:p>
-    <w:p>
-      <w:pPr>
-        <w:pStyle w:val="XMLvoorbeeld"/>
-        <w:rPr>
-          <w:lang w:val="en-GB"/>
-        </w:rPr>
-      </w:pPr>
-      <w:r>
-        <w:rPr>
-          <w:color w:val="999999"/>
-          <w:lang w:val="en-GB"/>
-        </w:rPr>
-        <w:t>&lt;</w:t>
-      </w:r>
-      <w:r>
-        <w:rPr>
-          <w:rStyle w:val="XMLComment"/>
-          <w:lang w:val="en-GB"/>
-        </w:rPr>
-        <w:t>var&gt;&lt;reg&gt;40008&lt;/reg&gt;&lt;text&gt;Analog in 3&lt;/text&gt;&lt;type&gt;uint16&lt;/type&gt;&lt;</w:t>
-      </w:r>
-      <w:proofErr w:type="spellStart"/>
-      <w:r>
-        <w:rPr>
-          <w:rStyle w:val="XMLComment"/>
-          <w:lang w:val="en-GB"/>
-        </w:rPr>
-        <w:t>rw</w:t>
-      </w:r>
-      <w:proofErr w:type="spellEnd"/>
-      <w:r>
-        <w:rPr>
-          <w:rStyle w:val="XMLComment"/>
-          <w:lang w:val="en-GB"/>
-        </w:rPr>
-        <w:t>&gt;r&lt;/</w:t>
-      </w:r>
-      <w:proofErr w:type="spellStart"/>
-      <w:r>
-        <w:rPr>
-          <w:rStyle w:val="XMLComment"/>
-          <w:lang w:val="en-GB"/>
-        </w:rPr>
-        <w:t>rw</w:t>
-      </w:r>
-      <w:proofErr w:type="spellEnd"/>
-      <w:r>
-        <w:rPr>
-          <w:rStyle w:val="XMLComment"/>
-          <w:lang w:val="en-GB"/>
-        </w:rPr>
-        <w:t>&gt;&lt;/var&gt;</w:t>
-      </w:r>
-    </w:p>
-    <w:p>
-      <w:pPr>
-        <w:pStyle w:val="XMLvoorbeeld"/>
-        <w:rPr>
-          <w:lang w:val="en-GB"/>
-        </w:rPr>
-      </w:pPr>
-      <w:r>
-        <w:rPr>
-          <w:rStyle w:val="XMLBracket"/>
-          <w:color w:val="CE181E"/>
-          <w:lang w:val="en-GB"/>
-        </w:rPr>
-        <w:t>--&gt;</w:t>
-      </w:r>
-    </w:p>
-    <w:p>
-      <w:pPr>
-        <w:pStyle w:val="XMLvoorbeeld"/>
-        <w:rPr>
-          <w:lang w:val="en-GB"/>
-        </w:rPr>
-      </w:pPr>
-      <w:r>
-        <w:rPr>
-          <w:rStyle w:val="XMLBracket"/>
-          <w:lang w:val="en-GB"/>
-        </w:rPr>
-        <w:t>&lt;</w:t>
-      </w:r>
-      <w:r>
-        <w:rPr>
-          <w:rStyle w:val="XMLElement"/>
-          <w:lang w:val="en-GB"/>
-        </w:rPr>
-        <w:t>var</w:t>
-      </w:r>
-      <w:r>
-        <w:rPr>
-          <w:rStyle w:val="XMLBracket"/>
-          <w:lang w:val="en-GB"/>
-        </w:rPr>
-        <w:t>&gt;&lt;</w:t>
-      </w:r>
-      <w:r>
-        <w:rPr>
-          <w:rStyle w:val="XMLElement"/>
-          <w:lang w:val="en-GB"/>
-        </w:rPr>
-        <w:t>reg</w:t>
-      </w:r>
-      <w:r>
-        <w:rPr>
-          <w:rStyle w:val="XMLBracket"/>
-          <w:lang w:val="en-GB"/>
-        </w:rPr>
-        <w:t>&gt;</w:t>
-      </w:r>
-      <w:r>
-        <w:rPr>
-          <w:rStyle w:val="XMLContent"/>
-          <w:lang w:val="en-GB"/>
-        </w:rPr>
-        <w:t>40009</w:t>
-      </w:r>
-      <w:r>
-        <w:rPr>
-          <w:rStyle w:val="XMLBracket"/>
-          <w:lang w:val="en-GB"/>
-        </w:rPr>
-        <w:t>&lt;/</w:t>
-      </w:r>
-      <w:r>
-        <w:rPr>
-          <w:rStyle w:val="XMLElement"/>
-          <w:lang w:val="en-GB"/>
-        </w:rPr>
-        <w:t>reg</w:t>
-      </w:r>
-      <w:r>
-        <w:rPr>
-          <w:rStyle w:val="XMLBracket"/>
-          <w:lang w:val="en-GB"/>
-        </w:rPr>
-        <w:t>&gt;&lt;</w:t>
-      </w:r>
-      <w:r>
-        <w:rPr>
-          <w:rStyle w:val="XMLElement"/>
-          <w:lang w:val="en-GB"/>
-        </w:rPr>
-        <w:t>text</w:t>
-      </w:r>
-      <w:r>
-        <w:rPr>
-          <w:rStyle w:val="XMLBracket"/>
-          <w:lang w:val="en-GB"/>
-        </w:rPr>
-        <w:t>&gt;</w:t>
-      </w:r>
-      <w:r>
-        <w:rPr>
-          <w:rStyle w:val="XMLContent"/>
-          <w:lang w:val="en-GB"/>
-        </w:rPr>
-        <w:t>Analog in 4</w:t>
-      </w:r>
-      <w:r>
-        <w:rPr>
-          <w:rStyle w:val="XMLBracket"/>
-          <w:lang w:val="en-GB"/>
-        </w:rPr>
-        <w:t>&lt;/</w:t>
-      </w:r>
-      <w:r>
-        <w:rPr>
-          <w:rStyle w:val="XMLElement"/>
-          <w:lang w:val="en-GB"/>
-        </w:rPr>
-        <w:t>text</w:t>
-      </w:r>
-      <w:r>
-        <w:rPr>
-          <w:rStyle w:val="XMLBracket"/>
-          <w:lang w:val="en-GB"/>
-        </w:rPr>
-        <w:t>&gt;&lt;</w:t>
-      </w:r>
-      <w:r>
-        <w:rPr>
-          <w:rStyle w:val="XMLKeyWord"/>
-          <w:lang w:val="en-GB"/>
-        </w:rPr>
-        <w:t>type</w:t>
-      </w:r>
-      <w:r>
-        <w:rPr>
-          <w:rStyle w:val="XMLBracket"/>
-          <w:lang w:val="en-GB"/>
-        </w:rPr>
-        <w:t>&gt;</w:t>
-      </w:r>
-      <w:r>
-        <w:rPr>
-          <w:rStyle w:val="XMLContent"/>
-          <w:lang w:val="en-GB"/>
-        </w:rPr>
-        <w:t>uint16</w:t>
-      </w:r>
-      <w:r>
-        <w:rPr>
-          <w:rStyle w:val="XMLBracket"/>
-          <w:lang w:val="en-GB"/>
-        </w:rPr>
-        <w:t>&lt;/</w:t>
-      </w:r>
-      <w:r>
-        <w:rPr>
-          <w:rStyle w:val="XMLKeyWord"/>
-          <w:lang w:val="en-GB"/>
-        </w:rPr>
-        <w:t>type</w:t>
-      </w:r>
-      <w:r>
-        <w:rPr>
-          <w:rStyle w:val="XMLBracket"/>
-          <w:lang w:val="en-GB"/>
-        </w:rPr>
-        <w:t>&gt;&lt;</w:t>
-      </w:r>
-      <w:proofErr w:type="spellStart"/>
-      <w:r>
-        <w:rPr>
-          <w:rStyle w:val="XMLElement"/>
-          <w:lang w:val="en-GB"/>
-        </w:rPr>
-        <w:t>rw</w:t>
-      </w:r>
-      <w:proofErr w:type="spellEnd"/>
-      <w:r>
-        <w:rPr>
-          <w:rStyle w:val="XMLBracket"/>
-          <w:lang w:val="en-GB"/>
-        </w:rPr>
-        <w:t>&gt;</w:t>
-      </w:r>
-      <w:r>
-        <w:rPr>
-          <w:rStyle w:val="XMLContent"/>
-          <w:lang w:val="en-GB"/>
-        </w:rPr>
-        <w:t>r</w:t>
-      </w:r>
-      <w:r>
-        <w:rPr>
-          <w:rStyle w:val="XMLBracket"/>
-          <w:lang w:val="en-GB"/>
-        </w:rPr>
-        <w:t>&lt;/</w:t>
-      </w:r>
-      <w:proofErr w:type="spellStart"/>
-      <w:r>
-        <w:rPr>
-          <w:rStyle w:val="XMLElement"/>
-          <w:lang w:val="en-GB"/>
-        </w:rPr>
-        <w:t>rw</w:t>
-      </w:r>
-      <w:proofErr w:type="spellEnd"/>
       <w:r>
         <w:rPr>
           <w:rStyle w:val="XMLBracket"/>
@@ -28971,7 +27537,7 @@
 </file>
 
 <file path=word/endnotes.xml><?xml version="1.0" encoding="utf-8"?>
-<w:endnotes xmlns:wpc="http://schemas.microsoft.com/office/word/2010/wordprocessingCanvas" xmlns:cx="http://schemas.microsoft.com/office/drawing/2014/chartex" xmlns:cx1="http://schemas.microsoft.com/office/drawing/2015/9/8/chartex" xmlns:cx2="http://schemas.microsoft.com/office/drawing/2015/10/21/chartex" xmlns:cx3="http://schemas.microsoft.com/office/drawing/2016/5/9/chartex" xmlns:cx4="http://schemas.microsoft.com/office/drawing/2016/5/10/chartex" xmlns:cx5="http://schemas.microsoft.com/office/drawing/2016/5/11/chartex" xmlns:cx6="http://schemas.microsoft.com/office/drawing/2016/5/12/chartex" xmlns:cx7="http://schemas.microsoft.com/office/drawing/2016/5/13/chartex" xmlns:cx8="http://schemas.microsoft.com/office/drawing/2016/5/14/chartex" xmlns:mc="http://schemas.openxmlformats.org/markup-compatibility/2006" xmlns:aink="http://schemas.microsoft.com/office/drawing/2016/ink" xmlns:am3d="http://schemas.microsoft.com/office/drawing/2017/model3d" xmlns:o="urn:schemas-microsoft-com:office:office" xmlns:oel="http://schemas.microsoft.com/office/2019/extlst" xmlns:r="http://schemas.openxmlformats.org/officeDocument/2006/relationships" xmlns:m="http://schemas.openxmlformats.org/officeDocument/2006/math" xmlns:v="urn:schemas-microsoft-com:vml" xmlns:wp14="http://schemas.microsoft.com/office/word/2010/wordprocessingDrawing" xmlns:wp="http://schemas.openxmlformats.org/drawingml/2006/wordprocessingDrawing" xmlns:w10="urn:schemas-microsoft-com:office:word" xmlns:w="http://schemas.openxmlformats.org/wordprocessingml/2006/main" xmlns:w14="http://schemas.microsoft.com/office/word/2010/wordml" xmlns:w15="http://schemas.microsoft.com/office/word/2012/wordml" xmlns:w16cex="http://schemas.microsoft.com/office/word/2018/wordml/cex" xmlns:w16cid="http://schemas.microsoft.com/office/word/2016/wordml/cid" xmlns:w16="http://schemas.microsoft.com/office/word/2018/wordml" xmlns:w16sdtdh="http://schemas.microsoft.com/office/word/2020/wordml/sdtdatahash" xmlns:w16se="http://schemas.microsoft.com/office/word/2015/wordml/symex" xmlns:wpg="http://schemas.microsoft.com/office/word/2010/wordprocessingGroup" xmlns:wpi="http://schemas.microsoft.com/office/word/2010/wordprocessingInk" xmlns:wne="http://schemas.microsoft.com/office/word/2006/wordml" xmlns:wps="http://schemas.microsoft.com/office/word/2010/wordprocessingShape" mc:Ignorable="w14 w15 w16se w16cid w16 w16cex w16sdtdh wp14">
+<w:endnotes xmlns:wpc="http://schemas.microsoft.com/office/word/2010/wordprocessingCanvas" xmlns:cx="http://schemas.microsoft.com/office/drawing/2014/chartex" xmlns:cx1="http://schemas.microsoft.com/office/drawing/2015/9/8/chartex" xmlns:cx2="http://schemas.microsoft.com/office/drawing/2015/10/21/chartex" xmlns:cx3="http://schemas.microsoft.com/office/drawing/2016/5/9/chartex" xmlns:cx4="http://schemas.microsoft.com/office/drawing/2016/5/10/chartex" xmlns:cx5="http://schemas.microsoft.com/office/drawing/2016/5/11/chartex" xmlns:cx6="http://schemas.microsoft.com/office/drawing/2016/5/12/chartex" xmlns:cx7="http://schemas.microsoft.com/office/drawing/2016/5/13/chartex" xmlns:cx8="http://schemas.microsoft.com/office/drawing/2016/5/14/chartex" xmlns:mc="http://schemas.openxmlformats.org/markup-compatibility/2006" xmlns:aink="http://schemas.microsoft.com/office/drawing/2016/ink" xmlns:am3d="http://schemas.microsoft.com/office/drawing/2017/model3d" xmlns:o="urn:schemas-microsoft-com:office:office" xmlns:oel="http://schemas.microsoft.com/office/2019/extlst" xmlns:r="http://schemas.openxmlformats.org/officeDocument/2006/relationships" xmlns:m="http://schemas.openxmlformats.org/officeDocument/2006/math" xmlns:v="urn:schemas-microsoft-com:vml" xmlns:wp14="http://schemas.microsoft.com/office/word/2010/wordprocessingDrawing" xmlns:wp="http://schemas.openxmlformats.org/drawingml/2006/wordprocessingDrawing" xmlns:w10="urn:schemas-microsoft-com:office:word" xmlns:w="http://schemas.openxmlformats.org/wordprocessingml/2006/main" xmlns:w14="http://schemas.microsoft.com/office/word/2010/wordml" xmlns:w15="http://schemas.microsoft.com/office/word/2012/wordml" xmlns:w16cex="http://schemas.microsoft.com/office/word/2018/wordml/cex" xmlns:w16cid="http://schemas.microsoft.com/office/word/2016/wordml/cid" xmlns:w16="http://schemas.microsoft.com/office/word/2018/wordml" xmlns:w16du="http://schemas.microsoft.com/office/word/2023/wordml/word16du" xmlns:w16sdtdh="http://schemas.microsoft.com/office/word/2020/wordml/sdtdatahash" xmlns:w16se="http://schemas.microsoft.com/office/word/2015/wordml/symex" xmlns:wpg="http://schemas.microsoft.com/office/word/2010/wordprocessingGroup" xmlns:wpi="http://schemas.microsoft.com/office/word/2010/wordprocessingInk" xmlns:wne="http://schemas.microsoft.com/office/word/2006/wordml" xmlns:wps="http://schemas.microsoft.com/office/word/2010/wordprocessingShape" mc:Ignorable="w14 w15 w16se w16cid w16 w16cex w16sdtdh w16du wp14">
   <w:endnote w:type="separator" w:id="-1">
     <w:p>
       <w:pPr>
@@ -29002,7 +27568,7 @@
 </file>
 
 <file path=word/footer1.xml><?xml version="1.0" encoding="utf-8"?>
-<w:ftr xmlns:wpc="http://schemas.microsoft.com/office/word/2010/wordprocessingCanvas" xmlns:cx="http://schemas.microsoft.com/office/drawing/2014/chartex" xmlns:cx1="http://schemas.microsoft.com/office/drawing/2015/9/8/chartex" xmlns:cx2="http://schemas.microsoft.com/office/drawing/2015/10/21/chartex" xmlns:cx3="http://schemas.microsoft.com/office/drawing/2016/5/9/chartex" xmlns:cx4="http://schemas.microsoft.com/office/drawing/2016/5/10/chartex" xmlns:cx5="http://schemas.microsoft.com/office/drawing/2016/5/11/chartex" xmlns:cx6="http://schemas.microsoft.com/office/drawing/2016/5/12/chartex" xmlns:cx7="http://schemas.microsoft.com/office/drawing/2016/5/13/chartex" xmlns:cx8="http://schemas.microsoft.com/office/drawing/2016/5/14/chartex" xmlns:mc="http://schemas.openxmlformats.org/markup-compatibility/2006" xmlns:aink="http://schemas.microsoft.com/office/drawing/2016/ink" xmlns:am3d="http://schemas.microsoft.com/office/drawing/2017/model3d" xmlns:o="urn:schemas-microsoft-com:office:office" xmlns:oel="http://schemas.microsoft.com/office/2019/extlst" xmlns:r="http://schemas.openxmlformats.org/officeDocument/2006/relationships" xmlns:m="http://schemas.openxmlformats.org/officeDocument/2006/math" xmlns:v="urn:schemas-microsoft-com:vml" xmlns:wp14="http://schemas.microsoft.com/office/word/2010/wordprocessingDrawing" xmlns:wp="http://schemas.openxmlformats.org/drawingml/2006/wordprocessingDrawing" xmlns:w10="urn:schemas-microsoft-com:office:word" xmlns:w="http://schemas.openxmlformats.org/wordprocessingml/2006/main" xmlns:w14="http://schemas.microsoft.com/office/word/2010/wordml" xmlns:w15="http://schemas.microsoft.com/office/word/2012/wordml" xmlns:w16cex="http://schemas.microsoft.com/office/word/2018/wordml/cex" xmlns:w16cid="http://schemas.microsoft.com/office/word/2016/wordml/cid" xmlns:w16="http://schemas.microsoft.com/office/word/2018/wordml" xmlns:w16sdtdh="http://schemas.microsoft.com/office/word/2020/wordml/sdtdatahash" xmlns:w16se="http://schemas.microsoft.com/office/word/2015/wordml/symex" xmlns:wpg="http://schemas.microsoft.com/office/word/2010/wordprocessingGroup" xmlns:wpi="http://schemas.microsoft.com/office/word/2010/wordprocessingInk" xmlns:wne="http://schemas.microsoft.com/office/word/2006/wordml" xmlns:wps="http://schemas.microsoft.com/office/word/2010/wordprocessingShape" mc:Ignorable="w14 w15 w16se w16cid w16 w16cex w16sdtdh wp14">
+<w:ftr xmlns:wpc="http://schemas.microsoft.com/office/word/2010/wordprocessingCanvas" xmlns:cx="http://schemas.microsoft.com/office/drawing/2014/chartex" xmlns:cx1="http://schemas.microsoft.com/office/drawing/2015/9/8/chartex" xmlns:cx2="http://schemas.microsoft.com/office/drawing/2015/10/21/chartex" xmlns:cx3="http://schemas.microsoft.com/office/drawing/2016/5/9/chartex" xmlns:cx4="http://schemas.microsoft.com/office/drawing/2016/5/10/chartex" xmlns:cx5="http://schemas.microsoft.com/office/drawing/2016/5/11/chartex" xmlns:cx6="http://schemas.microsoft.com/office/drawing/2016/5/12/chartex" xmlns:cx7="http://schemas.microsoft.com/office/drawing/2016/5/13/chartex" xmlns:cx8="http://schemas.microsoft.com/office/drawing/2016/5/14/chartex" xmlns:mc="http://schemas.openxmlformats.org/markup-compatibility/2006" xmlns:aink="http://schemas.microsoft.com/office/drawing/2016/ink" xmlns:am3d="http://schemas.microsoft.com/office/drawing/2017/model3d" xmlns:o="urn:schemas-microsoft-com:office:office" xmlns:oel="http://schemas.microsoft.com/office/2019/extlst" xmlns:r="http://schemas.openxmlformats.org/officeDocument/2006/relationships" xmlns:m="http://schemas.openxmlformats.org/officeDocument/2006/math" xmlns:v="urn:schemas-microsoft-com:vml" xmlns:wp14="http://schemas.microsoft.com/office/word/2010/wordprocessingDrawing" xmlns:wp="http://schemas.openxmlformats.org/drawingml/2006/wordprocessingDrawing" xmlns:w10="urn:schemas-microsoft-com:office:word" xmlns:w="http://schemas.openxmlformats.org/wordprocessingml/2006/main" xmlns:w14="http://schemas.microsoft.com/office/word/2010/wordml" xmlns:w15="http://schemas.microsoft.com/office/word/2012/wordml" xmlns:w16cex="http://schemas.microsoft.com/office/word/2018/wordml/cex" xmlns:w16cid="http://schemas.microsoft.com/office/word/2016/wordml/cid" xmlns:w16="http://schemas.microsoft.com/office/word/2018/wordml" xmlns:w16du="http://schemas.microsoft.com/office/word/2023/wordml/word16du" xmlns:w16sdtdh="http://schemas.microsoft.com/office/word/2020/wordml/sdtdatahash" xmlns:w16se="http://schemas.microsoft.com/office/word/2015/wordml/symex" xmlns:wpg="http://schemas.microsoft.com/office/word/2010/wordprocessingGroup" xmlns:wpi="http://schemas.microsoft.com/office/word/2010/wordprocessingInk" xmlns:wne="http://schemas.microsoft.com/office/word/2006/wordml" xmlns:wps="http://schemas.microsoft.com/office/word/2010/wordprocessingShape" mc:Ignorable="w14 w15 w16se w16cid w16 w16cex w16sdtdh w16du wp14">
   <w:p>
     <w:pPr>
       <w:pStyle w:val="Voettekst"/>
@@ -29055,7 +27621,7 @@
 </file>
 
 <file path=word/footnotes.xml><?xml version="1.0" encoding="utf-8"?>
-<w:footnotes xmlns:wpc="http://schemas.microsoft.com/office/word/2010/wordprocessingCanvas" xmlns:cx="http://schemas.microsoft.com/office/drawing/2014/chartex" xmlns:cx1="http://schemas.microsoft.com/office/drawing/2015/9/8/chartex" xmlns:cx2="http://schemas.microsoft.com/office/drawing/2015/10/21/chartex" xmlns:cx3="http://schemas.microsoft.com/office/drawing/2016/5/9/chartex" xmlns:cx4="http://schemas.microsoft.com/office/drawing/2016/5/10/chartex" xmlns:cx5="http://schemas.microsoft.com/office/drawing/2016/5/11/chartex" xmlns:cx6="http://schemas.microsoft.com/office/drawing/2016/5/12/chartex" xmlns:cx7="http://schemas.microsoft.com/office/drawing/2016/5/13/chartex" xmlns:cx8="http://schemas.microsoft.com/office/drawing/2016/5/14/chartex" xmlns:mc="http://schemas.openxmlformats.org/markup-compatibility/2006" xmlns:aink="http://schemas.microsoft.com/office/drawing/2016/ink" xmlns:am3d="http://schemas.microsoft.com/office/drawing/2017/model3d" xmlns:o="urn:schemas-microsoft-com:office:office" xmlns:oel="http://schemas.microsoft.com/office/2019/extlst" xmlns:r="http://schemas.openxmlformats.org/officeDocument/2006/relationships" xmlns:m="http://schemas.openxmlformats.org/officeDocument/2006/math" xmlns:v="urn:schemas-microsoft-com:vml" xmlns:wp14="http://schemas.microsoft.com/office/word/2010/wordprocessingDrawing" xmlns:wp="http://schemas.openxmlformats.org/drawingml/2006/wordprocessingDrawing" xmlns:w10="urn:schemas-microsoft-com:office:word" xmlns:w="http://schemas.openxmlformats.org/wordprocessingml/2006/main" xmlns:w14="http://schemas.microsoft.com/office/word/2010/wordml" xmlns:w15="http://schemas.microsoft.com/office/word/2012/wordml" xmlns:w16cex="http://schemas.microsoft.com/office/word/2018/wordml/cex" xmlns:w16cid="http://schemas.microsoft.com/office/word/2016/wordml/cid" xmlns:w16="http://schemas.microsoft.com/office/word/2018/wordml" xmlns:w16sdtdh="http://schemas.microsoft.com/office/word/2020/wordml/sdtdatahash" xmlns:w16se="http://schemas.microsoft.com/office/word/2015/wordml/symex" xmlns:wpg="http://schemas.microsoft.com/office/word/2010/wordprocessingGroup" xmlns:wpi="http://schemas.microsoft.com/office/word/2010/wordprocessingInk" xmlns:wne="http://schemas.microsoft.com/office/word/2006/wordml" xmlns:wps="http://schemas.microsoft.com/office/word/2010/wordprocessingShape" mc:Ignorable="w14 w15 w16se w16cid w16 w16cex w16sdtdh wp14">
+<w:footnotes xmlns:wpc="http://schemas.microsoft.com/office/word/2010/wordprocessingCanvas" xmlns:cx="http://schemas.microsoft.com/office/drawing/2014/chartex" xmlns:cx1="http://schemas.microsoft.com/office/drawing/2015/9/8/chartex" xmlns:cx2="http://schemas.microsoft.com/office/drawing/2015/10/21/chartex" xmlns:cx3="http://schemas.microsoft.com/office/drawing/2016/5/9/chartex" xmlns:cx4="http://schemas.microsoft.com/office/drawing/2016/5/10/chartex" xmlns:cx5="http://schemas.microsoft.com/office/drawing/2016/5/11/chartex" xmlns:cx6="http://schemas.microsoft.com/office/drawing/2016/5/12/chartex" xmlns:cx7="http://schemas.microsoft.com/office/drawing/2016/5/13/chartex" xmlns:cx8="http://schemas.microsoft.com/office/drawing/2016/5/14/chartex" xmlns:mc="http://schemas.openxmlformats.org/markup-compatibility/2006" xmlns:aink="http://schemas.microsoft.com/office/drawing/2016/ink" xmlns:am3d="http://schemas.microsoft.com/office/drawing/2017/model3d" xmlns:o="urn:schemas-microsoft-com:office:office" xmlns:oel="http://schemas.microsoft.com/office/2019/extlst" xmlns:r="http://schemas.openxmlformats.org/officeDocument/2006/relationships" xmlns:m="http://schemas.openxmlformats.org/officeDocument/2006/math" xmlns:v="urn:schemas-microsoft-com:vml" xmlns:wp14="http://schemas.microsoft.com/office/word/2010/wordprocessingDrawing" xmlns:wp="http://schemas.openxmlformats.org/drawingml/2006/wordprocessingDrawing" xmlns:w10="urn:schemas-microsoft-com:office:word" xmlns:w="http://schemas.openxmlformats.org/wordprocessingml/2006/main" xmlns:w14="http://schemas.microsoft.com/office/word/2010/wordml" xmlns:w15="http://schemas.microsoft.com/office/word/2012/wordml" xmlns:w16cex="http://schemas.microsoft.com/office/word/2018/wordml/cex" xmlns:w16cid="http://schemas.microsoft.com/office/word/2016/wordml/cid" xmlns:w16="http://schemas.microsoft.com/office/word/2018/wordml" xmlns:w16du="http://schemas.microsoft.com/office/word/2023/wordml/word16du" xmlns:w16sdtdh="http://schemas.microsoft.com/office/word/2020/wordml/sdtdatahash" xmlns:w16se="http://schemas.microsoft.com/office/word/2015/wordml/symex" xmlns:wpg="http://schemas.microsoft.com/office/word/2010/wordprocessingGroup" xmlns:wpi="http://schemas.microsoft.com/office/word/2010/wordprocessingInk" xmlns:wne="http://schemas.microsoft.com/office/word/2006/wordml" xmlns:wps="http://schemas.microsoft.com/office/word/2010/wordprocessingShape" mc:Ignorable="w14 w15 w16se w16cid w16 w16cex w16sdtdh w16du wp14">
   <w:footnote w:type="separator" w:id="-1">
     <w:p>
       <w:pPr>
@@ -29086,7 +27652,7 @@
 </file>
 
 <file path=word/numbering.xml><?xml version="1.0" encoding="utf-8"?>
-<w:numbering xmlns:wpc="http://schemas.microsoft.com/office/word/2010/wordprocessingCanvas" xmlns:cx="http://schemas.microsoft.com/office/drawing/2014/chartex" xmlns:cx1="http://schemas.microsoft.com/office/drawing/2015/9/8/chartex" xmlns:cx2="http://schemas.microsoft.com/office/drawing/2015/10/21/chartex" xmlns:cx3="http://schemas.microsoft.com/office/drawing/2016/5/9/chartex" xmlns:cx4="http://schemas.microsoft.com/office/drawing/2016/5/10/chartex" xmlns:cx5="http://schemas.microsoft.com/office/drawing/2016/5/11/chartex" xmlns:cx6="http://schemas.microsoft.com/office/drawing/2016/5/12/chartex" xmlns:cx7="http://schemas.microsoft.com/office/drawing/2016/5/13/chartex" xmlns:cx8="http://schemas.microsoft.com/office/drawing/2016/5/14/chartex" xmlns:mc="http://schemas.openxmlformats.org/markup-compatibility/2006" xmlns:aink="http://schemas.microsoft.com/office/drawing/2016/ink" xmlns:am3d="http://schemas.microsoft.com/office/drawing/2017/model3d" xmlns:o="urn:schemas-microsoft-com:office:office" xmlns:oel="http://schemas.microsoft.com/office/2019/extlst" xmlns:r="http://schemas.openxmlformats.org/officeDocument/2006/relationships" xmlns:m="http://schemas.openxmlformats.org/officeDocument/2006/math" xmlns:v="urn:schemas-microsoft-com:vml" xmlns:wp14="http://schemas.microsoft.com/office/word/2010/wordprocessingDrawing" xmlns:wp="http://schemas.openxmlformats.org/drawingml/2006/wordprocessingDrawing" xmlns:w10="urn:schemas-microsoft-com:office:word" xmlns:w="http://schemas.openxmlformats.org/wordprocessingml/2006/main" xmlns:w14="http://schemas.microsoft.com/office/word/2010/wordml" xmlns:w15="http://schemas.microsoft.com/office/word/2012/wordml" xmlns:w16cex="http://schemas.microsoft.com/office/word/2018/wordml/cex" xmlns:w16cid="http://schemas.microsoft.com/office/word/2016/wordml/cid" xmlns:w16="http://schemas.microsoft.com/office/word/2018/wordml" xmlns:w16sdtdh="http://schemas.microsoft.com/office/word/2020/wordml/sdtdatahash" xmlns:w16se="http://schemas.microsoft.com/office/word/2015/wordml/symex" xmlns:wpg="http://schemas.microsoft.com/office/word/2010/wordprocessingGroup" xmlns:wpi="http://schemas.microsoft.com/office/word/2010/wordprocessingInk" xmlns:wne="http://schemas.microsoft.com/office/word/2006/wordml" xmlns:wps="http://schemas.microsoft.com/office/word/2010/wordprocessingShape" mc:Ignorable="w14 w15 w16se w16cid w16 w16cex w16sdtdh wp14">
+<w:numbering xmlns:wpc="http://schemas.microsoft.com/office/word/2010/wordprocessingCanvas" xmlns:cx="http://schemas.microsoft.com/office/drawing/2014/chartex" xmlns:cx1="http://schemas.microsoft.com/office/drawing/2015/9/8/chartex" xmlns:cx2="http://schemas.microsoft.com/office/drawing/2015/10/21/chartex" xmlns:cx3="http://schemas.microsoft.com/office/drawing/2016/5/9/chartex" xmlns:cx4="http://schemas.microsoft.com/office/drawing/2016/5/10/chartex" xmlns:cx5="http://schemas.microsoft.com/office/drawing/2016/5/11/chartex" xmlns:cx6="http://schemas.microsoft.com/office/drawing/2016/5/12/chartex" xmlns:cx7="http://schemas.microsoft.com/office/drawing/2016/5/13/chartex" xmlns:cx8="http://schemas.microsoft.com/office/drawing/2016/5/14/chartex" xmlns:mc="http://schemas.openxmlformats.org/markup-compatibility/2006" xmlns:aink="http://schemas.microsoft.com/office/drawing/2016/ink" xmlns:am3d="http://schemas.microsoft.com/office/drawing/2017/model3d" xmlns:o="urn:schemas-microsoft-com:office:office" xmlns:oel="http://schemas.microsoft.com/office/2019/extlst" xmlns:r="http://schemas.openxmlformats.org/officeDocument/2006/relationships" xmlns:m="http://schemas.openxmlformats.org/officeDocument/2006/math" xmlns:v="urn:schemas-microsoft-com:vml" xmlns:wp14="http://schemas.microsoft.com/office/word/2010/wordprocessingDrawing" xmlns:wp="http://schemas.openxmlformats.org/drawingml/2006/wordprocessingDrawing" xmlns:w10="urn:schemas-microsoft-com:office:word" xmlns:w="http://schemas.openxmlformats.org/wordprocessingml/2006/main" xmlns:w14="http://schemas.microsoft.com/office/word/2010/wordml" xmlns:w15="http://schemas.microsoft.com/office/word/2012/wordml" xmlns:w16cex="http://schemas.microsoft.com/office/word/2018/wordml/cex" xmlns:w16cid="http://schemas.microsoft.com/office/word/2016/wordml/cid" xmlns:w16="http://schemas.microsoft.com/office/word/2018/wordml" xmlns:w16du="http://schemas.microsoft.com/office/word/2023/wordml/word16du" xmlns:w16sdtdh="http://schemas.microsoft.com/office/word/2020/wordml/sdtdatahash" xmlns:w16se="http://schemas.microsoft.com/office/word/2015/wordml/symex" xmlns:wpg="http://schemas.microsoft.com/office/word/2010/wordprocessingGroup" xmlns:wpi="http://schemas.microsoft.com/office/word/2010/wordprocessingInk" xmlns:wne="http://schemas.microsoft.com/office/word/2006/wordml" xmlns:wps="http://schemas.microsoft.com/office/word/2010/wordprocessingShape" mc:Ignorable="w14 w15 w16se w16cid w16 w16cex w16sdtdh w16du wp14">
   <w:abstractNum w:abstractNumId="0" w15:restartNumberingAfterBreak="0">
     <w:nsid w:val="00000001"/>
     <w:multiLevelType w:val="multilevel"/>
@@ -30086,7 +28652,7 @@
 </file>
 
 <file path=word/styles.xml><?xml version="1.0" encoding="utf-8"?>
-<w:styles xmlns:mc="http://schemas.openxmlformats.org/markup-compatibility/2006" xmlns:r="http://schemas.openxmlformats.org/officeDocument/2006/relationships" xmlns:w="http://schemas.openxmlformats.org/wordprocessingml/2006/main" xmlns:w14="http://schemas.microsoft.com/office/word/2010/wordml" xmlns:w15="http://schemas.microsoft.com/office/word/2012/wordml" xmlns:w16cex="http://schemas.microsoft.com/office/word/2018/wordml/cex" xmlns:w16cid="http://schemas.microsoft.com/office/word/2016/wordml/cid" xmlns:w16="http://schemas.microsoft.com/office/word/2018/wordml" xmlns:w16sdtdh="http://schemas.microsoft.com/office/word/2020/wordml/sdtdatahash" xmlns:w16se="http://schemas.microsoft.com/office/word/2015/wordml/symex" mc:Ignorable="w14 w15 w16se w16cid w16 w16cex w16sdtdh">
+<w:styles xmlns:mc="http://schemas.openxmlformats.org/markup-compatibility/2006" xmlns:r="http://schemas.openxmlformats.org/officeDocument/2006/relationships" xmlns:w="http://schemas.openxmlformats.org/wordprocessingml/2006/main" xmlns:w14="http://schemas.microsoft.com/office/word/2010/wordml" xmlns:w15="http://schemas.microsoft.com/office/word/2012/wordml" xmlns:w16cex="http://schemas.microsoft.com/office/word/2018/wordml/cex" xmlns:w16cid="http://schemas.microsoft.com/office/word/2016/wordml/cid" xmlns:w16="http://schemas.microsoft.com/office/word/2018/wordml" xmlns:w16du="http://schemas.microsoft.com/office/word/2023/wordml/word16du" xmlns:w16sdtdh="http://schemas.microsoft.com/office/word/2020/wordml/sdtdatahash" xmlns:w16se="http://schemas.microsoft.com/office/word/2015/wordml/symex" mc:Ignorable="w14 w15 w16se w16cid w16 w16cex w16sdtdh w16du">
   <w:docDefaults>
     <w:rPrDefault>
       <w:rPr>

</xml_diff>

<commit_message>
Changed TCP port info text to "default 502" instead of "usually 502". CSVprocessor: QuoteSelectedFields instead of QuoteSomeFields. ModbusImport and ModbusExport: Improved counting, showing number of errors, and return code. Always show counters, not only in verbose mode.
git-svn-id: http://visualsvn.edna.local/EDNA/ModbusControl/V2@4887 03c8d257-35a7-c645-9f01-50f27e98b9e6
</commit_message>
<xml_diff>
--- a/Manuals/ModbusControl - User manual.docx
+++ b/Manuals/ModbusControl - User manual.docx
@@ -3893,9 +3893,11 @@
       <w:r>
         <w:t>“</w:t>
       </w:r>
+      <w:proofErr w:type="spellStart"/>
       <w:r>
         <w:t>Demo.mbc</w:t>
       </w:r>
+      <w:proofErr w:type="spellEnd"/>
       <w:r>
         <w:t>”</w:t>
       </w:r>
@@ -4732,7 +4734,15 @@
         <w:t>The order is which the tab pages are exported to CSV</w:t>
       </w:r>
       <w:r>
-        <w:t xml:space="preserve"> can be controlled with the &lt;exportorder&gt; element. </w:t>
+        <w:t xml:space="preserve"> can be controlled with the &lt;</w:t>
+      </w:r>
+      <w:proofErr w:type="spellStart"/>
+      <w:r>
+        <w:t>exportorder</w:t>
+      </w:r>
+      <w:proofErr w:type="spellEnd"/>
+      <w:r>
+        <w:t xml:space="preserve">&gt; element. </w:t>
       </w:r>
       <w:r>
         <w:rPr>
@@ -4786,10 +4796,26 @@
         <w:t xml:space="preserve">] </w:t>
       </w:r>
       <w:r>
-        <w:t xml:space="preserve">&lt;exportorder&gt; </w:t>
-      </w:r>
-      <w:r>
-        <w:t>for more information on &lt;exportorder&gt;.</w:t>
+        <w:t>&lt;</w:t>
+      </w:r>
+      <w:proofErr w:type="spellStart"/>
+      <w:r>
+        <w:t>exportorder</w:t>
+      </w:r>
+      <w:proofErr w:type="spellEnd"/>
+      <w:r>
+        <w:t xml:space="preserve">&gt; </w:t>
+      </w:r>
+      <w:r>
+        <w:t>for more information on &lt;</w:t>
+      </w:r>
+      <w:proofErr w:type="spellStart"/>
+      <w:r>
+        <w:t>exportorder</w:t>
+      </w:r>
+      <w:proofErr w:type="spellEnd"/>
+      <w:r>
+        <w:t>&gt;.</w:t>
       </w:r>
     </w:p>
     <w:p>
@@ -5427,7 +5453,7 @@
             <v:path o:extrusionok="f" gradientshapeok="t" o:connecttype="rect"/>
             <o:lock v:ext="edit" aspectratio="t"/>
           </v:shapetype>
-          <v:shape id="_x0000_i1025" type="#_x0000_t75" style="width:408.6pt;height:55.8pt;visibility:visible;mso-wrap-style:square">
+          <v:shape id="_x0000_i1025" type="#_x0000_t75" style="width:408.75pt;height:55.5pt;visibility:visible;mso-wrap-style:square">
             <v:imagedata r:id="rId8" o:title=""/>
           </v:shape>
         </w:pict>
@@ -6311,8 +6337,13 @@
               </w:rPr>
             </w:pPr>
             <w:bookmarkStart w:id="16" w:name="Functioncodetowriteholdingregisters"/>
-            <w:r>
-              <w:t>Functioncode to write holding registers</w:t>
+            <w:proofErr w:type="spellStart"/>
+            <w:r>
+              <w:t>Functioncode</w:t>
+            </w:r>
+            <w:proofErr w:type="spellEnd"/>
+            <w:r>
+              <w:t xml:space="preserve"> to write holding registers</w:t>
             </w:r>
             <w:bookmarkEnd w:id="16"/>
             <w:r>
@@ -6995,7 +7026,15 @@
               </w:rPr>
             </w:pPr>
             <w:r>
-              <w:t>Sample rate (ms):</w:t>
+              <w:t>Sample rate (</w:t>
+            </w:r>
+            <w:proofErr w:type="spellStart"/>
+            <w:r>
+              <w:t>ms</w:t>
+            </w:r>
+            <w:proofErr w:type="spellEnd"/>
+            <w:r>
+              <w:t>):</w:t>
             </w:r>
           </w:p>
         </w:tc>
@@ -7339,7 +7378,13 @@
               </w:rPr>
             </w:pPr>
             <w:r>
-              <w:t>TCP port the bridge listens to, usually 502.</w:t>
+              <w:t xml:space="preserve">TCP port the bridge listens to, </w:t>
+            </w:r>
+            <w:r>
+              <w:t>default</w:t>
+            </w:r>
+            <w:r>
+              <w:t xml:space="preserve"> 502.</w:t>
             </w:r>
           </w:p>
         </w:tc>
@@ -8372,7 +8417,15 @@
         </w:rPr>
       </w:pPr>
       <w:r>
-        <w:t>To open a demo project file named Demo.mbc.</w:t>
+        <w:t xml:space="preserve">To open a demo project file named </w:t>
+      </w:r>
+      <w:proofErr w:type="spellStart"/>
+      <w:r>
+        <w:t>Demo.mbc</w:t>
+      </w:r>
+      <w:proofErr w:type="spellEnd"/>
+      <w:r>
+        <w:t>.</w:t>
       </w:r>
     </w:p>
     <w:p>
@@ -8428,7 +8481,15 @@
         </w:rPr>
       </w:pPr>
       <w:r>
-        <w:t xml:space="preserve">Right-click the mouse on the Register or Description column to change the background color of the line. This allows to highlight the registers you are currently focusing on. </w:t>
+        <w:t xml:space="preserve">Right-click the mouse on the Register or Description column to change the background </w:t>
+      </w:r>
+      <w:proofErr w:type="spellStart"/>
+      <w:r>
+        <w:t>color</w:t>
+      </w:r>
+      <w:proofErr w:type="spellEnd"/>
+      <w:r>
+        <w:t xml:space="preserve"> of the line. This allows to highlight the registers you are currently focusing on. </w:t>
       </w:r>
       <w:r>
         <w:br/>
@@ -8485,8 +8546,13 @@
           <w:rFonts w:hint="eastAsia"/>
         </w:rPr>
       </w:pPr>
-      <w:r>
-        <w:t>UInt: show as unsigned integer</w:t>
+      <w:proofErr w:type="spellStart"/>
+      <w:r>
+        <w:t>UInt</w:t>
+      </w:r>
+      <w:proofErr w:type="spellEnd"/>
+      <w:r>
+        <w:t>: show as unsigned integer</w:t>
       </w:r>
     </w:p>
     <w:p>
@@ -8705,7 +8771,7 @@
           <w:noProof/>
         </w:rPr>
         <w:pict w14:anchorId="5CABB691">
-          <v:shape id="_x0000_i1026" type="#_x0000_t75" style="width:391.2pt;height:52.2pt;visibility:visible;mso-wrap-style:square">
+          <v:shape id="_x0000_i1026" type="#_x0000_t75" style="width:391.5pt;height:52.5pt;visibility:visible;mso-wrap-style:square">
             <v:imagedata r:id="rId10" o:title=""/>
           </v:shape>
         </w:pict>
@@ -9117,7 +9183,15 @@
         </w:rPr>
       </w:pPr>
       <w:r>
-        <w:t>Bridge decode: the Modbus/TCP frames received and sent over the bridge decoded to human-readable messages like “Slave=1, Read holding registers: addr=100, quant=15”</w:t>
+        <w:t xml:space="preserve">Bridge decode: the Modbus/TCP frames received and sent over the bridge decoded to human-readable messages like “Slave=1, Read holding registers: </w:t>
+      </w:r>
+      <w:proofErr w:type="spellStart"/>
+      <w:r>
+        <w:t>addr</w:t>
+      </w:r>
+      <w:proofErr w:type="spellEnd"/>
+      <w:r>
+        <w:t>=100, quant=15”</w:t>
       </w:r>
     </w:p>
     <w:p>
@@ -9154,7 +9228,15 @@
         </w:rPr>
       </w:pPr>
       <w:r>
-        <w:t>ModbusControl has a built-in Modbus/TCP server that acts as a bridge to the connected modbus device. This allows Modbus/TCP clients like ModbusScope to communicate with the serial modbus device as well. It also allows multiple Modbus/TCP clients or more copies of ModbusControl to be connected to the modbus device simultaneously. Works for all connection types to the modbus device, not only the serial line.</w:t>
+        <w:t xml:space="preserve">ModbusControl has a built-in Modbus/TCP server that acts as a bridge to the connected modbus device. This allows Modbus/TCP clients like </w:t>
+      </w:r>
+      <w:proofErr w:type="spellStart"/>
+      <w:r>
+        <w:t>ModbusScope</w:t>
+      </w:r>
+      <w:proofErr w:type="spellEnd"/>
+      <w:r>
+        <w:t xml:space="preserve"> to communicate with the serial modbus device as well. It also allows multiple Modbus/TCP clients or more copies of ModbusControl to be connected to the modbus device simultaneously. Works for all connection types to the modbus device, not only the serial line.</w:t>
       </w:r>
     </w:p>
     <w:p>
@@ -9303,7 +9385,15 @@
         </w:rPr>
       </w:pPr>
       <w:r>
-        <w:t>In a Modbus command message, registers are addressed starting at zero. The first holding register is referred to as address 0 in the query message. For historic reasons 16-bit holding registers are often referred to as registers 40001..49999. The base for the register numbering is defined in the mbc project file with the &lt;holdingregisterstart&gt; element. It usually is 40001</w:t>
+        <w:t>In a Modbus command message, registers are addressed starting at zero. The first holding register is referred to as address 0 in the query message. For historic reasons 16-bit holding registers are often referred to as registers 40001..49999. The base for the register numbering is defined in the mbc project file with the &lt;</w:t>
+      </w:r>
+      <w:proofErr w:type="spellStart"/>
+      <w:r>
+        <w:t>holdingregisterstart</w:t>
+      </w:r>
+      <w:proofErr w:type="spellEnd"/>
+      <w:r>
+        <w:t>&gt; element. It usually is 40001</w:t>
       </w:r>
       <w:r>
         <w:t xml:space="preserve"> or</w:t>
@@ -9362,6 +9452,7 @@
       <w:r>
         <w:t>See [</w:t>
       </w:r>
+      <w:proofErr w:type="spellStart"/>
       <w:r>
         <w:rPr>
           <w:rFonts w:hint="eastAsia"/>
@@ -9395,7 +9486,11 @@
         <w:fldChar w:fldCharType="separate"/>
       </w:r>
       <w:r>
-        <w:t>Functioncode to write holding registers</w:t>
+        <w:t>Functioncode</w:t>
+      </w:r>
+      <w:proofErr w:type="spellEnd"/>
+      <w:r>
+        <w:t xml:space="preserve"> to write holding registers</w:t>
       </w:r>
       <w:r>
         <w:rPr>
@@ -10077,7 +10172,21 @@
               <w:rPr>
                 <w:rFonts w:hint="eastAsia"/>
               </w:rPr>
-              <w:t>end-of-message timeout (ms)</w:t>
+              <w:t>end-of-message timeout (</w:t>
+            </w:r>
+            <w:proofErr w:type="spellStart"/>
+            <w:r>
+              <w:rPr>
+                <w:rFonts w:hint="eastAsia"/>
+              </w:rPr>
+              <w:t>ms</w:t>
+            </w:r>
+            <w:proofErr w:type="spellEnd"/>
+            <w:r>
+              <w:rPr>
+                <w:rFonts w:hint="eastAsia"/>
+              </w:rPr>
+              <w:t>)</w:t>
             </w:r>
             <w:r>
               <w:t>.</w:t>
@@ -10262,22 +10371,7 @@
               <w:t>/server</w:t>
             </w:r>
             <w:r>
-              <w:t xml:space="preserve"> IP port, </w:t>
-            </w:r>
-            <w:r>
-              <w:t>usually</w:t>
-            </w:r>
-            <w:r>
-              <w:t xml:space="preserve"> </w:t>
-            </w:r>
-            <w:r>
-              <w:rPr>
-                <w:rFonts w:hint="eastAsia"/>
-              </w:rPr>
-              <w:t>50</w:t>
-            </w:r>
-            <w:r>
-              <w:t>2</w:t>
+              <w:t xml:space="preserve"> IP port</w:t>
             </w:r>
             <w:r>
               <w:t>.</w:t>
@@ -10466,7 +10560,21 @@
               <w:rPr>
                 <w:rFonts w:hint="eastAsia"/>
               </w:rPr>
-              <w:t>Maximum wait time for first byte of response (ms)</w:t>
+              <w:t>Maximum wait time for first byte of response (</w:t>
+            </w:r>
+            <w:proofErr w:type="spellStart"/>
+            <w:r>
+              <w:rPr>
+                <w:rFonts w:hint="eastAsia"/>
+              </w:rPr>
+              <w:t>ms</w:t>
+            </w:r>
+            <w:proofErr w:type="spellEnd"/>
+            <w:r>
+              <w:rPr>
+                <w:rFonts w:hint="eastAsia"/>
+              </w:rPr>
+              <w:t>)</w:t>
             </w:r>
             <w:r>
               <w:t>.</w:t>
@@ -10519,7 +10627,21 @@
               <w:rPr>
                 <w:rFonts w:hint="eastAsia"/>
               </w:rPr>
-              <w:t>Delay before sending next query (ms)</w:t>
+              <w:t>Delay before sending next query (</w:t>
+            </w:r>
+            <w:proofErr w:type="spellStart"/>
+            <w:r>
+              <w:rPr>
+                <w:rFonts w:hint="eastAsia"/>
+              </w:rPr>
+              <w:t>ms</w:t>
+            </w:r>
+            <w:proofErr w:type="spellEnd"/>
+            <w:r>
+              <w:rPr>
+                <w:rFonts w:hint="eastAsia"/>
+              </w:rPr>
+              <w:t>)</w:t>
             </w:r>
             <w:r>
               <w:t>.</w:t>
@@ -10668,7 +10790,15 @@
               <w:t>period for reading the registers from the slave/server</w:t>
             </w:r>
             <w:r>
-              <w:t xml:space="preserve"> (ms)</w:t>
+              <w:t xml:space="preserve"> (</w:t>
+            </w:r>
+            <w:proofErr w:type="spellStart"/>
+            <w:r>
+              <w:t>ms</w:t>
+            </w:r>
+            <w:proofErr w:type="spellEnd"/>
+            <w:r>
+              <w:t>)</w:t>
             </w:r>
             <w:r>
               <w:t>.</w:t>
@@ -10963,10 +11093,7 @@
         <w:t xml:space="preserve"> is required</w:t>
       </w:r>
       <w:r>
-        <w:t xml:space="preserve">. Connection parameters in the mbc file </w:t>
-      </w:r>
-      <w:r>
-        <w:t>can be overridden by command line options.</w:t>
+        <w:t>. Connection parameters in the mbc file can be overridden by command line options.</w:t>
       </w:r>
       <w:r>
         <w:t xml:space="preserve"> </w:t>
@@ -11456,7 +11583,21 @@
               <w:rPr>
                 <w:rFonts w:hint="eastAsia"/>
               </w:rPr>
-              <w:t>end-of-message timeout (ms)</w:t>
+              <w:t>end-of-message timeout (</w:t>
+            </w:r>
+            <w:proofErr w:type="spellStart"/>
+            <w:r>
+              <w:rPr>
+                <w:rFonts w:hint="eastAsia"/>
+              </w:rPr>
+              <w:t>ms</w:t>
+            </w:r>
+            <w:proofErr w:type="spellEnd"/>
+            <w:r>
+              <w:rPr>
+                <w:rFonts w:hint="eastAsia"/>
+              </w:rPr>
+              <w:t>)</w:t>
             </w:r>
             <w:r>
               <w:t>.</w:t>
@@ -11625,16 +11766,7 @@
               </w:rPr>
             </w:pPr>
             <w:r>
-              <w:t xml:space="preserve">Slave/server IP port, usually </w:t>
-            </w:r>
-            <w:r>
-              <w:rPr>
-                <w:rFonts w:hint="eastAsia"/>
-              </w:rPr>
-              <w:t>50</w:t>
-            </w:r>
-            <w:r>
-              <w:t>2</w:t>
+              <w:t>Slave/server IP port</w:t>
             </w:r>
             <w:r>
               <w:t>.</w:t>
@@ -11808,7 +11940,21 @@
               <w:rPr>
                 <w:rFonts w:hint="eastAsia"/>
               </w:rPr>
-              <w:t>Maximum wait time for first byte of response (ms)</w:t>
+              <w:t>Maximum wait time for first byte of response (</w:t>
+            </w:r>
+            <w:proofErr w:type="spellStart"/>
+            <w:r>
+              <w:rPr>
+                <w:rFonts w:hint="eastAsia"/>
+              </w:rPr>
+              <w:t>ms</w:t>
+            </w:r>
+            <w:proofErr w:type="spellEnd"/>
+            <w:r>
+              <w:rPr>
+                <w:rFonts w:hint="eastAsia"/>
+              </w:rPr>
+              <w:t>)</w:t>
             </w:r>
             <w:r>
               <w:t>.</w:t>
@@ -11855,7 +12001,21 @@
               <w:rPr>
                 <w:rFonts w:hint="eastAsia"/>
               </w:rPr>
-              <w:t>Delay before sending next query (ms)</w:t>
+              <w:t>Delay before sending next query (</w:t>
+            </w:r>
+            <w:proofErr w:type="spellStart"/>
+            <w:r>
+              <w:rPr>
+                <w:rFonts w:hint="eastAsia"/>
+              </w:rPr>
+              <w:t>ms</w:t>
+            </w:r>
+            <w:proofErr w:type="spellEnd"/>
+            <w:r>
+              <w:rPr>
+                <w:rFonts w:hint="eastAsia"/>
+              </w:rPr>
+              <w:t>)</w:t>
             </w:r>
             <w:r>
               <w:t>.</w:t>
@@ -12397,6 +12557,7 @@
               </w:rPr>
               <w:t>-tabs &lt;</w:t>
             </w:r>
+            <w:proofErr w:type="spellStart"/>
             <w:r>
               <w:rPr>
                 <w:rFonts w:hint="eastAsia"/>
@@ -12405,12 +12566,14 @@
               </w:rPr>
               <w:t>tabname</w:t>
             </w:r>
+            <w:proofErr w:type="spellEnd"/>
             <w:r>
               <w:rPr>
                 <w:rFonts w:hint="eastAsia"/>
               </w:rPr>
               <w:t>&gt; [</w:t>
             </w:r>
+            <w:proofErr w:type="spellStart"/>
             <w:r>
               <w:rPr>
                 <w:rFonts w:hint="eastAsia"/>
@@ -12419,6 +12582,7 @@
               </w:rPr>
               <w:t>tabname</w:t>
             </w:r>
+            <w:proofErr w:type="spellEnd"/>
             <w:r>
               <w:rPr>
                 <w:rFonts w:hint="eastAsia"/>
@@ -12543,8 +12707,13 @@
               </w:rPr>
             </w:pPr>
             <w:r>
-              <w:t>-logtime</w:t>
-            </w:r>
+              <w:t>-</w:t>
+            </w:r>
+            <w:proofErr w:type="spellStart"/>
+            <w:r>
+              <w:t>logtime</w:t>
+            </w:r>
+            <w:proofErr w:type="spellEnd"/>
           </w:p>
         </w:tc>
         <w:tc>
@@ -13519,7 +13688,21 @@
               <w:rPr>
                 <w:rFonts w:hint="eastAsia"/>
               </w:rPr>
-              <w:t>end-of-message timeout (ms)</w:t>
+              <w:t>end-of-message timeout (</w:t>
+            </w:r>
+            <w:proofErr w:type="spellStart"/>
+            <w:r>
+              <w:rPr>
+                <w:rFonts w:hint="eastAsia"/>
+              </w:rPr>
+              <w:t>ms</w:t>
+            </w:r>
+            <w:proofErr w:type="spellEnd"/>
+            <w:r>
+              <w:rPr>
+                <w:rFonts w:hint="eastAsia"/>
+              </w:rPr>
+              <w:t>)</w:t>
             </w:r>
             <w:r>
               <w:t>.</w:t>
@@ -13682,16 +13865,7 @@
               </w:rPr>
             </w:pPr>
             <w:r>
-              <w:t xml:space="preserve">Slave/server IP port, usually </w:t>
-            </w:r>
-            <w:r>
-              <w:rPr>
-                <w:rFonts w:hint="eastAsia"/>
-              </w:rPr>
-              <w:t>50</w:t>
-            </w:r>
-            <w:r>
-              <w:t>2</w:t>
+              <w:t>Slave/server IP port</w:t>
             </w:r>
             <w:r>
               <w:t>.</w:t>
@@ -13859,7 +14033,21 @@
               <w:rPr>
                 <w:rFonts w:hint="eastAsia"/>
               </w:rPr>
-              <w:t>Maximum wait time for first byte of response (ms)</w:t>
+              <w:t>Maximum wait time for first byte of response (</w:t>
+            </w:r>
+            <w:proofErr w:type="spellStart"/>
+            <w:r>
+              <w:rPr>
+                <w:rFonts w:hint="eastAsia"/>
+              </w:rPr>
+              <w:t>ms</w:t>
+            </w:r>
+            <w:proofErr w:type="spellEnd"/>
+            <w:r>
+              <w:rPr>
+                <w:rFonts w:hint="eastAsia"/>
+              </w:rPr>
+              <w:t>)</w:t>
             </w:r>
             <w:r>
               <w:t>.</w:t>
@@ -14018,7 +14206,21 @@
               <w:rPr>
                 <w:rFonts w:hint="eastAsia"/>
               </w:rPr>
-              <w:t>Delay before sending next query (ms)</w:t>
+              <w:t>Delay before sending next query (</w:t>
+            </w:r>
+            <w:proofErr w:type="spellStart"/>
+            <w:r>
+              <w:rPr>
+                <w:rFonts w:hint="eastAsia"/>
+              </w:rPr>
+              <w:t>ms</w:t>
+            </w:r>
+            <w:proofErr w:type="spellEnd"/>
+            <w:r>
+              <w:rPr>
+                <w:rFonts w:hint="eastAsia"/>
+              </w:rPr>
+              <w:t>)</w:t>
             </w:r>
             <w:r>
               <w:t>.</w:t>
@@ -14270,6 +14472,7 @@
               </w:rPr>
               <w:t>-tabs &lt;</w:t>
             </w:r>
+            <w:proofErr w:type="spellStart"/>
             <w:r>
               <w:rPr>
                 <w:rFonts w:hint="eastAsia"/>
@@ -14278,12 +14481,14 @@
               </w:rPr>
               <w:t>tabname</w:t>
             </w:r>
+            <w:proofErr w:type="spellEnd"/>
             <w:r>
               <w:rPr>
                 <w:rFonts w:hint="eastAsia"/>
               </w:rPr>
               <w:t>&gt; [</w:t>
             </w:r>
+            <w:proofErr w:type="spellStart"/>
             <w:r>
               <w:rPr>
                 <w:rFonts w:hint="eastAsia"/>
@@ -14292,6 +14497,7 @@
               </w:rPr>
               <w:t>tabname</w:t>
             </w:r>
+            <w:proofErr w:type="spellEnd"/>
             <w:r>
               <w:rPr>
                 <w:rFonts w:hint="eastAsia"/>
@@ -14413,8 +14619,13 @@
               </w:rPr>
             </w:pPr>
             <w:r>
-              <w:t>-logtime</w:t>
-            </w:r>
+              <w:t>-</w:t>
+            </w:r>
+            <w:proofErr w:type="spellStart"/>
+            <w:r>
+              <w:t>logtime</w:t>
+            </w:r>
+            <w:proofErr w:type="spellEnd"/>
           </w:p>
         </w:tc>
         <w:tc>
@@ -15078,7 +15289,25 @@
           <w:sz w:val="18"/>
           <w:szCs w:val="18"/>
         </w:rPr>
-        <w:t>Format (Int, UInt, Hex, Binary, Float, ASCII</w:t>
+        <w:t xml:space="preserve">Format (Int, </w:t>
+      </w:r>
+      <w:proofErr w:type="spellStart"/>
+      <w:r>
+        <w:rPr>
+          <w:rFonts w:cs="Liberation Serif"/>
+          <w:sz w:val="18"/>
+          <w:szCs w:val="18"/>
+        </w:rPr>
+        <w:t>UInt</w:t>
+      </w:r>
+      <w:proofErr w:type="spellEnd"/>
+      <w:r>
+        <w:rPr>
+          <w:rFonts w:cs="Liberation Serif"/>
+          <w:sz w:val="18"/>
+          <w:szCs w:val="18"/>
+        </w:rPr>
+        <w:t>, Hex, Binary, Float, ASCII</w:t>
       </w:r>
       <w:r>
         <w:rPr>
@@ -15558,7 +15787,15 @@
         </w:rPr>
       </w:pPr>
       <w:r>
-        <w:t>The mbc project file is an XML formatted text file that is both human-readable and machine-readable. ModbusControl does not (yet) support creation of a project file so it has to be edited manually. You can also use the example project Demo.mbc to start from. You</w:t>
+        <w:t xml:space="preserve">The mbc project file is an XML formatted text file that is both human-readable and machine-readable. ModbusControl does not (yet) support creation of a project file so it has to be edited manually. You can also use the example project </w:t>
+      </w:r>
+      <w:proofErr w:type="spellStart"/>
+      <w:r>
+        <w:t>Demo.mbc</w:t>
+      </w:r>
+      <w:proofErr w:type="spellEnd"/>
+      <w:r>
+        <w:t xml:space="preserve"> to start from. You</w:t>
       </w:r>
       <w:r>
         <w:t>’</w:t>
@@ -15574,17 +15811,33 @@
         </w:rPr>
       </w:pPr>
       <w:r>
-        <w:t xml:space="preserve">Some editors like Notepad++ recognize an XML file and apply XML syntax coloring. This makes the editing easier. </w:t>
-      </w:r>
-    </w:p>
-    <w:p>
-      <w:pPr>
-        <w:rPr>
-          <w:rFonts w:hint="eastAsia"/>
-        </w:rPr>
-      </w:pPr>
-      <w:r>
-        <w:t>XML tags are case sensitive! Nowadays ModbusControl uses all lowercase XML tags, but older versions used a mix of camel-case tags like “SampleRate” and lowercase tags. It is recommended to use all lowercase tags now. ModbusControl still recognizes the old camel-case tags for compatibility.</w:t>
+        <w:t xml:space="preserve">Some editors like Notepad++ recognize an XML file and apply XML syntax </w:t>
+      </w:r>
+      <w:proofErr w:type="spellStart"/>
+      <w:r>
+        <w:t>coloring</w:t>
+      </w:r>
+      <w:proofErr w:type="spellEnd"/>
+      <w:r>
+        <w:t xml:space="preserve">. This makes the editing easier. </w:t>
+      </w:r>
+    </w:p>
+    <w:p>
+      <w:pPr>
+        <w:rPr>
+          <w:rFonts w:hint="eastAsia"/>
+        </w:rPr>
+      </w:pPr>
+      <w:r>
+        <w:t>XML tags are case sensitive! Nowadays ModbusControl uses all lowercase XML tags, but older versions used a mix of camel-case tags like “</w:t>
+      </w:r>
+      <w:proofErr w:type="spellStart"/>
+      <w:r>
+        <w:t>SampleRate</w:t>
+      </w:r>
+      <w:proofErr w:type="spellEnd"/>
+      <w:r>
+        <w:t>” and lowercase tags. It is recommended to use all lowercase tags now. ModbusControl still recognizes the old camel-case tags for compatibility.</w:t>
       </w:r>
     </w:p>
     <w:p>
@@ -15599,7 +15852,21 @@
         <w:rPr>
           <w:lang w:val="en-GB"/>
         </w:rPr>
-        <w:t>The &lt;modbuscontrol&gt; root element</w:t>
+        <w:t>The &lt;</w:t>
+      </w:r>
+      <w:proofErr w:type="spellStart"/>
+      <w:r>
+        <w:rPr>
+          <w:lang w:val="en-GB"/>
+        </w:rPr>
+        <w:t>modbuscontrol</w:t>
+      </w:r>
+      <w:proofErr w:type="spellEnd"/>
+      <w:r>
+        <w:rPr>
+          <w:lang w:val="en-GB"/>
+        </w:rPr>
+        <w:t>&gt; root element</w:t>
       </w:r>
       <w:bookmarkEnd w:id="45"/>
     </w:p>
@@ -15613,7 +15880,15 @@
         <w:t xml:space="preserve">An XML file requires a single </w:t>
       </w:r>
       <w:r>
-        <w:t xml:space="preserve">&lt;modbuscontrol&gt; </w:t>
+        <w:t>&lt;</w:t>
+      </w:r>
+      <w:proofErr w:type="spellStart"/>
+      <w:r>
+        <w:t>modbuscontrol</w:t>
+      </w:r>
+      <w:proofErr w:type="spellEnd"/>
+      <w:r>
+        <w:t xml:space="preserve">&gt; </w:t>
       </w:r>
       <w:r>
         <w:t>root element that contains all the other elements. It supports the following elements:</w:t>
@@ -15729,7 +16004,21 @@
                 <w:lang w:val="en-GB"/>
               </w:rPr>
               <w:lastRenderedPageBreak/>
-              <w:t>&lt;modbustcpserver&gt;</w:t>
+              <w:t>&lt;</w:t>
+            </w:r>
+            <w:proofErr w:type="spellStart"/>
+            <w:r>
+              <w:rPr>
+                <w:lang w:val="en-GB"/>
+              </w:rPr>
+              <w:t>modbustcpserver</w:t>
+            </w:r>
+            <w:proofErr w:type="spellEnd"/>
+            <w:r>
+              <w:rPr>
+                <w:lang w:val="en-GB"/>
+              </w:rPr>
+              <w:t>&gt;</w:t>
             </w:r>
           </w:p>
         </w:tc>
@@ -15768,7 +16057,21 @@
               <w:rPr>
                 <w:lang w:val="en-GB"/>
               </w:rPr>
-              <w:t>&lt;autostart&gt;</w:t>
+              <w:t>&lt;</w:t>
+            </w:r>
+            <w:proofErr w:type="spellStart"/>
+            <w:r>
+              <w:rPr>
+                <w:lang w:val="en-GB"/>
+              </w:rPr>
+              <w:t>autostart</w:t>
+            </w:r>
+            <w:proofErr w:type="spellEnd"/>
+            <w:r>
+              <w:rPr>
+                <w:lang w:val="en-GB"/>
+              </w:rPr>
+              <w:t>&gt;</w:t>
             </w:r>
           </w:p>
         </w:tc>
@@ -16379,7 +16682,15 @@
               </w:rPr>
             </w:pPr>
             <w:r>
-              <w:t>Value “serial/rtu” for serial port with RTU protocol.</w:t>
+              <w:t>Value “serial/</w:t>
+            </w:r>
+            <w:proofErr w:type="spellStart"/>
+            <w:r>
+              <w:t>rtu</w:t>
+            </w:r>
+            <w:proofErr w:type="spellEnd"/>
+            <w:r>
+              <w:t>” for serial port with RTU protocol.</w:t>
             </w:r>
           </w:p>
           <w:p>
@@ -16390,7 +16701,15 @@
               </w:rPr>
             </w:pPr>
             <w:r>
-              <w:t>Value “modbus/tcp” for TCP connection with Modbus/TCP protocol.</w:t>
+              <w:t>Value “modbus/</w:t>
+            </w:r>
+            <w:proofErr w:type="spellStart"/>
+            <w:r>
+              <w:t>tcp</w:t>
+            </w:r>
+            <w:proofErr w:type="spellEnd"/>
+            <w:r>
+              <w:t>” for TCP connection with Modbus/TCP protocol.</w:t>
             </w:r>
           </w:p>
           <w:p>
@@ -16401,7 +16720,23 @@
               </w:rPr>
             </w:pPr>
             <w:r>
-              <w:t>Value “rtu/tcp” for TCP connection with RTU protocol.</w:t>
+              <w:t>Value “</w:t>
+            </w:r>
+            <w:proofErr w:type="spellStart"/>
+            <w:r>
+              <w:t>rtu</w:t>
+            </w:r>
+            <w:proofErr w:type="spellEnd"/>
+            <w:r>
+              <w:t>/</w:t>
+            </w:r>
+            <w:proofErr w:type="spellStart"/>
+            <w:r>
+              <w:t>tcp</w:t>
+            </w:r>
+            <w:proofErr w:type="spellEnd"/>
+            <w:r>
+              <w:t>” for TCP connection with RTU protocol.</w:t>
             </w:r>
           </w:p>
         </w:tc>
@@ -16788,7 +17123,21 @@
               <w:rPr>
                 <w:lang w:val="en-GB"/>
               </w:rPr>
-              <w:t>&lt;maximumframesize&gt;</w:t>
+              <w:t>&lt;</w:t>
+            </w:r>
+            <w:proofErr w:type="spellStart"/>
+            <w:r>
+              <w:rPr>
+                <w:lang w:val="en-GB"/>
+              </w:rPr>
+              <w:t>maximumframesize</w:t>
+            </w:r>
+            <w:proofErr w:type="spellEnd"/>
+            <w:r>
+              <w:rPr>
+                <w:lang w:val="en-GB"/>
+              </w:rPr>
+              <w:t>&gt;</w:t>
             </w:r>
           </w:p>
         </w:tc>
@@ -16893,7 +17242,21 @@
               <w:rPr>
                 <w:lang w:val="en-GB"/>
               </w:rPr>
-              <w:t>&lt;writeholdingregisterfc&gt;</w:t>
+              <w:t>&lt;</w:t>
+            </w:r>
+            <w:proofErr w:type="spellStart"/>
+            <w:r>
+              <w:rPr>
+                <w:lang w:val="en-GB"/>
+              </w:rPr>
+              <w:t>writeholdingregisterfc</w:t>
+            </w:r>
+            <w:proofErr w:type="spellEnd"/>
+            <w:r>
+              <w:rPr>
+                <w:lang w:val="en-GB"/>
+              </w:rPr>
+              <w:t>&gt;</w:t>
             </w:r>
           </w:p>
         </w:tc>
@@ -17197,7 +17560,21 @@
               <w:rPr>
                 <w:lang w:val="en-GB"/>
               </w:rPr>
-              <w:t>&lt;holdingregisterstart&gt;</w:t>
+              <w:t>&lt;</w:t>
+            </w:r>
+            <w:proofErr w:type="spellStart"/>
+            <w:r>
+              <w:rPr>
+                <w:lang w:val="en-GB"/>
+              </w:rPr>
+              <w:t>holdingregisterstart</w:t>
+            </w:r>
+            <w:proofErr w:type="spellEnd"/>
+            <w:r>
+              <w:rPr>
+                <w:lang w:val="en-GB"/>
+              </w:rPr>
+              <w:t>&gt;</w:t>
             </w:r>
           </w:p>
         </w:tc>
@@ -17382,8 +17759,17 @@
           <w:rStyle w:val="XMLContent"/>
           <w:lang w:val="en-GB"/>
         </w:rPr>
-        <w:t>serial/rtu</w:t>
-      </w:r>
+        <w:t>serial/</w:t>
+      </w:r>
+      <w:proofErr w:type="spellStart"/>
+      <w:r>
+        <w:rPr>
+          <w:rStyle w:val="XMLContent"/>
+          <w:lang w:val="en-GB"/>
+        </w:rPr>
+        <w:t>rtu</w:t>
+      </w:r>
+      <w:proofErr w:type="spellEnd"/>
       <w:r>
         <w:rPr>
           <w:rStyle w:val="XMLBracket"/>
@@ -17818,6 +18204,7 @@
         </w:rPr>
         <w:t>&lt;</w:t>
       </w:r>
+      <w:proofErr w:type="spellStart"/>
       <w:r>
         <w:rPr>
           <w:rStyle w:val="XMLElement"/>
@@ -17825,6 +18212,7 @@
         </w:rPr>
         <w:t>maximumframesize</w:t>
       </w:r>
+      <w:proofErr w:type="spellEnd"/>
       <w:r>
         <w:rPr>
           <w:rStyle w:val="XMLBracket"/>
@@ -17846,6 +18234,7 @@
         </w:rPr>
         <w:t>&lt;/</w:t>
       </w:r>
+      <w:proofErr w:type="spellStart"/>
       <w:r>
         <w:rPr>
           <w:rStyle w:val="XMLElement"/>
@@ -17853,6 +18242,7 @@
         </w:rPr>
         <w:t>maximumframesize</w:t>
       </w:r>
+      <w:proofErr w:type="spellEnd"/>
       <w:r>
         <w:rPr>
           <w:rStyle w:val="XMLBracket"/>
@@ -17883,6 +18273,7 @@
         </w:rPr>
         <w:t>&lt;</w:t>
       </w:r>
+      <w:proofErr w:type="spellStart"/>
       <w:r>
         <w:rPr>
           <w:rStyle w:val="XMLElement"/>
@@ -17890,6 +18281,7 @@
         </w:rPr>
         <w:t>writeholdingregisterfc</w:t>
       </w:r>
+      <w:proofErr w:type="spellEnd"/>
       <w:r>
         <w:rPr>
           <w:rStyle w:val="XMLBracket"/>
@@ -17911,6 +18303,7 @@
         </w:rPr>
         <w:t>&lt;/</w:t>
       </w:r>
+      <w:proofErr w:type="spellStart"/>
       <w:r>
         <w:rPr>
           <w:rStyle w:val="XMLElement"/>
@@ -17918,6 +18311,7 @@
         </w:rPr>
         <w:t>writeholdingregisterfc</w:t>
       </w:r>
+      <w:proofErr w:type="spellEnd"/>
       <w:r>
         <w:rPr>
           <w:rStyle w:val="XMLBracket"/>
@@ -18311,7 +18705,21 @@
               <w:rPr>
                 <w:lang w:val="en-GB"/>
               </w:rPr>
-              <w:t>&lt;exportorder&gt;</w:t>
+              <w:t>&lt;</w:t>
+            </w:r>
+            <w:proofErr w:type="spellStart"/>
+            <w:r>
+              <w:rPr>
+                <w:lang w:val="en-GB"/>
+              </w:rPr>
+              <w:t>exportorder</w:t>
+            </w:r>
+            <w:proofErr w:type="spellEnd"/>
+            <w:r>
+              <w:rPr>
+                <w:lang w:val="en-GB"/>
+              </w:rPr>
+              <w:t>&gt;</w:t>
             </w:r>
           </w:p>
         </w:tc>
@@ -18361,21 +18769,25 @@
             <w:r>
               <w:t xml:space="preserve">. The tab pages are exported in order of ascending </w:t>
             </w:r>
+            <w:proofErr w:type="spellStart"/>
             <w:r>
               <w:rPr>
                 <w:rFonts w:ascii="Courier New" w:hAnsi="Courier New" w:cs="Courier New"/>
               </w:rPr>
               <w:t>exportorder</w:t>
             </w:r>
+            <w:proofErr w:type="spellEnd"/>
             <w:r>
               <w:t xml:space="preserve"> number. Tab pages that do not have an </w:t>
             </w:r>
+            <w:proofErr w:type="spellStart"/>
             <w:r>
               <w:rPr>
                 <w:rFonts w:ascii="Courier New" w:hAnsi="Courier New" w:cs="Courier New"/>
               </w:rPr>
               <w:t>exportorder</w:t>
             </w:r>
+            <w:proofErr w:type="spellEnd"/>
             <w:r>
               <w:t xml:space="preserve"> number are exported lastly, and in order of appearance in the mbc file.</w:t>
             </w:r>
@@ -18400,7 +18812,21 @@
               <w:rPr>
                 <w:lang w:val="en-GB"/>
               </w:rPr>
-              <w:t>&lt;fcol&gt;</w:t>
+              <w:t>&lt;</w:t>
+            </w:r>
+            <w:proofErr w:type="spellStart"/>
+            <w:r>
+              <w:rPr>
+                <w:lang w:val="en-GB"/>
+              </w:rPr>
+              <w:t>fcol</w:t>
+            </w:r>
+            <w:proofErr w:type="spellEnd"/>
+            <w:r>
+              <w:rPr>
+                <w:lang w:val="en-GB"/>
+              </w:rPr>
+              <w:t>&gt;</w:t>
             </w:r>
           </w:p>
         </w:tc>
@@ -18417,7 +18843,15 @@
               </w:rPr>
             </w:pPr>
             <w:r>
-              <w:t>Sets the default font (text) color for all &lt;var&gt; on this tab page.</w:t>
+              <w:t xml:space="preserve">Sets the default font (text) </w:t>
+            </w:r>
+            <w:proofErr w:type="spellStart"/>
+            <w:r>
+              <w:t>color</w:t>
+            </w:r>
+            <w:proofErr w:type="spellEnd"/>
+            <w:r>
+              <w:t xml:space="preserve"> for all &lt;var&gt; on this tab page.</w:t>
             </w:r>
           </w:p>
           <w:p>
@@ -18471,7 +18905,23 @@
               <w:fldChar w:fldCharType="separate"/>
             </w:r>
             <w:r>
-              <w:t>The &lt;fcol&gt; and &lt;bcol&gt; elements</w:t>
+              <w:t>The &lt;</w:t>
+            </w:r>
+            <w:proofErr w:type="spellStart"/>
+            <w:r>
+              <w:t>fcol</w:t>
+            </w:r>
+            <w:proofErr w:type="spellEnd"/>
+            <w:r>
+              <w:t>&gt; and &lt;</w:t>
+            </w:r>
+            <w:proofErr w:type="spellStart"/>
+            <w:r>
+              <w:t>bcol</w:t>
+            </w:r>
+            <w:proofErr w:type="spellEnd"/>
+            <w:r>
+              <w:t>&gt; elements</w:t>
             </w:r>
             <w:r>
               <w:rPr>
@@ -18511,7 +18961,21 @@
               <w:rPr>
                 <w:lang w:val="en-GB"/>
               </w:rPr>
-              <w:t xml:space="preserve">&lt;bcol&gt; </w:t>
+              <w:t>&lt;</w:t>
+            </w:r>
+            <w:proofErr w:type="spellStart"/>
+            <w:r>
+              <w:rPr>
+                <w:lang w:val="en-GB"/>
+              </w:rPr>
+              <w:t>bcol</w:t>
+            </w:r>
+            <w:proofErr w:type="spellEnd"/>
+            <w:r>
+              <w:rPr>
+                <w:lang w:val="en-GB"/>
+              </w:rPr>
+              <w:t xml:space="preserve">&gt; </w:t>
             </w:r>
           </w:p>
         </w:tc>
@@ -18528,7 +18992,15 @@
               </w:rPr>
             </w:pPr>
             <w:r>
-              <w:t>Sets the default background color for all &lt;var&gt; on this tab page. See [</w:t>
+              <w:t xml:space="preserve">Sets the default background </w:t>
+            </w:r>
+            <w:proofErr w:type="spellStart"/>
+            <w:r>
+              <w:t>color</w:t>
+            </w:r>
+            <w:proofErr w:type="spellEnd"/>
+            <w:r>
+              <w:t xml:space="preserve"> for all &lt;var&gt; on this tab page. See [</w:t>
             </w:r>
             <w:r>
               <w:rPr>
@@ -18571,7 +19043,23 @@
               <w:fldChar w:fldCharType="separate"/>
             </w:r>
             <w:r>
-              <w:t>The &lt;fcol&gt; and &lt;bcol&gt; elements</w:t>
+              <w:t>The &lt;</w:t>
+            </w:r>
+            <w:proofErr w:type="spellStart"/>
+            <w:r>
+              <w:t>fcol</w:t>
+            </w:r>
+            <w:proofErr w:type="spellEnd"/>
+            <w:r>
+              <w:t>&gt; and &lt;</w:t>
+            </w:r>
+            <w:proofErr w:type="spellStart"/>
+            <w:r>
+              <w:t>bcol</w:t>
+            </w:r>
+            <w:proofErr w:type="spellEnd"/>
+            <w:r>
+              <w:t>&gt; elements</w:t>
             </w:r>
             <w:r>
               <w:rPr>
@@ -18611,7 +19099,21 @@
               <w:rPr>
                 <w:lang w:val="en-GB"/>
               </w:rPr>
-              <w:t>&lt;expandfields&gt;</w:t>
+              <w:t>&lt;</w:t>
+            </w:r>
+            <w:proofErr w:type="spellStart"/>
+            <w:r>
+              <w:rPr>
+                <w:lang w:val="en-GB"/>
+              </w:rPr>
+              <w:t>expandfields</w:t>
+            </w:r>
+            <w:proofErr w:type="spellEnd"/>
+            <w:r>
+              <w:rPr>
+                <w:lang w:val="en-GB"/>
+              </w:rPr>
+              <w:t>&gt;</w:t>
             </w:r>
           </w:p>
         </w:tc>
@@ -18956,6 +19458,7 @@
         </w:rPr>
         <w:t>&lt;</w:t>
       </w:r>
+      <w:proofErr w:type="spellStart"/>
       <w:r>
         <w:rPr>
           <w:rStyle w:val="XMLElement"/>
@@ -18963,6 +19466,7 @@
         </w:rPr>
         <w:t>rw</w:t>
       </w:r>
+      <w:proofErr w:type="spellEnd"/>
       <w:r>
         <w:rPr>
           <w:rStyle w:val="XMLBracket"/>
@@ -18984,6 +19488,7 @@
         </w:rPr>
         <w:t>&lt;/</w:t>
       </w:r>
+      <w:proofErr w:type="spellStart"/>
       <w:r>
         <w:rPr>
           <w:rStyle w:val="XMLElement"/>
@@ -18991,6 +19496,7 @@
         </w:rPr>
         <w:t>rw</w:t>
       </w:r>
+      <w:proofErr w:type="spellEnd"/>
       <w:r>
         <w:rPr>
           <w:rStyle w:val="XMLBracket"/>
@@ -19182,6 +19688,7 @@
         </w:rPr>
         <w:t>&lt;</w:t>
       </w:r>
+      <w:proofErr w:type="spellStart"/>
       <w:r>
         <w:rPr>
           <w:rStyle w:val="XMLElement"/>
@@ -19189,6 +19696,7 @@
         </w:rPr>
         <w:t>rw</w:t>
       </w:r>
+      <w:proofErr w:type="spellEnd"/>
       <w:r>
         <w:rPr>
           <w:rStyle w:val="XMLBracket"/>
@@ -19210,6 +19718,7 @@
         </w:rPr>
         <w:t>&lt;/</w:t>
       </w:r>
+      <w:proofErr w:type="spellStart"/>
       <w:r>
         <w:rPr>
           <w:rStyle w:val="XMLElement"/>
@@ -19217,6 +19726,7 @@
         </w:rPr>
         <w:t>rw</w:t>
       </w:r>
+      <w:proofErr w:type="spellEnd"/>
       <w:r>
         <w:rPr>
           <w:rStyle w:val="XMLBracket"/>
@@ -19490,12 +20000,14 @@
               </w:rPr>
               <w:t>&lt;</w:t>
             </w:r>
+            <w:proofErr w:type="spellStart"/>
             <w:r>
               <w:rPr>
                 <w:rFonts w:hint="eastAsia"/>
               </w:rPr>
               <w:t>required</w:t>
             </w:r>
+            <w:proofErr w:type="spellEnd"/>
             <w:r>
               <w:rPr>
                 <w:lang w:val="en-GB"/>
@@ -19590,7 +20102,23 @@
           <w:rStyle w:val="XMLElement"/>
           <w:rFonts w:hint="eastAsia"/>
         </w:rPr>
-        <w:t>&lt;include&gt;</w:t>
+        <w:t>&lt;</w:t>
+      </w:r>
+      <w:proofErr w:type="spellStart"/>
+      <w:r>
+        <w:rPr>
+          <w:rStyle w:val="XMLElement"/>
+          <w:rFonts w:hint="eastAsia"/>
+        </w:rPr>
+        <w:t>include</w:t>
+      </w:r>
+      <w:proofErr w:type="spellEnd"/>
+      <w:r>
+        <w:rPr>
+          <w:rStyle w:val="XMLElement"/>
+          <w:rFonts w:hint="eastAsia"/>
+        </w:rPr>
+        <w:t>&gt;</w:t>
       </w:r>
     </w:p>
     <w:p>
@@ -19611,6 +20139,7 @@
         </w:rPr>
         <w:t>file&gt;</w:t>
       </w:r>
+      <w:proofErr w:type="spellStart"/>
       <w:r>
         <w:t>Configuration</w:t>
       </w:r>
@@ -19620,6 +20149,7 @@
         </w:rPr>
         <w:t>.mbc</w:t>
       </w:r>
+      <w:proofErr w:type="spellEnd"/>
       <w:r>
         <w:rPr>
           <w:rStyle w:val="XMLElement"/>
@@ -19646,7 +20176,23 @@
           <w:rStyle w:val="XMLElement"/>
           <w:rFonts w:hint="eastAsia"/>
         </w:rPr>
-        <w:t>&lt;required&gt;</w:t>
+        <w:t>&lt;</w:t>
+      </w:r>
+      <w:proofErr w:type="spellStart"/>
+      <w:r>
+        <w:rPr>
+          <w:rStyle w:val="XMLElement"/>
+          <w:rFonts w:hint="eastAsia"/>
+        </w:rPr>
+        <w:t>required</w:t>
+      </w:r>
+      <w:proofErr w:type="spellEnd"/>
+      <w:r>
+        <w:rPr>
+          <w:rStyle w:val="XMLElement"/>
+          <w:rFonts w:hint="eastAsia"/>
+        </w:rPr>
+        <w:t>&gt;</w:t>
       </w:r>
       <w:r>
         <w:rPr>
@@ -19661,7 +20207,23 @@
           <w:rStyle w:val="XMLElement"/>
           <w:rFonts w:hint="eastAsia"/>
         </w:rPr>
-        <w:t>&lt;/required&gt;</w:t>
+        <w:t>&lt;/</w:t>
+      </w:r>
+      <w:proofErr w:type="spellStart"/>
+      <w:r>
+        <w:rPr>
+          <w:rStyle w:val="XMLElement"/>
+          <w:rFonts w:hint="eastAsia"/>
+        </w:rPr>
+        <w:t>required</w:t>
+      </w:r>
+      <w:proofErr w:type="spellEnd"/>
+      <w:r>
+        <w:rPr>
+          <w:rStyle w:val="XMLElement"/>
+          <w:rFonts w:hint="eastAsia"/>
+        </w:rPr>
+        <w:t>&gt;</w:t>
       </w:r>
     </w:p>
     <w:p>
@@ -19676,11 +20238,27 @@
           <w:rStyle w:val="XMLElement"/>
           <w:rFonts w:hint="eastAsia"/>
         </w:rPr>
-        <w:t>&lt;/include&gt;</w:t>
-      </w:r>
+        <w:t>&lt;/</w:t>
+      </w:r>
+      <w:proofErr w:type="spellStart"/>
       <w:r>
         <w:rPr>
           <w:rStyle w:val="XMLElement"/>
+          <w:rFonts w:hint="eastAsia"/>
+        </w:rPr>
+        <w:t>include</w:t>
+      </w:r>
+      <w:proofErr w:type="spellEnd"/>
+      <w:r>
+        <w:rPr>
+          <w:rStyle w:val="XMLElement"/>
+          <w:rFonts w:hint="eastAsia"/>
+        </w:rPr>
+        <w:t>&gt;</w:t>
+      </w:r>
+      <w:r>
+        <w:rPr>
+          <w:rStyle w:val="XMLElement"/>
         </w:rPr>
         <w:br/>
       </w:r>
@@ -19697,7 +20275,23 @@
           <w:rStyle w:val="XMLElement"/>
           <w:rFonts w:hint="eastAsia"/>
         </w:rPr>
-        <w:t>&lt;includex&gt;</w:t>
+        <w:t>&lt;</w:t>
+      </w:r>
+      <w:proofErr w:type="spellStart"/>
+      <w:r>
+        <w:rPr>
+          <w:rStyle w:val="XMLElement"/>
+          <w:rFonts w:hint="eastAsia"/>
+        </w:rPr>
+        <w:t>includex</w:t>
+      </w:r>
+      <w:proofErr w:type="spellEnd"/>
+      <w:r>
+        <w:rPr>
+          <w:rStyle w:val="XMLElement"/>
+          <w:rFonts w:hint="eastAsia"/>
+        </w:rPr>
+        <w:t>&gt;</w:t>
       </w:r>
     </w:p>
     <w:p>
@@ -19746,6 +20340,7 @@
         </w:rPr>
         <w:t>\</w:t>
       </w:r>
+      <w:proofErr w:type="spellStart"/>
       <w:r>
         <w:rPr>
           <w:rStyle w:val="XMLContent"/>
@@ -19761,6 +20356,7 @@
         </w:rPr>
         <w:t>.mbc</w:t>
       </w:r>
+      <w:proofErr w:type="spellEnd"/>
       <w:r>
         <w:rPr>
           <w:rStyle w:val="XMLElement"/>
@@ -19782,7 +20378,23 @@
           <w:rStyle w:val="XMLElement"/>
           <w:rFonts w:hint="eastAsia"/>
         </w:rPr>
-        <w:t>&lt;/include&gt;</w:t>
+        <w:t>&lt;/</w:t>
+      </w:r>
+      <w:proofErr w:type="spellStart"/>
+      <w:r>
+        <w:rPr>
+          <w:rStyle w:val="XMLElement"/>
+          <w:rFonts w:hint="eastAsia"/>
+        </w:rPr>
+        <w:t>include</w:t>
+      </w:r>
+      <w:proofErr w:type="spellEnd"/>
+      <w:r>
+        <w:rPr>
+          <w:rStyle w:val="XMLElement"/>
+          <w:rFonts w:hint="eastAsia"/>
+        </w:rPr>
+        <w:t>&gt;</w:t>
       </w:r>
     </w:p>
     <w:p>
@@ -19866,7 +20478,15 @@
               </w:rPr>
             </w:pPr>
             <w:r>
-              <w:t>The modbus register number. Numbering depends on the &lt;holdingregisterstart&gt; element. Holding registers numbering usually starts at 40001.</w:t>
+              <w:t>The modbus register number. Numbering depends on the &lt;</w:t>
+            </w:r>
+            <w:proofErr w:type="spellStart"/>
+            <w:r>
+              <w:t>holdingregisterstart</w:t>
+            </w:r>
+            <w:proofErr w:type="spellEnd"/>
+            <w:r>
+              <w:t>&gt; element. Holding registers numbering usually starts at 40001.</w:t>
             </w:r>
           </w:p>
         </w:tc>
@@ -19988,14 +20608,22 @@
               <w:rPr>
                 <w:lang w:val="en-GB"/>
               </w:rPr>
-              <w:t>&lt;longdesc</w:t>
-            </w:r>
+              <w:t>&lt;</w:t>
+            </w:r>
+            <w:proofErr w:type="spellStart"/>
             <w:r>
               <w:rPr>
                 <w:lang w:val="en-GB"/>
               </w:rPr>
+              <w:t>longdesc</w:t>
+            </w:r>
+            <w:r>
+              <w:rPr>
+                <w:lang w:val="en-GB"/>
+              </w:rPr>
               <w:t>r</w:t>
             </w:r>
+            <w:proofErr w:type="spellEnd"/>
             <w:r>
               <w:rPr>
                 <w:lang w:val="en-GB"/>
@@ -20142,7 +20770,21 @@
               <w:rPr>
                 <w:lang w:val="en-GB"/>
               </w:rPr>
-              <w:t>&lt;minlen&gt;</w:t>
+              <w:t>&lt;</w:t>
+            </w:r>
+            <w:proofErr w:type="spellStart"/>
+            <w:r>
+              <w:rPr>
+                <w:lang w:val="en-GB"/>
+              </w:rPr>
+              <w:t>minlen</w:t>
+            </w:r>
+            <w:proofErr w:type="spellEnd"/>
+            <w:r>
+              <w:rPr>
+                <w:lang w:val="en-GB"/>
+              </w:rPr>
+              <w:t>&gt;</w:t>
             </w:r>
           </w:p>
         </w:tc>
@@ -20159,7 +20801,15 @@
               </w:rPr>
             </w:pPr>
             <w:r>
-              <w:t xml:space="preserve">Determines the minimum number of digits shown for the value. It adds leading zeros if needed. It is useful when showing a register value in binary or hexadecimal format to avoid that the value jumps left and right when the upper bits change. Example: 15 (decimal) with hex format and minlen=4 will be </w:t>
+              <w:t xml:space="preserve">Determines the minimum number of digits shown for the value. It adds leading zeros if needed. It is useful when showing a register value in binary or hexadecimal format to avoid that the value jumps left and right when the upper bits change. Example: 15 (decimal) with hex format and </w:t>
+            </w:r>
+            <w:proofErr w:type="spellStart"/>
+            <w:r>
+              <w:t>minlen</w:t>
+            </w:r>
+            <w:proofErr w:type="spellEnd"/>
+            <w:r>
+              <w:t xml:space="preserve">=4 will be </w:t>
             </w:r>
             <w:r>
               <w:lastRenderedPageBreak/>
@@ -20194,7 +20844,21 @@
                 <w:lang w:val="en-GB"/>
               </w:rPr>
               <w:lastRenderedPageBreak/>
-              <w:t>&lt;rw&gt;</w:t>
+              <w:t>&lt;</w:t>
+            </w:r>
+            <w:proofErr w:type="spellStart"/>
+            <w:r>
+              <w:rPr>
+                <w:lang w:val="en-GB"/>
+              </w:rPr>
+              <w:t>rw</w:t>
+            </w:r>
+            <w:proofErr w:type="spellEnd"/>
+            <w:r>
+              <w:rPr>
+                <w:lang w:val="en-GB"/>
+              </w:rPr>
+              <w:t>&gt;</w:t>
             </w:r>
           </w:p>
         </w:tc>
@@ -20211,7 +20875,15 @@
               </w:rPr>
             </w:pPr>
             <w:r>
-              <w:t>Determines if the register if read only, write only or read/write. Can be “r”, “w” or “rw”. ModbusControl will only attempt to read registers that have the “r” property, and it will only allow writing of registers that have the “w” property.</w:t>
+              <w:t>Determines if the register if read only, write only or read/write. Can be “r”, “w” or “</w:t>
+            </w:r>
+            <w:proofErr w:type="spellStart"/>
+            <w:r>
+              <w:t>rw</w:t>
+            </w:r>
+            <w:proofErr w:type="spellEnd"/>
+            <w:r>
+              <w:t>”. ModbusControl will only attempt to read registers that have the “r” property, and it will only allow writing of registers that have the “w” property.</w:t>
             </w:r>
           </w:p>
           <w:p>
@@ -20241,7 +20913,21 @@
               <w:rPr>
                 <w:lang w:val="en-GB"/>
               </w:rPr>
-              <w:t>&lt;fcol&gt;</w:t>
+              <w:t>&lt;</w:t>
+            </w:r>
+            <w:proofErr w:type="spellStart"/>
+            <w:r>
+              <w:rPr>
+                <w:lang w:val="en-GB"/>
+              </w:rPr>
+              <w:t>fcol</w:t>
+            </w:r>
+            <w:proofErr w:type="spellEnd"/>
+            <w:r>
+              <w:rPr>
+                <w:lang w:val="en-GB"/>
+              </w:rPr>
+              <w:t>&gt;</w:t>
             </w:r>
           </w:p>
         </w:tc>
@@ -20258,7 +20944,15 @@
               </w:rPr>
             </w:pPr>
             <w:r>
-              <w:t xml:space="preserve">Sets the font (text) color of the register, description and value. </w:t>
+              <w:t xml:space="preserve">Sets the font (text) </w:t>
+            </w:r>
+            <w:proofErr w:type="spellStart"/>
+            <w:r>
+              <w:t>color</w:t>
+            </w:r>
+            <w:proofErr w:type="spellEnd"/>
+            <w:r>
+              <w:t xml:space="preserve"> of the register, description and value. </w:t>
             </w:r>
           </w:p>
           <w:p>
@@ -20312,7 +21006,23 @@
               <w:fldChar w:fldCharType="separate"/>
             </w:r>
             <w:r>
-              <w:t>The &lt;fcol&gt; and &lt;bcol&gt; elements</w:t>
+              <w:t>The &lt;</w:t>
+            </w:r>
+            <w:proofErr w:type="spellStart"/>
+            <w:r>
+              <w:t>fcol</w:t>
+            </w:r>
+            <w:proofErr w:type="spellEnd"/>
+            <w:r>
+              <w:t>&gt; and &lt;</w:t>
+            </w:r>
+            <w:proofErr w:type="spellStart"/>
+            <w:r>
+              <w:t>bcol</w:t>
+            </w:r>
+            <w:proofErr w:type="spellEnd"/>
+            <w:r>
+              <w:t>&gt; elements</w:t>
             </w:r>
             <w:r>
               <w:rPr>
@@ -20352,7 +21062,21 @@
               <w:rPr>
                 <w:lang w:val="en-GB"/>
               </w:rPr>
-              <w:t xml:space="preserve">&lt;bcol&gt; </w:t>
+              <w:t>&lt;</w:t>
+            </w:r>
+            <w:proofErr w:type="spellStart"/>
+            <w:r>
+              <w:rPr>
+                <w:lang w:val="en-GB"/>
+              </w:rPr>
+              <w:t>bcol</w:t>
+            </w:r>
+            <w:proofErr w:type="spellEnd"/>
+            <w:r>
+              <w:rPr>
+                <w:lang w:val="en-GB"/>
+              </w:rPr>
+              <w:t xml:space="preserve">&gt; </w:t>
             </w:r>
           </w:p>
         </w:tc>
@@ -20369,7 +21093,15 @@
               </w:rPr>
             </w:pPr>
             <w:r>
-              <w:t>Sets the background color of the register, description and value.</w:t>
+              <w:t xml:space="preserve">Sets the background </w:t>
+            </w:r>
+            <w:proofErr w:type="spellStart"/>
+            <w:r>
+              <w:t>color</w:t>
+            </w:r>
+            <w:proofErr w:type="spellEnd"/>
+            <w:r>
+              <w:t xml:space="preserve"> of the register, description and value.</w:t>
             </w:r>
           </w:p>
           <w:p>
@@ -20423,7 +21155,23 @@
               <w:fldChar w:fldCharType="separate"/>
             </w:r>
             <w:r>
-              <w:t>The &lt;fcol&gt; and &lt;bcol&gt; elements</w:t>
+              <w:t>The &lt;</w:t>
+            </w:r>
+            <w:proofErr w:type="spellStart"/>
+            <w:r>
+              <w:t>fcol</w:t>
+            </w:r>
+            <w:proofErr w:type="spellEnd"/>
+            <w:r>
+              <w:t>&gt; and &lt;</w:t>
+            </w:r>
+            <w:proofErr w:type="spellStart"/>
+            <w:r>
+              <w:t>bcol</w:t>
+            </w:r>
+            <w:proofErr w:type="spellEnd"/>
+            <w:r>
+              <w:t>&gt; elements</w:t>
             </w:r>
             <w:r>
               <w:rPr>
@@ -20491,7 +21239,15 @@
               </w:rPr>
             </w:pPr>
             <w:r>
-              <w:t>Allowed only for Int and UInt types.</w:t>
+              <w:t xml:space="preserve">Allowed only for Int and </w:t>
+            </w:r>
+            <w:proofErr w:type="spellStart"/>
+            <w:r>
+              <w:t>UInt</w:t>
+            </w:r>
+            <w:proofErr w:type="spellEnd"/>
+            <w:r>
+              <w:t xml:space="preserve"> types.</w:t>
             </w:r>
           </w:p>
           <w:p>
@@ -20755,7 +21511,21 @@
               <w:rPr>
                 <w:lang w:val="en-GB"/>
               </w:rPr>
-              <w:t>&lt;expandfields&gt;</w:t>
+              <w:t>&lt;</w:t>
+            </w:r>
+            <w:proofErr w:type="spellStart"/>
+            <w:r>
+              <w:rPr>
+                <w:lang w:val="en-GB"/>
+              </w:rPr>
+              <w:t>expandfields</w:t>
+            </w:r>
+            <w:proofErr w:type="spellEnd"/>
+            <w:r>
+              <w:rPr>
+                <w:lang w:val="en-GB"/>
+              </w:rPr>
+              <w:t>&gt;</w:t>
             </w:r>
           </w:p>
         </w:tc>
@@ -20981,6 +21751,7 @@
         </w:rPr>
         <w:t>&lt;</w:t>
       </w:r>
+      <w:proofErr w:type="spellStart"/>
       <w:r>
         <w:rPr>
           <w:rStyle w:val="XMLElement"/>
@@ -20988,6 +21759,7 @@
         </w:rPr>
         <w:t>rw</w:t>
       </w:r>
+      <w:proofErr w:type="spellEnd"/>
       <w:r>
         <w:rPr>
           <w:rStyle w:val="XMLBracket"/>
@@ -20995,6 +21767,7 @@
         </w:rPr>
         <w:t>&gt;</w:t>
       </w:r>
+      <w:proofErr w:type="spellStart"/>
       <w:r>
         <w:rPr>
           <w:rStyle w:val="XMLContent"/>
@@ -21002,6 +21775,7 @@
         </w:rPr>
         <w:t>rw</w:t>
       </w:r>
+      <w:proofErr w:type="spellEnd"/>
       <w:r>
         <w:rPr>
           <w:rStyle w:val="XMLBracket"/>
@@ -21009,6 +21783,7 @@
         </w:rPr>
         <w:t>&lt;/</w:t>
       </w:r>
+      <w:proofErr w:type="spellStart"/>
       <w:r>
         <w:rPr>
           <w:rStyle w:val="XMLElement"/>
@@ -21016,6 +21791,7 @@
         </w:rPr>
         <w:t>rw</w:t>
       </w:r>
+      <w:proofErr w:type="spellEnd"/>
       <w:r>
         <w:rPr>
           <w:rStyle w:val="XMLBracket"/>
@@ -21131,6 +21907,7 @@
         </w:rPr>
         <w:t>&gt;&lt;</w:t>
       </w:r>
+      <w:proofErr w:type="spellStart"/>
       <w:r>
         <w:rPr>
           <w:rStyle w:val="XMLElement"/>
@@ -21139,6 +21916,7 @@
         </w:rPr>
         <w:t>text</w:t>
       </w:r>
+      <w:proofErr w:type="spellEnd"/>
       <w:r>
         <w:rPr>
           <w:rStyle w:val="XMLBracket"/>
@@ -21153,7 +21931,25 @@
           <w:szCs w:val="18"/>
           <w:lang w:val="en-GB" w:eastAsia="zh-CN"/>
         </w:rPr>
-        <w:t>Temperature 1 (0,1 deg)</w:t>
+        <w:t xml:space="preserve">Temperature 1 (0,1 </w:t>
+      </w:r>
+      <w:proofErr w:type="spellStart"/>
+      <w:r>
+        <w:rPr>
+          <w:rStyle w:val="XMLContent"/>
+          <w:szCs w:val="18"/>
+          <w:lang w:val="en-GB" w:eastAsia="zh-CN"/>
+        </w:rPr>
+        <w:t>deg</w:t>
+      </w:r>
+      <w:proofErr w:type="spellEnd"/>
+      <w:r>
+        <w:rPr>
+          <w:rStyle w:val="XMLContent"/>
+          <w:szCs w:val="18"/>
+          <w:lang w:val="en-GB" w:eastAsia="zh-CN"/>
+        </w:rPr>
+        <w:t>)</w:t>
       </w:r>
       <w:r>
         <w:rPr>
@@ -21163,6 +21959,7 @@
         </w:rPr>
         <w:t>&lt;/</w:t>
       </w:r>
+      <w:proofErr w:type="spellStart"/>
       <w:r>
         <w:rPr>
           <w:rStyle w:val="XMLElement"/>
@@ -21171,6 +21968,7 @@
         </w:rPr>
         <w:t>text</w:t>
       </w:r>
+      <w:proofErr w:type="spellEnd"/>
       <w:r>
         <w:rPr>
           <w:rStyle w:val="XMLBracket"/>
@@ -21245,6 +22043,7 @@
         </w:rPr>
         <w:t>&lt;</w:t>
       </w:r>
+      <w:proofErr w:type="spellStart"/>
       <w:r>
         <w:rPr>
           <w:rStyle w:val="XMLElement"/>
@@ -21253,6 +22052,7 @@
         </w:rPr>
         <w:t>decimals</w:t>
       </w:r>
+      <w:proofErr w:type="spellEnd"/>
       <w:r>
         <w:rPr>
           <w:rStyle w:val="XMLBracket"/>
@@ -21277,6 +22077,7 @@
         </w:rPr>
         <w:t>&lt;/</w:t>
       </w:r>
+      <w:proofErr w:type="spellStart"/>
       <w:r>
         <w:rPr>
           <w:rStyle w:val="XMLElement"/>
@@ -21285,6 +22086,7 @@
         </w:rPr>
         <w:t>decimals</w:t>
       </w:r>
+      <w:proofErr w:type="spellEnd"/>
       <w:r>
         <w:rPr>
           <w:rStyle w:val="XMLBracket"/>
@@ -21293,6 +22095,7 @@
         </w:rPr>
         <w:t>&gt;&lt;</w:t>
       </w:r>
+      <w:proofErr w:type="spellStart"/>
       <w:r>
         <w:rPr>
           <w:rStyle w:val="XMLElement"/>
@@ -21301,6 +22104,7 @@
         </w:rPr>
         <w:t>rw</w:t>
       </w:r>
+      <w:proofErr w:type="spellEnd"/>
       <w:r>
         <w:rPr>
           <w:rStyle w:val="XMLBracket"/>
@@ -21325,6 +22129,7 @@
         </w:rPr>
         <w:t>&lt;/</w:t>
       </w:r>
+      <w:proofErr w:type="spellStart"/>
       <w:r>
         <w:rPr>
           <w:rStyle w:val="XMLElement"/>
@@ -21333,6 +22138,7 @@
         </w:rPr>
         <w:t>rw</w:t>
       </w:r>
+      <w:proofErr w:type="spellEnd"/>
       <w:r>
         <w:rPr>
           <w:rStyle w:val="XMLBracket"/>
@@ -21341,6 +22147,7 @@
         </w:rPr>
         <w:t>&gt;&lt;</w:t>
       </w:r>
+      <w:proofErr w:type="spellStart"/>
       <w:r>
         <w:rPr>
           <w:rStyle w:val="XMLElement"/>
@@ -21349,6 +22156,7 @@
         </w:rPr>
         <w:t>bcol</w:t>
       </w:r>
+      <w:proofErr w:type="spellEnd"/>
       <w:r>
         <w:rPr>
           <w:rStyle w:val="XMLBracket"/>
@@ -21373,6 +22181,7 @@
         </w:rPr>
         <w:t>&lt;/</w:t>
       </w:r>
+      <w:proofErr w:type="spellStart"/>
       <w:r>
         <w:rPr>
           <w:rStyle w:val="XMLElement"/>
@@ -21381,6 +22190,7 @@
         </w:rPr>
         <w:t>bcol</w:t>
       </w:r>
+      <w:proofErr w:type="spellEnd"/>
       <w:r>
         <w:rPr>
           <w:rStyle w:val="XMLBracket"/>
@@ -21506,7 +22316,21 @@
               <w:rPr>
                 <w:lang w:val="en-GB"/>
               </w:rPr>
-              <w:t>&amp;lt;</w:t>
+              <w:t>&amp;</w:t>
+            </w:r>
+            <w:proofErr w:type="spellStart"/>
+            <w:r>
+              <w:rPr>
+                <w:lang w:val="en-GB"/>
+              </w:rPr>
+              <w:t>lt</w:t>
+            </w:r>
+            <w:proofErr w:type="spellEnd"/>
+            <w:r>
+              <w:rPr>
+                <w:lang w:val="en-GB"/>
+              </w:rPr>
+              <w:t>;</w:t>
             </w:r>
           </w:p>
         </w:tc>
@@ -21549,7 +22373,21 @@
                 <w:lang w:val="en-GB"/>
               </w:rPr>
               <w:lastRenderedPageBreak/>
-              <w:t>&amp;gt;</w:t>
+              <w:t>&amp;</w:t>
+            </w:r>
+            <w:proofErr w:type="spellStart"/>
+            <w:r>
+              <w:rPr>
+                <w:lang w:val="en-GB"/>
+              </w:rPr>
+              <w:t>gt</w:t>
+            </w:r>
+            <w:proofErr w:type="spellEnd"/>
+            <w:r>
+              <w:rPr>
+                <w:lang w:val="en-GB"/>
+              </w:rPr>
+              <w:t>;</w:t>
             </w:r>
           </w:p>
         </w:tc>
@@ -21675,7 +22513,21 @@
               <w:rPr>
                 <w:lang w:val="en-GB"/>
               </w:rPr>
-              <w:t>&amp;quot;</w:t>
+              <w:t>&amp;</w:t>
+            </w:r>
+            <w:proofErr w:type="spellStart"/>
+            <w:r>
+              <w:rPr>
+                <w:lang w:val="en-GB"/>
+              </w:rPr>
+              <w:t>quot</w:t>
+            </w:r>
+            <w:proofErr w:type="spellEnd"/>
+            <w:r>
+              <w:rPr>
+                <w:lang w:val="en-GB"/>
+              </w:rPr>
+              <w:t>;</w:t>
             </w:r>
           </w:p>
         </w:tc>
@@ -21894,7 +22746,14 @@
         <w:rPr>
           <w:lang w:val="en-GB"/>
         </w:rPr>
-        <w:t>The &lt;longdesc</w:t>
+        <w:t>The &lt;</w:t>
+      </w:r>
+      <w:proofErr w:type="spellStart"/>
+      <w:r>
+        <w:rPr>
+          <w:lang w:val="en-GB"/>
+        </w:rPr>
+        <w:t>longdesc</w:t>
       </w:r>
       <w:r>
         <w:rPr>
@@ -21902,6 +22761,7 @@
         </w:rPr>
         <w:t>r</w:t>
       </w:r>
+      <w:proofErr w:type="spellEnd"/>
       <w:r>
         <w:rPr>
           <w:lang w:val="en-GB"/>
@@ -21917,11 +22777,16 @@
         </w:rPr>
       </w:pPr>
       <w:r>
-        <w:t>The &lt;longdesc</w:t>
+        <w:t>The &lt;</w:t>
+      </w:r>
+      <w:proofErr w:type="spellStart"/>
+      <w:r>
+        <w:t>longdesc</w:t>
       </w:r>
       <w:r>
         <w:t>r</w:t>
       </w:r>
+      <w:proofErr w:type="spellEnd"/>
       <w:r>
         <w:t xml:space="preserve">&gt; element </w:t>
       </w:r>
@@ -21993,14 +22858,22 @@
               <w:rPr>
                 <w:lang w:val="en-GB"/>
               </w:rPr>
-              <w:t>&lt;longdesc</w:t>
-            </w:r>
+              <w:t>&lt;</w:t>
+            </w:r>
+            <w:proofErr w:type="spellStart"/>
             <w:r>
               <w:rPr>
                 <w:lang w:val="en-GB"/>
               </w:rPr>
+              <w:t>longdesc</w:t>
+            </w:r>
+            <w:r>
+              <w:rPr>
+                <w:lang w:val="en-GB"/>
+              </w:rPr>
               <w:t>r</w:t>
             </w:r>
+            <w:proofErr w:type="spellEnd"/>
             <w:r>
               <w:rPr>
                 <w:lang w:val="en-GB"/>
@@ -22170,12 +23043,30 @@
           <w:lang w:val="en-GB"/>
         </w:rPr>
         <w:tab/>
-        <w:t>&lt;longdescr&gt;</w:t>
-      </w:r>
+        <w:t>&lt;</w:t>
+      </w:r>
+      <w:proofErr w:type="spellStart"/>
       <w:r>
         <w:rPr>
           <w:rStyle w:val="XMLElement"/>
           <w:rFonts w:hint="eastAsia"/>
+          <w:lang w:val="en-GB"/>
+        </w:rPr>
+        <w:t>longdescr</w:t>
+      </w:r>
+      <w:proofErr w:type="spellEnd"/>
+      <w:r>
+        <w:rPr>
+          <w:rStyle w:val="XMLElement"/>
+          <w:rFonts w:hint="eastAsia"/>
+          <w:lang w:val="en-GB"/>
+        </w:rPr>
+        <w:t>&gt;</w:t>
+      </w:r>
+      <w:r>
+        <w:rPr>
+          <w:rStyle w:val="XMLElement"/>
+          <w:rFonts w:hint="eastAsia"/>
           <w:color w:val="auto"/>
           <w:lang w:val="en-GB"/>
         </w:rPr>
@@ -22187,7 +23078,25 @@
           <w:rFonts w:hint="eastAsia"/>
           <w:lang w:val="en-GB"/>
         </w:rPr>
-        <w:t>&lt;/longdescr&gt;</w:t>
+        <w:t>&lt;/</w:t>
+      </w:r>
+      <w:proofErr w:type="spellStart"/>
+      <w:r>
+        <w:rPr>
+          <w:rStyle w:val="XMLElement"/>
+          <w:rFonts w:hint="eastAsia"/>
+          <w:lang w:val="en-GB"/>
+        </w:rPr>
+        <w:t>longdescr</w:t>
+      </w:r>
+      <w:proofErr w:type="spellEnd"/>
+      <w:r>
+        <w:rPr>
+          <w:rStyle w:val="XMLElement"/>
+          <w:rFonts w:hint="eastAsia"/>
+          <w:lang w:val="en-GB"/>
+        </w:rPr>
+        <w:t>&gt;</w:t>
       </w:r>
     </w:p>
     <w:p>
@@ -22256,7 +23165,7 @@
           <w:noProof/>
         </w:rPr>
         <w:pict w14:anchorId="56E75F81">
-          <v:shape id="Afbeelding 1" o:spid="_x0000_i1027" type="#_x0000_t75" style="width:345.6pt;height:52.2pt;visibility:visible;mso-wrap-style:square">
+          <v:shape id="Afbeelding 1" o:spid="_x0000_i1027" type="#_x0000_t75" style="width:345.75pt;height:52.5pt;visibility:visible;mso-wrap-style:square">
             <v:imagedata r:id="rId14" o:title=""/>
           </v:shape>
         </w:pict>
@@ -23775,7 +24684,21 @@
               <w:rPr>
                 <w:lang w:val="en-GB"/>
               </w:rPr>
-              <w:t>&lt;pos&gt;</w:t>
+              <w:t>&lt;</w:t>
+            </w:r>
+            <w:proofErr w:type="spellStart"/>
+            <w:r>
+              <w:rPr>
+                <w:lang w:val="en-GB"/>
+              </w:rPr>
+              <w:t>pos</w:t>
+            </w:r>
+            <w:proofErr w:type="spellEnd"/>
+            <w:r>
+              <w:rPr>
+                <w:lang w:val="en-GB"/>
+              </w:rPr>
+              <w:t>&gt;</w:t>
             </w:r>
           </w:p>
         </w:tc>
@@ -23961,14 +24884,22 @@
               <w:rPr>
                 <w:lang w:val="en-GB"/>
               </w:rPr>
-              <w:t>&lt;longdesc</w:t>
-            </w:r>
+              <w:t>&lt;</w:t>
+            </w:r>
+            <w:proofErr w:type="spellStart"/>
             <w:r>
               <w:rPr>
                 <w:lang w:val="en-GB"/>
               </w:rPr>
+              <w:t>longdesc</w:t>
+            </w:r>
+            <w:r>
+              <w:rPr>
+                <w:lang w:val="en-GB"/>
+              </w:rPr>
               <w:t>r</w:t>
             </w:r>
+            <w:proofErr w:type="spellEnd"/>
             <w:r>
               <w:rPr>
                 <w:lang w:val="en-GB"/>
@@ -24135,7 +25066,21 @@
               <w:rPr>
                 <w:lang w:val="en-GB"/>
               </w:rPr>
-              <w:t>&lt;minlen&gt;</w:t>
+              <w:t>&lt;</w:t>
+            </w:r>
+            <w:proofErr w:type="spellStart"/>
+            <w:r>
+              <w:rPr>
+                <w:lang w:val="en-GB"/>
+              </w:rPr>
+              <w:t>minlen</w:t>
+            </w:r>
+            <w:proofErr w:type="spellEnd"/>
+            <w:r>
+              <w:rPr>
+                <w:lang w:val="en-GB"/>
+              </w:rPr>
+              <w:t>&gt;</w:t>
             </w:r>
           </w:p>
         </w:tc>
@@ -24182,7 +25127,21 @@
               <w:rPr>
                 <w:lang w:val="en-GB"/>
               </w:rPr>
-              <w:t>&lt;fcol&gt;</w:t>
+              <w:t>&lt;</w:t>
+            </w:r>
+            <w:proofErr w:type="spellStart"/>
+            <w:r>
+              <w:rPr>
+                <w:lang w:val="en-GB"/>
+              </w:rPr>
+              <w:t>fcol</w:t>
+            </w:r>
+            <w:proofErr w:type="spellEnd"/>
+            <w:r>
+              <w:rPr>
+                <w:lang w:val="en-GB"/>
+              </w:rPr>
+              <w:t>&gt;</w:t>
             </w:r>
           </w:p>
         </w:tc>
@@ -24199,7 +25158,15 @@
               </w:rPr>
             </w:pPr>
             <w:r>
-              <w:t xml:space="preserve">Sets the font (text) color of the bit field, description and value. </w:t>
+              <w:t xml:space="preserve">Sets the font (text) </w:t>
+            </w:r>
+            <w:proofErr w:type="spellStart"/>
+            <w:r>
+              <w:t>color</w:t>
+            </w:r>
+            <w:proofErr w:type="spellEnd"/>
+            <w:r>
+              <w:t xml:space="preserve"> of the bit field, description and value. </w:t>
             </w:r>
           </w:p>
           <w:p>
@@ -24253,7 +25220,23 @@
               <w:fldChar w:fldCharType="separate"/>
             </w:r>
             <w:r>
-              <w:t>The &lt;fcol&gt; and &lt;bcol&gt; elements</w:t>
+              <w:t>The &lt;</w:t>
+            </w:r>
+            <w:proofErr w:type="spellStart"/>
+            <w:r>
+              <w:t>fcol</w:t>
+            </w:r>
+            <w:proofErr w:type="spellEnd"/>
+            <w:r>
+              <w:t>&gt; and &lt;</w:t>
+            </w:r>
+            <w:proofErr w:type="spellStart"/>
+            <w:r>
+              <w:t>bcol</w:t>
+            </w:r>
+            <w:proofErr w:type="spellEnd"/>
+            <w:r>
+              <w:t>&gt; elements</w:t>
             </w:r>
             <w:r>
               <w:rPr>
@@ -24296,7 +25279,21 @@
               <w:rPr>
                 <w:lang w:val="en-GB"/>
               </w:rPr>
-              <w:t xml:space="preserve">&lt;bcol&gt; </w:t>
+              <w:t>&lt;</w:t>
+            </w:r>
+            <w:proofErr w:type="spellStart"/>
+            <w:r>
+              <w:rPr>
+                <w:lang w:val="en-GB"/>
+              </w:rPr>
+              <w:t>bcol</w:t>
+            </w:r>
+            <w:proofErr w:type="spellEnd"/>
+            <w:r>
+              <w:rPr>
+                <w:lang w:val="en-GB"/>
+              </w:rPr>
+              <w:t xml:space="preserve">&gt; </w:t>
             </w:r>
           </w:p>
         </w:tc>
@@ -24313,7 +25310,15 @@
               </w:rPr>
             </w:pPr>
             <w:r>
-              <w:t xml:space="preserve">Sets the background color of the bit field, description and value. </w:t>
+              <w:t xml:space="preserve">Sets the background </w:t>
+            </w:r>
+            <w:proofErr w:type="spellStart"/>
+            <w:r>
+              <w:t>color</w:t>
+            </w:r>
+            <w:proofErr w:type="spellEnd"/>
+            <w:r>
+              <w:t xml:space="preserve"> of the bit field, description and value. </w:t>
             </w:r>
           </w:p>
           <w:p>
@@ -24367,7 +25372,23 @@
               <w:fldChar w:fldCharType="separate"/>
             </w:r>
             <w:r>
-              <w:t>The &lt;fcol&gt; and &lt;bcol&gt; elements</w:t>
+              <w:t>The &lt;</w:t>
+            </w:r>
+            <w:proofErr w:type="spellStart"/>
+            <w:r>
+              <w:t>fcol</w:t>
+            </w:r>
+            <w:proofErr w:type="spellEnd"/>
+            <w:r>
+              <w:t>&gt; and &lt;</w:t>
+            </w:r>
+            <w:proofErr w:type="spellStart"/>
+            <w:r>
+              <w:t>bcol</w:t>
+            </w:r>
+            <w:proofErr w:type="spellEnd"/>
+            <w:r>
+              <w:t>&gt; elements</w:t>
             </w:r>
             <w:r>
               <w:rPr>
@@ -24439,6 +25460,7 @@
         </w:rPr>
         <w:t>&gt;&lt;</w:t>
       </w:r>
+      <w:proofErr w:type="spellStart"/>
       <w:r>
         <w:rPr>
           <w:rStyle w:val="XMLElement"/>
@@ -24446,6 +25468,7 @@
         </w:rPr>
         <w:t>pos</w:t>
       </w:r>
+      <w:proofErr w:type="spellEnd"/>
       <w:r>
         <w:rPr>
           <w:rStyle w:val="XMLBracket"/>
@@ -24467,6 +25490,7 @@
         </w:rPr>
         <w:t>&lt;/</w:t>
       </w:r>
+      <w:proofErr w:type="spellStart"/>
       <w:r>
         <w:rPr>
           <w:rStyle w:val="XMLElement"/>
@@ -24474,6 +25498,7 @@
         </w:rPr>
         <w:t>pos</w:t>
       </w:r>
+      <w:proofErr w:type="spellEnd"/>
       <w:r>
         <w:rPr>
           <w:rStyle w:val="XMLBracket"/>
@@ -24990,6 +26015,7 @@
         </w:rPr>
         <w:t>&gt;&lt;</w:t>
       </w:r>
+      <w:proofErr w:type="spellStart"/>
       <w:r>
         <w:rPr>
           <w:rStyle w:val="XMLElement"/>
@@ -24999,6 +26025,7 @@
         </w:rPr>
         <w:t>minlen</w:t>
       </w:r>
+      <w:proofErr w:type="spellEnd"/>
       <w:r>
         <w:rPr>
           <w:rStyle w:val="XMLBracket"/>
@@ -25026,6 +26053,7 @@
         </w:rPr>
         <w:t>&lt;/</w:t>
       </w:r>
+      <w:proofErr w:type="spellStart"/>
       <w:r>
         <w:rPr>
           <w:rStyle w:val="XMLElement"/>
@@ -25035,6 +26063,7 @@
         </w:rPr>
         <w:t>minlen</w:t>
       </w:r>
+      <w:proofErr w:type="spellEnd"/>
       <w:r>
         <w:rPr>
           <w:rStyle w:val="XMLBracket"/>
@@ -25044,6 +26073,7 @@
         </w:rPr>
         <w:t>&gt;&lt;</w:t>
       </w:r>
+      <w:proofErr w:type="spellStart"/>
       <w:r>
         <w:rPr>
           <w:rStyle w:val="XMLElement"/>
@@ -25053,6 +26083,7 @@
         </w:rPr>
         <w:t>rw</w:t>
       </w:r>
+      <w:proofErr w:type="spellEnd"/>
       <w:r>
         <w:rPr>
           <w:rStyle w:val="XMLBracket"/>
@@ -25080,6 +26111,7 @@
         </w:rPr>
         <w:t>&lt;/</w:t>
       </w:r>
+      <w:proofErr w:type="spellStart"/>
       <w:r>
         <w:rPr>
           <w:rStyle w:val="XMLElement"/>
@@ -25089,6 +26121,7 @@
         </w:rPr>
         <w:t>rw</w:t>
       </w:r>
+      <w:proofErr w:type="spellEnd"/>
       <w:r>
         <w:rPr>
           <w:rStyle w:val="XMLBracket"/>
@@ -25144,6 +26177,7 @@
         </w:rPr>
         <w:t>&gt;&lt;</w:t>
       </w:r>
+      <w:proofErr w:type="spellStart"/>
       <w:r>
         <w:rPr>
           <w:rStyle w:val="XMLElement"/>
@@ -25153,6 +26187,7 @@
         </w:rPr>
         <w:t>pos</w:t>
       </w:r>
+      <w:proofErr w:type="spellEnd"/>
       <w:r>
         <w:rPr>
           <w:rStyle w:val="XMLBracket"/>
@@ -25180,6 +26215,7 @@
         </w:rPr>
         <w:t>&lt;/</w:t>
       </w:r>
+      <w:proofErr w:type="spellStart"/>
       <w:r>
         <w:rPr>
           <w:rStyle w:val="XMLElement"/>
@@ -25189,6 +26225,7 @@
         </w:rPr>
         <w:t>pos</w:t>
       </w:r>
+      <w:proofErr w:type="spellEnd"/>
       <w:r>
         <w:rPr>
           <w:rStyle w:val="XMLBracket"/>
@@ -25316,6 +26353,7 @@
         </w:rPr>
         <w:t>&gt;&lt;</w:t>
       </w:r>
+      <w:proofErr w:type="spellStart"/>
       <w:r>
         <w:rPr>
           <w:rStyle w:val="XMLElement"/>
@@ -25325,6 +26363,7 @@
         </w:rPr>
         <w:t>pos</w:t>
       </w:r>
+      <w:proofErr w:type="spellEnd"/>
       <w:r>
         <w:rPr>
           <w:rStyle w:val="XMLBracket"/>
@@ -25352,6 +26391,7 @@
         </w:rPr>
         <w:t>&lt;/</w:t>
       </w:r>
+      <w:proofErr w:type="spellStart"/>
       <w:r>
         <w:rPr>
           <w:rStyle w:val="XMLElement"/>
@@ -25361,6 +26401,7 @@
         </w:rPr>
         <w:t>pos</w:t>
       </w:r>
+      <w:proofErr w:type="spellEnd"/>
       <w:r>
         <w:rPr>
           <w:rStyle w:val="XMLBracket"/>
@@ -25488,6 +26529,7 @@
         </w:rPr>
         <w:t>&gt;&lt;</w:t>
       </w:r>
+      <w:proofErr w:type="spellStart"/>
       <w:r>
         <w:rPr>
           <w:rStyle w:val="XMLElement"/>
@@ -25497,6 +26539,7 @@
         </w:rPr>
         <w:t>pos</w:t>
       </w:r>
+      <w:proofErr w:type="spellEnd"/>
       <w:r>
         <w:rPr>
           <w:rStyle w:val="XMLBracket"/>
@@ -25524,6 +26567,7 @@
         </w:rPr>
         <w:t>&lt;/</w:t>
       </w:r>
+      <w:proofErr w:type="spellStart"/>
       <w:r>
         <w:rPr>
           <w:rStyle w:val="XMLElement"/>
@@ -25533,6 +26577,7 @@
         </w:rPr>
         <w:t>pos</w:t>
       </w:r>
+      <w:proofErr w:type="spellEnd"/>
       <w:r>
         <w:rPr>
           <w:rStyle w:val="XMLBracket"/>
@@ -25660,6 +26705,7 @@
         </w:rPr>
         <w:t>&gt;&lt;</w:t>
       </w:r>
+      <w:proofErr w:type="spellStart"/>
       <w:r>
         <w:rPr>
           <w:rStyle w:val="XMLElement"/>
@@ -25669,6 +26715,7 @@
         </w:rPr>
         <w:t>pos</w:t>
       </w:r>
+      <w:proofErr w:type="spellEnd"/>
       <w:r>
         <w:rPr>
           <w:rStyle w:val="XMLBracket"/>
@@ -25696,6 +26743,7 @@
         </w:rPr>
         <w:t>&lt;/</w:t>
       </w:r>
+      <w:proofErr w:type="spellStart"/>
       <w:r>
         <w:rPr>
           <w:rStyle w:val="XMLElement"/>
@@ -25705,6 +26753,7 @@
         </w:rPr>
         <w:t>pos</w:t>
       </w:r>
+      <w:proofErr w:type="spellEnd"/>
       <w:r>
         <w:rPr>
           <w:rStyle w:val="XMLBracket"/>
@@ -25833,7 +26882,35 @@
         <w:rPr>
           <w:lang w:val="en-GB"/>
         </w:rPr>
-        <w:t>The &lt;fcol&gt; and &lt;bcol&gt; elements</w:t>
+        <w:t>The &lt;</w:t>
+      </w:r>
+      <w:proofErr w:type="spellStart"/>
+      <w:r>
+        <w:rPr>
+          <w:lang w:val="en-GB"/>
+        </w:rPr>
+        <w:t>fcol</w:t>
+      </w:r>
+      <w:proofErr w:type="spellEnd"/>
+      <w:r>
+        <w:rPr>
+          <w:lang w:val="en-GB"/>
+        </w:rPr>
+        <w:t>&gt; and &lt;</w:t>
+      </w:r>
+      <w:proofErr w:type="spellStart"/>
+      <w:r>
+        <w:rPr>
+          <w:lang w:val="en-GB"/>
+        </w:rPr>
+        <w:t>bcol</w:t>
+      </w:r>
+      <w:proofErr w:type="spellEnd"/>
+      <w:r>
+        <w:rPr>
+          <w:lang w:val="en-GB"/>
+        </w:rPr>
+        <w:t>&gt; elements</w:t>
       </w:r>
       <w:bookmarkEnd w:id="62"/>
       <w:bookmarkEnd w:id="63"/>
@@ -25850,7 +26927,39 @@
         </w:rPr>
       </w:pPr>
       <w:r>
-        <w:t>The &lt;fcol&gt; and &lt;bcol&gt; elements define the font (text) and background colors. A color can be specified in 3 ways:</w:t>
+        <w:t>The &lt;</w:t>
+      </w:r>
+      <w:proofErr w:type="spellStart"/>
+      <w:r>
+        <w:t>fcol</w:t>
+      </w:r>
+      <w:proofErr w:type="spellEnd"/>
+      <w:r>
+        <w:t>&gt; and &lt;</w:t>
+      </w:r>
+      <w:proofErr w:type="spellStart"/>
+      <w:r>
+        <w:t>bcol</w:t>
+      </w:r>
+      <w:proofErr w:type="spellEnd"/>
+      <w:r>
+        <w:t xml:space="preserve">&gt; elements define the font (text) and background </w:t>
+      </w:r>
+      <w:proofErr w:type="spellStart"/>
+      <w:r>
+        <w:t>colors</w:t>
+      </w:r>
+      <w:proofErr w:type="spellEnd"/>
+      <w:r>
+        <w:t xml:space="preserve">. A </w:t>
+      </w:r>
+      <w:proofErr w:type="spellStart"/>
+      <w:r>
+        <w:t>color</w:t>
+      </w:r>
+      <w:proofErr w:type="spellEnd"/>
+      <w:r>
+        <w:t xml:space="preserve"> can be specified in 3 ways:</w:t>
       </w:r>
     </w:p>
     <w:p>
@@ -25906,6 +27015,7 @@
               </w:rPr>
               <w:t>&lt;</w:t>
             </w:r>
+            <w:proofErr w:type="spellStart"/>
             <w:r>
               <w:rPr>
                 <w:rStyle w:val="XMLElement"/>
@@ -25913,6 +27023,7 @@
               </w:rPr>
               <w:t>bcol</w:t>
             </w:r>
+            <w:proofErr w:type="spellEnd"/>
             <w:r>
               <w:rPr>
                 <w:rStyle w:val="XMLBracket"/>
@@ -25934,6 +27045,7 @@
               </w:rPr>
               <w:t>&lt;/</w:t>
             </w:r>
+            <w:proofErr w:type="spellStart"/>
             <w:r>
               <w:rPr>
                 <w:rStyle w:val="XMLElement"/>
@@ -25941,6 +27053,7 @@
               </w:rPr>
               <w:t>bcol</w:t>
             </w:r>
+            <w:proofErr w:type="spellEnd"/>
             <w:r>
               <w:rPr>
                 <w:rStyle w:val="XMLBracket"/>
@@ -25985,6 +27098,7 @@
               </w:rPr>
               <w:t>&lt;</w:t>
             </w:r>
+            <w:proofErr w:type="spellStart"/>
             <w:r>
               <w:rPr>
                 <w:rStyle w:val="XMLElement"/>
@@ -25992,6 +27106,7 @@
               </w:rPr>
               <w:t>bcol</w:t>
             </w:r>
+            <w:proofErr w:type="spellEnd"/>
             <w:r>
               <w:rPr>
                 <w:rStyle w:val="XMLBracket"/>
@@ -26013,6 +27128,7 @@
               </w:rPr>
               <w:t>&lt;/</w:t>
             </w:r>
+            <w:proofErr w:type="spellStart"/>
             <w:r>
               <w:rPr>
                 <w:rStyle w:val="XMLElement"/>
@@ -26020,6 +27136,7 @@
               </w:rPr>
               <w:t>bcol</w:t>
             </w:r>
+            <w:proofErr w:type="spellEnd"/>
             <w:r>
               <w:rPr>
                 <w:rStyle w:val="XMLBracket"/>
@@ -26064,6 +27181,7 @@
               </w:rPr>
               <w:t>&lt;</w:t>
             </w:r>
+            <w:proofErr w:type="spellStart"/>
             <w:r>
               <w:rPr>
                 <w:rStyle w:val="XMLElement"/>
@@ -26071,6 +27189,7 @@
               </w:rPr>
               <w:t>bcol</w:t>
             </w:r>
+            <w:proofErr w:type="spellEnd"/>
             <w:r>
               <w:rPr>
                 <w:rStyle w:val="XMLBracket"/>
@@ -26092,6 +27211,7 @@
               </w:rPr>
               <w:t>&lt;/</w:t>
             </w:r>
+            <w:proofErr w:type="spellStart"/>
             <w:r>
               <w:rPr>
                 <w:rStyle w:val="XMLElement"/>
@@ -26099,6 +27219,7 @@
               </w:rPr>
               <w:t>bcol</w:t>
             </w:r>
+            <w:proofErr w:type="spellEnd"/>
             <w:r>
               <w:rPr>
                 <w:rStyle w:val="XMLBracket"/>
@@ -26139,7 +27260,15 @@
         </w:rPr>
       </w:pPr>
       <w:r>
-        <w:t xml:space="preserve">As a HTML color specification, as #RRGGBB. Where RR, GG and BB are 2 hexadecimal digits each, with range 00 .. FF. </w:t>
+        <w:t xml:space="preserve">As a HTML </w:t>
+      </w:r>
+      <w:proofErr w:type="spellStart"/>
+      <w:r>
+        <w:t>color</w:t>
+      </w:r>
+      <w:proofErr w:type="spellEnd"/>
+      <w:r>
+        <w:t xml:space="preserve"> specification, as #RRGGBB. Where RR, GG and BB are 2 hexadecimal digits each, with range 00 .. FF. </w:t>
       </w:r>
       <w:r>
         <w:br/>
@@ -26180,6 +27309,7 @@
               </w:rPr>
               <w:t>&lt;</w:t>
             </w:r>
+            <w:proofErr w:type="spellStart"/>
             <w:r>
               <w:rPr>
                 <w:rStyle w:val="XMLElement"/>
@@ -26187,6 +27317,7 @@
               </w:rPr>
               <w:t>bcol</w:t>
             </w:r>
+            <w:proofErr w:type="spellEnd"/>
             <w:r>
               <w:rPr>
                 <w:rStyle w:val="XMLBracket"/>
@@ -26259,6 +27390,7 @@
               </w:rPr>
               <w:t>&lt;</w:t>
             </w:r>
+            <w:proofErr w:type="spellStart"/>
             <w:r>
               <w:rPr>
                 <w:rStyle w:val="XMLElement"/>
@@ -26266,6 +27398,7 @@
               </w:rPr>
               <w:t>bcol</w:t>
             </w:r>
+            <w:proofErr w:type="spellEnd"/>
             <w:r>
               <w:rPr>
                 <w:rStyle w:val="XMLBracket"/>
@@ -26338,6 +27471,7 @@
               </w:rPr>
               <w:t>&lt;</w:t>
             </w:r>
+            <w:proofErr w:type="spellStart"/>
             <w:r>
               <w:rPr>
                 <w:rStyle w:val="XMLElement"/>
@@ -26345,6 +27479,7 @@
               </w:rPr>
               <w:t>bcol</w:t>
             </w:r>
+            <w:proofErr w:type="spellEnd"/>
             <w:r>
               <w:rPr>
                 <w:rStyle w:val="XMLBracket"/>
@@ -26413,7 +27548,63 @@
         </w:rPr>
       </w:pPr>
       <w:r>
-        <w:t>By color name. Like Red, Green, Aqua, Gold, Royalblue, Steelblue, Mediumblue, Darkblue, Royalblue, Deepskyblue, etc…</w:t>
+        <w:t xml:space="preserve">By </w:t>
+      </w:r>
+      <w:proofErr w:type="spellStart"/>
+      <w:r>
+        <w:t>color</w:t>
+      </w:r>
+      <w:proofErr w:type="spellEnd"/>
+      <w:r>
+        <w:t xml:space="preserve"> name. Like Red, Green, Aqua, Gold, </w:t>
+      </w:r>
+      <w:proofErr w:type="spellStart"/>
+      <w:r>
+        <w:t>Royalblue</w:t>
+      </w:r>
+      <w:proofErr w:type="spellEnd"/>
+      <w:r>
+        <w:t xml:space="preserve">, </w:t>
+      </w:r>
+      <w:proofErr w:type="spellStart"/>
+      <w:r>
+        <w:t>Steelblue</w:t>
+      </w:r>
+      <w:proofErr w:type="spellEnd"/>
+      <w:r>
+        <w:t xml:space="preserve">, </w:t>
+      </w:r>
+      <w:proofErr w:type="spellStart"/>
+      <w:r>
+        <w:t>Mediumblue</w:t>
+      </w:r>
+      <w:proofErr w:type="spellEnd"/>
+      <w:r>
+        <w:t xml:space="preserve">, </w:t>
+      </w:r>
+      <w:proofErr w:type="spellStart"/>
+      <w:r>
+        <w:t>Darkblue</w:t>
+      </w:r>
+      <w:proofErr w:type="spellEnd"/>
+      <w:r>
+        <w:t xml:space="preserve">, </w:t>
+      </w:r>
+      <w:proofErr w:type="spellStart"/>
+      <w:r>
+        <w:t>Royalblue</w:t>
+      </w:r>
+      <w:proofErr w:type="spellEnd"/>
+      <w:r>
+        <w:t xml:space="preserve">, </w:t>
+      </w:r>
+      <w:proofErr w:type="spellStart"/>
+      <w:r>
+        <w:t>Deepskyblue</w:t>
+      </w:r>
+      <w:proofErr w:type="spellEnd"/>
+      <w:r>
+        <w:t>, etc…</w:t>
       </w:r>
     </w:p>
     <w:tbl>
@@ -26449,18 +27640,21 @@
               </w:rPr>
               <w:t>&lt;</w:t>
             </w:r>
+            <w:proofErr w:type="spellStart"/>
             <w:r>
               <w:rPr>
                 <w:rStyle w:val="XMLElement"/>
               </w:rPr>
               <w:t>bcol</w:t>
             </w:r>
+            <w:proofErr w:type="spellEnd"/>
             <w:r>
               <w:rPr>
                 <w:rStyle w:val="XMLBracket"/>
               </w:rPr>
               <w:t>&gt;</w:t>
             </w:r>
+            <w:proofErr w:type="spellStart"/>
             <w:r>
               <w:rPr>
                 <w:rStyle w:val="XMLContent"/>
@@ -26468,18 +27662,21 @@
               </w:rPr>
               <w:t>royalblue</w:t>
             </w:r>
+            <w:proofErr w:type="spellEnd"/>
             <w:r>
               <w:rPr>
                 <w:rStyle w:val="XMLBracket"/>
               </w:rPr>
               <w:t>&lt;/</w:t>
             </w:r>
+            <w:proofErr w:type="spellStart"/>
             <w:r>
               <w:rPr>
                 <w:rStyle w:val="XMLElement"/>
               </w:rPr>
               <w:t>bcol</w:t>
             </w:r>
+            <w:proofErr w:type="spellEnd"/>
             <w:r>
               <w:rPr>
                 <w:rStyle w:val="XMLBracket"/>
@@ -26534,7 +27731,15 @@
         <w:t>’</w:t>
       </w:r>
       <w:r>
-        <w:t xml:space="preserve">s a chart showing all colors with their names and RGB values. Zoom in to read the </w:t>
+        <w:t xml:space="preserve">s a chart showing all </w:t>
+      </w:r>
+      <w:proofErr w:type="spellStart"/>
+      <w:r>
+        <w:t>colors</w:t>
+      </w:r>
+      <w:proofErr w:type="spellEnd"/>
+      <w:r>
+        <w:t xml:space="preserve"> with their names and RGB values. Zoom in to read the </w:t>
       </w:r>
       <w:r>
         <w:lastRenderedPageBreak/>
@@ -26577,7 +27782,21 @@
         <w:rPr>
           <w:lang w:val="en-GB"/>
         </w:rPr>
-        <w:t>The &lt;autostart&gt; element</w:t>
+        <w:t>The &lt;</w:t>
+      </w:r>
+      <w:proofErr w:type="spellStart"/>
+      <w:r>
+        <w:rPr>
+          <w:lang w:val="en-GB"/>
+        </w:rPr>
+        <w:t>autostart</w:t>
+      </w:r>
+      <w:proofErr w:type="spellEnd"/>
+      <w:r>
+        <w:rPr>
+          <w:lang w:val="en-GB"/>
+        </w:rPr>
+        <w:t>&gt; element</w:t>
       </w:r>
       <w:bookmarkEnd w:id="69"/>
     </w:p>
@@ -26589,7 +27808,15 @@
         </w:rPr>
       </w:pPr>
       <w:r>
-        <w:t xml:space="preserve">The &lt;autostart&gt; element defines if the communication is started automatically when the project is opened, and optionally which tab page is shown. </w:t>
+        <w:t>The &lt;</w:t>
+      </w:r>
+      <w:proofErr w:type="spellStart"/>
+      <w:r>
+        <w:t>autostart</w:t>
+      </w:r>
+      <w:proofErr w:type="spellEnd"/>
+      <w:r>
+        <w:t xml:space="preserve">&gt; element defines if the communication is started automatically when the project is opened, and optionally which tab page is shown. </w:t>
       </w:r>
     </w:p>
     <w:p>
@@ -26600,7 +27827,31 @@
         </w:rPr>
       </w:pPr>
       <w:r>
-        <w:t>When there is no &lt;autostart&gt; element the communication is started automatically and the first tab page is shown. This is for compatibility with older versions. When an &lt;autostart&gt; element is defined then autostart is determined by the &lt;enable&gt; element.</w:t>
+        <w:t>When there is no &lt;</w:t>
+      </w:r>
+      <w:proofErr w:type="spellStart"/>
+      <w:r>
+        <w:t>autostart</w:t>
+      </w:r>
+      <w:proofErr w:type="spellEnd"/>
+      <w:r>
+        <w:t>&gt; element the communication is started automatically and the first tab page is shown. This is for compatibility with older versions. When an &lt;</w:t>
+      </w:r>
+      <w:proofErr w:type="spellStart"/>
+      <w:r>
+        <w:t>autostart</w:t>
+      </w:r>
+      <w:proofErr w:type="spellEnd"/>
+      <w:r>
+        <w:t xml:space="preserve">&gt; element is defined then </w:t>
+      </w:r>
+      <w:proofErr w:type="spellStart"/>
+      <w:r>
+        <w:t>autostart</w:t>
+      </w:r>
+      <w:proofErr w:type="spellEnd"/>
+      <w:r>
+        <w:t xml:space="preserve"> is determined by the &lt;enable&gt; element.</w:t>
       </w:r>
     </w:p>
     <w:tbl>
@@ -26651,7 +27902,15 @@
               </w:rPr>
             </w:pPr>
             <w:r>
-              <w:t>Enables or disables the autostart. Valid values are “true” and “false”.</w:t>
+              <w:t xml:space="preserve">Enables or disables the </w:t>
+            </w:r>
+            <w:proofErr w:type="spellStart"/>
+            <w:r>
+              <w:t>autostart</w:t>
+            </w:r>
+            <w:proofErr w:type="spellEnd"/>
+            <w:r>
+              <w:t>. Valid values are “true” and “false”.</w:t>
             </w:r>
             <w:r>
               <w:br/>
@@ -26691,7 +27950,15 @@
               </w:rPr>
             </w:pPr>
             <w:r>
-              <w:t>Defines which tab page is shown on autostart. This can be the name of the tab page like “Inputs”, or the tab page number starting from 1.</w:t>
+              <w:t xml:space="preserve">Defines which tab page is shown on </w:t>
+            </w:r>
+            <w:proofErr w:type="spellStart"/>
+            <w:r>
+              <w:t>autostart</w:t>
+            </w:r>
+            <w:proofErr w:type="spellEnd"/>
+            <w:r>
+              <w:t>. This can be the name of the tab page like “Inputs”, or the tab page number starting from 1.</w:t>
             </w:r>
           </w:p>
           <w:p>
@@ -26720,7 +27987,21 @@
         <w:rPr>
           <w:lang w:val="en-GB"/>
         </w:rPr>
-        <w:t>The &lt;modbustcpserver&gt; element</w:t>
+        <w:t>The &lt;</w:t>
+      </w:r>
+      <w:proofErr w:type="spellStart"/>
+      <w:r>
+        <w:rPr>
+          <w:lang w:val="en-GB"/>
+        </w:rPr>
+        <w:t>modbustcpserver</w:t>
+      </w:r>
+      <w:proofErr w:type="spellEnd"/>
+      <w:r>
+        <w:rPr>
+          <w:lang w:val="en-GB"/>
+        </w:rPr>
+        <w:t>&gt; element</w:t>
       </w:r>
       <w:bookmarkEnd w:id="70"/>
     </w:p>
@@ -26732,7 +28013,15 @@
         </w:rPr>
       </w:pPr>
       <w:r>
-        <w:t xml:space="preserve">The &lt;modbustcpserver&gt; element configures the built-in Modbus/TCP server that acts as a bridge to the connected modbus device. This allows other Modbus/TCP clients to be connected to the serial modbus device simultaneously. </w:t>
+        <w:t>The &lt;</w:t>
+      </w:r>
+      <w:proofErr w:type="spellStart"/>
+      <w:r>
+        <w:t>modbustcpserver</w:t>
+      </w:r>
+      <w:proofErr w:type="spellEnd"/>
+      <w:r>
+        <w:t xml:space="preserve">&gt; element configures the built-in Modbus/TCP server that acts as a bridge to the connected modbus device. This allows other Modbus/TCP clients to be connected to the serial modbus device simultaneously. </w:t>
       </w:r>
     </w:p>
     <w:p>
@@ -26835,7 +28124,15 @@
               <w:pStyle w:val="Xmlgridtag"/>
             </w:pPr>
             <w:r>
-              <w:t>&lt;enable&gt;</w:t>
+              <w:t>&lt;</w:t>
+            </w:r>
+            <w:proofErr w:type="spellStart"/>
+            <w:r>
+              <w:t>enable</w:t>
+            </w:r>
+            <w:proofErr w:type="spellEnd"/>
+            <w:r>
+              <w:t>&gt;</w:t>
             </w:r>
           </w:p>
         </w:tc>
@@ -27167,6 +28464,7 @@
         </w:rPr>
         <w:t>&gt;&lt;</w:t>
       </w:r>
+      <w:proofErr w:type="spellStart"/>
       <w:r>
         <w:rPr>
           <w:rStyle w:val="XMLElement"/>
@@ -27174,6 +28472,7 @@
         </w:rPr>
         <w:t>rw</w:t>
       </w:r>
+      <w:proofErr w:type="spellEnd"/>
       <w:r>
         <w:rPr>
           <w:rStyle w:val="XMLBracket"/>
@@ -27195,6 +28494,7 @@
         </w:rPr>
         <w:t>&lt;/</w:t>
       </w:r>
+      <w:proofErr w:type="spellStart"/>
       <w:r>
         <w:rPr>
           <w:rStyle w:val="XMLElement"/>
@@ -27202,6 +28502,7 @@
         </w:rPr>
         <w:t>rw</w:t>
       </w:r>
+      <w:proofErr w:type="spellEnd"/>
       <w:r>
         <w:rPr>
           <w:rStyle w:val="XMLBracket"/>
@@ -27259,7 +28560,39 @@
           <w:rStyle w:val="XMLComment"/>
           <w:lang w:val="en-GB"/>
         </w:rPr>
-        <w:t>var&gt;&lt;reg&gt;40007&lt;/reg&gt;&lt;text&gt;Analog in 2&lt;/text&gt;&lt;type&gt;uint16&lt;/type&gt;&lt;rw&gt;r&lt;/rw&gt;&lt;/var&gt;</w:t>
+        <w:t>var&gt;&lt;reg&gt;40007&lt;/reg&gt;&lt;text&gt;Analog in 2&lt;/text&gt;&lt;type&gt;uint16&lt;/type&gt;&lt;</w:t>
+      </w:r>
+      <w:proofErr w:type="spellStart"/>
+      <w:r>
+        <w:rPr>
+          <w:rStyle w:val="XMLComment"/>
+          <w:lang w:val="en-GB"/>
+        </w:rPr>
+        <w:t>rw</w:t>
+      </w:r>
+      <w:proofErr w:type="spellEnd"/>
+      <w:r>
+        <w:rPr>
+          <w:rStyle w:val="XMLComment"/>
+          <w:lang w:val="en-GB"/>
+        </w:rPr>
+        <w:t>&gt;r&lt;/</w:t>
+      </w:r>
+      <w:proofErr w:type="spellStart"/>
+      <w:r>
+        <w:rPr>
+          <w:rStyle w:val="XMLComment"/>
+          <w:lang w:val="en-GB"/>
+        </w:rPr>
+        <w:t>rw</w:t>
+      </w:r>
+      <w:proofErr w:type="spellEnd"/>
+      <w:r>
+        <w:rPr>
+          <w:rStyle w:val="XMLComment"/>
+          <w:lang w:val="en-GB"/>
+        </w:rPr>
+        <w:t>&gt;&lt;/var&gt;</w:t>
       </w:r>
     </w:p>
     <w:p>
@@ -27281,7 +28614,39 @@
           <w:rStyle w:val="XMLComment"/>
           <w:lang w:val="en-GB"/>
         </w:rPr>
-        <w:t>var&gt;&lt;reg&gt;40008&lt;/reg&gt;&lt;text&gt;Analog in 3&lt;/text&gt;&lt;type&gt;uint16&lt;/type&gt;&lt;rw&gt;r&lt;/rw&gt;&lt;/var&gt;</w:t>
+        <w:t>var&gt;&lt;reg&gt;40008&lt;/reg&gt;&lt;text&gt;Analog in 3&lt;/text&gt;&lt;type&gt;uint16&lt;/type&gt;&lt;</w:t>
+      </w:r>
+      <w:proofErr w:type="spellStart"/>
+      <w:r>
+        <w:rPr>
+          <w:rStyle w:val="XMLComment"/>
+          <w:lang w:val="en-GB"/>
+        </w:rPr>
+        <w:t>rw</w:t>
+      </w:r>
+      <w:proofErr w:type="spellEnd"/>
+      <w:r>
+        <w:rPr>
+          <w:rStyle w:val="XMLComment"/>
+          <w:lang w:val="en-GB"/>
+        </w:rPr>
+        <w:t>&gt;r&lt;/</w:t>
+      </w:r>
+      <w:proofErr w:type="spellStart"/>
+      <w:r>
+        <w:rPr>
+          <w:rStyle w:val="XMLComment"/>
+          <w:lang w:val="en-GB"/>
+        </w:rPr>
+        <w:t>rw</w:t>
+      </w:r>
+      <w:proofErr w:type="spellEnd"/>
+      <w:r>
+        <w:rPr>
+          <w:rStyle w:val="XMLComment"/>
+          <w:lang w:val="en-GB"/>
+        </w:rPr>
+        <w:t>&gt;&lt;/var&gt;</w:t>
       </w:r>
     </w:p>
     <w:p>
@@ -27454,6 +28819,7 @@
         </w:rPr>
         <w:t>&gt;&lt;</w:t>
       </w:r>
+      <w:proofErr w:type="spellStart"/>
       <w:r>
         <w:rPr>
           <w:rStyle w:val="XMLElement"/>
@@ -27461,6 +28827,7 @@
         </w:rPr>
         <w:t>rw</w:t>
       </w:r>
+      <w:proofErr w:type="spellEnd"/>
       <w:r>
         <w:rPr>
           <w:rStyle w:val="XMLBracket"/>
@@ -27482,6 +28849,7 @@
         </w:rPr>
         <w:t>&lt;/</w:t>
       </w:r>
+      <w:proofErr w:type="spellStart"/>
       <w:r>
         <w:rPr>
           <w:rStyle w:val="XMLElement"/>
@@ -27489,6 +28857,7 @@
         </w:rPr>
         <w:t>rw</w:t>
       </w:r>
+      <w:proofErr w:type="spellEnd"/>
       <w:r>
         <w:rPr>
           <w:rStyle w:val="XMLBracket"/>

</xml_diff>

<commit_message>
Diagnostics counters: right align, form a bit smaller. Main: fixed Loading and isLoading flags. Options: "Revert to default" button added nead xsd path setting. Added a few tooltips.
git-svn-id: http://visualsvn.edna.local/EDNA/ModbusControl/V2@4929 03c8d257-35a7-c645-9f01-50f27e98b9e6
</commit_message>
<xml_diff>
--- a/Manuals/ModbusControl - User manual.docx
+++ b/Manuals/ModbusControl - User manual.docx
@@ -42,7 +42,7 @@
         </w:rPr>
       </w:pPr>
       <w:r>
-        <w:t>Refers to</w:t>
+        <w:t>For</w:t>
       </w:r>
       <w:r>
         <w:t xml:space="preserve"> version 2.0.2</w:t>
@@ -865,7 +865,21 @@
             <w:rStyle w:val="Hyperlink"/>
             <w:noProof/>
           </w:rPr>
-          <w:t>Options</w:t>
+          <w:t>Opt</w:t>
+        </w:r>
+        <w:r>
+          <w:rPr>
+            <w:rStyle w:val="Hyperlink"/>
+            <w:noProof/>
+          </w:rPr>
+          <w:t>i</w:t>
+        </w:r>
+        <w:r>
+          <w:rPr>
+            <w:rStyle w:val="Hyperlink"/>
+            <w:noProof/>
+          </w:rPr>
+          <w:t>ons</w:t>
         </w:r>
         <w:r>
           <w:rPr>
@@ -3752,6 +3766,7 @@
       <w:r>
         <w:t xml:space="preserve"> an example project file ”</w:t>
       </w:r>
+      <w:proofErr w:type="spellStart"/>
       <w:r>
         <w:rPr>
           <w:b/>
@@ -3759,6 +3774,7 @@
         </w:rPr>
         <w:t>Demo.mbc</w:t>
       </w:r>
+      <w:proofErr w:type="spellEnd"/>
       <w:r>
         <w:t xml:space="preserve">”, a </w:t>
       </w:r>
@@ -4628,7 +4644,21 @@
         <w:rPr>
           <w:rStyle w:val="XML"/>
         </w:rPr>
-        <w:t>&lt;exportorder&gt;</w:t>
+        <w:t>&lt;</w:t>
+      </w:r>
+      <w:proofErr w:type="spellStart"/>
+      <w:r>
+        <w:rPr>
+          <w:rStyle w:val="XML"/>
+        </w:rPr>
+        <w:t>exportorder</w:t>
+      </w:r>
+      <w:proofErr w:type="spellEnd"/>
+      <w:r>
+        <w:rPr>
+          <w:rStyle w:val="XML"/>
+        </w:rPr>
+        <w:t>&gt;</w:t>
       </w:r>
       <w:r>
         <w:t xml:space="preserve"> element in the .mbc file. This is useful when you want registers to appear in a specific sequence in the CSV file</w:t>
@@ -4637,7 +4667,15 @@
         <w:t xml:space="preserve"> - </w:t>
       </w:r>
       <w:r>
-        <w:t>for example, placing setup registers first to ensure correct import behavior.</w:t>
+        <w:t xml:space="preserve">for example, placing setup registers first to ensure correct import </w:t>
+      </w:r>
+      <w:proofErr w:type="spellStart"/>
+      <w:r>
+        <w:t>behavior</w:t>
+      </w:r>
+      <w:proofErr w:type="spellEnd"/>
+      <w:r>
+        <w:t>.</w:t>
       </w:r>
     </w:p>
     <w:p>
@@ -4722,7 +4760,21 @@
         <w:rPr>
           <w:rStyle w:val="XML"/>
         </w:rPr>
-        <w:t>&lt;exportorder&gt;</w:t>
+        <w:t>&lt;</w:t>
+      </w:r>
+      <w:proofErr w:type="spellStart"/>
+      <w:r>
+        <w:rPr>
+          <w:rStyle w:val="XML"/>
+        </w:rPr>
+        <w:t>exportorder</w:t>
+      </w:r>
+      <w:proofErr w:type="spellEnd"/>
+      <w:r>
+        <w:rPr>
+          <w:rStyle w:val="XML"/>
+        </w:rPr>
+        <w:t>&gt;</w:t>
       </w:r>
       <w:r>
         <w:t xml:space="preserve"> for</w:t>
@@ -5335,7 +5387,7 @@
             <v:path o:extrusionok="f" gradientshapeok="t" o:connecttype="rect"/>
             <o:lock v:ext="edit" aspectratio="t"/>
           </v:shapetype>
-          <v:shape id="_x0000_i1025" type="#_x0000_t75" style="width:408.6pt;height:55.8pt;visibility:visible;mso-wrap-style:square">
+          <v:shape id="_x0000_i1025" type="#_x0000_t75" style="width:408.9pt;height:55.7pt;visibility:visible;mso-wrap-style:square">
             <v:imagedata r:id="rId8" o:title=""/>
           </v:shape>
         </w:pict>
@@ -5839,8 +5891,17 @@
                 <w:b/>
                 <w:bCs/>
               </w:rPr>
-              <w:t>100 ms</w:t>
-            </w:r>
+              <w:t xml:space="preserve">100 </w:t>
+            </w:r>
+            <w:proofErr w:type="spellStart"/>
+            <w:r>
+              <w:rPr>
+                <w:b/>
+                <w:bCs/>
+              </w:rPr>
+              <w:t>ms</w:t>
+            </w:r>
+            <w:proofErr w:type="spellEnd"/>
             <w:r>
               <w:t>.</w:t>
             </w:r>
@@ -6278,7 +6339,15 @@
               <w:t>0 (auto)</w:t>
             </w:r>
             <w:r>
-              <w:t xml:space="preserve"> applies the default delay of four character times (for example, about 4 ms at 9600 baud). Any value greater than 0 specifies the delay in milliseconds.</w:t>
+              <w:t xml:space="preserve"> applies the default delay of four character times (for example, about 4 </w:t>
+            </w:r>
+            <w:proofErr w:type="spellStart"/>
+            <w:r>
+              <w:t>ms</w:t>
+            </w:r>
+            <w:proofErr w:type="spellEnd"/>
+            <w:r>
+              <w:t xml:space="preserve"> at 9600 baud). Any value greater than 0 specifies the delay in milliseconds.</w:t>
             </w:r>
           </w:p>
           <w:p>
@@ -7215,7 +7284,15 @@
               </w:rPr>
             </w:pPr>
             <w:r>
-              <w:t>Sample rate (ms):</w:t>
+              <w:t>Sample rate (</w:t>
+            </w:r>
+            <w:proofErr w:type="spellStart"/>
+            <w:r>
+              <w:t>ms</w:t>
+            </w:r>
+            <w:proofErr w:type="spellEnd"/>
+            <w:r>
+              <w:t>):</w:t>
             </w:r>
           </w:p>
         </w:tc>
@@ -8863,7 +8940,15 @@
         <w:t>125 registers</w:t>
       </w:r>
       <w:r>
-        <w:t xml:space="preserve"> in a single operation, validating device behavior, or troubleshooting communication issues.</w:t>
+        <w:t xml:space="preserve"> in a single operation, validating device </w:t>
+      </w:r>
+      <w:proofErr w:type="spellStart"/>
+      <w:r>
+        <w:t>behavior</w:t>
+      </w:r>
+      <w:proofErr w:type="spellEnd"/>
+      <w:r>
+        <w:t>, or troubleshooting communication issues.</w:t>
       </w:r>
     </w:p>
     <w:p>
@@ -9198,13 +9283,23 @@
           <w:lang w:val="nl-BE"/>
         </w:rPr>
       </w:pPr>
+      <w:proofErr w:type="spellStart"/>
       <w:r>
         <w:rPr>
           <w:b/>
           <w:bCs/>
           <w:lang w:val="nl-BE"/>
         </w:rPr>
-        <w:t>Decimal format:</w:t>
+        <w:t>Decimal</w:t>
+      </w:r>
+      <w:proofErr w:type="spellEnd"/>
+      <w:r>
+        <w:rPr>
+          <w:b/>
+          <w:bCs/>
+          <w:lang w:val="nl-BE"/>
+        </w:rPr>
+        <w:t xml:space="preserve"> format:</w:t>
       </w:r>
       <w:r>
         <w:rPr>
@@ -9277,11 +9372,33 @@
           <w:lang w:val="nl-BE"/>
         </w:rPr>
       </w:pPr>
+      <w:proofErr w:type="spellStart"/>
       <w:r>
         <w:rPr>
           <w:lang w:val="nl-BE"/>
         </w:rPr>
-        <w:t>Simulating edge cases</w:t>
+        <w:t>Simulating</w:t>
+      </w:r>
+      <w:proofErr w:type="spellEnd"/>
+      <w:r>
+        <w:rPr>
+          <w:lang w:val="nl-BE"/>
+        </w:rPr>
+        <w:t xml:space="preserve"> </w:t>
+      </w:r>
+      <w:proofErr w:type="spellStart"/>
+      <w:r>
+        <w:rPr>
+          <w:lang w:val="nl-BE"/>
+        </w:rPr>
+        <w:t>edge</w:t>
+      </w:r>
+      <w:proofErr w:type="spellEnd"/>
+      <w:r>
+        <w:rPr>
+          <w:lang w:val="nl-BE"/>
+        </w:rPr>
+        <w:t xml:space="preserve"> cases</w:t>
       </w:r>
     </w:p>
     <w:p>
@@ -9295,7 +9412,15 @@
         </w:rPr>
       </w:pPr>
       <w:r>
-        <w:t>Verifying device behavior under specific conditions</w:t>
+        <w:t xml:space="preserve">Verifying device </w:t>
+      </w:r>
+      <w:proofErr w:type="spellStart"/>
+      <w:r>
+        <w:t>behavior</w:t>
+      </w:r>
+      <w:proofErr w:type="spellEnd"/>
+      <w:r>
+        <w:t xml:space="preserve"> under specific conditions</w:t>
       </w:r>
     </w:p>
     <w:p>
@@ -9318,7 +9443,7 @@
         </w:rPr>
         <w:lastRenderedPageBreak/>
         <w:pict w14:anchorId="30845F7A">
-          <v:shape id="_x0000_i1026" type="#_x0000_t75" style="width:472.2pt;height:142.8pt;visibility:visible;mso-wrap-style:square">
+          <v:shape id="_x0000_i1026" type="#_x0000_t75" style="width:472.1pt;height:142.65pt;visibility:visible;mso-wrap-style:square">
             <v:imagedata r:id="rId10" o:title=""/>
           </v:shape>
         </w:pict>
@@ -9773,6 +9898,7 @@
       <w:r>
         <w:t xml:space="preserve"> Loads a sample project file named </w:t>
       </w:r>
+      <w:proofErr w:type="spellStart"/>
       <w:r>
         <w:rPr>
           <w:b/>
@@ -9780,6 +9906,7 @@
         </w:rPr>
         <w:t>Demo.mbc</w:t>
       </w:r>
+      <w:proofErr w:type="spellEnd"/>
       <w:r>
         <w:t>, useful for exploring the tool’s capabilities and learning how to structure your own projects.</w:t>
       </w:r>
@@ -10166,12 +10293,21 @@
           <w:rFonts w:hint="eastAsia"/>
         </w:rPr>
       </w:pPr>
+      <w:proofErr w:type="spellStart"/>
       <w:r>
         <w:rPr>
           <w:b/>
           <w:bCs/>
         </w:rPr>
-        <w:t>UInt:</w:t>
+        <w:t>UInt</w:t>
+      </w:r>
+      <w:proofErr w:type="spellEnd"/>
+      <w:r>
+        <w:rPr>
+          <w:b/>
+          <w:bCs/>
+        </w:rPr>
+        <w:t>:</w:t>
       </w:r>
       <w:r>
         <w:t xml:space="preserve"> </w:t>
@@ -10808,11 +10944,117 @@
       <w:r>
         <w:t xml:space="preserve">, a dropdown list of predefined values appears during editing. </w:t>
       </w:r>
+      <w:proofErr w:type="spellStart"/>
       <w:r>
         <w:rPr>
           <w:lang w:val="nl-BE"/>
         </w:rPr>
-        <w:t>You may still enter any other valid value manually.</w:t>
+        <w:t>You</w:t>
+      </w:r>
+      <w:proofErr w:type="spellEnd"/>
+      <w:r>
+        <w:rPr>
+          <w:lang w:val="nl-BE"/>
+        </w:rPr>
+        <w:t xml:space="preserve"> </w:t>
+      </w:r>
+      <w:proofErr w:type="spellStart"/>
+      <w:r>
+        <w:rPr>
+          <w:lang w:val="nl-BE"/>
+        </w:rPr>
+        <w:t>may</w:t>
+      </w:r>
+      <w:proofErr w:type="spellEnd"/>
+      <w:r>
+        <w:rPr>
+          <w:lang w:val="nl-BE"/>
+        </w:rPr>
+        <w:t xml:space="preserve"> </w:t>
+      </w:r>
+      <w:proofErr w:type="spellStart"/>
+      <w:r>
+        <w:rPr>
+          <w:lang w:val="nl-BE"/>
+        </w:rPr>
+        <w:t>still</w:t>
+      </w:r>
+      <w:proofErr w:type="spellEnd"/>
+      <w:r>
+        <w:rPr>
+          <w:lang w:val="nl-BE"/>
+        </w:rPr>
+        <w:t xml:space="preserve"> enter </w:t>
+      </w:r>
+      <w:proofErr w:type="spellStart"/>
+      <w:r>
+        <w:rPr>
+          <w:lang w:val="nl-BE"/>
+        </w:rPr>
+        <w:t>any</w:t>
+      </w:r>
+      <w:proofErr w:type="spellEnd"/>
+      <w:r>
+        <w:rPr>
+          <w:lang w:val="nl-BE"/>
+        </w:rPr>
+        <w:t xml:space="preserve"> </w:t>
+      </w:r>
+      <w:proofErr w:type="spellStart"/>
+      <w:r>
+        <w:rPr>
+          <w:lang w:val="nl-BE"/>
+        </w:rPr>
+        <w:t>other</w:t>
+      </w:r>
+      <w:proofErr w:type="spellEnd"/>
+      <w:r>
+        <w:rPr>
+          <w:lang w:val="nl-BE"/>
+        </w:rPr>
+        <w:t xml:space="preserve"> </w:t>
+      </w:r>
+      <w:proofErr w:type="spellStart"/>
+      <w:r>
+        <w:rPr>
+          <w:lang w:val="nl-BE"/>
+        </w:rPr>
+        <w:t>valid</w:t>
+      </w:r>
+      <w:proofErr w:type="spellEnd"/>
+      <w:r>
+        <w:rPr>
+          <w:lang w:val="nl-BE"/>
+        </w:rPr>
+        <w:t xml:space="preserve"> </w:t>
+      </w:r>
+      <w:proofErr w:type="spellStart"/>
+      <w:r>
+        <w:rPr>
+          <w:lang w:val="nl-BE"/>
+        </w:rPr>
+        <w:t>value</w:t>
+      </w:r>
+      <w:proofErr w:type="spellEnd"/>
+      <w:r>
+        <w:rPr>
+          <w:lang w:val="nl-BE"/>
+        </w:rPr>
+        <w:t xml:space="preserve"> </w:t>
+      </w:r>
+      <w:proofErr w:type="spellStart"/>
+      <w:r>
+        <w:rPr>
+          <w:lang w:val="nl-BE"/>
+        </w:rPr>
+        <w:t>manually</w:t>
+      </w:r>
+      <w:proofErr w:type="spellEnd"/>
+      <w:r>
+        <w:rPr>
+          <w:lang w:val="nl-BE"/>
+        </w:rPr>
+        <w:t>.</w:t>
       </w:r>
     </w:p>
     <w:p>
@@ -10828,7 +11070,7 @@
           <w:noProof/>
         </w:rPr>
         <w:pict w14:anchorId="5CABB691">
-          <v:shape id="_x0000_i1027" type="#_x0000_t75" style="width:391.2pt;height:52.2pt;visibility:visible;mso-wrap-style:square">
+          <v:shape id="_x0000_i1027" type="#_x0000_t75" style="width:391.25pt;height:52.3pt;visibility:visible;mso-wrap-style:square">
             <v:imagedata r:id="rId11" o:title=""/>
           </v:shape>
         </w:pict>
@@ -10952,8 +11194,44 @@
         <w:rPr>
           <w:lang w:val="nl-BE"/>
         </w:rPr>
-        <w:t>The number of successful reads</w:t>
-      </w:r>
+        <w:t xml:space="preserve">The </w:t>
+      </w:r>
+      <w:proofErr w:type="spellStart"/>
+      <w:r>
+        <w:rPr>
+          <w:lang w:val="nl-BE"/>
+        </w:rPr>
+        <w:t>number</w:t>
+      </w:r>
+      <w:proofErr w:type="spellEnd"/>
+      <w:r>
+        <w:rPr>
+          <w:lang w:val="nl-BE"/>
+        </w:rPr>
+        <w:t xml:space="preserve"> of </w:t>
+      </w:r>
+      <w:proofErr w:type="spellStart"/>
+      <w:r>
+        <w:rPr>
+          <w:lang w:val="nl-BE"/>
+        </w:rPr>
+        <w:t>successful</w:t>
+      </w:r>
+      <w:proofErr w:type="spellEnd"/>
+      <w:r>
+        <w:rPr>
+          <w:lang w:val="nl-BE"/>
+        </w:rPr>
+        <w:t xml:space="preserve"> </w:t>
+      </w:r>
+      <w:proofErr w:type="spellStart"/>
+      <w:r>
+        <w:rPr>
+          <w:lang w:val="nl-BE"/>
+        </w:rPr>
+        <w:t>reads</w:t>
+      </w:r>
+      <w:proofErr w:type="spellEnd"/>
     </w:p>
     <w:p>
       <w:pPr>
@@ -11341,7 +11619,35 @@
         <w:rPr>
           <w:lang w:val="nl-BE"/>
         </w:rPr>
-        <w:t>The logger can capture:</w:t>
+        <w:t xml:space="preserve">The logger </w:t>
+      </w:r>
+      <w:proofErr w:type="spellStart"/>
+      <w:r>
+        <w:rPr>
+          <w:lang w:val="nl-BE"/>
+        </w:rPr>
+        <w:t>can</w:t>
+      </w:r>
+      <w:proofErr w:type="spellEnd"/>
+      <w:r>
+        <w:rPr>
+          <w:lang w:val="nl-BE"/>
+        </w:rPr>
+        <w:t xml:space="preserve"> </w:t>
+      </w:r>
+      <w:proofErr w:type="spellStart"/>
+      <w:r>
+        <w:rPr>
+          <w:lang w:val="nl-BE"/>
+        </w:rPr>
+        <w:t>capture</w:t>
+      </w:r>
+      <w:proofErr w:type="spellEnd"/>
+      <w:r>
+        <w:rPr>
+          <w:lang w:val="nl-BE"/>
+        </w:rPr>
+        <w:t>:</w:t>
       </w:r>
     </w:p>
     <w:p>
@@ -11367,7 +11673,21 @@
         <w:rPr>
           <w:lang w:val="nl-BE"/>
         </w:rPr>
-        <w:t xml:space="preserve"> — such as response timeouts</w:t>
+        <w:t xml:space="preserve"> — </w:t>
+      </w:r>
+      <w:proofErr w:type="spellStart"/>
+      <w:r>
+        <w:rPr>
+          <w:lang w:val="nl-BE"/>
+        </w:rPr>
+        <w:t>such</w:t>
+      </w:r>
+      <w:proofErr w:type="spellEnd"/>
+      <w:r>
+        <w:rPr>
+          <w:lang w:val="nl-BE"/>
+        </w:rPr>
+        <w:t xml:space="preserve"> as response timeouts</w:t>
       </w:r>
     </w:p>
     <w:p>
@@ -11381,6 +11701,7 @@
           <w:lang w:val="nl-BE"/>
         </w:rPr>
       </w:pPr>
+      <w:proofErr w:type="spellStart"/>
       <w:r>
         <w:rPr>
           <w:b/>
@@ -11389,6 +11710,7 @@
         </w:rPr>
         <w:t>Warnings</w:t>
       </w:r>
+      <w:proofErr w:type="spellEnd"/>
     </w:p>
     <w:p>
       <w:pPr>
@@ -11549,7 +11871,23 @@
           <w:i/>
           <w:iCs/>
         </w:rPr>
-        <w:t>“Slave=1, Read holding registers: addr=100, quant=15”</w:t>
+        <w:t xml:space="preserve">“Slave=1, Read holding registers: </w:t>
+      </w:r>
+      <w:proofErr w:type="spellStart"/>
+      <w:r>
+        <w:rPr>
+          <w:i/>
+          <w:iCs/>
+        </w:rPr>
+        <w:t>addr</w:t>
+      </w:r>
+      <w:proofErr w:type="spellEnd"/>
+      <w:r>
+        <w:rPr>
+          <w:i/>
+          <w:iCs/>
+        </w:rPr>
+        <w:t>=100, quant=15”</w:t>
       </w:r>
     </w:p>
     <w:p>
@@ -11668,6 +12006,7 @@
         </w:rPr>
         <w:t xml:space="preserve">such as </w:t>
       </w:r>
+      <w:proofErr w:type="spellStart"/>
       <w:r>
         <w:rPr>
           <w:rStyle w:val="Zwaar"/>
@@ -11675,6 +12014,7 @@
         </w:rPr>
         <w:t>ModbusScope</w:t>
       </w:r>
+      <w:proofErr w:type="spellEnd"/>
       <w:r>
         <w:rPr>
           <w:rStyle w:val="Zwaar"/>
@@ -12000,27 +12340,6 @@
       <w:pPr>
         <w:rPr>
           <w:rFonts w:hint="eastAsia"/>
-        </w:rPr>
-      </w:pPr>
-    </w:p>
-    <w:p>
-      <w:pPr>
-        <w:rPr>
-          <w:rFonts w:hint="eastAsia"/>
-        </w:rPr>
-      </w:pPr>
-    </w:p>
-    <w:p>
-      <w:pPr>
-        <w:rPr>
-          <w:rFonts w:hint="eastAsia"/>
-        </w:rPr>
-      </w:pPr>
-    </w:p>
-    <w:p>
-      <w:pPr>
-        <w:rPr>
-          <w:rFonts w:hint="eastAsia"/>
           <w:b/>
           <w:bCs/>
           <w:lang w:val="nl-BE"/>
@@ -12041,8 +12360,18 @@
           <w:lang w:val="nl-BE"/>
         </w:rPr>
         <w:noBreakHyphen/>
-        <w:t>bit values</w:t>
-      </w:r>
+        <w:t xml:space="preserve">bit </w:t>
+      </w:r>
+      <w:proofErr w:type="spellStart"/>
+      <w:r>
+        <w:rPr>
+          <w:b/>
+          <w:bCs/>
+          <w:lang w:val="nl-BE"/>
+        </w:rPr>
+        <w:t>values</w:t>
+      </w:r>
+      <w:proofErr w:type="spellEnd"/>
     </w:p>
     <w:p>
       <w:pPr>
@@ -12850,7 +13179,6 @@
         </w:rPr>
       </w:pPr>
       <w:r>
-        <w:lastRenderedPageBreak/>
         <w:t xml:space="preserve">Example usage: </w:t>
       </w:r>
     </w:p>
@@ -12892,6 +13220,7 @@
         </w:rPr>
       </w:pPr>
       <w:r>
+        <w:lastRenderedPageBreak/>
         <w:t>The .mbc filename is optional.</w:t>
       </w:r>
     </w:p>
@@ -13212,7 +13541,15 @@
             </w:r>
             <w:r>
               <w:noBreakHyphen/>
-              <w:t>message timeout for serial communication (ms)</w:t>
+              <w:t>message timeout for serial communication (</w:t>
+            </w:r>
+            <w:proofErr w:type="spellStart"/>
+            <w:r>
+              <w:t>ms</w:t>
+            </w:r>
+            <w:proofErr w:type="spellEnd"/>
+            <w:r>
+              <w:t>)</w:t>
             </w:r>
             <w:r>
               <w:t xml:space="preserve"> </w:t>
@@ -13469,7 +13806,15 @@
               </w:rPr>
             </w:pPr>
             <w:r>
-              <w:t>Maximum wait time for the first response byte (ms)</w:t>
+              <w:t>Maximum wait time for the first response byte (</w:t>
+            </w:r>
+            <w:proofErr w:type="spellStart"/>
+            <w:r>
+              <w:t>ms</w:t>
+            </w:r>
+            <w:proofErr w:type="spellEnd"/>
+            <w:r>
+              <w:t>)</w:t>
             </w:r>
           </w:p>
         </w:tc>
@@ -13504,7 +13849,15 @@
               </w:rPr>
             </w:pPr>
             <w:r>
-              <w:t>Delay before sending the next query (ms)</w:t>
+              <w:t>Delay before sending the next query (</w:t>
+            </w:r>
+            <w:proofErr w:type="spellStart"/>
+            <w:r>
+              <w:t>ms</w:t>
+            </w:r>
+            <w:proofErr w:type="spellEnd"/>
+            <w:r>
+              <w:t>)</w:t>
             </w:r>
             <w:r>
               <w:t xml:space="preserve">. </w:t>
@@ -13608,7 +13961,15 @@
               </w:rPr>
             </w:pPr>
             <w:r>
-              <w:t>Polling period for reading registers (ms)</w:t>
+              <w:t>Polling period for reading registers (</w:t>
+            </w:r>
+            <w:proofErr w:type="spellStart"/>
+            <w:r>
+              <w:t>ms</w:t>
+            </w:r>
+            <w:proofErr w:type="spellEnd"/>
+            <w:r>
+              <w:t>)</w:t>
             </w:r>
           </w:p>
         </w:tc>
@@ -14000,7 +14361,6 @@
         <w:rPr>
           <w:lang w:val="en-GB"/>
         </w:rPr>
-        <w:lastRenderedPageBreak/>
         <w:t xml:space="preserve">The </w:t>
       </w:r>
       <w:r>
@@ -14088,6 +14448,7 @@
         <w:rPr>
           <w:lang w:val="en-GB"/>
         </w:rPr>
+        <w:lastRenderedPageBreak/>
         <w:t xml:space="preserve">Options may use either </w:t>
       </w:r>
       <w:r>
@@ -14399,7 +14760,15 @@
             </w:r>
             <w:r>
               <w:noBreakHyphen/>
-              <w:t>message timeout (ms)</w:t>
+              <w:t>message timeout (</w:t>
+            </w:r>
+            <w:proofErr w:type="spellStart"/>
+            <w:r>
+              <w:t>ms</w:t>
+            </w:r>
+            <w:proofErr w:type="spellEnd"/>
+            <w:r>
+              <w:t>)</w:t>
             </w:r>
             <w:r>
               <w:br/>
@@ -14631,7 +15000,15 @@
               <w:t xml:space="preserve">Maximum </w:t>
             </w:r>
             <w:r>
-              <w:t>wait time for first response byte (ms)</w:t>
+              <w:t>wait time for first response byte (</w:t>
+            </w:r>
+            <w:proofErr w:type="spellStart"/>
+            <w:r>
+              <w:t>ms</w:t>
+            </w:r>
+            <w:proofErr w:type="spellEnd"/>
+            <w:r>
+              <w:t>)</w:t>
             </w:r>
             <w:r>
               <w:br/>
@@ -14667,7 +15044,15 @@
               </w:rPr>
             </w:pPr>
             <w:r>
-              <w:t>Delay before sending next query (ms)</w:t>
+              <w:t>Delay before sending next query (</w:t>
+            </w:r>
+            <w:proofErr w:type="spellStart"/>
+            <w:r>
+              <w:t>ms</w:t>
+            </w:r>
+            <w:proofErr w:type="spellEnd"/>
+            <w:r>
+              <w:t>)</w:t>
             </w:r>
             <w:r>
               <w:br/>
@@ -14981,9 +15366,9 @@
               </w:rPr>
             </w:pPr>
             <w:r>
-              <w:lastRenderedPageBreak/>
               <w:t>-tabs &lt;</w:t>
             </w:r>
+            <w:proofErr w:type="spellStart"/>
             <w:r>
               <w:rPr>
                 <w:i/>
@@ -14991,9 +15376,11 @@
               </w:rPr>
               <w:t>tabname</w:t>
             </w:r>
+            <w:proofErr w:type="spellEnd"/>
             <w:r>
               <w:t>&gt; [</w:t>
             </w:r>
+            <w:proofErr w:type="spellStart"/>
             <w:r>
               <w:rPr>
                 <w:i/>
@@ -15001,6 +15388,7 @@
               </w:rPr>
               <w:t>tabname</w:t>
             </w:r>
+            <w:proofErr w:type="spellEnd"/>
             <w:r>
               <w:t>]...</w:t>
             </w:r>
@@ -15090,8 +15478,14 @@
               </w:rPr>
             </w:pPr>
             <w:r>
-              <w:t>-logtime</w:t>
-            </w:r>
+              <w:lastRenderedPageBreak/>
+              <w:t>-</w:t>
+            </w:r>
+            <w:proofErr w:type="spellStart"/>
+            <w:r>
+              <w:t>logtime</w:t>
+            </w:r>
+            <w:proofErr w:type="spellEnd"/>
           </w:p>
         </w:tc>
         <w:tc>
@@ -15796,7 +16190,6 @@
               </w:rPr>
             </w:pPr>
             <w:r>
-              <w:lastRenderedPageBreak/>
               <w:t xml:space="preserve">-baudrate ### </w:t>
             </w:r>
           </w:p>
@@ -15888,6 +16281,7 @@
               </w:rPr>
             </w:pPr>
             <w:r>
+              <w:lastRenderedPageBreak/>
               <w:t xml:space="preserve">-endofmessagetimeout ### </w:t>
             </w:r>
           </w:p>
@@ -15920,7 +16314,15 @@
             </w:r>
             <w:r>
               <w:noBreakHyphen/>
-              <w:t>message timeout (ms)</w:t>
+              <w:t>message timeout (</w:t>
+            </w:r>
+            <w:proofErr w:type="spellStart"/>
+            <w:r>
+              <w:t>ms</w:t>
+            </w:r>
+            <w:proofErr w:type="spellEnd"/>
+            <w:r>
+              <w:t>)</w:t>
             </w:r>
             <w:r>
               <w:br/>
@@ -16163,7 +16565,15 @@
               <w:t>imum</w:t>
             </w:r>
             <w:r>
-              <w:t xml:space="preserve"> wait time for first response byte (ms)</w:t>
+              <w:t xml:space="preserve"> wait time for first response byte (</w:t>
+            </w:r>
+            <w:proofErr w:type="spellStart"/>
+            <w:r>
+              <w:t>ms</w:t>
+            </w:r>
+            <w:proofErr w:type="spellEnd"/>
+            <w:r>
+              <w:t>)</w:t>
             </w:r>
             <w:r>
               <w:br/>
@@ -16257,7 +16667,21 @@
               <w:rPr>
                 <w:rFonts w:hint="eastAsia"/>
               </w:rPr>
-              <w:t>Delay before sending next query (ms)</w:t>
+              <w:t>Delay before sending next query (</w:t>
+            </w:r>
+            <w:proofErr w:type="spellStart"/>
+            <w:r>
+              <w:rPr>
+                <w:rFonts w:hint="eastAsia"/>
+              </w:rPr>
+              <w:t>ms</w:t>
+            </w:r>
+            <w:proofErr w:type="spellEnd"/>
+            <w:r>
+              <w:rPr>
+                <w:rFonts w:hint="eastAsia"/>
+              </w:rPr>
+              <w:t>)</w:t>
             </w:r>
             <w:r>
               <w:br/>
@@ -16437,6 +16861,7 @@
             <w:r>
               <w:t>-tabs &lt;</w:t>
             </w:r>
+            <w:proofErr w:type="spellStart"/>
             <w:r>
               <w:rPr>
                 <w:i/>
@@ -16444,9 +16869,11 @@
               </w:rPr>
               <w:t>tabname</w:t>
             </w:r>
+            <w:proofErr w:type="spellEnd"/>
             <w:r>
               <w:t>&gt; [</w:t>
             </w:r>
+            <w:proofErr w:type="spellStart"/>
             <w:r>
               <w:rPr>
                 <w:i/>
@@ -16454,6 +16881,7 @@
               </w:rPr>
               <w:t>tabname</w:t>
             </w:r>
+            <w:proofErr w:type="spellEnd"/>
             <w:r>
               <w:t>]...</w:t>
             </w:r>
@@ -16546,8 +16974,13 @@
               </w:rPr>
             </w:pPr>
             <w:r>
-              <w:t>-logtime</w:t>
-            </w:r>
+              <w:t>-</w:t>
+            </w:r>
+            <w:proofErr w:type="spellStart"/>
+            <w:r>
+              <w:t>logtime</w:t>
+            </w:r>
+            <w:proofErr w:type="spellEnd"/>
           </w:p>
         </w:tc>
         <w:tc>
@@ -16702,7 +17135,6 @@
           <w:b/>
           <w:bCs/>
         </w:rPr>
-        <w:lastRenderedPageBreak/>
         <w:t xml:space="preserve">Exit codes: </w:t>
       </w:r>
       <w:r>
@@ -16722,6 +17154,7 @@
         </w:rPr>
       </w:pPr>
       <w:r>
+        <w:lastRenderedPageBreak/>
         <w:t>0 = No error</w:t>
       </w:r>
       <w:r>
@@ -17240,7 +17673,25 @@
           <w:sz w:val="18"/>
           <w:szCs w:val="18"/>
         </w:rPr>
-        <w:t>Format (Int, UInt, Hex, Binary, Float, ASCII</w:t>
+        <w:t xml:space="preserve">Format (Int, </w:t>
+      </w:r>
+      <w:proofErr w:type="spellStart"/>
+      <w:r>
+        <w:rPr>
+          <w:rFonts w:cs="Liberation Serif"/>
+          <w:sz w:val="18"/>
+          <w:szCs w:val="18"/>
+        </w:rPr>
+        <w:t>UInt</w:t>
+      </w:r>
+      <w:proofErr w:type="spellEnd"/>
+      <w:r>
+        <w:rPr>
+          <w:rFonts w:cs="Liberation Serif"/>
+          <w:sz w:val="18"/>
+          <w:szCs w:val="18"/>
+        </w:rPr>
+        <w:t>, Hex, Binary, Float, ASCII</w:t>
       </w:r>
       <w:r>
         <w:rPr>
@@ -17673,7 +18124,6 @@
       </w:pPr>
       <w:bookmarkStart w:id="46" w:name="_Toc223081717"/>
       <w:r>
-        <w:lastRenderedPageBreak/>
         <w:t>More about Modbus</w:t>
       </w:r>
       <w:bookmarkEnd w:id="46"/>
@@ -17715,6 +18165,7 @@
           <w:bCs/>
           <w:lang w:val="nl-BE"/>
         </w:rPr>
+        <w:lastRenderedPageBreak/>
         <w:t>Technical Resources</w:t>
       </w:r>
     </w:p>
@@ -17735,8 +18186,18 @@
           <w:bCs/>
           <w:lang w:val="nl-BE"/>
         </w:rPr>
-        <w:t>Modbus Specifications</w:t>
-      </w:r>
+        <w:t xml:space="preserve">Modbus </w:t>
+      </w:r>
+      <w:proofErr w:type="spellStart"/>
+      <w:r>
+        <w:rPr>
+          <w:b/>
+          <w:bCs/>
+          <w:lang w:val="nl-BE"/>
+        </w:rPr>
+        <w:t>Specifications</w:t>
+      </w:r>
+      <w:proofErr w:type="spellEnd"/>
     </w:p>
     <w:p>
       <w:pPr>
@@ -17755,8 +18216,18 @@
           <w:bCs/>
           <w:lang w:val="nl-BE"/>
         </w:rPr>
-        <w:t>MODBUS Protocol Specification</w:t>
-      </w:r>
+        <w:t xml:space="preserve">MODBUS Protocol </w:t>
+      </w:r>
+      <w:proofErr w:type="spellStart"/>
+      <w:r>
+        <w:rPr>
+          <w:b/>
+          <w:bCs/>
+          <w:lang w:val="nl-BE"/>
+        </w:rPr>
+        <w:t>Specification</w:t>
+      </w:r>
+      <w:proofErr w:type="spellEnd"/>
     </w:p>
     <w:p>
       <w:pPr>
@@ -17773,10 +18244,22 @@
           <w:b/>
           <w:bCs/>
         </w:rPr>
-        <w:t>Modbus Serial Line Protocol and Implementation Guide</w:t>
-      </w:r>
-      <w:r>
-        <w:t>Editing the mbc project file</w:t>
+        <w:t xml:space="preserve">Modbus Serial Line Protocol and Implementation </w:t>
+      </w:r>
+      <w:proofErr w:type="spellStart"/>
+      <w:r>
+        <w:rPr>
+          <w:b/>
+          <w:bCs/>
+        </w:rPr>
+        <w:t>Guide</w:t>
+      </w:r>
+      <w:r>
+        <w:t>Editing</w:t>
+      </w:r>
+      <w:proofErr w:type="spellEnd"/>
+      <w:r>
+        <w:t xml:space="preserve"> the mbc project file</w:t>
       </w:r>
     </w:p>
     <w:p>
@@ -17863,6 +18346,7 @@
         <w:noBreakHyphen/>
         <w:t xml:space="preserve">readable. ModbusControl does not (yet) support creating new project files, so they must be edited manually. You can also use the example project </w:t>
       </w:r>
+      <w:proofErr w:type="spellStart"/>
       <w:r>
         <w:rPr>
           <w:rStyle w:val="Zwaar"/>
@@ -17870,6 +18354,7 @@
         </w:rPr>
         <w:t>Demo.mbc</w:t>
       </w:r>
+      <w:proofErr w:type="spellEnd"/>
       <w:r>
         <w:rPr>
           <w:rStyle w:val="Zwaar"/>
@@ -18009,9 +18494,11 @@
       <w:r>
         <w:t>“</w:t>
       </w:r>
+      <w:proofErr w:type="spellStart"/>
       <w:r>
         <w:t>SampleRate</w:t>
       </w:r>
+      <w:proofErr w:type="spellEnd"/>
       <w:r>
         <w:t>”</w:t>
       </w:r>
@@ -18040,7 +18527,21 @@
         <w:rPr>
           <w:lang w:val="en-GB"/>
         </w:rPr>
-        <w:t>The &lt;modbuscontrol&gt; root element</w:t>
+        <w:t>The &lt;</w:t>
+      </w:r>
+      <w:proofErr w:type="spellStart"/>
+      <w:r>
+        <w:rPr>
+          <w:lang w:val="en-GB"/>
+        </w:rPr>
+        <w:t>modbuscontrol</w:t>
+      </w:r>
+      <w:proofErr w:type="spellEnd"/>
+      <w:r>
+        <w:rPr>
+          <w:lang w:val="en-GB"/>
+        </w:rPr>
+        <w:t>&gt; root element</w:t>
       </w:r>
       <w:bookmarkEnd w:id="48"/>
     </w:p>
@@ -18075,7 +18576,23 @@
           <w:rStyle w:val="XML"/>
           <w:lang w:val="en-GB"/>
         </w:rPr>
-        <w:t>&lt;modbuscontrol&gt;</w:t>
+        <w:t>&lt;</w:t>
+      </w:r>
+      <w:proofErr w:type="spellStart"/>
+      <w:r>
+        <w:rPr>
+          <w:rStyle w:val="XML"/>
+          <w:lang w:val="en-GB"/>
+        </w:rPr>
+        <w:t>modbuscontrol</w:t>
+      </w:r>
+      <w:proofErr w:type="spellEnd"/>
+      <w:r>
+        <w:rPr>
+          <w:rStyle w:val="XML"/>
+          <w:lang w:val="en-GB"/>
+        </w:rPr>
+        <w:t>&gt;</w:t>
       </w:r>
       <w:r>
         <w:rPr>
@@ -18115,7 +18632,23 @@
           <w:rStyle w:val="XML"/>
           <w:lang w:val="en-GB"/>
         </w:rPr>
-        <w:t>&lt;modbuscontrol&gt;</w:t>
+        <w:t>&lt;</w:t>
+      </w:r>
+      <w:proofErr w:type="spellStart"/>
+      <w:r>
+        <w:rPr>
+          <w:rStyle w:val="XML"/>
+          <w:lang w:val="en-GB"/>
+        </w:rPr>
+        <w:t>modbuscontrol</w:t>
+      </w:r>
+      <w:proofErr w:type="spellEnd"/>
+      <w:r>
+        <w:rPr>
+          <w:rStyle w:val="XML"/>
+          <w:lang w:val="en-GB"/>
+        </w:rPr>
+        <w:t>&gt;</w:t>
       </w:r>
       <w:r>
         <w:rPr>
@@ -18163,7 +18696,21 @@
               <w:rPr>
                 <w:rStyle w:val="XML"/>
               </w:rPr>
-              <w:t>&lt;size&gt;</w:t>
+              <w:t>&lt;</w:t>
+            </w:r>
+            <w:proofErr w:type="spellStart"/>
+            <w:r>
+              <w:rPr>
+                <w:rStyle w:val="XML"/>
+              </w:rPr>
+              <w:t>size</w:t>
+            </w:r>
+            <w:proofErr w:type="spellEnd"/>
+            <w:r>
+              <w:rPr>
+                <w:rStyle w:val="XML"/>
+              </w:rPr>
+              <w:t>&gt;</w:t>
             </w:r>
           </w:p>
         </w:tc>
@@ -18249,7 +18796,21 @@
               <w:rPr>
                 <w:rStyle w:val="XML"/>
               </w:rPr>
-              <w:t>&lt;modbustcpserver&gt;</w:t>
+              <w:t>&lt;</w:t>
+            </w:r>
+            <w:proofErr w:type="spellStart"/>
+            <w:r>
+              <w:rPr>
+                <w:rStyle w:val="XML"/>
+              </w:rPr>
+              <w:t>modbustcpserver</w:t>
+            </w:r>
+            <w:proofErr w:type="spellEnd"/>
+            <w:r>
+              <w:rPr>
+                <w:rStyle w:val="XML"/>
+              </w:rPr>
+              <w:t>&gt;</w:t>
             </w:r>
           </w:p>
         </w:tc>
@@ -18313,9 +18874,11 @@
             <w:r>
               <w:t xml:space="preserve">start </w:t>
             </w:r>
+            <w:proofErr w:type="spellStart"/>
             <w:r>
               <w:t>behavior</w:t>
             </w:r>
+            <w:proofErr w:type="spellEnd"/>
             <w:r>
               <w:t>.</w:t>
             </w:r>
@@ -18384,7 +18947,21 @@
               <w:rPr>
                 <w:rStyle w:val="XML"/>
               </w:rPr>
-              <w:t>&lt;include&gt;</w:t>
+              <w:t>&lt;</w:t>
+            </w:r>
+            <w:proofErr w:type="spellStart"/>
+            <w:r>
+              <w:rPr>
+                <w:rStyle w:val="XML"/>
+              </w:rPr>
+              <w:t>include</w:t>
+            </w:r>
+            <w:proofErr w:type="spellEnd"/>
+            <w:r>
+              <w:rPr>
+                <w:rStyle w:val="XML"/>
+              </w:rPr>
+              <w:t>&gt;</w:t>
             </w:r>
           </w:p>
         </w:tc>
@@ -18516,7 +19093,21 @@
               <w:rPr>
                 <w:rStyle w:val="XML"/>
               </w:rPr>
-              <w:t>&lt;width&gt;</w:t>
+              <w:t>&lt;</w:t>
+            </w:r>
+            <w:proofErr w:type="spellStart"/>
+            <w:r>
+              <w:rPr>
+                <w:rStyle w:val="XML"/>
+              </w:rPr>
+              <w:t>width</w:t>
+            </w:r>
+            <w:proofErr w:type="spellEnd"/>
+            <w:r>
+              <w:rPr>
+                <w:rStyle w:val="XML"/>
+              </w:rPr>
+              <w:t>&gt;</w:t>
             </w:r>
           </w:p>
         </w:tc>
@@ -18553,7 +19144,21 @@
               <w:rPr>
                 <w:rStyle w:val="XML"/>
               </w:rPr>
-              <w:t>&lt;height&gt;</w:t>
+              <w:t>&lt;</w:t>
+            </w:r>
+            <w:proofErr w:type="spellStart"/>
+            <w:r>
+              <w:rPr>
+                <w:rStyle w:val="XML"/>
+              </w:rPr>
+              <w:t>height</w:t>
+            </w:r>
+            <w:proofErr w:type="spellEnd"/>
+            <w:r>
+              <w:rPr>
+                <w:rStyle w:val="XML"/>
+              </w:rPr>
+              <w:t>&gt;</w:t>
             </w:r>
           </w:p>
         </w:tc>
@@ -18629,11 +19234,7 @@
         <w:t>DPI</w:t>
       </w:r>
       <w:r>
-        <w:t xml:space="preserve"> systems, the </w:t>
-      </w:r>
-      <w:r>
-        <w:lastRenderedPageBreak/>
-        <w:t>values are automatically scaled so that the window appears the same physical size as on a 96</w:t>
+        <w:t xml:space="preserve"> systems, the values are automatically scaled so that the window appears the same physical size as on a 96</w:t>
       </w:r>
       <w:r>
         <w:noBreakHyphen/>
@@ -18671,6 +19272,7 @@
           <w:rStyle w:val="XMLBracket"/>
           <w:lang w:val="en-GB"/>
         </w:rPr>
+        <w:lastRenderedPageBreak/>
         <w:t>&lt;</w:t>
       </w:r>
       <w:r>
@@ -18994,7 +19596,21 @@
               <w:rPr>
                 <w:rStyle w:val="XML"/>
               </w:rPr>
-              <w:t>&lt;connection&gt;</w:t>
+              <w:t>&lt;</w:t>
+            </w:r>
+            <w:proofErr w:type="spellStart"/>
+            <w:r>
+              <w:rPr>
+                <w:rStyle w:val="XML"/>
+              </w:rPr>
+              <w:t>connection</w:t>
+            </w:r>
+            <w:proofErr w:type="spellEnd"/>
+            <w:r>
+              <w:rPr>
+                <w:rStyle w:val="XML"/>
+              </w:rPr>
+              <w:t>&gt;</w:t>
             </w:r>
           </w:p>
         </w:tc>
@@ -19014,15 +19630,47 @@
             </w:r>
             <w:r>
               <w:br/>
-              <w:t xml:space="preserve">• serial/rtu — Serial port using Modbus RTU protocol </w:t>
+              <w:t>• serial/</w:t>
+            </w:r>
+            <w:proofErr w:type="spellStart"/>
+            <w:r>
+              <w:t>rtu</w:t>
+            </w:r>
+            <w:proofErr w:type="spellEnd"/>
+            <w:r>
+              <w:t xml:space="preserve"> — Serial port using Modbus RTU protocol </w:t>
             </w:r>
             <w:r>
               <w:br/>
-              <w:t xml:space="preserve">• modbus/tcp — TCP connection using Modbus/TCP protocol </w:t>
+              <w:t>• modbus/</w:t>
+            </w:r>
+            <w:proofErr w:type="spellStart"/>
+            <w:r>
+              <w:t>tcp</w:t>
+            </w:r>
+            <w:proofErr w:type="spellEnd"/>
+            <w:r>
+              <w:t xml:space="preserve"> — TCP connection using Modbus/TCP protocol </w:t>
             </w:r>
             <w:r>
               <w:br/>
-              <w:t>• rtu/tcp — TCP connection using Modbus RTU protocol</w:t>
+              <w:t xml:space="preserve">• </w:t>
+            </w:r>
+            <w:proofErr w:type="spellStart"/>
+            <w:r>
+              <w:t>rtu</w:t>
+            </w:r>
+            <w:proofErr w:type="spellEnd"/>
+            <w:r>
+              <w:t>/</w:t>
+            </w:r>
+            <w:proofErr w:type="spellStart"/>
+            <w:r>
+              <w:t>tcp</w:t>
+            </w:r>
+            <w:proofErr w:type="spellEnd"/>
+            <w:r>
+              <w:t xml:space="preserve"> — TCP connection using Modbus RTU protocol</w:t>
             </w:r>
           </w:p>
         </w:tc>
@@ -19117,7 +19765,21 @@
               <w:rPr>
                 <w:rStyle w:val="XML"/>
               </w:rPr>
-              <w:t xml:space="preserve">&lt;parity&gt; </w:t>
+              <w:t>&lt;</w:t>
+            </w:r>
+            <w:proofErr w:type="spellStart"/>
+            <w:r>
+              <w:rPr>
+                <w:rStyle w:val="XML"/>
+              </w:rPr>
+              <w:t>parity</w:t>
+            </w:r>
+            <w:proofErr w:type="spellEnd"/>
+            <w:r>
+              <w:rPr>
+                <w:rStyle w:val="XML"/>
+              </w:rPr>
+              <w:t xml:space="preserve">&gt; </w:t>
             </w:r>
           </w:p>
         </w:tc>
@@ -19178,7 +19840,23 @@
             </w:r>
             <w:r>
               <w:noBreakHyphen/>
-              <w:t>message timeout (ms). Required when using the Modbus/TCP bridge with unknown function codes. Default: 100 ms.</w:t>
+              <w:t>message timeout (</w:t>
+            </w:r>
+            <w:proofErr w:type="spellStart"/>
+            <w:r>
+              <w:t>ms</w:t>
+            </w:r>
+            <w:proofErr w:type="spellEnd"/>
+            <w:r>
+              <w:t xml:space="preserve">). Required when using the Modbus/TCP bridge with unknown function codes. Default: 100 </w:t>
+            </w:r>
+            <w:proofErr w:type="spellStart"/>
+            <w:r>
+              <w:t>ms</w:t>
+            </w:r>
+            <w:proofErr w:type="spellEnd"/>
+            <w:r>
+              <w:t>.</w:t>
             </w:r>
           </w:p>
         </w:tc>
@@ -19398,7 +20076,15 @@
               </w:rPr>
             </w:pPr>
             <w:r>
-              <w:t>Maximum wait time for the first response byte (ms).</w:t>
+              <w:t>Maximum wait time for the first response byte (</w:t>
+            </w:r>
+            <w:proofErr w:type="spellStart"/>
+            <w:r>
+              <w:t>ms</w:t>
+            </w:r>
+            <w:proofErr w:type="spellEnd"/>
+            <w:r>
+              <w:t>).</w:t>
             </w:r>
           </w:p>
         </w:tc>
@@ -19485,11 +20171,27 @@
             </w:r>
             <w:r>
               <w:br/>
-              <w:t xml:space="preserve">• Serial: 0 = default delay (4 character times). Values &gt; 0 = delay in ms. </w:t>
+              <w:t xml:space="preserve">• Serial: 0 = default delay (4 character times). Values &gt; 0 = delay in </w:t>
+            </w:r>
+            <w:proofErr w:type="spellStart"/>
+            <w:r>
+              <w:t>ms</w:t>
+            </w:r>
+            <w:proofErr w:type="spellEnd"/>
+            <w:r>
+              <w:t xml:space="preserve">. </w:t>
             </w:r>
             <w:r>
               <w:br/>
-              <w:t xml:space="preserve">• TCP: 0 = no delay. Values &gt; 0 = delay in ms. </w:t>
+              <w:t xml:space="preserve">• TCP: 0 = no delay. Values &gt; 0 = delay in </w:t>
+            </w:r>
+            <w:proofErr w:type="spellStart"/>
+            <w:r>
+              <w:t>ms</w:t>
+            </w:r>
+            <w:proofErr w:type="spellEnd"/>
+            <w:r>
+              <w:t xml:space="preserve">. </w:t>
             </w:r>
             <w:r>
               <w:br/>
@@ -19571,7 +20273,6 @@
               <w:rPr>
                 <w:rStyle w:val="XML"/>
               </w:rPr>
-              <w:lastRenderedPageBreak/>
               <w:t xml:space="preserve">&lt;int32endian&gt; </w:t>
             </w:r>
           </w:p>
@@ -19684,6 +20385,7 @@
               <w:rPr>
                 <w:rStyle w:val="XML"/>
               </w:rPr>
+              <w:lastRenderedPageBreak/>
               <w:t>&lt;float32endian&gt;</w:t>
             </w:r>
           </w:p>
@@ -20247,8 +20949,17 @@
           <w:rStyle w:val="XMLContent"/>
           <w:lang w:val="en-GB"/>
         </w:rPr>
-        <w:t>serial/rtu</w:t>
-      </w:r>
+        <w:t>serial/</w:t>
+      </w:r>
+      <w:proofErr w:type="spellStart"/>
+      <w:r>
+        <w:rPr>
+          <w:rStyle w:val="XMLContent"/>
+          <w:lang w:val="en-GB"/>
+        </w:rPr>
+        <w:t>rtu</w:t>
+      </w:r>
+      <w:proofErr w:type="spellEnd"/>
       <w:r>
         <w:rPr>
           <w:rStyle w:val="XMLBracket"/>
@@ -21094,7 +21805,6 @@
         <w:rPr>
           <w:lang w:val="en-GB"/>
         </w:rPr>
-        <w:lastRenderedPageBreak/>
         <w:t>The &lt;tab&gt; element</w:t>
       </w:r>
       <w:bookmarkEnd w:id="51"/>
@@ -21183,6 +21893,7 @@
         <w:rPr>
           <w:lang w:val="en-GB"/>
         </w:rPr>
+        <w:lastRenderedPageBreak/>
         <w:t xml:space="preserve">A </w:t>
       </w:r>
       <w:r>
@@ -21297,7 +22008,15 @@
               <w:t xml:space="preserve"> </w:t>
             </w:r>
             <w:r>
-              <w:t>for example, exporting setup registers first to ensure correct import behavior.</w:t>
+              <w:t xml:space="preserve">for example, exporting setup registers first to ensure correct import </w:t>
+            </w:r>
+            <w:proofErr w:type="spellStart"/>
+            <w:r>
+              <w:t>behavior</w:t>
+            </w:r>
+            <w:proofErr w:type="spellEnd"/>
+            <w:r>
+              <w:t>.</w:t>
             </w:r>
           </w:p>
           <w:p>
@@ -21372,7 +22091,15 @@
               <w:t>without</w:t>
             </w:r>
             <w:r>
-              <w:t xml:space="preserve"> an &lt;exportorder&gt; value are exported </w:t>
+              <w:t xml:space="preserve"> an &lt;</w:t>
+            </w:r>
+            <w:proofErr w:type="spellStart"/>
+            <w:r>
+              <w:t>exportorder</w:t>
+            </w:r>
+            <w:proofErr w:type="spellEnd"/>
+            <w:r>
+              <w:t xml:space="preserve">&gt; value are exported </w:t>
             </w:r>
             <w:r>
               <w:rPr>
@@ -21396,11 +22123,19 @@
                 <w:rFonts w:hint="eastAsia"/>
               </w:rPr>
             </w:pPr>
+            <w:proofErr w:type="spellStart"/>
             <w:r>
               <w:rPr>
                 <w:lang w:val="nl-BE"/>
               </w:rPr>
-              <w:t>Optional.</w:t>
+              <w:t>Optional</w:t>
+            </w:r>
+            <w:proofErr w:type="spellEnd"/>
+            <w:r>
+              <w:rPr>
+                <w:lang w:val="nl-BE"/>
+              </w:rPr>
+              <w:t>.</w:t>
             </w:r>
           </w:p>
         </w:tc>
@@ -21421,7 +22156,21 @@
               <w:rPr>
                 <w:rStyle w:val="XML"/>
               </w:rPr>
-              <w:t>&lt;fcol&gt;</w:t>
+              <w:t>&lt;</w:t>
+            </w:r>
+            <w:proofErr w:type="spellStart"/>
+            <w:r>
+              <w:rPr>
+                <w:rStyle w:val="XML"/>
+              </w:rPr>
+              <w:t>fcol</w:t>
+            </w:r>
+            <w:proofErr w:type="spellEnd"/>
+            <w:r>
+              <w:rPr>
+                <w:rStyle w:val="XML"/>
+              </w:rPr>
+              <w:t>&gt;</w:t>
             </w:r>
           </w:p>
         </w:tc>
@@ -21500,7 +22249,35 @@
               <w:rPr>
                 <w:rStyle w:val="Kruisverwijzing"/>
               </w:rPr>
-              <w:t>The &lt;fcol&gt; and &lt;bcol&gt; elements</w:t>
+              <w:t>The &lt;</w:t>
+            </w:r>
+            <w:proofErr w:type="spellStart"/>
+            <w:r>
+              <w:rPr>
+                <w:rStyle w:val="Kruisverwijzing"/>
+              </w:rPr>
+              <w:t>fcol</w:t>
+            </w:r>
+            <w:proofErr w:type="spellEnd"/>
+            <w:r>
+              <w:rPr>
+                <w:rStyle w:val="Kruisverwijzing"/>
+              </w:rPr>
+              <w:t>&gt; and &lt;</w:t>
+            </w:r>
+            <w:proofErr w:type="spellStart"/>
+            <w:r>
+              <w:rPr>
+                <w:rStyle w:val="Kruisverwijzing"/>
+              </w:rPr>
+              <w:t>bcol</w:t>
+            </w:r>
+            <w:proofErr w:type="spellEnd"/>
+            <w:r>
+              <w:rPr>
+                <w:rStyle w:val="Kruisverwijzing"/>
+              </w:rPr>
+              <w:t>&gt; elements</w:t>
             </w:r>
             <w:r>
               <w:rPr>
@@ -21538,7 +22315,21 @@
               <w:rPr>
                 <w:rStyle w:val="XML"/>
               </w:rPr>
-              <w:t xml:space="preserve">&lt;bcol&gt; </w:t>
+              <w:t>&lt;</w:t>
+            </w:r>
+            <w:proofErr w:type="spellStart"/>
+            <w:r>
+              <w:rPr>
+                <w:rStyle w:val="XML"/>
+              </w:rPr>
+              <w:t>bcol</w:t>
+            </w:r>
+            <w:proofErr w:type="spellEnd"/>
+            <w:r>
+              <w:rPr>
+                <w:rStyle w:val="XML"/>
+              </w:rPr>
+              <w:t xml:space="preserve">&gt; </w:t>
             </w:r>
           </w:p>
         </w:tc>
@@ -21620,7 +22411,35 @@
               <w:rPr>
                 <w:rStyle w:val="Kruisverwijzing"/>
               </w:rPr>
-              <w:t>The &lt;fcol&gt; and &lt;bcol&gt; elements</w:t>
+              <w:t>The &lt;</w:t>
+            </w:r>
+            <w:proofErr w:type="spellStart"/>
+            <w:r>
+              <w:rPr>
+                <w:rStyle w:val="Kruisverwijzing"/>
+              </w:rPr>
+              <w:t>fcol</w:t>
+            </w:r>
+            <w:proofErr w:type="spellEnd"/>
+            <w:r>
+              <w:rPr>
+                <w:rStyle w:val="Kruisverwijzing"/>
+              </w:rPr>
+              <w:t>&gt; and &lt;</w:t>
+            </w:r>
+            <w:proofErr w:type="spellStart"/>
+            <w:r>
+              <w:rPr>
+                <w:rStyle w:val="Kruisverwijzing"/>
+              </w:rPr>
+              <w:t>bcol</w:t>
+            </w:r>
+            <w:proofErr w:type="spellEnd"/>
+            <w:r>
+              <w:rPr>
+                <w:rStyle w:val="Kruisverwijzing"/>
+              </w:rPr>
+              <w:t>&gt; elements</w:t>
             </w:r>
             <w:r>
               <w:rPr>
@@ -21658,7 +22477,21 @@
               <w:rPr>
                 <w:rStyle w:val="XML"/>
               </w:rPr>
-              <w:t>&lt;expandfields&gt;</w:t>
+              <w:t>&lt;</w:t>
+            </w:r>
+            <w:proofErr w:type="spellStart"/>
+            <w:r>
+              <w:rPr>
+                <w:rStyle w:val="XML"/>
+              </w:rPr>
+              <w:t>expandfields</w:t>
+            </w:r>
+            <w:proofErr w:type="spellEnd"/>
+            <w:r>
+              <w:rPr>
+                <w:rStyle w:val="XML"/>
+              </w:rPr>
+              <w:t>&gt;</w:t>
             </w:r>
           </w:p>
         </w:tc>
@@ -21689,12 +22522,56 @@
                 <w:lang w:val="nl-BE"/>
               </w:rPr>
             </w:pPr>
+            <w:proofErr w:type="spellStart"/>
             <w:r>
               <w:rPr>
                 <w:lang w:val="nl-BE"/>
               </w:rPr>
-              <w:t>Valid values: true or false</w:t>
-            </w:r>
+              <w:t>Valid</w:t>
+            </w:r>
+            <w:proofErr w:type="spellEnd"/>
+            <w:r>
+              <w:rPr>
+                <w:lang w:val="nl-BE"/>
+              </w:rPr>
+              <w:t xml:space="preserve"> </w:t>
+            </w:r>
+            <w:proofErr w:type="spellStart"/>
+            <w:r>
+              <w:rPr>
+                <w:lang w:val="nl-BE"/>
+              </w:rPr>
+              <w:t>values</w:t>
+            </w:r>
+            <w:proofErr w:type="spellEnd"/>
+            <w:r>
+              <w:rPr>
+                <w:lang w:val="nl-BE"/>
+              </w:rPr>
+              <w:t xml:space="preserve">: </w:t>
+            </w:r>
+            <w:proofErr w:type="spellStart"/>
+            <w:r>
+              <w:rPr>
+                <w:lang w:val="nl-BE"/>
+              </w:rPr>
+              <w:t>true</w:t>
+            </w:r>
+            <w:proofErr w:type="spellEnd"/>
+            <w:r>
+              <w:rPr>
+                <w:lang w:val="nl-BE"/>
+              </w:rPr>
+              <w:t xml:space="preserve"> or </w:t>
+            </w:r>
+            <w:proofErr w:type="spellStart"/>
+            <w:r>
+              <w:rPr>
+                <w:lang w:val="nl-BE"/>
+              </w:rPr>
+              <w:t>false</w:t>
+            </w:r>
+            <w:proofErr w:type="spellEnd"/>
           </w:p>
           <w:p>
             <w:pPr>
@@ -21712,8 +22589,16 @@
               <w:rPr>
                 <w:lang w:val="nl-BE"/>
               </w:rPr>
-              <w:t>Default: false</w:t>
-            </w:r>
+              <w:t xml:space="preserve">Default: </w:t>
+            </w:r>
+            <w:proofErr w:type="spellStart"/>
+            <w:r>
+              <w:rPr>
+                <w:lang w:val="nl-BE"/>
+              </w:rPr>
+              <w:t>false</w:t>
+            </w:r>
+            <w:proofErr w:type="spellEnd"/>
           </w:p>
           <w:p>
             <w:pPr>
@@ -21726,12 +22611,14 @@
                 <w:rFonts w:hint="eastAsia"/>
               </w:rPr>
             </w:pPr>
+            <w:proofErr w:type="spellStart"/>
             <w:r>
               <w:rPr>
                 <w:lang w:val="nl-BE"/>
               </w:rPr>
               <w:t>Optional</w:t>
             </w:r>
+            <w:proofErr w:type="spellEnd"/>
           </w:p>
         </w:tc>
       </w:tr>
@@ -21781,8 +22668,13 @@
             <w:r>
               <w:t xml:space="preserve">, description text, numeric type and format, </w:t>
             </w:r>
-            <w:r>
-              <w:t>colors, and more.</w:t>
+            <w:proofErr w:type="spellStart"/>
+            <w:r>
+              <w:t>colors</w:t>
+            </w:r>
+            <w:proofErr w:type="spellEnd"/>
+            <w:r>
+              <w:t>, and more.</w:t>
             </w:r>
           </w:p>
         </w:tc>
@@ -22071,6 +22963,7 @@
         </w:rPr>
         <w:t>&lt;</w:t>
       </w:r>
+      <w:proofErr w:type="spellStart"/>
       <w:r>
         <w:rPr>
           <w:rStyle w:val="XMLElement"/>
@@ -22078,6 +22971,7 @@
         </w:rPr>
         <w:t>rw</w:t>
       </w:r>
+      <w:proofErr w:type="spellEnd"/>
       <w:r>
         <w:rPr>
           <w:rStyle w:val="XMLBracket"/>
@@ -22099,6 +22993,7 @@
         </w:rPr>
         <w:t>&lt;/</w:t>
       </w:r>
+      <w:proofErr w:type="spellStart"/>
       <w:r>
         <w:rPr>
           <w:rStyle w:val="XMLElement"/>
@@ -22106,6 +23001,7 @@
         </w:rPr>
         <w:t>rw</w:t>
       </w:r>
+      <w:proofErr w:type="spellEnd"/>
       <w:r>
         <w:rPr>
           <w:rStyle w:val="XMLBracket"/>
@@ -22297,6 +23193,7 @@
         </w:rPr>
         <w:t>&lt;</w:t>
       </w:r>
+      <w:proofErr w:type="spellStart"/>
       <w:r>
         <w:rPr>
           <w:rStyle w:val="XMLElement"/>
@@ -22304,6 +23201,7 @@
         </w:rPr>
         <w:t>rw</w:t>
       </w:r>
+      <w:proofErr w:type="spellEnd"/>
       <w:r>
         <w:rPr>
           <w:rStyle w:val="XMLBracket"/>
@@ -22325,6 +23223,7 @@
         </w:rPr>
         <w:t>&lt;/</w:t>
       </w:r>
+      <w:proofErr w:type="spellStart"/>
       <w:r>
         <w:rPr>
           <w:rStyle w:val="XMLElement"/>
@@ -22332,6 +23231,7 @@
         </w:rPr>
         <w:t>rw</w:t>
       </w:r>
+      <w:proofErr w:type="spellEnd"/>
       <w:r>
         <w:rPr>
           <w:rStyle w:val="XMLBracket"/>
@@ -22653,7 +23553,6 @@
               <w:rPr>
                 <w:rStyle w:val="XML"/>
               </w:rPr>
-              <w:lastRenderedPageBreak/>
               <w:t>&lt;file&gt;</w:t>
             </w:r>
           </w:p>
@@ -22691,7 +23590,21 @@
               <w:rPr>
                 <w:rStyle w:val="XML"/>
               </w:rPr>
-              <w:t>&lt;required&gt;</w:t>
+              <w:t>&lt;</w:t>
+            </w:r>
+            <w:proofErr w:type="spellStart"/>
+            <w:r>
+              <w:rPr>
+                <w:rStyle w:val="XML"/>
+              </w:rPr>
+              <w:t>required</w:t>
+            </w:r>
+            <w:proofErr w:type="spellEnd"/>
+            <w:r>
+              <w:rPr>
+                <w:rStyle w:val="XML"/>
+              </w:rPr>
+              <w:t>&gt;</w:t>
             </w:r>
           </w:p>
         </w:tc>
@@ -22758,6 +23671,7 @@
               </w:rPr>
               <w:t xml:space="preserve">Default: </w:t>
             </w:r>
+            <w:proofErr w:type="spellStart"/>
             <w:r>
               <w:rPr>
                 <w:b/>
@@ -22766,6 +23680,7 @@
               </w:rPr>
               <w:t>true</w:t>
             </w:r>
+            <w:proofErr w:type="spellEnd"/>
           </w:p>
           <w:p>
             <w:pPr>
@@ -22847,12 +23762,14 @@
         </w:rPr>
         <w:t>file&gt;</w:t>
       </w:r>
+      <w:proofErr w:type="spellStart"/>
       <w:r>
         <w:rPr>
           <w:lang w:val="en-GB"/>
         </w:rPr>
         <w:t>Configuration.mbc</w:t>
       </w:r>
+      <w:proofErr w:type="spellEnd"/>
       <w:r>
         <w:rPr>
           <w:rStyle w:val="XMLElement"/>
@@ -22933,7 +23850,23 @@
           <w:rStyle w:val="XMLElement"/>
           <w:lang w:val="en-GB"/>
         </w:rPr>
-        <w:t>&lt;includex&gt;</w:t>
+        <w:t>&lt;</w:t>
+      </w:r>
+      <w:proofErr w:type="spellStart"/>
+      <w:r>
+        <w:rPr>
+          <w:rStyle w:val="XMLElement"/>
+          <w:lang w:val="en-GB"/>
+        </w:rPr>
+        <w:t>includex</w:t>
+      </w:r>
+      <w:proofErr w:type="spellEnd"/>
+      <w:r>
+        <w:rPr>
+          <w:rStyle w:val="XMLElement"/>
+          <w:lang w:val="en-GB"/>
+        </w:rPr>
+        <w:t>&gt;</w:t>
       </w:r>
     </w:p>
     <w:p>
@@ -22973,6 +23906,7 @@
         </w:rPr>
         <w:t>\</w:t>
       </w:r>
+      <w:proofErr w:type="spellStart"/>
       <w:r>
         <w:rPr>
           <w:rStyle w:val="XMLContent"/>
@@ -22987,6 +23921,7 @@
         </w:rPr>
         <w:t>.mbc</w:t>
       </w:r>
+      <w:proofErr w:type="spellEnd"/>
       <w:r>
         <w:rPr>
           <w:rStyle w:val="XMLElement"/>
@@ -23216,7 +24151,21 @@
               <w:rPr>
                 <w:rStyle w:val="XML"/>
               </w:rPr>
-              <w:t>&lt;text&gt;</w:t>
+              <w:t>&lt;</w:t>
+            </w:r>
+            <w:proofErr w:type="spellStart"/>
+            <w:r>
+              <w:rPr>
+                <w:rStyle w:val="XML"/>
+              </w:rPr>
+              <w:t>text</w:t>
+            </w:r>
+            <w:proofErr w:type="spellEnd"/>
+            <w:r>
+              <w:rPr>
+                <w:rStyle w:val="XML"/>
+              </w:rPr>
+              <w:t>&gt;</w:t>
             </w:r>
           </w:p>
         </w:tc>
@@ -23316,14 +24265,22 @@
               <w:rPr>
                 <w:rStyle w:val="XML"/>
               </w:rPr>
-              <w:t>&lt;longdesc</w:t>
-            </w:r>
+              <w:t>&lt;</w:t>
+            </w:r>
+            <w:proofErr w:type="spellStart"/>
             <w:r>
               <w:rPr>
                 <w:rStyle w:val="XML"/>
               </w:rPr>
+              <w:t>longdesc</w:t>
+            </w:r>
+            <w:r>
+              <w:rPr>
+                <w:rStyle w:val="XML"/>
+              </w:rPr>
               <w:t>r</w:t>
             </w:r>
+            <w:proofErr w:type="spellEnd"/>
             <w:r>
               <w:rPr>
                 <w:rStyle w:val="XML"/>
@@ -23424,11 +24381,19 @@
                 <w:lang w:val="nl-BE"/>
               </w:rPr>
             </w:pPr>
+            <w:proofErr w:type="spellStart"/>
             <w:r>
               <w:rPr>
                 <w:lang w:val="nl-BE"/>
               </w:rPr>
-              <w:t>Size (16</w:t>
+              <w:t>Size</w:t>
+            </w:r>
+            <w:proofErr w:type="spellEnd"/>
+            <w:r>
+              <w:rPr>
+                <w:lang w:val="nl-BE"/>
+              </w:rPr>
+              <w:t xml:space="preserve"> (16</w:t>
             </w:r>
             <w:r>
               <w:rPr>
@@ -23457,12 +24422,42 @@
                 <w:lang w:val="nl-BE"/>
               </w:rPr>
             </w:pPr>
+            <w:proofErr w:type="spellStart"/>
             <w:r>
               <w:rPr>
                 <w:lang w:val="nl-BE"/>
               </w:rPr>
-              <w:t>Signed/unsigned interpretation</w:t>
-            </w:r>
+              <w:t>Signed</w:t>
+            </w:r>
+            <w:proofErr w:type="spellEnd"/>
+            <w:r>
+              <w:rPr>
+                <w:lang w:val="nl-BE"/>
+              </w:rPr>
+              <w:t>/</w:t>
+            </w:r>
+            <w:proofErr w:type="spellStart"/>
+            <w:r>
+              <w:rPr>
+                <w:lang w:val="nl-BE"/>
+              </w:rPr>
+              <w:t>unsigned</w:t>
+            </w:r>
+            <w:proofErr w:type="spellEnd"/>
+            <w:r>
+              <w:rPr>
+                <w:lang w:val="nl-BE"/>
+              </w:rPr>
+              <w:t xml:space="preserve"> </w:t>
+            </w:r>
+            <w:proofErr w:type="spellStart"/>
+            <w:r>
+              <w:rPr>
+                <w:lang w:val="nl-BE"/>
+              </w:rPr>
+              <w:t>interpretation</w:t>
+            </w:r>
+            <w:proofErr w:type="spellEnd"/>
           </w:p>
           <w:p>
             <w:pPr>
@@ -23571,7 +24566,21 @@
               <w:rPr>
                 <w:rStyle w:val="XML"/>
               </w:rPr>
-              <w:t>&lt;minlen&gt;</w:t>
+              <w:t>&lt;</w:t>
+            </w:r>
+            <w:proofErr w:type="spellStart"/>
+            <w:r>
+              <w:rPr>
+                <w:rStyle w:val="XML"/>
+              </w:rPr>
+              <w:t>minlen</w:t>
+            </w:r>
+            <w:proofErr w:type="spellEnd"/>
+            <w:r>
+              <w:rPr>
+                <w:rStyle w:val="XML"/>
+              </w:rPr>
+              <w:t>&gt;</w:t>
             </w:r>
           </w:p>
         </w:tc>
@@ -23623,7 +24632,15 @@
               </w:rPr>
             </w:pPr>
             <w:r>
-              <w:t>Example: value 15 (decimal), hex format, minlen=4 → 0x000F</w:t>
+              <w:t xml:space="preserve">Example: value 15 (decimal), hex format, </w:t>
+            </w:r>
+            <w:proofErr w:type="spellStart"/>
+            <w:r>
+              <w:t>minlen</w:t>
+            </w:r>
+            <w:proofErr w:type="spellEnd"/>
+            <w:r>
+              <w:t>=4 → 0x000F</w:t>
             </w:r>
           </w:p>
           <w:p>
@@ -23638,12 +24655,14 @@
                 <w:lang w:val="nl-BE"/>
               </w:rPr>
             </w:pPr>
+            <w:proofErr w:type="spellStart"/>
             <w:r>
               <w:rPr>
                 <w:lang w:val="nl-BE"/>
               </w:rPr>
               <w:t>Optional</w:t>
             </w:r>
+            <w:proofErr w:type="spellEnd"/>
           </w:p>
           <w:p>
             <w:pPr>
@@ -23681,7 +24700,21 @@
               <w:rPr>
                 <w:rStyle w:val="XML"/>
               </w:rPr>
-              <w:t>&lt;rw&gt;</w:t>
+              <w:t>&lt;</w:t>
+            </w:r>
+            <w:proofErr w:type="spellStart"/>
+            <w:r>
+              <w:rPr>
+                <w:rStyle w:val="XML"/>
+              </w:rPr>
+              <w:t>rw</w:t>
+            </w:r>
+            <w:proofErr w:type="spellEnd"/>
+            <w:r>
+              <w:rPr>
+                <w:rStyle w:val="XML"/>
+              </w:rPr>
+              <w:t>&gt;</w:t>
             </w:r>
           </w:p>
         </w:tc>
@@ -23716,7 +24749,14 @@
               <w:rPr>
                 <w:lang w:val="nl-BE"/>
               </w:rPr>
-              <w:t>r — read</w:t>
+              <w:t xml:space="preserve">r — </w:t>
+            </w:r>
+            <w:proofErr w:type="spellStart"/>
+            <w:r>
+              <w:rPr>
+                <w:lang w:val="nl-BE"/>
+              </w:rPr>
+              <w:t>read</w:t>
             </w:r>
             <w:r>
               <w:rPr>
@@ -23725,6 +24765,7 @@
               <w:noBreakHyphen/>
               <w:t>only</w:t>
             </w:r>
+            <w:proofErr w:type="spellEnd"/>
           </w:p>
           <w:p>
             <w:pPr>
@@ -23742,7 +24783,14 @@
               <w:rPr>
                 <w:lang w:val="nl-BE"/>
               </w:rPr>
-              <w:t>w — write</w:t>
+              <w:t xml:space="preserve">w — </w:t>
+            </w:r>
+            <w:proofErr w:type="spellStart"/>
+            <w:r>
+              <w:rPr>
+                <w:lang w:val="nl-BE"/>
+              </w:rPr>
+              <w:t>write</w:t>
             </w:r>
             <w:r>
               <w:rPr>
@@ -23751,6 +24799,7 @@
               <w:noBreakHyphen/>
               <w:t>only</w:t>
             </w:r>
+            <w:proofErr w:type="spellEnd"/>
           </w:p>
           <w:p>
             <w:pPr>
@@ -23764,12 +24813,42 @@
                 <w:lang w:val="nl-BE"/>
               </w:rPr>
             </w:pPr>
+            <w:proofErr w:type="spellStart"/>
             <w:r>
               <w:rPr>
                 <w:lang w:val="nl-BE"/>
               </w:rPr>
-              <w:t>rw — read/write</w:t>
-            </w:r>
+              <w:t>rw</w:t>
+            </w:r>
+            <w:proofErr w:type="spellEnd"/>
+            <w:r>
+              <w:rPr>
+                <w:lang w:val="nl-BE"/>
+              </w:rPr>
+              <w:t xml:space="preserve"> — </w:t>
+            </w:r>
+            <w:proofErr w:type="spellStart"/>
+            <w:r>
+              <w:rPr>
+                <w:lang w:val="nl-BE"/>
+              </w:rPr>
+              <w:t>read</w:t>
+            </w:r>
+            <w:proofErr w:type="spellEnd"/>
+            <w:r>
+              <w:rPr>
+                <w:lang w:val="nl-BE"/>
+              </w:rPr>
+              <w:t>/</w:t>
+            </w:r>
+            <w:proofErr w:type="spellStart"/>
+            <w:r>
+              <w:rPr>
+                <w:lang w:val="nl-BE"/>
+              </w:rPr>
+              <w:t>write</w:t>
+            </w:r>
+            <w:proofErr w:type="spellEnd"/>
           </w:p>
           <w:p>
             <w:pPr>
@@ -23832,7 +24911,21 @@
               <w:rPr>
                 <w:rStyle w:val="XML"/>
               </w:rPr>
-              <w:t>&lt;fcol&gt;</w:t>
+              <w:t>&lt;</w:t>
+            </w:r>
+            <w:proofErr w:type="spellStart"/>
+            <w:r>
+              <w:rPr>
+                <w:rStyle w:val="XML"/>
+              </w:rPr>
+              <w:t>fcol</w:t>
+            </w:r>
+            <w:proofErr w:type="spellEnd"/>
+            <w:r>
+              <w:rPr>
+                <w:rStyle w:val="XML"/>
+              </w:rPr>
+              <w:t>&gt;</w:t>
             </w:r>
           </w:p>
         </w:tc>
@@ -23917,14 +25010,35 @@
               <w:rPr>
                 <w:rStyle w:val="Kruisverwijzing"/>
               </w:rPr>
-              <w:t xml:space="preserve">The &lt;fcol&gt; and &lt;bcol&gt; </w:t>
-            </w:r>
+              <w:t>The &lt;</w:t>
+            </w:r>
+            <w:proofErr w:type="spellStart"/>
             <w:r>
               <w:rPr>
                 <w:rStyle w:val="Kruisverwijzing"/>
               </w:rPr>
-              <w:lastRenderedPageBreak/>
-              <w:t>elements</w:t>
+              <w:t>fcol</w:t>
+            </w:r>
+            <w:proofErr w:type="spellEnd"/>
+            <w:r>
+              <w:rPr>
+                <w:rStyle w:val="Kruisverwijzing"/>
+              </w:rPr>
+              <w:t>&gt; and &lt;</w:t>
+            </w:r>
+            <w:proofErr w:type="spellStart"/>
+            <w:r>
+              <w:rPr>
+                <w:rStyle w:val="Kruisverwijzing"/>
+              </w:rPr>
+              <w:t>bcol</w:t>
+            </w:r>
+            <w:proofErr w:type="spellEnd"/>
+            <w:r>
+              <w:rPr>
+                <w:rStyle w:val="Kruisverwijzing"/>
+              </w:rPr>
+              <w:t>&gt; elements</w:t>
             </w:r>
             <w:r>
               <w:rPr>
@@ -23955,8 +25069,21 @@
               <w:rPr>
                 <w:rStyle w:val="XML"/>
               </w:rPr>
-              <w:lastRenderedPageBreak/>
-              <w:t xml:space="preserve">&lt;bcol&gt; </w:t>
+              <w:t>&lt;</w:t>
+            </w:r>
+            <w:proofErr w:type="spellStart"/>
+            <w:r>
+              <w:rPr>
+                <w:rStyle w:val="XML"/>
+              </w:rPr>
+              <w:t>bcol</w:t>
+            </w:r>
+            <w:proofErr w:type="spellEnd"/>
+            <w:r>
+              <w:rPr>
+                <w:rStyle w:val="XML"/>
+              </w:rPr>
+              <w:t xml:space="preserve">&gt; </w:t>
             </w:r>
           </w:p>
         </w:tc>
@@ -24044,7 +25171,35 @@
               <w:rPr>
                 <w:rStyle w:val="Kruisverwijzing"/>
               </w:rPr>
-              <w:t>The &lt;fcol&gt; and &lt;bcol&gt; elements</w:t>
+              <w:t>The &lt;</w:t>
+            </w:r>
+            <w:proofErr w:type="spellStart"/>
+            <w:r>
+              <w:rPr>
+                <w:rStyle w:val="Kruisverwijzing"/>
+              </w:rPr>
+              <w:t>fcol</w:t>
+            </w:r>
+            <w:proofErr w:type="spellEnd"/>
+            <w:r>
+              <w:rPr>
+                <w:rStyle w:val="Kruisverwijzing"/>
+              </w:rPr>
+              <w:t>&gt; and &lt;</w:t>
+            </w:r>
+            <w:proofErr w:type="spellStart"/>
+            <w:r>
+              <w:rPr>
+                <w:rStyle w:val="Kruisverwijzing"/>
+              </w:rPr>
+              <w:t>bcol</w:t>
+            </w:r>
+            <w:proofErr w:type="spellEnd"/>
+            <w:r>
+              <w:rPr>
+                <w:rStyle w:val="Kruisverwijzing"/>
+              </w:rPr>
+              <w:t>&gt; elements</w:t>
             </w:r>
             <w:r>
               <w:rPr>
@@ -24075,7 +25230,21 @@
               <w:rPr>
                 <w:rStyle w:val="XML"/>
               </w:rPr>
-              <w:t>&lt;decimals&gt;</w:t>
+              <w:t>&lt;</w:t>
+            </w:r>
+            <w:proofErr w:type="spellStart"/>
+            <w:r>
+              <w:rPr>
+                <w:rStyle w:val="XML"/>
+              </w:rPr>
+              <w:t>decimals</w:t>
+            </w:r>
+            <w:proofErr w:type="spellEnd"/>
+            <w:r>
+              <w:rPr>
+                <w:rStyle w:val="XML"/>
+              </w:rPr>
+              <w:t>&gt;</w:t>
             </w:r>
           </w:p>
         </w:tc>
@@ -24118,6 +25287,7 @@
             <w:r>
               <w:t xml:space="preserve"> and </w:t>
             </w:r>
+            <w:proofErr w:type="spellStart"/>
             <w:r>
               <w:rPr>
                 <w:b/>
@@ -24125,6 +25295,7 @@
               </w:rPr>
               <w:t>UInt</w:t>
             </w:r>
+            <w:proofErr w:type="spellEnd"/>
             <w:r>
               <w:t xml:space="preserve"> types</w:t>
             </w:r>
@@ -24141,11 +25312,20 @@
                 <w:lang w:val="nl-BE"/>
               </w:rPr>
             </w:pPr>
+            <w:proofErr w:type="spellStart"/>
             <w:r>
               <w:rPr>
                 <w:lang w:val="nl-BE"/>
               </w:rPr>
-              <w:t xml:space="preserve">Valid range: </w:t>
+              <w:lastRenderedPageBreak/>
+              <w:t>Valid</w:t>
+            </w:r>
+            <w:proofErr w:type="spellEnd"/>
+            <w:r>
+              <w:rPr>
+                <w:lang w:val="nl-BE"/>
+              </w:rPr>
+              <w:t xml:space="preserve"> range: </w:t>
             </w:r>
             <w:r>
               <w:rPr>
@@ -24168,12 +25348,14 @@
                 <w:lang w:val="nl-BE"/>
               </w:rPr>
             </w:pPr>
+            <w:proofErr w:type="spellStart"/>
             <w:r>
               <w:rPr>
                 <w:lang w:val="nl-BE"/>
               </w:rPr>
               <w:t>Optional</w:t>
             </w:r>
+            <w:proofErr w:type="spellEnd"/>
           </w:p>
           <w:p>
             <w:pPr>
@@ -24209,11 +25391,47 @@
                 <w:rFonts w:hint="eastAsia"/>
               </w:rPr>
             </w:pPr>
+            <w:proofErr w:type="spellStart"/>
             <w:r>
               <w:rPr>
                 <w:lang w:val="nl-BE"/>
               </w:rPr>
-              <w:t>Example: Value 12345 with decimals=2 → 123,45</w:t>
+              <w:t>Example</w:t>
+            </w:r>
+            <w:proofErr w:type="spellEnd"/>
+            <w:r>
+              <w:rPr>
+                <w:lang w:val="nl-BE"/>
+              </w:rPr>
+              <w:t xml:space="preserve">: Value 12345 </w:t>
+            </w:r>
+            <w:proofErr w:type="spellStart"/>
+            <w:r>
+              <w:rPr>
+                <w:lang w:val="nl-BE"/>
+              </w:rPr>
+              <w:t>with</w:t>
+            </w:r>
+            <w:proofErr w:type="spellEnd"/>
+            <w:r>
+              <w:rPr>
+                <w:lang w:val="nl-BE"/>
+              </w:rPr>
+              <w:t xml:space="preserve"> </w:t>
+            </w:r>
+            <w:proofErr w:type="spellStart"/>
+            <w:r>
+              <w:rPr>
+                <w:lang w:val="nl-BE"/>
+              </w:rPr>
+              <w:t>decimals</w:t>
+            </w:r>
+            <w:proofErr w:type="spellEnd"/>
+            <w:r>
+              <w:rPr>
+                <w:lang w:val="nl-BE"/>
+              </w:rPr>
+              <w:t>=2 → 123,45</w:t>
             </w:r>
           </w:p>
         </w:tc>
@@ -24234,6 +25452,7 @@
               <w:rPr>
                 <w:rStyle w:val="XML"/>
               </w:rPr>
+              <w:lastRenderedPageBreak/>
               <w:t>&lt;enum&gt;</w:t>
             </w:r>
           </w:p>
@@ -24532,7 +25751,21 @@
               <w:rPr>
                 <w:rStyle w:val="XML"/>
               </w:rPr>
-              <w:t>&lt;expandfields&gt;</w:t>
+              <w:t>&lt;</w:t>
+            </w:r>
+            <w:proofErr w:type="spellStart"/>
+            <w:r>
+              <w:rPr>
+                <w:rStyle w:val="XML"/>
+              </w:rPr>
+              <w:t>expandfields</w:t>
+            </w:r>
+            <w:proofErr w:type="spellEnd"/>
+            <w:r>
+              <w:rPr>
+                <w:rStyle w:val="XML"/>
+              </w:rPr>
+              <w:t>&gt;</w:t>
             </w:r>
           </w:p>
         </w:tc>
@@ -24563,12 +25796,56 @@
                 <w:lang w:val="nl-BE"/>
               </w:rPr>
             </w:pPr>
+            <w:proofErr w:type="spellStart"/>
             <w:r>
               <w:rPr>
                 <w:lang w:val="nl-BE"/>
               </w:rPr>
-              <w:t>Valid values: true, false</w:t>
-            </w:r>
+              <w:t>Valid</w:t>
+            </w:r>
+            <w:proofErr w:type="spellEnd"/>
+            <w:r>
+              <w:rPr>
+                <w:lang w:val="nl-BE"/>
+              </w:rPr>
+              <w:t xml:space="preserve"> </w:t>
+            </w:r>
+            <w:proofErr w:type="spellStart"/>
+            <w:r>
+              <w:rPr>
+                <w:lang w:val="nl-BE"/>
+              </w:rPr>
+              <w:t>values</w:t>
+            </w:r>
+            <w:proofErr w:type="spellEnd"/>
+            <w:r>
+              <w:rPr>
+                <w:lang w:val="nl-BE"/>
+              </w:rPr>
+              <w:t xml:space="preserve">: </w:t>
+            </w:r>
+            <w:proofErr w:type="spellStart"/>
+            <w:r>
+              <w:rPr>
+                <w:lang w:val="nl-BE"/>
+              </w:rPr>
+              <w:t>true</w:t>
+            </w:r>
+            <w:proofErr w:type="spellEnd"/>
+            <w:r>
+              <w:rPr>
+                <w:lang w:val="nl-BE"/>
+              </w:rPr>
+              <w:t xml:space="preserve">, </w:t>
+            </w:r>
+            <w:proofErr w:type="spellStart"/>
+            <w:r>
+              <w:rPr>
+                <w:lang w:val="nl-BE"/>
+              </w:rPr>
+              <w:t>false</w:t>
+            </w:r>
+            <w:proofErr w:type="spellEnd"/>
           </w:p>
           <w:p>
             <w:pPr>
@@ -24588,6 +25865,7 @@
               </w:rPr>
               <w:t xml:space="preserve">Default: </w:t>
             </w:r>
+            <w:proofErr w:type="spellStart"/>
             <w:r>
               <w:rPr>
                 <w:b/>
@@ -24596,6 +25874,7 @@
               </w:rPr>
               <w:t>false</w:t>
             </w:r>
+            <w:proofErr w:type="spellEnd"/>
           </w:p>
           <w:p>
             <w:pPr>
@@ -24608,12 +25887,14 @@
                 <w:rFonts w:hint="eastAsia"/>
               </w:rPr>
             </w:pPr>
+            <w:proofErr w:type="spellStart"/>
             <w:r>
               <w:rPr>
                 <w:lang w:val="nl-BE"/>
               </w:rPr>
               <w:t>Optional</w:t>
             </w:r>
+            <w:proofErr w:type="spellEnd"/>
           </w:p>
         </w:tc>
       </w:tr>
@@ -24806,6 +26087,7 @@
         <w:br/>
         <w:t xml:space="preserve"> &lt;</w:t>
       </w:r>
+      <w:proofErr w:type="spellStart"/>
       <w:r>
         <w:rPr>
           <w:rStyle w:val="XMLElement"/>
@@ -24813,6 +26095,7 @@
         </w:rPr>
         <w:t>rw</w:t>
       </w:r>
+      <w:proofErr w:type="spellEnd"/>
       <w:r>
         <w:rPr>
           <w:rStyle w:val="XMLBracket"/>
@@ -24820,6 +26103,7 @@
         </w:rPr>
         <w:t>&gt;</w:t>
       </w:r>
+      <w:proofErr w:type="spellStart"/>
       <w:r>
         <w:rPr>
           <w:rStyle w:val="XMLContent"/>
@@ -24827,6 +26111,7 @@
         </w:rPr>
         <w:t>rw</w:t>
       </w:r>
+      <w:proofErr w:type="spellEnd"/>
       <w:r>
         <w:rPr>
           <w:rStyle w:val="XMLBracket"/>
@@ -24834,6 +26119,7 @@
         </w:rPr>
         <w:t>&lt;/</w:t>
       </w:r>
+      <w:proofErr w:type="spellStart"/>
       <w:r>
         <w:rPr>
           <w:rStyle w:val="XMLElement"/>
@@ -24841,6 +26127,7 @@
         </w:rPr>
         <w:t>rw</w:t>
       </w:r>
+      <w:proofErr w:type="spellEnd"/>
       <w:r>
         <w:rPr>
           <w:rStyle w:val="XMLBracket"/>
@@ -24990,7 +26277,25 @@
           <w:szCs w:val="18"/>
           <w:lang w:val="en-GB" w:eastAsia="zh-CN"/>
         </w:rPr>
-        <w:t>Temperature 1 (0,1 deg)</w:t>
+        <w:t xml:space="preserve">Temperature 1 (0,1 </w:t>
+      </w:r>
+      <w:proofErr w:type="spellStart"/>
+      <w:r>
+        <w:rPr>
+          <w:rStyle w:val="XMLContent"/>
+          <w:szCs w:val="18"/>
+          <w:lang w:val="en-GB" w:eastAsia="zh-CN"/>
+        </w:rPr>
+        <w:t>deg</w:t>
+      </w:r>
+      <w:proofErr w:type="spellEnd"/>
+      <w:r>
+        <w:rPr>
+          <w:rStyle w:val="XMLContent"/>
+          <w:szCs w:val="18"/>
+          <w:lang w:val="en-GB" w:eastAsia="zh-CN"/>
+        </w:rPr>
+        <w:t>)</w:t>
       </w:r>
       <w:r>
         <w:rPr>
@@ -25130,6 +26435,7 @@
         </w:rPr>
         <w:t>&gt;&lt;</w:t>
       </w:r>
+      <w:proofErr w:type="spellStart"/>
       <w:r>
         <w:rPr>
           <w:rStyle w:val="XMLElement"/>
@@ -25138,6 +26444,7 @@
         </w:rPr>
         <w:t>rw</w:t>
       </w:r>
+      <w:proofErr w:type="spellEnd"/>
       <w:r>
         <w:rPr>
           <w:rStyle w:val="XMLBracket"/>
@@ -25162,6 +26469,7 @@
         </w:rPr>
         <w:t>&lt;/</w:t>
       </w:r>
+      <w:proofErr w:type="spellStart"/>
       <w:r>
         <w:rPr>
           <w:rStyle w:val="XMLElement"/>
@@ -25170,6 +26478,7 @@
         </w:rPr>
         <w:t>rw</w:t>
       </w:r>
+      <w:proofErr w:type="spellEnd"/>
       <w:r>
         <w:rPr>
           <w:rStyle w:val="XMLBracket"/>
@@ -25178,6 +26487,7 @@
         </w:rPr>
         <w:t>&gt;&lt;</w:t>
       </w:r>
+      <w:proofErr w:type="spellStart"/>
       <w:r>
         <w:rPr>
           <w:rStyle w:val="XMLElement"/>
@@ -25186,6 +26496,7 @@
         </w:rPr>
         <w:t>bcol</w:t>
       </w:r>
+      <w:proofErr w:type="spellEnd"/>
       <w:r>
         <w:rPr>
           <w:rStyle w:val="XMLBracket"/>
@@ -25210,6 +26521,7 @@
         </w:rPr>
         <w:t>&lt;/</w:t>
       </w:r>
+      <w:proofErr w:type="spellStart"/>
       <w:r>
         <w:rPr>
           <w:rStyle w:val="XMLElement"/>
@@ -25218,6 +26530,7 @@
         </w:rPr>
         <w:t>bcol</w:t>
       </w:r>
+      <w:proofErr w:type="spellEnd"/>
       <w:r>
         <w:rPr>
           <w:rStyle w:val="XMLBracket"/>
@@ -25367,7 +26680,21 @@
               <w:rPr>
                 <w:rStyle w:val="XML"/>
               </w:rPr>
-              <w:t>&amp;lt;</w:t>
+              <w:t>&amp;</w:t>
+            </w:r>
+            <w:proofErr w:type="spellStart"/>
+            <w:r>
+              <w:rPr>
+                <w:rStyle w:val="XML"/>
+              </w:rPr>
+              <w:t>lt</w:t>
+            </w:r>
+            <w:proofErr w:type="spellEnd"/>
+            <w:r>
+              <w:rPr>
+                <w:rStyle w:val="XML"/>
+              </w:rPr>
+              <w:t>;</w:t>
             </w:r>
           </w:p>
         </w:tc>
@@ -25410,7 +26737,21 @@
               <w:rPr>
                 <w:rStyle w:val="XML"/>
               </w:rPr>
-              <w:t>&amp;gt;</w:t>
+              <w:t>&amp;</w:t>
+            </w:r>
+            <w:proofErr w:type="spellStart"/>
+            <w:r>
+              <w:rPr>
+                <w:rStyle w:val="XML"/>
+              </w:rPr>
+              <w:t>gt</w:t>
+            </w:r>
+            <w:proofErr w:type="spellEnd"/>
+            <w:r>
+              <w:rPr>
+                <w:rStyle w:val="XML"/>
+              </w:rPr>
+              <w:t>;</w:t>
             </w:r>
           </w:p>
         </w:tc>
@@ -25453,7 +26794,21 @@
               <w:rPr>
                 <w:rStyle w:val="XML"/>
               </w:rPr>
-              <w:t>&amp;amp;</w:t>
+              <w:t>&amp;</w:t>
+            </w:r>
+            <w:proofErr w:type="spellStart"/>
+            <w:r>
+              <w:rPr>
+                <w:rStyle w:val="XML"/>
+              </w:rPr>
+              <w:t>amp</w:t>
+            </w:r>
+            <w:proofErr w:type="spellEnd"/>
+            <w:r>
+              <w:rPr>
+                <w:rStyle w:val="XML"/>
+              </w:rPr>
+              <w:t>;</w:t>
             </w:r>
           </w:p>
         </w:tc>
@@ -25496,7 +26851,21 @@
               <w:rPr>
                 <w:rStyle w:val="XML"/>
               </w:rPr>
-              <w:t>&amp;apos;</w:t>
+              <w:t>&amp;</w:t>
+            </w:r>
+            <w:proofErr w:type="spellStart"/>
+            <w:r>
+              <w:rPr>
+                <w:rStyle w:val="XML"/>
+              </w:rPr>
+              <w:t>apos</w:t>
+            </w:r>
+            <w:proofErr w:type="spellEnd"/>
+            <w:r>
+              <w:rPr>
+                <w:rStyle w:val="XML"/>
+              </w:rPr>
+              <w:t>;</w:t>
             </w:r>
           </w:p>
         </w:tc>
@@ -25539,7 +26908,21 @@
               <w:rPr>
                 <w:rStyle w:val="XML"/>
               </w:rPr>
-              <w:t>&amp;quot;</w:t>
+              <w:t>&amp;</w:t>
+            </w:r>
+            <w:proofErr w:type="spellStart"/>
+            <w:r>
+              <w:rPr>
+                <w:rStyle w:val="XML"/>
+              </w:rPr>
+              <w:t>quot</w:t>
+            </w:r>
+            <w:proofErr w:type="spellEnd"/>
+            <w:r>
+              <w:rPr>
+                <w:rStyle w:val="XML"/>
+              </w:rPr>
+              <w:t>;</w:t>
             </w:r>
           </w:p>
         </w:tc>
@@ -25609,7 +26992,6 @@
           <w:szCs w:val="22"/>
           <w:lang w:val="en-GB" w:eastAsia="zh-CN"/>
         </w:rPr>
-        <w:lastRenderedPageBreak/>
         <w:t>&lt;</w:t>
       </w:r>
       <w:r>
@@ -25749,7 +27131,15 @@
         <w:rPr>
           <w:lang w:val="en-GB"/>
         </w:rPr>
-        <w:t>The &lt;longdesc</w:t>
+        <w:lastRenderedPageBreak/>
+        <w:t>The &lt;</w:t>
+      </w:r>
+      <w:proofErr w:type="spellStart"/>
+      <w:r>
+        <w:rPr>
+          <w:lang w:val="en-GB"/>
+        </w:rPr>
+        <w:t>longdesc</w:t>
       </w:r>
       <w:r>
         <w:rPr>
@@ -25757,6 +27147,7 @@
         </w:rPr>
         <w:t>r</w:t>
       </w:r>
+      <w:proofErr w:type="spellEnd"/>
       <w:r>
         <w:rPr>
           <w:lang w:val="en-GB"/>
@@ -25778,7 +27169,21 @@
         <w:rPr>
           <w:rStyle w:val="XML"/>
         </w:rPr>
-        <w:t>&lt;longdescr&gt;</w:t>
+        <w:t>&lt;</w:t>
+      </w:r>
+      <w:proofErr w:type="spellStart"/>
+      <w:r>
+        <w:rPr>
+          <w:rStyle w:val="XML"/>
+        </w:rPr>
+        <w:t>longdescr</w:t>
+      </w:r>
+      <w:proofErr w:type="spellEnd"/>
+      <w:r>
+        <w:rPr>
+          <w:rStyle w:val="XML"/>
+        </w:rPr>
+        <w:t>&gt;</w:t>
       </w:r>
       <w:r>
         <w:t xml:space="preserve"> element defines an extended description text that is displayed as a </w:t>
@@ -25830,14 +27235,22 @@
               <w:rPr>
                 <w:rStyle w:val="XML"/>
               </w:rPr>
-              <w:t>&lt;longdesc</w:t>
-            </w:r>
+              <w:t>&lt;</w:t>
+            </w:r>
+            <w:proofErr w:type="spellStart"/>
             <w:r>
               <w:rPr>
                 <w:rStyle w:val="XML"/>
               </w:rPr>
+              <w:t>longdesc</w:t>
+            </w:r>
+            <w:r>
+              <w:rPr>
+                <w:rStyle w:val="XML"/>
+              </w:rPr>
               <w:t>r</w:t>
             </w:r>
+            <w:proofErr w:type="spellEnd"/>
             <w:r>
               <w:rPr>
                 <w:rStyle w:val="XML"/>
@@ -26023,7 +27436,23 @@
           <w:lang w:val="en-GB"/>
         </w:rPr>
         <w:tab/>
-        <w:t>&lt;longdescr&gt;</w:t>
+        <w:t>&lt;</w:t>
+      </w:r>
+      <w:proofErr w:type="spellStart"/>
+      <w:r>
+        <w:rPr>
+          <w:rStyle w:val="XMLElement"/>
+          <w:lang w:val="en-GB"/>
+        </w:rPr>
+        <w:t>longdescr</w:t>
+      </w:r>
+      <w:proofErr w:type="spellEnd"/>
+      <w:r>
+        <w:rPr>
+          <w:rStyle w:val="XMLElement"/>
+          <w:lang w:val="en-GB"/>
+        </w:rPr>
+        <w:t>&gt;</w:t>
       </w:r>
       <w:r>
         <w:rPr>
@@ -26038,7 +27467,23 @@
           <w:rStyle w:val="XMLElement"/>
           <w:lang w:val="en-GB"/>
         </w:rPr>
-        <w:t>&lt;/longdescr&gt;</w:t>
+        <w:t>&lt;/</w:t>
+      </w:r>
+      <w:proofErr w:type="spellStart"/>
+      <w:r>
+        <w:rPr>
+          <w:rStyle w:val="XMLElement"/>
+          <w:lang w:val="en-GB"/>
+        </w:rPr>
+        <w:t>longdescr</w:t>
+      </w:r>
+      <w:proofErr w:type="spellEnd"/>
+      <w:r>
+        <w:rPr>
+          <w:rStyle w:val="XMLElement"/>
+          <w:lang w:val="en-GB"/>
+        </w:rPr>
+        <w:t>&gt;</w:t>
       </w:r>
     </w:p>
     <w:p>
@@ -26105,7 +27550,7 @@
           <w:lang w:val="en-GB"/>
         </w:rPr>
         <w:pict w14:anchorId="56E75F81">
-          <v:shape id="Afbeelding 1" o:spid="_x0000_i1028" type="#_x0000_t75" style="width:345.6pt;height:50.4pt;visibility:visible;mso-wrap-style:square">
+          <v:shape id="Afbeelding 1" o:spid="_x0000_i1028" type="#_x0000_t75" style="width:345.75pt;height:50.25pt;visibility:visible;mso-wrap-style:square">
             <v:imagedata r:id="rId12" o:title=""/>
           </v:shape>
         </w:pict>
@@ -26568,7 +28013,6 @@
               <w:rPr>
                 <w:rStyle w:val="XML"/>
               </w:rPr>
-              <w:lastRenderedPageBreak/>
               <w:t>hex32</w:t>
             </w:r>
           </w:p>
@@ -26744,6 +28188,7 @@
               <w:rPr>
                 <w:rStyle w:val="XML"/>
               </w:rPr>
+              <w:lastRenderedPageBreak/>
               <w:t>ascii16</w:t>
             </w:r>
           </w:p>
@@ -27118,11 +28563,19 @@
       <w:r>
         <w:t xml:space="preserve"> elements. </w:t>
       </w:r>
+      <w:proofErr w:type="spellStart"/>
       <w:r>
         <w:rPr>
           <w:lang w:val="nl-BE"/>
         </w:rPr>
-        <w:t xml:space="preserve">Each </w:t>
+        <w:t>Each</w:t>
+      </w:r>
+      <w:proofErr w:type="spellEnd"/>
+      <w:r>
+        <w:rPr>
+          <w:lang w:val="nl-BE"/>
+        </w:rPr>
+        <w:t xml:space="preserve"> </w:t>
       </w:r>
       <w:r>
         <w:rPr>
@@ -27135,7 +28588,21 @@
         <w:rPr>
           <w:lang w:val="nl-BE"/>
         </w:rPr>
-        <w:t xml:space="preserve"> defines:</w:t>
+        <w:t xml:space="preserve"> </w:t>
+      </w:r>
+      <w:proofErr w:type="spellStart"/>
+      <w:r>
+        <w:rPr>
+          <w:lang w:val="nl-BE"/>
+        </w:rPr>
+        <w:t>defines</w:t>
+      </w:r>
+      <w:proofErr w:type="spellEnd"/>
+      <w:r>
+        <w:rPr>
+          <w:lang w:val="nl-BE"/>
+        </w:rPr>
+        <w:t>:</w:t>
       </w:r>
     </w:p>
     <w:p>
@@ -27156,6 +28623,7 @@
         </w:rPr>
         <w:t xml:space="preserve">a </w:t>
       </w:r>
+      <w:proofErr w:type="spellStart"/>
       <w:r>
         <w:rPr>
           <w:b/>
@@ -27164,6 +28632,7 @@
         </w:rPr>
         <w:t>value</w:t>
       </w:r>
+      <w:proofErr w:type="spellEnd"/>
     </w:p>
     <w:p>
       <w:pPr>
@@ -28267,7 +29736,6 @@
         <w:rPr>
           <w:lang w:val="en-GB"/>
         </w:rPr>
-        <w:lastRenderedPageBreak/>
         <w:t>The &lt;field&gt; element</w:t>
       </w:r>
       <w:bookmarkEnd w:id="63"/>
@@ -28489,7 +29957,22 @@
               <w:rPr>
                 <w:rStyle w:val="XML"/>
               </w:rPr>
-              <w:t>&lt;width&gt;</w:t>
+              <w:lastRenderedPageBreak/>
+              <w:t>&lt;</w:t>
+            </w:r>
+            <w:proofErr w:type="spellStart"/>
+            <w:r>
+              <w:rPr>
+                <w:rStyle w:val="XML"/>
+              </w:rPr>
+              <w:t>width</w:t>
+            </w:r>
+            <w:proofErr w:type="spellEnd"/>
+            <w:r>
+              <w:rPr>
+                <w:rStyle w:val="XML"/>
+              </w:rPr>
+              <w:t>&gt;</w:t>
             </w:r>
           </w:p>
         </w:tc>
@@ -28520,12 +30003,14 @@
             <w:r>
               <w:t xml:space="preserve"> </w:t>
             </w:r>
+            <w:proofErr w:type="spellStart"/>
             <w:r>
               <w:rPr>
                 <w:lang w:val="nl-BE"/>
               </w:rPr>
               <w:t>Optional</w:t>
             </w:r>
+            <w:proofErr w:type="spellEnd"/>
             <w:r>
               <w:rPr>
                 <w:lang w:val="nl-BE"/>
@@ -28573,7 +30058,21 @@
               <w:rPr>
                 <w:rStyle w:val="XML"/>
               </w:rPr>
-              <w:t xml:space="preserve">&lt;text&gt; </w:t>
+              <w:t>&lt;</w:t>
+            </w:r>
+            <w:proofErr w:type="spellStart"/>
+            <w:r>
+              <w:rPr>
+                <w:rStyle w:val="XML"/>
+              </w:rPr>
+              <w:t>text</w:t>
+            </w:r>
+            <w:proofErr w:type="spellEnd"/>
+            <w:r>
+              <w:rPr>
+                <w:rStyle w:val="XML"/>
+              </w:rPr>
+              <w:t xml:space="preserve">&gt; </w:t>
             </w:r>
           </w:p>
         </w:tc>
@@ -28676,14 +30175,22 @@
               <w:rPr>
                 <w:rStyle w:val="XML"/>
               </w:rPr>
-              <w:t>&lt;longdesc</w:t>
-            </w:r>
+              <w:t>&lt;</w:t>
+            </w:r>
+            <w:proofErr w:type="spellStart"/>
             <w:r>
               <w:rPr>
                 <w:rStyle w:val="XML"/>
               </w:rPr>
+              <w:t>longdesc</w:t>
+            </w:r>
+            <w:r>
+              <w:rPr>
+                <w:rStyle w:val="XML"/>
+              </w:rPr>
               <w:t>r</w:t>
             </w:r>
+            <w:proofErr w:type="spellEnd"/>
             <w:r>
               <w:rPr>
                 <w:rStyle w:val="XML"/>
@@ -28804,8 +30311,30 @@
               <w:rPr>
                 <w:lang w:val="nl-BE"/>
               </w:rPr>
-              <w:t>int — signed decimal</w:t>
-            </w:r>
+              <w:t xml:space="preserve">int — </w:t>
+            </w:r>
+            <w:proofErr w:type="spellStart"/>
+            <w:r>
+              <w:rPr>
+                <w:lang w:val="nl-BE"/>
+              </w:rPr>
+              <w:t>signed</w:t>
+            </w:r>
+            <w:proofErr w:type="spellEnd"/>
+            <w:r>
+              <w:rPr>
+                <w:lang w:val="nl-BE"/>
+              </w:rPr>
+              <w:t xml:space="preserve"> </w:t>
+            </w:r>
+            <w:proofErr w:type="spellStart"/>
+            <w:r>
+              <w:rPr>
+                <w:lang w:val="nl-BE"/>
+              </w:rPr>
+              <w:t>decimal</w:t>
+            </w:r>
+            <w:proofErr w:type="spellEnd"/>
           </w:p>
           <w:p>
             <w:pPr>
@@ -28823,8 +30352,30 @@
               <w:rPr>
                 <w:lang w:val="nl-BE"/>
               </w:rPr>
-              <w:t>uint — unsigned decimal</w:t>
-            </w:r>
+              <w:t xml:space="preserve">uint — </w:t>
+            </w:r>
+            <w:proofErr w:type="spellStart"/>
+            <w:r>
+              <w:rPr>
+                <w:lang w:val="nl-BE"/>
+              </w:rPr>
+              <w:t>unsigned</w:t>
+            </w:r>
+            <w:proofErr w:type="spellEnd"/>
+            <w:r>
+              <w:rPr>
+                <w:lang w:val="nl-BE"/>
+              </w:rPr>
+              <w:t xml:space="preserve"> </w:t>
+            </w:r>
+            <w:proofErr w:type="spellStart"/>
+            <w:r>
+              <w:rPr>
+                <w:lang w:val="nl-BE"/>
+              </w:rPr>
+              <w:t>decimal</w:t>
+            </w:r>
+            <w:proofErr w:type="spellEnd"/>
           </w:p>
           <w:p>
             <w:pPr>
@@ -28838,12 +30389,28 @@
                 <w:lang w:val="nl-BE"/>
               </w:rPr>
             </w:pPr>
+            <w:proofErr w:type="spellStart"/>
             <w:r>
               <w:rPr>
                 <w:lang w:val="nl-BE"/>
               </w:rPr>
-              <w:t>hex — hexadecimal</w:t>
-            </w:r>
+              <w:t>hex</w:t>
+            </w:r>
+            <w:proofErr w:type="spellEnd"/>
+            <w:r>
+              <w:rPr>
+                <w:lang w:val="nl-BE"/>
+              </w:rPr>
+              <w:t xml:space="preserve"> — </w:t>
+            </w:r>
+            <w:proofErr w:type="spellStart"/>
+            <w:r>
+              <w:rPr>
+                <w:lang w:val="nl-BE"/>
+              </w:rPr>
+              <w:t>hexadecimal</w:t>
+            </w:r>
+            <w:proofErr w:type="spellEnd"/>
           </w:p>
           <w:p>
             <w:pPr>
@@ -28861,8 +30428,16 @@
               <w:rPr>
                 <w:lang w:val="nl-BE"/>
               </w:rPr>
-              <w:t>bin — binary</w:t>
-            </w:r>
+              <w:t xml:space="preserve">bin — </w:t>
+            </w:r>
+            <w:proofErr w:type="spellStart"/>
+            <w:r>
+              <w:rPr>
+                <w:lang w:val="nl-BE"/>
+              </w:rPr>
+              <w:t>binary</w:t>
+            </w:r>
+            <w:proofErr w:type="spellEnd"/>
           </w:p>
           <w:p>
             <w:pPr>
@@ -28893,7 +30468,21 @@
               <w:rPr>
                 <w:rStyle w:val="XML"/>
               </w:rPr>
-              <w:t>&lt;minlen&gt;</w:t>
+              <w:t>&lt;</w:t>
+            </w:r>
+            <w:proofErr w:type="spellStart"/>
+            <w:r>
+              <w:rPr>
+                <w:rStyle w:val="XML"/>
+              </w:rPr>
+              <w:t>minlen</w:t>
+            </w:r>
+            <w:proofErr w:type="spellEnd"/>
+            <w:r>
+              <w:rPr>
+                <w:rStyle w:val="XML"/>
+              </w:rPr>
+              <w:t>&gt;</w:t>
             </w:r>
           </w:p>
         </w:tc>
@@ -28929,12 +30518,14 @@
                 <w:rFonts w:hint="eastAsia"/>
               </w:rPr>
             </w:pPr>
+            <w:proofErr w:type="spellStart"/>
             <w:r>
               <w:rPr>
                 <w:lang w:val="nl-BE"/>
               </w:rPr>
               <w:t>Optional</w:t>
             </w:r>
+            <w:proofErr w:type="spellEnd"/>
             <w:r>
               <w:rPr>
                 <w:lang w:val="nl-BE"/>
@@ -28982,7 +30573,21 @@
               <w:rPr>
                 <w:rStyle w:val="XML"/>
               </w:rPr>
-              <w:t>&lt;fcol&gt;</w:t>
+              <w:t>&lt;</w:t>
+            </w:r>
+            <w:proofErr w:type="spellStart"/>
+            <w:r>
+              <w:rPr>
+                <w:rStyle w:val="XML"/>
+              </w:rPr>
+              <w:t>fcol</w:t>
+            </w:r>
+            <w:proofErr w:type="spellEnd"/>
+            <w:r>
+              <w:rPr>
+                <w:rStyle w:val="XML"/>
+              </w:rPr>
+              <w:t>&gt;</w:t>
             </w:r>
           </w:p>
         </w:tc>
@@ -29067,7 +30672,35 @@
               <w:rPr>
                 <w:rStyle w:val="Kruisverwijzing"/>
               </w:rPr>
-              <w:t>The &lt;fcol&gt; and &lt;bcol&gt; elements</w:t>
+              <w:t>The &lt;</w:t>
+            </w:r>
+            <w:proofErr w:type="spellStart"/>
+            <w:r>
+              <w:rPr>
+                <w:rStyle w:val="Kruisverwijzing"/>
+              </w:rPr>
+              <w:t>fcol</w:t>
+            </w:r>
+            <w:proofErr w:type="spellEnd"/>
+            <w:r>
+              <w:rPr>
+                <w:rStyle w:val="Kruisverwijzing"/>
+              </w:rPr>
+              <w:t>&gt; and &lt;</w:t>
+            </w:r>
+            <w:proofErr w:type="spellStart"/>
+            <w:r>
+              <w:rPr>
+                <w:rStyle w:val="Kruisverwijzing"/>
+              </w:rPr>
+              <w:t>bcol</w:t>
+            </w:r>
+            <w:proofErr w:type="spellEnd"/>
+            <w:r>
+              <w:rPr>
+                <w:rStyle w:val="Kruisverwijzing"/>
+              </w:rPr>
+              <w:t>&gt; elements</w:t>
             </w:r>
             <w:r>
               <w:rPr>
@@ -29098,7 +30731,21 @@
               <w:rPr>
                 <w:rStyle w:val="XML"/>
               </w:rPr>
-              <w:t xml:space="preserve">&lt;bcol&gt; </w:t>
+              <w:t>&lt;</w:t>
+            </w:r>
+            <w:proofErr w:type="spellStart"/>
+            <w:r>
+              <w:rPr>
+                <w:rStyle w:val="XML"/>
+              </w:rPr>
+              <w:t>bcol</w:t>
+            </w:r>
+            <w:proofErr w:type="spellEnd"/>
+            <w:r>
+              <w:rPr>
+                <w:rStyle w:val="XML"/>
+              </w:rPr>
+              <w:t xml:space="preserve">&gt; </w:t>
             </w:r>
           </w:p>
         </w:tc>
@@ -29186,7 +30833,35 @@
               <w:rPr>
                 <w:rStyle w:val="Kruisverwijzing"/>
               </w:rPr>
-              <w:t>The &lt;fcol&gt; and &lt;bcol&gt; elements</w:t>
+              <w:t>The &lt;</w:t>
+            </w:r>
+            <w:proofErr w:type="spellStart"/>
+            <w:r>
+              <w:rPr>
+                <w:rStyle w:val="Kruisverwijzing"/>
+              </w:rPr>
+              <w:t>fcol</w:t>
+            </w:r>
+            <w:proofErr w:type="spellEnd"/>
+            <w:r>
+              <w:rPr>
+                <w:rStyle w:val="Kruisverwijzing"/>
+              </w:rPr>
+              <w:t>&gt; and &lt;</w:t>
+            </w:r>
+            <w:proofErr w:type="spellStart"/>
+            <w:r>
+              <w:rPr>
+                <w:rStyle w:val="Kruisverwijzing"/>
+              </w:rPr>
+              <w:t>bcol</w:t>
+            </w:r>
+            <w:proofErr w:type="spellEnd"/>
+            <w:r>
+              <w:rPr>
+                <w:rStyle w:val="Kruisverwijzing"/>
+              </w:rPr>
+              <w:t>&gt; elements</w:t>
             </w:r>
             <w:r>
               <w:rPr>
@@ -29253,6 +30928,7 @@
         </w:rPr>
         <w:t>&gt;&lt;</w:t>
       </w:r>
+      <w:proofErr w:type="spellStart"/>
       <w:r>
         <w:rPr>
           <w:rStyle w:val="XMLElement"/>
@@ -29260,6 +30936,7 @@
         </w:rPr>
         <w:t>pos</w:t>
       </w:r>
+      <w:proofErr w:type="spellEnd"/>
       <w:r>
         <w:rPr>
           <w:rStyle w:val="XMLBracket"/>
@@ -29281,6 +30958,7 @@
         </w:rPr>
         <w:t>&lt;/</w:t>
       </w:r>
+      <w:proofErr w:type="spellStart"/>
       <w:r>
         <w:rPr>
           <w:rStyle w:val="XMLElement"/>
@@ -29288,6 +30966,7 @@
         </w:rPr>
         <w:t>pos</w:t>
       </w:r>
+      <w:proofErr w:type="spellEnd"/>
       <w:r>
         <w:rPr>
           <w:rStyle w:val="XMLBracket"/>
@@ -29822,6 +31501,7 @@
         </w:rPr>
         <w:t>&gt;&lt;</w:t>
       </w:r>
+      <w:proofErr w:type="spellStart"/>
       <w:r>
         <w:rPr>
           <w:rStyle w:val="XMLElement"/>
@@ -29831,6 +31511,7 @@
         </w:rPr>
         <w:t>minlen</w:t>
       </w:r>
+      <w:proofErr w:type="spellEnd"/>
       <w:r>
         <w:rPr>
           <w:rStyle w:val="XMLBracket"/>
@@ -29858,6 +31539,7 @@
         </w:rPr>
         <w:t>&lt;/</w:t>
       </w:r>
+      <w:proofErr w:type="spellStart"/>
       <w:r>
         <w:rPr>
           <w:rStyle w:val="XMLElement"/>
@@ -29867,6 +31549,7 @@
         </w:rPr>
         <w:t>minlen</w:t>
       </w:r>
+      <w:proofErr w:type="spellEnd"/>
       <w:r>
         <w:rPr>
           <w:rStyle w:val="XMLBracket"/>
@@ -29876,6 +31559,7 @@
         </w:rPr>
         <w:t>&gt;&lt;</w:t>
       </w:r>
+      <w:proofErr w:type="spellStart"/>
       <w:r>
         <w:rPr>
           <w:rStyle w:val="XMLElement"/>
@@ -29885,6 +31569,7 @@
         </w:rPr>
         <w:t>rw</w:t>
       </w:r>
+      <w:proofErr w:type="spellEnd"/>
       <w:r>
         <w:rPr>
           <w:rStyle w:val="XMLBracket"/>
@@ -29912,6 +31597,7 @@
         </w:rPr>
         <w:t>&lt;/</w:t>
       </w:r>
+      <w:proofErr w:type="spellStart"/>
       <w:r>
         <w:rPr>
           <w:rStyle w:val="XMLElement"/>
@@ -29921,6 +31607,7 @@
         </w:rPr>
         <w:t>rw</w:t>
       </w:r>
+      <w:proofErr w:type="spellEnd"/>
       <w:r>
         <w:rPr>
           <w:rStyle w:val="XMLBracket"/>
@@ -29976,6 +31663,7 @@
         </w:rPr>
         <w:t>&gt;&lt;</w:t>
       </w:r>
+      <w:proofErr w:type="spellStart"/>
       <w:r>
         <w:rPr>
           <w:rStyle w:val="XMLElement"/>
@@ -29985,6 +31673,7 @@
         </w:rPr>
         <w:t>pos</w:t>
       </w:r>
+      <w:proofErr w:type="spellEnd"/>
       <w:r>
         <w:rPr>
           <w:rStyle w:val="XMLBracket"/>
@@ -30012,6 +31701,7 @@
         </w:rPr>
         <w:t>&lt;/</w:t>
       </w:r>
+      <w:proofErr w:type="spellStart"/>
       <w:r>
         <w:rPr>
           <w:rStyle w:val="XMLElement"/>
@@ -30021,6 +31711,7 @@
         </w:rPr>
         <w:t>pos</w:t>
       </w:r>
+      <w:proofErr w:type="spellEnd"/>
       <w:r>
         <w:rPr>
           <w:rStyle w:val="XMLBracket"/>
@@ -30148,6 +31839,7 @@
         </w:rPr>
         <w:t>&gt;&lt;</w:t>
       </w:r>
+      <w:proofErr w:type="spellStart"/>
       <w:r>
         <w:rPr>
           <w:rStyle w:val="XMLElement"/>
@@ -30157,6 +31849,7 @@
         </w:rPr>
         <w:t>pos</w:t>
       </w:r>
+      <w:proofErr w:type="spellEnd"/>
       <w:r>
         <w:rPr>
           <w:rStyle w:val="XMLBracket"/>
@@ -30184,6 +31877,7 @@
         </w:rPr>
         <w:t>&lt;/</w:t>
       </w:r>
+      <w:proofErr w:type="spellStart"/>
       <w:r>
         <w:rPr>
           <w:rStyle w:val="XMLElement"/>
@@ -30193,6 +31887,7 @@
         </w:rPr>
         <w:t>pos</w:t>
       </w:r>
+      <w:proofErr w:type="spellEnd"/>
       <w:r>
         <w:rPr>
           <w:rStyle w:val="XMLBracket"/>
@@ -30320,6 +32015,7 @@
         </w:rPr>
         <w:t>&gt;&lt;</w:t>
       </w:r>
+      <w:proofErr w:type="spellStart"/>
       <w:r>
         <w:rPr>
           <w:rStyle w:val="XMLElement"/>
@@ -30329,6 +32025,7 @@
         </w:rPr>
         <w:t>pos</w:t>
       </w:r>
+      <w:proofErr w:type="spellEnd"/>
       <w:r>
         <w:rPr>
           <w:rStyle w:val="XMLBracket"/>
@@ -30356,6 +32053,7 @@
         </w:rPr>
         <w:t>&lt;/</w:t>
       </w:r>
+      <w:proofErr w:type="spellStart"/>
       <w:r>
         <w:rPr>
           <w:rStyle w:val="XMLElement"/>
@@ -30365,6 +32063,7 @@
         </w:rPr>
         <w:t>pos</w:t>
       </w:r>
+      <w:proofErr w:type="spellEnd"/>
       <w:r>
         <w:rPr>
           <w:rStyle w:val="XMLBracket"/>
@@ -30492,6 +32191,7 @@
         </w:rPr>
         <w:t>&gt;&lt;</w:t>
       </w:r>
+      <w:proofErr w:type="spellStart"/>
       <w:r>
         <w:rPr>
           <w:rStyle w:val="XMLElement"/>
@@ -30501,6 +32201,7 @@
         </w:rPr>
         <w:t>pos</w:t>
       </w:r>
+      <w:proofErr w:type="spellEnd"/>
       <w:r>
         <w:rPr>
           <w:rStyle w:val="XMLBracket"/>
@@ -30528,6 +32229,7 @@
         </w:rPr>
         <w:t>&lt;/</w:t>
       </w:r>
+      <w:proofErr w:type="spellStart"/>
       <w:r>
         <w:rPr>
           <w:rStyle w:val="XMLElement"/>
@@ -30537,6 +32239,7 @@
         </w:rPr>
         <w:t>pos</w:t>
       </w:r>
+      <w:proofErr w:type="spellEnd"/>
       <w:r>
         <w:rPr>
           <w:rStyle w:val="XMLBracket"/>
@@ -30666,7 +32369,35 @@
         <w:rPr>
           <w:lang w:val="en-GB"/>
         </w:rPr>
-        <w:t>The &lt;fcol&gt; and &lt;bcol&gt; elements</w:t>
+        <w:t>The &lt;</w:t>
+      </w:r>
+      <w:proofErr w:type="spellStart"/>
+      <w:r>
+        <w:rPr>
+          <w:lang w:val="en-GB"/>
+        </w:rPr>
+        <w:t>fcol</w:t>
+      </w:r>
+      <w:proofErr w:type="spellEnd"/>
+      <w:r>
+        <w:rPr>
+          <w:lang w:val="en-GB"/>
+        </w:rPr>
+        <w:t>&gt; and &lt;</w:t>
+      </w:r>
+      <w:proofErr w:type="spellStart"/>
+      <w:r>
+        <w:rPr>
+          <w:lang w:val="en-GB"/>
+        </w:rPr>
+        <w:t>bcol</w:t>
+      </w:r>
+      <w:proofErr w:type="spellEnd"/>
+      <w:r>
+        <w:rPr>
+          <w:lang w:val="en-GB"/>
+        </w:rPr>
+        <w:t>&gt; elements</w:t>
       </w:r>
       <w:bookmarkEnd w:id="65"/>
       <w:bookmarkEnd w:id="66"/>
@@ -30689,7 +32420,21 @@
         <w:rPr>
           <w:rStyle w:val="XML"/>
         </w:rPr>
-        <w:t>&lt;fcol&gt;</w:t>
+        <w:t>&lt;</w:t>
+      </w:r>
+      <w:proofErr w:type="spellStart"/>
+      <w:r>
+        <w:rPr>
+          <w:rStyle w:val="XML"/>
+        </w:rPr>
+        <w:t>fcol</w:t>
+      </w:r>
+      <w:proofErr w:type="spellEnd"/>
+      <w:r>
+        <w:rPr>
+          <w:rStyle w:val="XML"/>
+        </w:rPr>
+        <w:t>&gt;</w:t>
       </w:r>
       <w:r>
         <w:t xml:space="preserve"> and </w:t>
@@ -30698,7 +32443,21 @@
         <w:rPr>
           <w:rStyle w:val="XML"/>
         </w:rPr>
-        <w:t>&lt;bcol&gt;</w:t>
+        <w:t>&lt;</w:t>
+      </w:r>
+      <w:proofErr w:type="spellStart"/>
+      <w:r>
+        <w:rPr>
+          <w:rStyle w:val="XML"/>
+        </w:rPr>
+        <w:t>bcol</w:t>
+      </w:r>
+      <w:proofErr w:type="spellEnd"/>
+      <w:r>
+        <w:rPr>
+          <w:rStyle w:val="XML"/>
+        </w:rPr>
+        <w:t>&gt;</w:t>
       </w:r>
       <w:r>
         <w:t xml:space="preserve"> elements define the </w:t>
@@ -30803,11 +32562,7 @@
         <w:t>0–255</w:t>
       </w:r>
       <w:r>
-        <w:t xml:space="preserve">, separated by </w:t>
-      </w:r>
-      <w:r>
-        <w:lastRenderedPageBreak/>
-        <w:t>commas.</w:t>
+        <w:t>, separated by commas.</w:t>
       </w:r>
       <w:r>
         <w:t xml:space="preserve"> </w:t>
@@ -30860,6 +32615,7 @@
               </w:rPr>
               <w:t>&lt;</w:t>
             </w:r>
+            <w:proofErr w:type="spellStart"/>
             <w:r>
               <w:rPr>
                 <w:rStyle w:val="XMLElement"/>
@@ -30867,6 +32623,7 @@
               </w:rPr>
               <w:t>bcol</w:t>
             </w:r>
+            <w:proofErr w:type="spellEnd"/>
             <w:r>
               <w:rPr>
                 <w:rStyle w:val="XMLBracket"/>
@@ -30888,6 +32645,7 @@
               </w:rPr>
               <w:t>&lt;/</w:t>
             </w:r>
+            <w:proofErr w:type="spellStart"/>
             <w:r>
               <w:rPr>
                 <w:rStyle w:val="XMLElement"/>
@@ -30895,6 +32653,7 @@
               </w:rPr>
               <w:t>bcol</w:t>
             </w:r>
+            <w:proofErr w:type="spellEnd"/>
             <w:r>
               <w:rPr>
                 <w:rStyle w:val="XMLBracket"/>
@@ -30916,11 +32675,19 @@
                 <w:lang w:val="nl-BE"/>
               </w:rPr>
             </w:pPr>
+            <w:proofErr w:type="spellStart"/>
             <w:r>
               <w:rPr>
                 <w:lang w:val="nl-BE"/>
               </w:rPr>
-              <w:t>Bright red background</w:t>
+              <w:t>Bright</w:t>
+            </w:r>
+            <w:proofErr w:type="spellEnd"/>
+            <w:r>
+              <w:rPr>
+                <w:lang w:val="nl-BE"/>
+              </w:rPr>
+              <w:t xml:space="preserve"> red background</w:t>
             </w:r>
           </w:p>
         </w:tc>
@@ -30951,6 +32718,7 @@
               </w:rPr>
               <w:t>&lt;</w:t>
             </w:r>
+            <w:proofErr w:type="spellStart"/>
             <w:r>
               <w:rPr>
                 <w:rStyle w:val="XMLElement"/>
@@ -30958,6 +32726,7 @@
               </w:rPr>
               <w:t>bcol</w:t>
             </w:r>
+            <w:proofErr w:type="spellEnd"/>
             <w:r>
               <w:rPr>
                 <w:rStyle w:val="XMLBracket"/>
@@ -30979,6 +32748,7 @@
               </w:rPr>
               <w:t>&lt;/</w:t>
             </w:r>
+            <w:proofErr w:type="spellStart"/>
             <w:r>
               <w:rPr>
                 <w:rStyle w:val="XMLElement"/>
@@ -30986,6 +32756,7 @@
               </w:rPr>
               <w:t>bcol</w:t>
             </w:r>
+            <w:proofErr w:type="spellEnd"/>
             <w:r>
               <w:rPr>
                 <w:rStyle w:val="XMLBracket"/>
@@ -31007,11 +32778,19 @@
                 <w:lang w:val="nl-BE"/>
               </w:rPr>
             </w:pPr>
+            <w:proofErr w:type="spellStart"/>
             <w:r>
               <w:rPr>
                 <w:lang w:val="nl-BE"/>
               </w:rPr>
-              <w:t>Bright green background</w:t>
+              <w:t>Bright</w:t>
+            </w:r>
+            <w:proofErr w:type="spellEnd"/>
+            <w:r>
+              <w:rPr>
+                <w:lang w:val="nl-BE"/>
+              </w:rPr>
+              <w:t xml:space="preserve"> green background</w:t>
             </w:r>
           </w:p>
         </w:tc>
@@ -31042,6 +32821,7 @@
               </w:rPr>
               <w:t>&lt;</w:t>
             </w:r>
+            <w:proofErr w:type="spellStart"/>
             <w:r>
               <w:rPr>
                 <w:rStyle w:val="XMLElement"/>
@@ -31049,6 +32829,7 @@
               </w:rPr>
               <w:t>bcol</w:t>
             </w:r>
+            <w:proofErr w:type="spellEnd"/>
             <w:r>
               <w:rPr>
                 <w:rStyle w:val="XMLBracket"/>
@@ -31070,6 +32851,7 @@
               </w:rPr>
               <w:t>&lt;/</w:t>
             </w:r>
+            <w:proofErr w:type="spellStart"/>
             <w:r>
               <w:rPr>
                 <w:rStyle w:val="XMLElement"/>
@@ -31077,6 +32859,7 @@
               </w:rPr>
               <w:t>bcol</w:t>
             </w:r>
+            <w:proofErr w:type="spellEnd"/>
             <w:r>
               <w:rPr>
                 <w:rStyle w:val="XMLBracket"/>
@@ -31102,7 +32885,21 @@
               <w:rPr>
                 <w:lang w:val="nl-BE"/>
               </w:rPr>
-              <w:t>Soft yellow background</w:t>
+              <w:t xml:space="preserve">Soft </w:t>
+            </w:r>
+            <w:proofErr w:type="spellStart"/>
+            <w:r>
+              <w:rPr>
+                <w:lang w:val="nl-BE"/>
+              </w:rPr>
+              <w:t>yellow</w:t>
+            </w:r>
+            <w:proofErr w:type="spellEnd"/>
+            <w:r>
+              <w:rPr>
+                <w:lang w:val="nl-BE"/>
+              </w:rPr>
+              <w:t xml:space="preserve"> background</w:t>
             </w:r>
           </w:p>
         </w:tc>
@@ -31134,6 +32931,7 @@
               </w:rPr>
               <w:t>&lt;</w:t>
             </w:r>
+            <w:proofErr w:type="spellStart"/>
             <w:r>
               <w:rPr>
                 <w:rStyle w:val="XMLElement"/>
@@ -31141,6 +32939,7 @@
               </w:rPr>
               <w:t>bcol</w:t>
             </w:r>
+            <w:proofErr w:type="spellEnd"/>
             <w:r>
               <w:rPr>
                 <w:rStyle w:val="XMLBracket"/>
@@ -31162,6 +32961,7 @@
               </w:rPr>
               <w:t>&lt;/</w:t>
             </w:r>
+            <w:proofErr w:type="spellStart"/>
             <w:r>
               <w:rPr>
                 <w:rStyle w:val="XMLElement"/>
@@ -31169,6 +32969,7 @@
               </w:rPr>
               <w:t>bcol</w:t>
             </w:r>
+            <w:proofErr w:type="spellEnd"/>
             <w:r>
               <w:rPr>
                 <w:rStyle w:val="XMLBracket"/>
@@ -31190,11 +32991,19 @@
                 <w:lang w:val="nl-BE"/>
               </w:rPr>
             </w:pPr>
+            <w:proofErr w:type="spellStart"/>
             <w:r>
               <w:rPr>
                 <w:lang w:val="nl-BE"/>
               </w:rPr>
-              <w:t xml:space="preserve">Grey </w:t>
+              <w:t>Grey</w:t>
+            </w:r>
+            <w:proofErr w:type="spellEnd"/>
+            <w:r>
+              <w:rPr>
+                <w:lang w:val="nl-BE"/>
+              </w:rPr>
+              <w:t xml:space="preserve"> </w:t>
             </w:r>
             <w:r>
               <w:rPr>
@@ -31242,6 +33051,7 @@
         <w:br/>
       </w:r>
       <w:r>
+        <w:lastRenderedPageBreak/>
         <w:t>Specify the color using a hexadecimal HTML color code:</w:t>
       </w:r>
       <w:r>
@@ -31309,6 +33119,7 @@
               </w:rPr>
               <w:t>&lt;</w:t>
             </w:r>
+            <w:proofErr w:type="spellStart"/>
             <w:r>
               <w:rPr>
                 <w:rStyle w:val="XMLElement"/>
@@ -31316,6 +33127,7 @@
               </w:rPr>
               <w:t>bcol</w:t>
             </w:r>
+            <w:proofErr w:type="spellEnd"/>
             <w:r>
               <w:rPr>
                 <w:rStyle w:val="XMLBracket"/>
@@ -31364,11 +33176,19 @@
                 <w:rFonts w:hint="eastAsia"/>
               </w:rPr>
             </w:pPr>
+            <w:proofErr w:type="spellStart"/>
             <w:r>
               <w:rPr>
                 <w:lang w:val="nl-BE"/>
               </w:rPr>
-              <w:t>Bright red background</w:t>
+              <w:t>Bright</w:t>
+            </w:r>
+            <w:proofErr w:type="spellEnd"/>
+            <w:r>
+              <w:rPr>
+                <w:lang w:val="nl-BE"/>
+              </w:rPr>
+              <w:t xml:space="preserve"> red background</w:t>
             </w:r>
           </w:p>
         </w:tc>
@@ -31399,6 +33219,7 @@
               </w:rPr>
               <w:t>&lt;</w:t>
             </w:r>
+            <w:proofErr w:type="spellStart"/>
             <w:r>
               <w:rPr>
                 <w:rStyle w:val="XMLElement"/>
@@ -31406,6 +33227,7 @@
               </w:rPr>
               <w:t>bcol</w:t>
             </w:r>
+            <w:proofErr w:type="spellEnd"/>
             <w:r>
               <w:rPr>
                 <w:rStyle w:val="XMLBracket"/>
@@ -31455,11 +33277,19 @@
                 <w:lang w:val="nl-BE"/>
               </w:rPr>
             </w:pPr>
+            <w:proofErr w:type="spellStart"/>
             <w:r>
               <w:rPr>
                 <w:lang w:val="nl-BE"/>
               </w:rPr>
-              <w:t>Bright green background</w:t>
+              <w:t>Bright</w:t>
+            </w:r>
+            <w:proofErr w:type="spellEnd"/>
+            <w:r>
+              <w:rPr>
+                <w:lang w:val="nl-BE"/>
+              </w:rPr>
+              <w:t xml:space="preserve"> green background</w:t>
             </w:r>
           </w:p>
         </w:tc>
@@ -31478,7 +33308,21 @@
         <w:rPr>
           <w:lang w:val="en-GB"/>
         </w:rPr>
-        <w:t>The &lt;autostart&gt; element</w:t>
+        <w:t>The &lt;</w:t>
+      </w:r>
+      <w:proofErr w:type="spellStart"/>
+      <w:r>
+        <w:rPr>
+          <w:lang w:val="en-GB"/>
+        </w:rPr>
+        <w:t>autostart</w:t>
+      </w:r>
+      <w:proofErr w:type="spellEnd"/>
+      <w:r>
+        <w:rPr>
+          <w:lang w:val="en-GB"/>
+        </w:rPr>
+        <w:t>&gt; element</w:t>
       </w:r>
       <w:bookmarkEnd w:id="72"/>
     </w:p>
@@ -31496,7 +33340,21 @@
         <w:rPr>
           <w:rStyle w:val="XML"/>
         </w:rPr>
-        <w:t>&lt;autostart&gt;</w:t>
+        <w:t>&lt;</w:t>
+      </w:r>
+      <w:proofErr w:type="spellStart"/>
+      <w:r>
+        <w:rPr>
+          <w:rStyle w:val="XML"/>
+        </w:rPr>
+        <w:t>autostart</w:t>
+      </w:r>
+      <w:proofErr w:type="spellEnd"/>
+      <w:r>
+        <w:rPr>
+          <w:rStyle w:val="XML"/>
+        </w:rPr>
+        <w:t>&gt;</w:t>
       </w:r>
       <w:r>
         <w:t xml:space="preserve"> element controls whether communication with the Modbus device is started </w:t>
@@ -31536,7 +33394,21 @@
         <w:rPr>
           <w:rStyle w:val="XML"/>
         </w:rPr>
-        <w:t>&lt;autostart&gt;</w:t>
+        <w:t>&lt;</w:t>
+      </w:r>
+      <w:proofErr w:type="spellStart"/>
+      <w:r>
+        <w:rPr>
+          <w:rStyle w:val="XML"/>
+        </w:rPr>
+        <w:t>autostart</w:t>
+      </w:r>
+      <w:proofErr w:type="spellEnd"/>
+      <w:r>
+        <w:rPr>
+          <w:rStyle w:val="XML"/>
+        </w:rPr>
+        <w:t>&gt;</w:t>
       </w:r>
       <w:r>
         <w:t xml:space="preserve"> element is present</w:t>
@@ -31569,8 +33441,18 @@
           <w:bCs/>
           <w:lang w:val="nl-BE"/>
         </w:rPr>
-        <w:t>starts automatically</w:t>
-      </w:r>
+        <w:t xml:space="preserve">starts </w:t>
+      </w:r>
+      <w:proofErr w:type="spellStart"/>
+      <w:r>
+        <w:rPr>
+          <w:b/>
+          <w:bCs/>
+          <w:lang w:val="nl-BE"/>
+        </w:rPr>
+        <w:t>automatically</w:t>
+      </w:r>
+      <w:proofErr w:type="spellEnd"/>
     </w:p>
     <w:p>
       <w:pPr>
@@ -31611,10 +33493,40 @@
         <w:rPr>
           <w:rStyle w:val="XML"/>
         </w:rPr>
-        <w:t>&lt;autostart&gt;</w:t>
-      </w:r>
-      <w:r>
-        <w:t xml:space="preserve"> element is defined, the autostart behavior is determined by its child elements.</w:t>
+        <w:t>&lt;</w:t>
+      </w:r>
+      <w:proofErr w:type="spellStart"/>
+      <w:r>
+        <w:rPr>
+          <w:rStyle w:val="XML"/>
+        </w:rPr>
+        <w:t>autostart</w:t>
+      </w:r>
+      <w:proofErr w:type="spellEnd"/>
+      <w:r>
+        <w:rPr>
+          <w:rStyle w:val="XML"/>
+        </w:rPr>
+        <w:t>&gt;</w:t>
+      </w:r>
+      <w:r>
+        <w:t xml:space="preserve"> element is defined, the </w:t>
+      </w:r>
+      <w:proofErr w:type="spellStart"/>
+      <w:r>
+        <w:t>autostart</w:t>
+      </w:r>
+      <w:proofErr w:type="spellEnd"/>
+      <w:r>
+        <w:t xml:space="preserve"> </w:t>
+      </w:r>
+      <w:proofErr w:type="spellStart"/>
+      <w:r>
+        <w:t>behavior</w:t>
+      </w:r>
+      <w:proofErr w:type="spellEnd"/>
+      <w:r>
+        <w:t xml:space="preserve"> is determined by its child elements.</w:t>
       </w:r>
     </w:p>
     <w:p>
@@ -31631,7 +33543,21 @@
         <w:rPr>
           <w:rStyle w:val="XML"/>
         </w:rPr>
-        <w:t>&lt;autostart&gt;</w:t>
+        <w:t>&lt;</w:t>
+      </w:r>
+      <w:proofErr w:type="spellStart"/>
+      <w:r>
+        <w:rPr>
+          <w:rStyle w:val="XML"/>
+        </w:rPr>
+        <w:t>autostart</w:t>
+      </w:r>
+      <w:proofErr w:type="spellEnd"/>
+      <w:r>
+        <w:rPr>
+          <w:rStyle w:val="XML"/>
+        </w:rPr>
+        <w:t>&gt;</w:t>
       </w:r>
       <w:r>
         <w:t xml:space="preserve"> element may contain the following:</w:t>
@@ -31670,7 +33596,21 @@
               <w:rPr>
                 <w:rStyle w:val="XML"/>
               </w:rPr>
-              <w:t>&lt;enable&gt;</w:t>
+              <w:t>&lt;</w:t>
+            </w:r>
+            <w:proofErr w:type="spellStart"/>
+            <w:r>
+              <w:rPr>
+                <w:rStyle w:val="XML"/>
+              </w:rPr>
+              <w:t>enable</w:t>
+            </w:r>
+            <w:proofErr w:type="spellEnd"/>
+            <w:r>
+              <w:rPr>
+                <w:rStyle w:val="XML"/>
+              </w:rPr>
+              <w:t>&gt;</w:t>
             </w:r>
           </w:p>
         </w:tc>
@@ -31755,7 +33695,15 @@
               </w:rPr>
             </w:pPr>
             <w:r>
-              <w:t>Specifies which tab page is shown when autostart is active.</w:t>
+              <w:t xml:space="preserve">Specifies which tab page is shown when </w:t>
+            </w:r>
+            <w:proofErr w:type="spellStart"/>
+            <w:r>
+              <w:t>autostart</w:t>
+            </w:r>
+            <w:proofErr w:type="spellEnd"/>
+            <w:r>
+              <w:t xml:space="preserve"> is active.</w:t>
             </w:r>
           </w:p>
           <w:p>
@@ -31846,7 +33794,21 @@
         <w:rPr>
           <w:lang w:val="en-GB"/>
         </w:rPr>
-        <w:t>The &lt;modbustcpserver&gt; element</w:t>
+        <w:t>The &lt;</w:t>
+      </w:r>
+      <w:proofErr w:type="spellStart"/>
+      <w:r>
+        <w:rPr>
+          <w:lang w:val="en-GB"/>
+        </w:rPr>
+        <w:t>modbustcpserver</w:t>
+      </w:r>
+      <w:proofErr w:type="spellEnd"/>
+      <w:r>
+        <w:rPr>
+          <w:lang w:val="en-GB"/>
+        </w:rPr>
+        <w:t>&gt; element</w:t>
       </w:r>
       <w:bookmarkEnd w:id="73"/>
     </w:p>
@@ -31868,7 +33830,23 @@
           <w:rStyle w:val="XML"/>
           <w:lang w:val="en-GB"/>
         </w:rPr>
-        <w:t>&lt;modbustcpserver&gt;</w:t>
+        <w:t>&lt;</w:t>
+      </w:r>
+      <w:proofErr w:type="spellStart"/>
+      <w:r>
+        <w:rPr>
+          <w:rStyle w:val="XML"/>
+          <w:lang w:val="en-GB"/>
+        </w:rPr>
+        <w:t>modbustcpserver</w:t>
+      </w:r>
+      <w:proofErr w:type="spellEnd"/>
+      <w:r>
+        <w:rPr>
+          <w:rStyle w:val="XML"/>
+          <w:lang w:val="en-GB"/>
+        </w:rPr>
+        <w:t>&gt;</w:t>
       </w:r>
       <w:r>
         <w:rPr>
@@ -32012,7 +33990,23 @@
           <w:rStyle w:val="XML"/>
           <w:lang w:val="en-GB"/>
         </w:rPr>
-        <w:t>&lt;modbustcpserver&gt;</w:t>
+        <w:t>&lt;</w:t>
+      </w:r>
+      <w:proofErr w:type="spellStart"/>
+      <w:r>
+        <w:rPr>
+          <w:rStyle w:val="XML"/>
+          <w:lang w:val="en-GB"/>
+        </w:rPr>
+        <w:t>modbustcpserver</w:t>
+      </w:r>
+      <w:proofErr w:type="spellEnd"/>
+      <w:r>
+        <w:rPr>
+          <w:rStyle w:val="XML"/>
+          <w:lang w:val="en-GB"/>
+        </w:rPr>
+        <w:t>&gt;</w:t>
       </w:r>
       <w:r>
         <w:rPr>
@@ -32054,7 +34048,21 @@
               <w:rPr>
                 <w:rStyle w:val="XML"/>
               </w:rPr>
-              <w:t>&lt;enable&gt;</w:t>
+              <w:t>&lt;</w:t>
+            </w:r>
+            <w:proofErr w:type="spellStart"/>
+            <w:r>
+              <w:rPr>
+                <w:rStyle w:val="XML"/>
+              </w:rPr>
+              <w:t>enable</w:t>
+            </w:r>
+            <w:proofErr w:type="spellEnd"/>
+            <w:r>
+              <w:rPr>
+                <w:rStyle w:val="XML"/>
+              </w:rPr>
+              <w:t>&gt;</w:t>
             </w:r>
           </w:p>
         </w:tc>
@@ -32085,9 +34093,6 @@
             </w:r>
             <w:r>
               <w:br/>
-            </w:r>
-            <w:r>
-              <w:lastRenderedPageBreak/>
               <w:t xml:space="preserve">Optional. </w:t>
             </w:r>
             <w:r>
@@ -32096,6 +34101,7 @@
               </w:rPr>
               <w:t xml:space="preserve">Default: </w:t>
             </w:r>
+            <w:proofErr w:type="spellStart"/>
             <w:r>
               <w:rPr>
                 <w:b/>
@@ -32104,6 +34110,7 @@
               </w:rPr>
               <w:t>false</w:t>
             </w:r>
+            <w:proofErr w:type="spellEnd"/>
             <w:r>
               <w:t xml:space="preserve"> </w:t>
             </w:r>
@@ -32126,7 +34133,6 @@
               <w:rPr>
                 <w:rStyle w:val="XML"/>
               </w:rPr>
-              <w:lastRenderedPageBreak/>
               <w:t>&lt;port&gt;</w:t>
             </w:r>
           </w:p>
@@ -32245,6 +34251,7 @@
         </w:rPr>
       </w:pPr>
       <w:r>
+        <w:lastRenderedPageBreak/>
         <w:t>An XML comment:</w:t>
       </w:r>
     </w:p>
@@ -32265,7 +34272,25 @@
           <w:bCs/>
           <w:lang w:val="nl-BE"/>
         </w:rPr>
-        <w:t>starts with:</w:t>
+        <w:t xml:space="preserve">starts </w:t>
+      </w:r>
+      <w:proofErr w:type="spellStart"/>
+      <w:r>
+        <w:rPr>
+          <w:b/>
+          <w:bCs/>
+          <w:lang w:val="nl-BE"/>
+        </w:rPr>
+        <w:t>with</w:t>
+      </w:r>
+      <w:proofErr w:type="spellEnd"/>
+      <w:r>
+        <w:rPr>
+          <w:b/>
+          <w:bCs/>
+          <w:lang w:val="nl-BE"/>
+        </w:rPr>
+        <w:t>:</w:t>
       </w:r>
       <w:r>
         <w:rPr>
@@ -32298,13 +34323,41 @@
           <w:lang w:val="nl-BE"/>
         </w:rPr>
       </w:pPr>
+      <w:proofErr w:type="spellStart"/>
       <w:r>
         <w:rPr>
           <w:b/>
           <w:bCs/>
           <w:lang w:val="nl-BE"/>
         </w:rPr>
-        <w:t>ends with:</w:t>
+        <w:t>ends</w:t>
+      </w:r>
+      <w:proofErr w:type="spellEnd"/>
+      <w:r>
+        <w:rPr>
+          <w:b/>
+          <w:bCs/>
+          <w:lang w:val="nl-BE"/>
+        </w:rPr>
+        <w:t xml:space="preserve"> </w:t>
+      </w:r>
+      <w:proofErr w:type="spellStart"/>
+      <w:r>
+        <w:rPr>
+          <w:b/>
+          <w:bCs/>
+          <w:lang w:val="nl-BE"/>
+        </w:rPr>
+        <w:t>with</w:t>
+      </w:r>
+      <w:proofErr w:type="spellEnd"/>
+      <w:r>
+        <w:rPr>
+          <w:b/>
+          <w:bCs/>
+          <w:lang w:val="nl-BE"/>
+        </w:rPr>
+        <w:t>:</w:t>
       </w:r>
       <w:r>
         <w:rPr>
@@ -32520,6 +34573,7 @@
         </w:rPr>
         <w:t>&gt;&lt;</w:t>
       </w:r>
+      <w:proofErr w:type="spellStart"/>
       <w:r>
         <w:rPr>
           <w:rStyle w:val="XMLElement"/>
@@ -32527,6 +34581,7 @@
         </w:rPr>
         <w:t>rw</w:t>
       </w:r>
+      <w:proofErr w:type="spellEnd"/>
       <w:r>
         <w:rPr>
           <w:rStyle w:val="XMLBracket"/>
@@ -32548,6 +34603,7 @@
         </w:rPr>
         <w:t>&lt;/</w:t>
       </w:r>
+      <w:proofErr w:type="spellStart"/>
       <w:r>
         <w:rPr>
           <w:rStyle w:val="XMLElement"/>
@@ -32555,6 +34611,7 @@
         </w:rPr>
         <w:t>rw</w:t>
       </w:r>
+      <w:proofErr w:type="spellEnd"/>
       <w:r>
         <w:rPr>
           <w:rStyle w:val="XMLBracket"/>
@@ -32612,7 +34669,39 @@
           <w:rStyle w:val="XMLComment"/>
           <w:lang w:val="en-GB"/>
         </w:rPr>
-        <w:t>var&gt;&lt;reg&gt;40007&lt;/reg&gt;&lt;text&gt;Analog in 2&lt;/text&gt;&lt;type&gt;uint16&lt;/type&gt;&lt;rw&gt;r&lt;/rw&gt;&lt;/var&gt;</w:t>
+        <w:t>var&gt;&lt;reg&gt;40007&lt;/reg&gt;&lt;text&gt;Analog in 2&lt;/text&gt;&lt;type&gt;uint16&lt;/type&gt;&lt;</w:t>
+      </w:r>
+      <w:proofErr w:type="spellStart"/>
+      <w:r>
+        <w:rPr>
+          <w:rStyle w:val="XMLComment"/>
+          <w:lang w:val="en-GB"/>
+        </w:rPr>
+        <w:t>rw</w:t>
+      </w:r>
+      <w:proofErr w:type="spellEnd"/>
+      <w:r>
+        <w:rPr>
+          <w:rStyle w:val="XMLComment"/>
+          <w:lang w:val="en-GB"/>
+        </w:rPr>
+        <w:t>&gt;r&lt;/</w:t>
+      </w:r>
+      <w:proofErr w:type="spellStart"/>
+      <w:r>
+        <w:rPr>
+          <w:rStyle w:val="XMLComment"/>
+          <w:lang w:val="en-GB"/>
+        </w:rPr>
+        <w:t>rw</w:t>
+      </w:r>
+      <w:proofErr w:type="spellEnd"/>
+      <w:r>
+        <w:rPr>
+          <w:rStyle w:val="XMLComment"/>
+          <w:lang w:val="en-GB"/>
+        </w:rPr>
+        <w:t>&gt;&lt;/var&gt;</w:t>
       </w:r>
     </w:p>
     <w:p>
@@ -32634,7 +34723,39 @@
           <w:rStyle w:val="XMLComment"/>
           <w:lang w:val="en-GB"/>
         </w:rPr>
-        <w:t>var&gt;&lt;reg&gt;40008&lt;/reg&gt;&lt;text&gt;Analog in 3&lt;/text&gt;&lt;type&gt;uint16&lt;/type&gt;&lt;rw&gt;r&lt;/rw&gt;&lt;/var&gt;</w:t>
+        <w:t>var&gt;&lt;reg&gt;40008&lt;/reg&gt;&lt;text&gt;Analog in 3&lt;/text&gt;&lt;type&gt;uint16&lt;/type&gt;&lt;</w:t>
+      </w:r>
+      <w:proofErr w:type="spellStart"/>
+      <w:r>
+        <w:rPr>
+          <w:rStyle w:val="XMLComment"/>
+          <w:lang w:val="en-GB"/>
+        </w:rPr>
+        <w:t>rw</w:t>
+      </w:r>
+      <w:proofErr w:type="spellEnd"/>
+      <w:r>
+        <w:rPr>
+          <w:rStyle w:val="XMLComment"/>
+          <w:lang w:val="en-GB"/>
+        </w:rPr>
+        <w:t>&gt;r&lt;/</w:t>
+      </w:r>
+      <w:proofErr w:type="spellStart"/>
+      <w:r>
+        <w:rPr>
+          <w:rStyle w:val="XMLComment"/>
+          <w:lang w:val="en-GB"/>
+        </w:rPr>
+        <w:t>rw</w:t>
+      </w:r>
+      <w:proofErr w:type="spellEnd"/>
+      <w:r>
+        <w:rPr>
+          <w:rStyle w:val="XMLComment"/>
+          <w:lang w:val="en-GB"/>
+        </w:rPr>
+        <w:t>&gt;&lt;/var&gt;</w:t>
       </w:r>
     </w:p>
     <w:p>
@@ -32808,6 +34929,7 @@
         </w:rPr>
         <w:t>&gt;&lt;</w:t>
       </w:r>
+      <w:proofErr w:type="spellStart"/>
       <w:r>
         <w:rPr>
           <w:rStyle w:val="XMLElement"/>
@@ -32815,6 +34937,7 @@
         </w:rPr>
         <w:t>rw</w:t>
       </w:r>
+      <w:proofErr w:type="spellEnd"/>
       <w:r>
         <w:rPr>
           <w:rStyle w:val="XMLBracket"/>
@@ -32836,6 +34959,7 @@
         </w:rPr>
         <w:t>&lt;/</w:t>
       </w:r>
+      <w:proofErr w:type="spellStart"/>
       <w:r>
         <w:rPr>
           <w:rStyle w:val="XMLElement"/>
@@ -32843,6 +34967,7 @@
         </w:rPr>
         <w:t>rw</w:t>
       </w:r>
+      <w:proofErr w:type="spellEnd"/>
       <w:r>
         <w:rPr>
           <w:rStyle w:val="XMLBracket"/>

</xml_diff>

<commit_message>
Revised the handling of the register numbering (40001, 40000, 400001, 400000). Made RegisterToOffset class instance-based instead of static. The project configuration screen shows register numbering scheme more clearly, like "40001-49999 + 400001-465536". Mbc project file loading no longer allows register 40001 when numbering scheme is 400001, as was intended. Some fixes in the tests.
</commit_message>
<xml_diff>
--- a/Manuals/ModbusControl - User manual.docx
+++ b/Manuals/ModbusControl - User manual.docx
@@ -5373,7 +5373,7 @@
             <v:path o:extrusionok="f" gradientshapeok="t" o:connecttype="rect"/>
             <o:lock v:ext="edit" aspectratio="t"/>
           </v:shapetype>
-          <v:shape id="_x0000_i1025" type="#_x0000_t75" style="width:408.55pt;height:56.1pt;visibility:visible;mso-wrap-style:square">
+          <v:shape id="_x0000_i1025" type="#_x0000_t75" style="width:408.6pt;height:56.4pt;visibility:visible;mso-wrap-style:square">
             <v:imagedata r:id="rId8" o:title=""/>
           </v:shape>
         </w:pict>
@@ -7329,10 +7329,10 @@
               </w:rPr>
             </w:pPr>
             <w:r>
-              <w:t xml:space="preserve">Holding registers </w:t>
-            </w:r>
-            <w:r>
-              <w:t>start</w:t>
+              <w:t xml:space="preserve">Register </w:t>
+            </w:r>
+            <w:r>
+              <w:t>numbering scheme</w:t>
             </w:r>
             <w:r>
               <w:t>:</w:t>
@@ -9429,7 +9429,7 @@
         </w:rPr>
         <w:lastRenderedPageBreak/>
         <w:pict w14:anchorId="30845F7A">
-          <v:shape id="_x0000_i1026" type="#_x0000_t75" style="width:472.2pt;height:142.35pt;visibility:visible;mso-wrap-style:square">
+          <v:shape id="_x0000_i1026" type="#_x0000_t75" style="width:472.2pt;height:142.2pt;visibility:visible;mso-wrap-style:square">
             <v:imagedata r:id="rId10" o:title=""/>
           </v:shape>
         </w:pict>
@@ -11056,7 +11056,7 @@
           <w:noProof/>
         </w:rPr>
         <w:pict w14:anchorId="5CABB691">
-          <v:shape id="_x0000_i1027" type="#_x0000_t75" style="width:391.8pt;height:51.9pt;visibility:visible;mso-wrap-style:square">
+          <v:shape id="_x0000_i1027" type="#_x0000_t75" style="width:391.8pt;height:51.6pt;visibility:visible;mso-wrap-style:square">
             <v:imagedata r:id="rId11" o:title=""/>
           </v:shape>
         </w:pict>
@@ -27536,7 +27536,7 @@
           <w:lang w:val="en-GB"/>
         </w:rPr>
         <w:pict w14:anchorId="56E75F81">
-          <v:shape id="Afbeelding 1" o:spid="_x0000_i1028" type="#_x0000_t75" style="width:345.75pt;height:50.25pt;visibility:visible;mso-wrap-style:square">
+          <v:shape id="Afbeelding 1" o:spid="_x0000_i1028" type="#_x0000_t75" style="width:345.6pt;height:50.4pt;visibility:visible;mso-wrap-style:square">
             <v:imagedata r:id="rId12" o:title=""/>
           </v:shape>
         </w:pict>

</xml_diff>